<commit_message>
fix: correct landing page copy for guest limits and pricing
- FAQ: "Do I need an account?" now states 20 questions/day guest limit,
  midnight reset, and that Exam/Adventure modes require an account
- Trust badge: "no premium tier" → accurate pricing copy ($9.99/month AUD)
- Guest badge sub-text updated to "20 free questions a day"

Co-Authored-By: Claude Sonnet 4.6 <noreply@anthropic.com>
</commit_message>
<xml_diff>
--- a/DESIGN.docx
+++ b/DESIGN.docx
@@ -27777,7 +27777,7 @@
                 <w:b/>
                 <w:color w:val="1E293B"/>
               </w:rPr>
-              <w:t>v0.26.0</w:t>
+              <w:t>v0.27.0</w:t>
             </w:r>
           </w:p>
         </w:tc>
@@ -27827,112 +27827,7 @@
                 <w:color w:val="1E293B"/>
                 <w:sz w:val="18"/>
               </w:rPr>
-              <w:t xml:space="preserve">DoS protection — three-layer defence: (1) Upstash Redis distributed rate limiting replaces the defunct in-memory </w:t>
-            </w:r>
-            <w:r>
-              <w:rPr>
-                <w:rFonts w:ascii="Courier New" w:hAnsi="Courier New"/>
-                <w:color w:val="0F172A"/>
-                <w:sz w:val="18"/>
-              </w:rPr>
-              <w:t>Map</w:t>
-            </w:r>
-            <w:r>
-              <w:rPr>
-                <w:color w:val="1E293B"/>
-                <w:sz w:val="18"/>
-              </w:rPr>
-              <w:t xml:space="preserve"> in </w:t>
-            </w:r>
-            <w:r>
-              <w:rPr>
-                <w:rFonts w:ascii="Courier New" w:hAnsi="Courier New"/>
-                <w:color w:val="0F172A"/>
-                <w:sz w:val="18"/>
-              </w:rPr>
-              <w:t>lib/ratelimit.ts</w:t>
-            </w:r>
-            <w:r>
-              <w:rPr>
-                <w:color w:val="1E293B"/>
-                <w:sz w:val="18"/>
-              </w:rPr>
-              <w:t xml:space="preserve"> — sliding window, graceful in-memory fallback when env vars absent, unique Redis prefix per endpoint. </w:t>
-            </w:r>
-            <w:r>
-              <w:rPr>
-                <w:rFonts w:ascii="Courier New" w:hAnsi="Courier New"/>
-                <w:color w:val="0F172A"/>
-                <w:sz w:val="18"/>
-              </w:rPr>
-              <w:t>middleware.ts</w:t>
-            </w:r>
-            <w:r>
-              <w:rPr>
-                <w:color w:val="1E293B"/>
-                <w:sz w:val="18"/>
-              </w:rPr>
-              <w:t xml:space="preserve"> deprecated → renamed to </w:t>
-            </w:r>
-            <w:r>
-              <w:rPr>
-                <w:rFonts w:ascii="Courier New" w:hAnsi="Courier New"/>
-                <w:color w:val="0F172A"/>
-                <w:sz w:val="18"/>
-              </w:rPr>
-              <w:t>proxy.ts</w:t>
-            </w:r>
-            <w:r>
-              <w:rPr>
-                <w:color w:val="1E293B"/>
-                <w:sz w:val="18"/>
-              </w:rPr>
-              <w:t xml:space="preserve"> per Next.js 16 proxy convention; proxy runs a blanket 120-req/60s-per-IP gate on all </w:t>
-            </w:r>
-            <w:r>
-              <w:rPr>
-                <w:rFonts w:ascii="Courier New" w:hAnsi="Courier New"/>
-                <w:color w:val="0F172A"/>
-                <w:sz w:val="18"/>
-              </w:rPr>
-              <w:t>/api/*</w:t>
-            </w:r>
-            <w:r>
-              <w:rPr>
-                <w:color w:val="1E293B"/>
-                <w:sz w:val="18"/>
-              </w:rPr>
-              <w:t xml:space="preserve"> routes before any serverless function is invoked. (2) Per-endpoint fine-grained limits: </w:t>
-            </w:r>
-            <w:r>
-              <w:rPr>
-                <w:rFonts w:ascii="Courier New" w:hAnsi="Courier New"/>
-                <w:color w:val="0F172A"/>
-                <w:sz w:val="18"/>
-              </w:rPr>
-              <w:t>/api/chat</w:t>
-            </w:r>
-            <w:r>
-              <w:rPr>
-                <w:color w:val="1E293B"/>
-                <w:sz w:val="18"/>
-              </w:rPr>
-              <w:t xml:space="preserve"> 30/60s, </w:t>
-            </w:r>
-            <w:r>
-              <w:rPr>
-                <w:rFonts w:ascii="Courier New" w:hAnsi="Courier New"/>
-                <w:color w:val="0F172A"/>
-                <w:sz w:val="18"/>
-              </w:rPr>
-              <w:t>/api/trivia</w:t>
-            </w:r>
-            <w:r>
-              <w:rPr>
-                <w:color w:val="1E293B"/>
-                <w:sz w:val="18"/>
-              </w:rPr>
-              <w:t xml:space="preserve"> 10/60s, `/api/exam/generate</w:t>
+              <w:t>Landing page copy fixes — FAQ "Do I need an account?" updated to mention 20-question/day guest limit and midnight reset; correctly states Exam Mode and Adventure Mode require an account. Trust badge "Free to use / no premium tier" corrected to "Free to start / 7-day trial then $9.99/month AUD". Guest badge updated to "20 free questions a day"</w:t>
             </w:r>
           </w:p>
         </w:tc>
@@ -27959,7 +27854,7 @@
                 <w:b/>
                 <w:color w:val="1E293B"/>
               </w:rPr>
-              <w:t>v0.25.0</w:t>
+              <w:t>v0.26.0</w:t>
             </w:r>
           </w:p>
         </w:tc>
@@ -28009,7 +27904,7 @@
                 <w:color w:val="1E293B"/>
                 <w:sz w:val="18"/>
               </w:rPr>
-              <w:t xml:space="preserve">Automated security agent — (1) </w:t>
+              <w:t xml:space="preserve">DoS protection — three-layer defence: (1) Upstash Redis distributed rate limiting replaces the defunct in-memory </w:t>
             </w:r>
             <w:r>
               <w:rPr>
@@ -28017,14 +27912,14 @@
                 <w:color w:val="0F172A"/>
                 <w:sz w:val="18"/>
               </w:rPr>
-              <w:t>next.config.ts</w:t>
+              <w:t>Map</w:t>
             </w:r>
             <w:r>
               <w:rPr>
                 <w:color w:val="1E293B"/>
                 <w:sz w:val="18"/>
               </w:rPr>
-              <w:t xml:space="preserve"> now sets 7 HTTP security headers on every route: </w:t>
+              <w:t xml:space="preserve"> in </w:t>
             </w:r>
             <w:r>
               <w:rPr>
@@ -28032,14 +27927,14 @@
                 <w:color w:val="0F172A"/>
                 <w:sz w:val="18"/>
               </w:rPr>
-              <w:t>X-Frame-Options: SAMEORIGIN</w:t>
+              <w:t>lib/ratelimit.ts</w:t>
             </w:r>
             <w:r>
               <w:rPr>
                 <w:color w:val="1E293B"/>
                 <w:sz w:val="18"/>
               </w:rPr>
-              <w:t xml:space="preserve">, </w:t>
+              <w:t xml:space="preserve"> — sliding window, graceful in-memory fallback when env vars absent, unique Redis prefix per endpoint. </w:t>
             </w:r>
             <w:r>
               <w:rPr>
@@ -28047,14 +27942,14 @@
                 <w:color w:val="0F172A"/>
                 <w:sz w:val="18"/>
               </w:rPr>
-              <w:t>X-Content-Type-Options: nosniff</w:t>
+              <w:t>middleware.ts</w:t>
             </w:r>
             <w:r>
               <w:rPr>
                 <w:color w:val="1E293B"/>
                 <w:sz w:val="18"/>
               </w:rPr>
-              <w:t xml:space="preserve">, </w:t>
+              <w:t xml:space="preserve"> deprecated → renamed to </w:t>
             </w:r>
             <w:r>
               <w:rPr>
@@ -28062,14 +27957,14 @@
                 <w:color w:val="0F172A"/>
                 <w:sz w:val="18"/>
               </w:rPr>
-              <w:t>Referrer-Policy: strict-origin-when-cross-origin</w:t>
+              <w:t>proxy.ts</w:t>
             </w:r>
             <w:r>
               <w:rPr>
                 <w:color w:val="1E293B"/>
                 <w:sz w:val="18"/>
               </w:rPr>
-              <w:t xml:space="preserve">, </w:t>
+              <w:t xml:space="preserve"> per Next.js 16 proxy convention; proxy runs a blanket 120-req/60s-per-IP gate on all </w:t>
             </w:r>
             <w:r>
               <w:rPr>
@@ -28077,14 +27972,14 @@
                 <w:color w:val="0F172A"/>
                 <w:sz w:val="18"/>
               </w:rPr>
-              <w:t>Permissions-Policy</w:t>
+              <w:t>/api/*</w:t>
             </w:r>
             <w:r>
               <w:rPr>
                 <w:color w:val="1E293B"/>
                 <w:sz w:val="18"/>
               </w:rPr>
-              <w:t xml:space="preserve"> (blocks camera/mic/geo/payment), </w:t>
+              <w:t xml:space="preserve"> routes before any serverless function is invoked. (2) Per-endpoint fine-grained limits: </w:t>
             </w:r>
             <w:r>
               <w:rPr>
@@ -28092,14 +27987,14 @@
                 <w:color w:val="0F172A"/>
                 <w:sz w:val="18"/>
               </w:rPr>
-              <w:t>Strict-Transport-Security</w:t>
+              <w:t>/api/chat</w:t>
             </w:r>
             <w:r>
               <w:rPr>
                 <w:color w:val="1E293B"/>
                 <w:sz w:val="18"/>
               </w:rPr>
-              <w:t xml:space="preserve"> (2yr + preload), </w:t>
+              <w:t xml:space="preserve"> 30/60s, </w:t>
             </w:r>
             <w:r>
               <w:rPr>
@@ -28107,44 +28002,14 @@
                 <w:color w:val="0F172A"/>
                 <w:sz w:val="18"/>
               </w:rPr>
-              <w:t>X-DNS-Prefetch-Control</w:t>
+              <w:t>/api/trivia</w:t>
             </w:r>
             <w:r>
               <w:rPr>
                 <w:color w:val="1E293B"/>
                 <w:sz w:val="18"/>
               </w:rPr>
-              <w:t xml:space="preserve">, and a full </w:t>
-            </w:r>
-            <w:r>
-              <w:rPr>
-                <w:rFonts w:ascii="Courier New" w:hAnsi="Courier New"/>
-                <w:color w:val="0F172A"/>
-                <w:sz w:val="18"/>
-              </w:rPr>
-              <w:t>Content-Security-Policy</w:t>
-            </w:r>
-            <w:r>
-              <w:rPr>
-                <w:color w:val="1E293B"/>
-                <w:sz w:val="18"/>
-              </w:rPr>
-              <w:t xml:space="preserve"> covering script/style/font/img/connect/frame origins for Clerk, Stripe, KaTeX, Google Fonts, and Vercel Analytics. (2) </w:t>
-            </w:r>
-            <w:r>
-              <w:rPr>
-                <w:rFonts w:ascii="Courier New" w:hAnsi="Courier New"/>
-                <w:color w:val="0F172A"/>
-                <w:sz w:val="18"/>
-              </w:rPr>
-              <w:t>scripts/pentest.mjs</w:t>
-            </w:r>
-            <w:r>
-              <w:rPr>
-                <w:color w:val="1E293B"/>
-                <w:sz w:val="18"/>
-              </w:rPr>
-              <w:t xml:space="preserve"> — runnable Node.js audit that checks headers, probes 7 API endpoints for unauthenticated access, runs npm audit, scans codebase for dangerous patterns (dangerouslySetInnerHTML, eval, hardcoded secrets, SQL injection, wildcard CORS, sensitive console.log, NEXT_PUBLIC_ secrets, missing auth on API routes), and checks TLS redirect; outputs structured JSON. (3) Weekly Claude Code agent scheduled trigger (every Monday 18:00 UTC) — runs the audit, auto-fixes CRITICAL/HIGH findings, rebuilds, deploys, re-audits to confirm, updates DESIGN.md, and emails the founder a markdown report</w:t>
+              <w:t xml:space="preserve"> 10/60s, `/api/exam/generate</w:t>
             </w:r>
           </w:p>
         </w:tc>
@@ -28171,7 +28036,7 @@
                 <w:b/>
                 <w:color w:val="1E293B"/>
               </w:rPr>
-              <w:t>v0.24.0</w:t>
+              <w:t>v0.25.0</w:t>
             </w:r>
           </w:p>
         </w:tc>
@@ -28221,7 +28086,7 @@
                 <w:color w:val="1E293B"/>
                 <w:sz w:val="18"/>
               </w:rPr>
-              <w:t>Guest 20-questions/day limit — anonymous users (no Clerk session, no child session) are now gated at 20 questions per day via localStorage (</w:t>
+              <w:t xml:space="preserve">Automated security agent — (1) </w:t>
             </w:r>
             <w:r>
               <w:rPr>
@@ -28229,14 +28094,14 @@
                 <w:color w:val="0F172A"/>
                 <w:sz w:val="18"/>
               </w:rPr>
-              <w:t>selected_guest_usage: {count, date}</w:t>
+              <w:t>next.config.ts</w:t>
             </w:r>
             <w:r>
               <w:rPr>
                 <w:color w:val="1E293B"/>
                 <w:sz w:val="18"/>
               </w:rPr>
-              <w:t xml:space="preserve">). On limit hit or locked-mode attempt, </w:t>
+              <w:t xml:space="preserve"> now sets 7 HTTP security headers on every route: </w:t>
             </w:r>
             <w:r>
               <w:rPr>
@@ -28244,14 +28109,14 @@
                 <w:color w:val="0F172A"/>
                 <w:sz w:val="18"/>
               </w:rPr>
-              <w:t>GuestLimitModal</w:t>
+              <w:t>X-Frame-Options: SAMEORIGIN</w:t>
             </w:r>
             <w:r>
               <w:rPr>
                 <w:color w:val="1E293B"/>
                 <w:sz w:val="18"/>
               </w:rPr>
-              <w:t xml:space="preserve"> opens: shows reset countdown to midnight, "Start free 7-day trial" (Clerk SignUpButton modal) and "I already have an account" (SignInButton modal). Header badge shows </w:t>
+              <w:t xml:space="preserve">, </w:t>
             </w:r>
             <w:r>
               <w:rPr>
@@ -28259,14 +28124,14 @@
                 <w:color w:val="0F172A"/>
                 <w:sz w:val="18"/>
               </w:rPr>
-              <w:t>X/20 questions today</w:t>
+              <w:t>X-Content-Type-Options: nosniff</w:t>
             </w:r>
             <w:r>
               <w:rPr>
                 <w:color w:val="1E293B"/>
                 <w:sz w:val="18"/>
               </w:rPr>
-              <w:t xml:space="preserve"> for guests (turns red at limit). Signed-in parents and child sessions continue to use server-side tracking. </w:t>
+              <w:t xml:space="preserve">, </w:t>
             </w:r>
             <w:r>
               <w:rPr>
@@ -28274,14 +28139,89 @@
                 <w:color w:val="0F172A"/>
                 <w:sz w:val="18"/>
               </w:rPr>
-              <w:t>app/components/GuestLimitModal.tsx</w:t>
+              <w:t>Referrer-Policy: strict-origin-when-cross-origin</w:t>
             </w:r>
             <w:r>
               <w:rPr>
                 <w:color w:val="1E293B"/>
                 <w:sz w:val="18"/>
               </w:rPr>
-              <w:t xml:space="preserve"> added</w:t>
+              <w:t xml:space="preserve">, </w:t>
+            </w:r>
+            <w:r>
+              <w:rPr>
+                <w:rFonts w:ascii="Courier New" w:hAnsi="Courier New"/>
+                <w:color w:val="0F172A"/>
+                <w:sz w:val="18"/>
+              </w:rPr>
+              <w:t>Permissions-Policy</w:t>
+            </w:r>
+            <w:r>
+              <w:rPr>
+                <w:color w:val="1E293B"/>
+                <w:sz w:val="18"/>
+              </w:rPr>
+              <w:t xml:space="preserve"> (blocks camera/mic/geo/payment), </w:t>
+            </w:r>
+            <w:r>
+              <w:rPr>
+                <w:rFonts w:ascii="Courier New" w:hAnsi="Courier New"/>
+                <w:color w:val="0F172A"/>
+                <w:sz w:val="18"/>
+              </w:rPr>
+              <w:t>Strict-Transport-Security</w:t>
+            </w:r>
+            <w:r>
+              <w:rPr>
+                <w:color w:val="1E293B"/>
+                <w:sz w:val="18"/>
+              </w:rPr>
+              <w:t xml:space="preserve"> (2yr + preload), </w:t>
+            </w:r>
+            <w:r>
+              <w:rPr>
+                <w:rFonts w:ascii="Courier New" w:hAnsi="Courier New"/>
+                <w:color w:val="0F172A"/>
+                <w:sz w:val="18"/>
+              </w:rPr>
+              <w:t>X-DNS-Prefetch-Control</w:t>
+            </w:r>
+            <w:r>
+              <w:rPr>
+                <w:color w:val="1E293B"/>
+                <w:sz w:val="18"/>
+              </w:rPr>
+              <w:t xml:space="preserve">, and a full </w:t>
+            </w:r>
+            <w:r>
+              <w:rPr>
+                <w:rFonts w:ascii="Courier New" w:hAnsi="Courier New"/>
+                <w:color w:val="0F172A"/>
+                <w:sz w:val="18"/>
+              </w:rPr>
+              <w:t>Content-Security-Policy</w:t>
+            </w:r>
+            <w:r>
+              <w:rPr>
+                <w:color w:val="1E293B"/>
+                <w:sz w:val="18"/>
+              </w:rPr>
+              <w:t xml:space="preserve"> covering script/style/font/img/connect/frame origins for Clerk, Stripe, KaTeX, Google Fonts, and Vercel Analytics. (2) </w:t>
+            </w:r>
+            <w:r>
+              <w:rPr>
+                <w:rFonts w:ascii="Courier New" w:hAnsi="Courier New"/>
+                <w:color w:val="0F172A"/>
+                <w:sz w:val="18"/>
+              </w:rPr>
+              <w:t>scripts/pentest.mjs</w:t>
+            </w:r>
+            <w:r>
+              <w:rPr>
+                <w:color w:val="1E293B"/>
+                <w:sz w:val="18"/>
+              </w:rPr>
+              <w:t xml:space="preserve"> — runnable Node.js audit that checks headers, probes 7 API endpoints for unauthenticated access, runs npm audit, scans codebase for dangerous patterns (dangerouslySetInnerHTML, eval, hardcoded secrets, SQL injection, wildcard CORS, sensitive console.log, NEXT_PUBLIC_ secrets, missing auth on API routes), and checks TLS redirect; outputs structured JSON. (3) Weekly Claude Code agent scheduled trigger (every Monday 18:00 UTC) — runs the audit, auto-fixes CRITICAL/HIGH findings, rebuilds, deploys, re-audits to confirm, updates DESIGN.md, and emails the founder a markdown report</w:t>
             </w:r>
           </w:p>
         </w:tc>
@@ -28308,7 +28248,7 @@
                 <w:b/>
                 <w:color w:val="1E293B"/>
               </w:rPr>
-              <w:t>v0.23.0</w:t>
+              <w:t>v0.24.0</w:t>
             </w:r>
           </w:p>
         </w:tc>
@@ -28358,6 +28298,143 @@
                 <w:color w:val="1E293B"/>
                 <w:sz w:val="18"/>
               </w:rPr>
+              <w:t>Guest 20-questions/day limit — anonymous users (no Clerk session, no child session) are now gated at 20 questions per day via localStorage (</w:t>
+            </w:r>
+            <w:r>
+              <w:rPr>
+                <w:rFonts w:ascii="Courier New" w:hAnsi="Courier New"/>
+                <w:color w:val="0F172A"/>
+                <w:sz w:val="18"/>
+              </w:rPr>
+              <w:t>selected_guest_usage: {count, date}</w:t>
+            </w:r>
+            <w:r>
+              <w:rPr>
+                <w:color w:val="1E293B"/>
+                <w:sz w:val="18"/>
+              </w:rPr>
+              <w:t xml:space="preserve">). On limit hit or locked-mode attempt, </w:t>
+            </w:r>
+            <w:r>
+              <w:rPr>
+                <w:rFonts w:ascii="Courier New" w:hAnsi="Courier New"/>
+                <w:color w:val="0F172A"/>
+                <w:sz w:val="18"/>
+              </w:rPr>
+              <w:t>GuestLimitModal</w:t>
+            </w:r>
+            <w:r>
+              <w:rPr>
+                <w:color w:val="1E293B"/>
+                <w:sz w:val="18"/>
+              </w:rPr>
+              <w:t xml:space="preserve"> opens: shows reset countdown to midnight, "Start free 7-day trial" (Clerk SignUpButton modal) and "I already have an account" (SignInButton modal). Header badge shows </w:t>
+            </w:r>
+            <w:r>
+              <w:rPr>
+                <w:rFonts w:ascii="Courier New" w:hAnsi="Courier New"/>
+                <w:color w:val="0F172A"/>
+                <w:sz w:val="18"/>
+              </w:rPr>
+              <w:t>X/20 questions today</w:t>
+            </w:r>
+            <w:r>
+              <w:rPr>
+                <w:color w:val="1E293B"/>
+                <w:sz w:val="18"/>
+              </w:rPr>
+              <w:t xml:space="preserve"> for guests (turns red at limit). Signed-in parents and child sessions continue to use server-side tracking. </w:t>
+            </w:r>
+            <w:r>
+              <w:rPr>
+                <w:rFonts w:ascii="Courier New" w:hAnsi="Courier New"/>
+                <w:color w:val="0F172A"/>
+                <w:sz w:val="18"/>
+              </w:rPr>
+              <w:t>app/components/GuestLimitModal.tsx</w:t>
+            </w:r>
+            <w:r>
+              <w:rPr>
+                <w:color w:val="1E293B"/>
+                <w:sz w:val="18"/>
+              </w:rPr>
+              <w:t xml:space="preserve"> added</w:t>
+            </w:r>
+          </w:p>
+        </w:tc>
+      </w:tr>
+      <w:tr>
+        <w:tc>
+          <w:tcPr>
+            <w:tcW w:type="dxa" w:w="3024"/>
+            <w:shd w:val="clear" w:color="auto" w:fill="F8FAFC"/>
+            <w:tcBorders>
+              <w:top w:val="single" w:sz="4" w:space="0" w:color="E2E8F0"/>
+              <w:left w:val="single" w:sz="4" w:space="0" w:color="E2E8F0"/>
+              <w:bottom w:val="single" w:sz="4" w:space="0" w:color="E2E8F0"/>
+              <w:right w:val="single" w:sz="4" w:space="0" w:color="E2E8F0"/>
+            </w:tcBorders>
+          </w:tcPr>
+          <w:p>
+            <w:pPr>
+              <w:spacing w:before="30" w:after="30"/>
+            </w:pPr>
+            <w:r/>
+            <w:r>
+              <w:rPr>
+                <w:b/>
+                <w:color w:val="1E293B"/>
+              </w:rPr>
+              <w:t>v0.23.0</w:t>
+            </w:r>
+          </w:p>
+        </w:tc>
+        <w:tc>
+          <w:tcPr>
+            <w:tcW w:type="dxa" w:w="3024"/>
+            <w:shd w:val="clear" w:color="auto" w:fill="F8FAFC"/>
+            <w:tcBorders>
+              <w:top w:val="single" w:sz="4" w:space="0" w:color="E2E8F0"/>
+              <w:left w:val="single" w:sz="4" w:space="0" w:color="E2E8F0"/>
+              <w:bottom w:val="single" w:sz="4" w:space="0" w:color="E2E8F0"/>
+              <w:right w:val="single" w:sz="4" w:space="0" w:color="E2E8F0"/>
+            </w:tcBorders>
+          </w:tcPr>
+          <w:p>
+            <w:pPr>
+              <w:spacing w:before="30" w:after="30"/>
+            </w:pPr>
+            <w:r/>
+            <w:r>
+              <w:rPr>
+                <w:color w:val="1E293B"/>
+                <w:sz w:val="18"/>
+              </w:rPr>
+              <w:t>July 2026</w:t>
+            </w:r>
+          </w:p>
+        </w:tc>
+        <w:tc>
+          <w:tcPr>
+            <w:tcW w:type="dxa" w:w="3024"/>
+            <w:shd w:val="clear" w:color="auto" w:fill="F8FAFC"/>
+            <w:tcBorders>
+              <w:top w:val="single" w:sz="4" w:space="0" w:color="E2E8F0"/>
+              <w:left w:val="single" w:sz="4" w:space="0" w:color="E2E8F0"/>
+              <w:bottom w:val="single" w:sz="4" w:space="0" w:color="E2E8F0"/>
+              <w:right w:val="single" w:sz="4" w:space="0" w:color="E2E8F0"/>
+            </w:tcBorders>
+          </w:tcPr>
+          <w:p>
+            <w:pPr>
+              <w:spacing w:before="30" w:after="30"/>
+            </w:pPr>
+            <w:r/>
+            <w:r>
+              <w:rPr>
+                <w:color w:val="1E293B"/>
+                <w:sz w:val="18"/>
+              </w:rPr>
               <w:t xml:space="preserve">Landing page: exam coverage panel, testimonials section, FAQ accordion — (1) Hero redesigned to two-column layout on desktop: text/CTAs left, exam coverage panel right. Panel shows 8 colour-coded exam badges (AMC, Olympiad, ACER, ICAS, ATAR, NAPLAN, Bebras, KSF) with name, full title, year range, and coloured accent bar. Includes legal disclaimer: "SelectEd is an independent preparation platform. Not affiliated with, endorsed by, or connected to the organisations that administer these assessments." (2) Testimonials section added (after Founder card): 3 hardcoded seed cards + fetched approved DB testimonials; "Share your experience →" opens inline form (name, location, star rating, quote); </w:t>
             </w:r>
             <w:r>
@@ -28462,7 +28539,7 @@
           <w:i/>
           <w:color w:val="1E293B"/>
         </w:rPr>
-        <w:t>Document last updated: 1 July 2026 (v0.26). Updated alongside the codebase whenever routes, components, or UX decisions change.</w:t>
+        <w:t>Document last updated: 1 July 2026 (v0.27). Updated alongside the codebase whenever routes, components, or UX decisions change.</w:t>
       </w:r>
     </w:p>
     <w:p>

</xml_diff>

<commit_message>
feat: landing page visual overhaul, Adventure Mode game-feel, CAPTCHA, matplotlib diagrams
Co-Authored-By: Claude Sonnet 4.6 <noreply@anthropic.com>
</commit_message>
<xml_diff>
--- a/DESIGN.docx
+++ b/DESIGN.docx
@@ -27777,7 +27777,7 @@
                 <w:b/>
                 <w:color w:val="1E293B"/>
               </w:rPr>
-              <w:t>v0.27.0</w:t>
+              <w:t>v0.28.0</w:t>
             </w:r>
           </w:p>
         </w:tc>
@@ -27827,7 +27827,283 @@
                 <w:color w:val="1E293B"/>
                 <w:sz w:val="18"/>
               </w:rPr>
-              <w:t>Landing page copy fixes — FAQ "Do I need an account?" updated to mention 20-question/day guest limit and midnight reset; correctly states Exam Mode and Adventure Mode require an account. Trust badge "Free to use / no premium tier" corrected to "Free to start / 7-day trial then $9.99/month AUD". Guest badge updated to "20 free questions a day"</w:t>
+              <w:t xml:space="preserve">Landing page visual overhaul + Adventure Mode game-feel + CAPTCHA + professional diagrams — (1) </w:t>
+            </w:r>
+            <w:r>
+              <w:rPr>
+                <w:b/>
+                <w:color w:val="1E293B"/>
+              </w:rPr>
+              <w:t>Sign-in button</w:t>
+            </w:r>
+            <w:r>
+              <w:rPr>
+                <w:color w:val="1E293B"/>
+                <w:sz w:val="18"/>
+              </w:rPr>
+              <w:t xml:space="preserve"> made prominent: navy-bordered outlined button with </w:t>
+            </w:r>
+            <w:r>
+              <w:rPr>
+                <w:rFonts w:ascii="Courier New" w:hAnsi="Courier New"/>
+                <w:color w:val="0F172A"/>
+                <w:sz w:val="18"/>
+              </w:rPr>
+              <w:t>Sign in →</w:t>
+            </w:r>
+            <w:r>
+              <w:rPr>
+                <w:color w:val="1E293B"/>
+                <w:sz w:val="18"/>
+              </w:rPr>
+              <w:t xml:space="preserve"> text. (2) </w:t>
+            </w:r>
+            <w:r>
+              <w:rPr>
+                <w:b/>
+                <w:color w:val="1E293B"/>
+              </w:rPr>
+              <w:t>"Our story"</w:t>
+            </w:r>
+            <w:r>
+              <w:rPr>
+                <w:color w:val="1E293B"/>
+                <w:sz w:val="18"/>
+              </w:rPr>
+              <w:t xml:space="preserve"> nav link coloured blue with arrow; </w:t>
+            </w:r>
+            <w:r>
+              <w:rPr>
+                <w:b/>
+                <w:color w:val="1E293B"/>
+              </w:rPr>
+              <w:t>Pricing</w:t>
+            </w:r>
+            <w:r>
+              <w:rPr>
+                <w:color w:val="1E293B"/>
+                <w:sz w:val="18"/>
+              </w:rPr>
+              <w:t xml:space="preserve"> becomes a gold pill button. (3) </w:t>
+            </w:r>
+            <w:r>
+              <w:rPr>
+                <w:b/>
+                <w:color w:val="1E293B"/>
+              </w:rPr>
+              <w:t>Rolling banner</w:t>
+            </w:r>
+            <w:r>
+              <w:rPr>
+                <w:color w:val="1E293B"/>
+                <w:sz w:val="18"/>
+              </w:rPr>
+              <w:t xml:space="preserve"> (navy ticker) below stats strip: auto-scrolling marquee of testimonial snippets, exam names, and feature highlights using CSS </w:t>
+            </w:r>
+            <w:r>
+              <w:rPr>
+                <w:rFonts w:ascii="Courier New" w:hAnsi="Courier New"/>
+                <w:color w:val="0F172A"/>
+                <w:sz w:val="18"/>
+              </w:rPr>
+              <w:t>marquee-scroll</w:t>
+            </w:r>
+            <w:r>
+              <w:rPr>
+                <w:color w:val="1E293B"/>
+                <w:sz w:val="18"/>
+              </w:rPr>
+              <w:t xml:space="preserve"> keyframe. (4) </w:t>
+            </w:r>
+            <w:r>
+              <w:rPr>
+                <w:b/>
+                <w:color w:val="1E293B"/>
+              </w:rPr>
+              <w:t>Animated motion background</w:t>
+            </w:r>
+            <w:r>
+              <w:rPr>
+                <w:color w:val="1E293B"/>
+                <w:sz w:val="18"/>
+              </w:rPr>
+              <w:t xml:space="preserve"> on hero: 16 floating maths symbols (π, ∑, √, ∫, Δ, etc.) drift upward with staggered fade using </w:t>
+            </w:r>
+            <w:r>
+              <w:rPr>
+                <w:rFonts w:ascii="Courier New" w:hAnsi="Courier New"/>
+                <w:color w:val="0F172A"/>
+                <w:sz w:val="18"/>
+              </w:rPr>
+              <w:t>float-symbol</w:t>
+            </w:r>
+            <w:r>
+              <w:rPr>
+                <w:color w:val="1E293B"/>
+                <w:sz w:val="18"/>
+              </w:rPr>
+              <w:t xml:space="preserve"> keyframe; three gradient orbs pulse with </w:t>
+            </w:r>
+            <w:r>
+              <w:rPr>
+                <w:rFonts w:ascii="Courier New" w:hAnsi="Courier New"/>
+                <w:color w:val="0F172A"/>
+                <w:sz w:val="18"/>
+              </w:rPr>
+              <w:t>pulse-orb</w:t>
+            </w:r>
+            <w:r>
+              <w:rPr>
+                <w:color w:val="1E293B"/>
+                <w:sz w:val="18"/>
+              </w:rPr>
+              <w:t xml:space="preserve"> animation. (5) </w:t>
+            </w:r>
+            <w:r>
+              <w:rPr>
+                <w:b/>
+                <w:color w:val="1E293B"/>
+              </w:rPr>
+              <w:t>Visual exam badges</w:t>
+            </w:r>
+            <w:r>
+              <w:rPr>
+                <w:color w:val="1E293B"/>
+                <w:sz w:val="18"/>
+              </w:rPr>
+              <w:t xml:space="preserve">: hero right panel and Exams section now display circular coloured badges with abbreviation text and emoji icon per exam instead of plain text with left-bar accent. (6) </w:t>
+            </w:r>
+            <w:r>
+              <w:rPr>
+                <w:b/>
+                <w:color w:val="1E293B"/>
+              </w:rPr>
+              <w:t>Human verification CAPTCHA</w:t>
+            </w:r>
+            <w:r>
+              <w:rPr>
+                <w:color w:val="1E293B"/>
+                <w:sz w:val="18"/>
+              </w:rPr>
+              <w:t xml:space="preserve"> on testimonial form: math challenge (</w:t>
+            </w:r>
+            <w:r>
+              <w:rPr>
+                <w:rFonts w:ascii="Courier New" w:hAnsi="Courier New"/>
+                <w:color w:val="0F172A"/>
+                <w:sz w:val="18"/>
+              </w:rPr>
+              <w:t>What is A + B?</w:t>
+            </w:r>
+            <w:r>
+              <w:rPr>
+                <w:color w:val="1E293B"/>
+                <w:sz w:val="18"/>
+              </w:rPr>
+              <w:t xml:space="preserve">) + invisible honeypot field. Bot submissions rejected client-side before API call. (7) </w:t>
+            </w:r>
+            <w:r>
+              <w:rPr>
+                <w:b/>
+                <w:color w:val="1E293B"/>
+              </w:rPr>
+              <w:t>Adventure Mode overhaul</w:t>
+            </w:r>
+            <w:r>
+              <w:rPr>
+                <w:color w:val="1E293B"/>
+                <w:sz w:val="18"/>
+              </w:rPr>
+              <w:t xml:space="preserve">: rank system (Novice → Explorer → Scholar → Expert → Champion → Legend) with animated rank-glow border and XP progress bar to next rank; combo multiplier system (×2 at 3-streak, ×3 at 5-streak) with </w:t>
+            </w:r>
+            <w:r>
+              <w:rPr>
+                <w:rFonts w:ascii="Courier New" w:hAnsi="Courier New"/>
+                <w:color w:val="0F172A"/>
+                <w:sz w:val="18"/>
+              </w:rPr>
+              <w:t>combo-pop</w:t>
+            </w:r>
+            <w:r>
+              <w:rPr>
+                <w:color w:val="1E293B"/>
+                <w:sz w:val="18"/>
+              </w:rPr>
+              <w:t xml:space="preserve"> animation in HUD; block shake animation on wrong answer (</w:t>
+            </w:r>
+            <w:r>
+              <w:rPr>
+                <w:rFonts w:ascii="Courier New" w:hAnsi="Courier New"/>
+                <w:color w:val="0F172A"/>
+                <w:sz w:val="18"/>
+              </w:rPr>
+              <w:t>shake-x</w:t>
+            </w:r>
+            <w:r>
+              <w:rPr>
+                <w:color w:val="1E293B"/>
+                <w:sz w:val="18"/>
+              </w:rPr>
+              <w:t>); block bounce on correct answer (</w:t>
+            </w:r>
+            <w:r>
+              <w:rPr>
+                <w:rFonts w:ascii="Courier New" w:hAnsi="Courier New"/>
+                <w:color w:val="0F172A"/>
+                <w:sz w:val="18"/>
+              </w:rPr>
+              <w:t>correct-bounce</w:t>
+            </w:r>
+            <w:r>
+              <w:rPr>
+                <w:color w:val="1E293B"/>
+                <w:sz w:val="18"/>
+              </w:rPr>
+              <w:t xml:space="preserve">); spinning loader while fetching questions; chapter numbers in world map; best-combo display on stage-complete and game-over screens; animated sequential star reveal on stage-complete; animated skull bounce on game-over with red-pulse background flash. (8) </w:t>
+            </w:r>
+            <w:r>
+              <w:rPr>
+                <w:b/>
+                <w:color w:val="1E293B"/>
+              </w:rPr>
+              <w:t>DESIGN.docx</w:t>
+            </w:r>
+            <w:r>
+              <w:rPr>
+                <w:color w:val="1E293B"/>
+                <w:sz w:val="18"/>
+              </w:rPr>
+              <w:t xml:space="preserve"> now includes a visual appendix of three matplotlib-generated diagrams: system architecture (component boxes with arrows), user journey funnel, and learning modes overview — auto-generated by </w:t>
+            </w:r>
+            <w:r>
+              <w:rPr>
+                <w:rFonts w:ascii="Courier New" w:hAnsi="Courier New"/>
+                <w:color w:val="0F172A"/>
+                <w:sz w:val="18"/>
+              </w:rPr>
+              <w:t>scripts/generate_design_doc.py</w:t>
+            </w:r>
+            <w:r>
+              <w:rPr>
+                <w:color w:val="1E293B"/>
+                <w:sz w:val="18"/>
+              </w:rPr>
+              <w:t xml:space="preserve"> when </w:t>
+            </w:r>
+            <w:r>
+              <w:rPr>
+                <w:rFonts w:ascii="Courier New" w:hAnsi="Courier New"/>
+                <w:color w:val="0F172A"/>
+                <w:sz w:val="18"/>
+              </w:rPr>
+              <w:t>matplotlib</w:t>
+            </w:r>
+            <w:r>
+              <w:rPr>
+                <w:color w:val="1E293B"/>
+                <w:sz w:val="18"/>
+              </w:rPr>
+              <w:t xml:space="preserve"> is installed</w:t>
             </w:r>
           </w:p>
         </w:tc>
@@ -27854,7 +28130,7 @@
                 <w:b/>
                 <w:color w:val="1E293B"/>
               </w:rPr>
-              <w:t>v0.26.0</w:t>
+              <w:t>v0.27.0</w:t>
             </w:r>
           </w:p>
         </w:tc>
@@ -27904,112 +28180,7 @@
                 <w:color w:val="1E293B"/>
                 <w:sz w:val="18"/>
               </w:rPr>
-              <w:t xml:space="preserve">DoS protection — three-layer defence: (1) Upstash Redis distributed rate limiting replaces the defunct in-memory </w:t>
-            </w:r>
-            <w:r>
-              <w:rPr>
-                <w:rFonts w:ascii="Courier New" w:hAnsi="Courier New"/>
-                <w:color w:val="0F172A"/>
-                <w:sz w:val="18"/>
-              </w:rPr>
-              <w:t>Map</w:t>
-            </w:r>
-            <w:r>
-              <w:rPr>
-                <w:color w:val="1E293B"/>
-                <w:sz w:val="18"/>
-              </w:rPr>
-              <w:t xml:space="preserve"> in </w:t>
-            </w:r>
-            <w:r>
-              <w:rPr>
-                <w:rFonts w:ascii="Courier New" w:hAnsi="Courier New"/>
-                <w:color w:val="0F172A"/>
-                <w:sz w:val="18"/>
-              </w:rPr>
-              <w:t>lib/ratelimit.ts</w:t>
-            </w:r>
-            <w:r>
-              <w:rPr>
-                <w:color w:val="1E293B"/>
-                <w:sz w:val="18"/>
-              </w:rPr>
-              <w:t xml:space="preserve"> — sliding window, graceful in-memory fallback when env vars absent, unique Redis prefix per endpoint. </w:t>
-            </w:r>
-            <w:r>
-              <w:rPr>
-                <w:rFonts w:ascii="Courier New" w:hAnsi="Courier New"/>
-                <w:color w:val="0F172A"/>
-                <w:sz w:val="18"/>
-              </w:rPr>
-              <w:t>middleware.ts</w:t>
-            </w:r>
-            <w:r>
-              <w:rPr>
-                <w:color w:val="1E293B"/>
-                <w:sz w:val="18"/>
-              </w:rPr>
-              <w:t xml:space="preserve"> deprecated → renamed to </w:t>
-            </w:r>
-            <w:r>
-              <w:rPr>
-                <w:rFonts w:ascii="Courier New" w:hAnsi="Courier New"/>
-                <w:color w:val="0F172A"/>
-                <w:sz w:val="18"/>
-              </w:rPr>
-              <w:t>proxy.ts</w:t>
-            </w:r>
-            <w:r>
-              <w:rPr>
-                <w:color w:val="1E293B"/>
-                <w:sz w:val="18"/>
-              </w:rPr>
-              <w:t xml:space="preserve"> per Next.js 16 proxy convention; proxy runs a blanket 120-req/60s-per-IP gate on all </w:t>
-            </w:r>
-            <w:r>
-              <w:rPr>
-                <w:rFonts w:ascii="Courier New" w:hAnsi="Courier New"/>
-                <w:color w:val="0F172A"/>
-                <w:sz w:val="18"/>
-              </w:rPr>
-              <w:t>/api/*</w:t>
-            </w:r>
-            <w:r>
-              <w:rPr>
-                <w:color w:val="1E293B"/>
-                <w:sz w:val="18"/>
-              </w:rPr>
-              <w:t xml:space="preserve"> routes before any serverless function is invoked. (2) Per-endpoint fine-grained limits: </w:t>
-            </w:r>
-            <w:r>
-              <w:rPr>
-                <w:rFonts w:ascii="Courier New" w:hAnsi="Courier New"/>
-                <w:color w:val="0F172A"/>
-                <w:sz w:val="18"/>
-              </w:rPr>
-              <w:t>/api/chat</w:t>
-            </w:r>
-            <w:r>
-              <w:rPr>
-                <w:color w:val="1E293B"/>
-                <w:sz w:val="18"/>
-              </w:rPr>
-              <w:t xml:space="preserve"> 30/60s, </w:t>
-            </w:r>
-            <w:r>
-              <w:rPr>
-                <w:rFonts w:ascii="Courier New" w:hAnsi="Courier New"/>
-                <w:color w:val="0F172A"/>
-                <w:sz w:val="18"/>
-              </w:rPr>
-              <w:t>/api/trivia</w:t>
-            </w:r>
-            <w:r>
-              <w:rPr>
-                <w:color w:val="1E293B"/>
-                <w:sz w:val="18"/>
-              </w:rPr>
-              <w:t xml:space="preserve"> 10/60s, `/api/exam/generate</w:t>
+              <w:t>Landing page copy fixes — FAQ "Do I need an account?" updated to mention 20-question/day guest limit and midnight reset; correctly states Exam Mode and Adventure Mode require an account. Trust badge "Free to use / no premium tier" corrected to "Free to start / 7-day trial then $9.99/month AUD". Guest badge updated to "20 free questions a day"</w:t>
             </w:r>
           </w:p>
         </w:tc>
@@ -28036,7 +28207,7 @@
                 <w:b/>
                 <w:color w:val="1E293B"/>
               </w:rPr>
-              <w:t>v0.25.0</w:t>
+              <w:t>v0.26.0</w:t>
             </w:r>
           </w:p>
         </w:tc>
@@ -28086,7 +28257,7 @@
                 <w:color w:val="1E293B"/>
                 <w:sz w:val="18"/>
               </w:rPr>
-              <w:t xml:space="preserve">Automated security agent — (1) </w:t>
+              <w:t xml:space="preserve">DoS protection — three-layer defence: (1) Upstash Redis distributed rate limiting replaces the defunct in-memory </w:t>
             </w:r>
             <w:r>
               <w:rPr>
@@ -28094,14 +28265,14 @@
                 <w:color w:val="0F172A"/>
                 <w:sz w:val="18"/>
               </w:rPr>
-              <w:t>next.config.ts</w:t>
-            </w:r>
-            <w:r>
-              <w:rPr>
-                <w:color w:val="1E293B"/>
-                <w:sz w:val="18"/>
-              </w:rPr>
-              <w:t xml:space="preserve"> now sets 7 HTTP security headers on every route: </w:t>
+              <w:t>Map</w:t>
+            </w:r>
+            <w:r>
+              <w:rPr>
+                <w:color w:val="1E293B"/>
+                <w:sz w:val="18"/>
+              </w:rPr>
+              <w:t xml:space="preserve"> in </w:t>
             </w:r>
             <w:r>
               <w:rPr>
@@ -28109,14 +28280,14 @@
                 <w:color w:val="0F172A"/>
                 <w:sz w:val="18"/>
               </w:rPr>
-              <w:t>X-Frame-Options: SAMEORIGIN</w:t>
-            </w:r>
-            <w:r>
-              <w:rPr>
-                <w:color w:val="1E293B"/>
-                <w:sz w:val="18"/>
-              </w:rPr>
-              <w:t xml:space="preserve">, </w:t>
+              <w:t>lib/ratelimit.ts</w:t>
+            </w:r>
+            <w:r>
+              <w:rPr>
+                <w:color w:val="1E293B"/>
+                <w:sz w:val="18"/>
+              </w:rPr>
+              <w:t xml:space="preserve"> — sliding window, graceful in-memory fallback when env vars absent, unique Redis prefix per endpoint. </w:t>
             </w:r>
             <w:r>
               <w:rPr>
@@ -28124,14 +28295,14 @@
                 <w:color w:val="0F172A"/>
                 <w:sz w:val="18"/>
               </w:rPr>
-              <w:t>X-Content-Type-Options: nosniff</w:t>
-            </w:r>
-            <w:r>
-              <w:rPr>
-                <w:color w:val="1E293B"/>
-                <w:sz w:val="18"/>
-              </w:rPr>
-              <w:t xml:space="preserve">, </w:t>
+              <w:t>middleware.ts</w:t>
+            </w:r>
+            <w:r>
+              <w:rPr>
+                <w:color w:val="1E293B"/>
+                <w:sz w:val="18"/>
+              </w:rPr>
+              <w:t xml:space="preserve"> deprecated → renamed to </w:t>
             </w:r>
             <w:r>
               <w:rPr>
@@ -28139,14 +28310,14 @@
                 <w:color w:val="0F172A"/>
                 <w:sz w:val="18"/>
               </w:rPr>
-              <w:t>Referrer-Policy: strict-origin-when-cross-origin</w:t>
-            </w:r>
-            <w:r>
-              <w:rPr>
-                <w:color w:val="1E293B"/>
-                <w:sz w:val="18"/>
-              </w:rPr>
-              <w:t xml:space="preserve">, </w:t>
+              <w:t>proxy.ts</w:t>
+            </w:r>
+            <w:r>
+              <w:rPr>
+                <w:color w:val="1E293B"/>
+                <w:sz w:val="18"/>
+              </w:rPr>
+              <w:t xml:space="preserve"> per Next.js 16 proxy convention; proxy runs a blanket 120-req/60s-per-IP gate on all </w:t>
             </w:r>
             <w:r>
               <w:rPr>
@@ -28154,14 +28325,14 @@
                 <w:color w:val="0F172A"/>
                 <w:sz w:val="18"/>
               </w:rPr>
-              <w:t>Permissions-Policy</w:t>
-            </w:r>
-            <w:r>
-              <w:rPr>
-                <w:color w:val="1E293B"/>
-                <w:sz w:val="18"/>
-              </w:rPr>
-              <w:t xml:space="preserve"> (blocks camera/mic/geo/payment), </w:t>
+              <w:t>/api/*</w:t>
+            </w:r>
+            <w:r>
+              <w:rPr>
+                <w:color w:val="1E293B"/>
+                <w:sz w:val="18"/>
+              </w:rPr>
+              <w:t xml:space="preserve"> routes before any serverless function is invoked. (2) Per-endpoint fine-grained limits: </w:t>
             </w:r>
             <w:r>
               <w:rPr>
@@ -28169,14 +28340,14 @@
                 <w:color w:val="0F172A"/>
                 <w:sz w:val="18"/>
               </w:rPr>
-              <w:t>Strict-Transport-Security</w:t>
-            </w:r>
-            <w:r>
-              <w:rPr>
-                <w:color w:val="1E293B"/>
-                <w:sz w:val="18"/>
-              </w:rPr>
-              <w:t xml:space="preserve"> (2yr + preload), </w:t>
+              <w:t>/api/chat</w:t>
+            </w:r>
+            <w:r>
+              <w:rPr>
+                <w:color w:val="1E293B"/>
+                <w:sz w:val="18"/>
+              </w:rPr>
+              <w:t xml:space="preserve"> 30/60s, </w:t>
             </w:r>
             <w:r>
               <w:rPr>
@@ -28184,44 +28355,14 @@
                 <w:color w:val="0F172A"/>
                 <w:sz w:val="18"/>
               </w:rPr>
-              <w:t>X-DNS-Prefetch-Control</w:t>
-            </w:r>
-            <w:r>
-              <w:rPr>
-                <w:color w:val="1E293B"/>
-                <w:sz w:val="18"/>
-              </w:rPr>
-              <w:t xml:space="preserve">, and a full </w:t>
-            </w:r>
-            <w:r>
-              <w:rPr>
-                <w:rFonts w:ascii="Courier New" w:hAnsi="Courier New"/>
-                <w:color w:val="0F172A"/>
-                <w:sz w:val="18"/>
-              </w:rPr>
-              <w:t>Content-Security-Policy</w:t>
-            </w:r>
-            <w:r>
-              <w:rPr>
-                <w:color w:val="1E293B"/>
-                <w:sz w:val="18"/>
-              </w:rPr>
-              <w:t xml:space="preserve"> covering script/style/font/img/connect/frame origins for Clerk, Stripe, KaTeX, Google Fonts, and Vercel Analytics. (2) </w:t>
-            </w:r>
-            <w:r>
-              <w:rPr>
-                <w:rFonts w:ascii="Courier New" w:hAnsi="Courier New"/>
-                <w:color w:val="0F172A"/>
-                <w:sz w:val="18"/>
-              </w:rPr>
-              <w:t>scripts/pentest.mjs</w:t>
-            </w:r>
-            <w:r>
-              <w:rPr>
-                <w:color w:val="1E293B"/>
-                <w:sz w:val="18"/>
-              </w:rPr>
-              <w:t xml:space="preserve"> — runnable Node.js audit that checks headers, probes 7 API endpoints for unauthenticated access, runs npm audit, scans codebase for dangerous patterns (dangerouslySetInnerHTML, eval, hardcoded secrets, SQL injection, wildcard CORS, sensitive console.log, NEXT_PUBLIC_ secrets, missing auth on API routes), and checks TLS redirect; outputs structured JSON. (3) Weekly Claude Code agent scheduled trigger (every Monday 18:00 UTC) — runs the audit, auto-fixes CRITICAL/HIGH findings, rebuilds, deploys, re-audits to confirm, updates DESIGN.md, and emails the founder a markdown report</w:t>
+              <w:t>/api/trivia</w:t>
+            </w:r>
+            <w:r>
+              <w:rPr>
+                <w:color w:val="1E293B"/>
+                <w:sz w:val="18"/>
+              </w:rPr>
+              <w:t xml:space="preserve"> 10/60s, `/api/exam/generate</w:t>
             </w:r>
           </w:p>
         </w:tc>
@@ -28248,7 +28389,7 @@
                 <w:b/>
                 <w:color w:val="1E293B"/>
               </w:rPr>
-              <w:t>v0.24.0</w:t>
+              <w:t>v0.25.0</w:t>
             </w:r>
           </w:p>
         </w:tc>
@@ -28298,7 +28439,7 @@
                 <w:color w:val="1E293B"/>
                 <w:sz w:val="18"/>
               </w:rPr>
-              <w:t>Guest 20-questions/day limit — anonymous users (no Clerk session, no child session) are now gated at 20 questions per day via localStorage (</w:t>
+              <w:t xml:space="preserve">Automated security agent — (1) </w:t>
             </w:r>
             <w:r>
               <w:rPr>
@@ -28306,14 +28447,14 @@
                 <w:color w:val="0F172A"/>
                 <w:sz w:val="18"/>
               </w:rPr>
-              <w:t>selected_guest_usage: {count, date}</w:t>
-            </w:r>
-            <w:r>
-              <w:rPr>
-                <w:color w:val="1E293B"/>
-                <w:sz w:val="18"/>
-              </w:rPr>
-              <w:t xml:space="preserve">). On limit hit or locked-mode attempt, </w:t>
+              <w:t>next.config.ts</w:t>
+            </w:r>
+            <w:r>
+              <w:rPr>
+                <w:color w:val="1E293B"/>
+                <w:sz w:val="18"/>
+              </w:rPr>
+              <w:t xml:space="preserve"> now sets 7 HTTP security headers on every route: </w:t>
             </w:r>
             <w:r>
               <w:rPr>
@@ -28321,14 +28462,14 @@
                 <w:color w:val="0F172A"/>
                 <w:sz w:val="18"/>
               </w:rPr>
-              <w:t>GuestLimitModal</w:t>
-            </w:r>
-            <w:r>
-              <w:rPr>
-                <w:color w:val="1E293B"/>
-                <w:sz w:val="18"/>
-              </w:rPr>
-              <w:t xml:space="preserve"> opens: shows reset countdown to midnight, "Start free 7-day trial" (Clerk SignUpButton modal) and "I already have an account" (SignInButton modal). Header badge shows </w:t>
+              <w:t>X-Frame-Options: SAMEORIGIN</w:t>
+            </w:r>
+            <w:r>
+              <w:rPr>
+                <w:color w:val="1E293B"/>
+                <w:sz w:val="18"/>
+              </w:rPr>
+              <w:t xml:space="preserve">, </w:t>
             </w:r>
             <w:r>
               <w:rPr>
@@ -28336,14 +28477,14 @@
                 <w:color w:val="0F172A"/>
                 <w:sz w:val="18"/>
               </w:rPr>
-              <w:t>X/20 questions today</w:t>
-            </w:r>
-            <w:r>
-              <w:rPr>
-                <w:color w:val="1E293B"/>
-                <w:sz w:val="18"/>
-              </w:rPr>
-              <w:t xml:space="preserve"> for guests (turns red at limit). Signed-in parents and child sessions continue to use server-side tracking. </w:t>
+              <w:t>X-Content-Type-Options: nosniff</w:t>
+            </w:r>
+            <w:r>
+              <w:rPr>
+                <w:color w:val="1E293B"/>
+                <w:sz w:val="18"/>
+              </w:rPr>
+              <w:t xml:space="preserve">, </w:t>
             </w:r>
             <w:r>
               <w:rPr>
@@ -28351,14 +28492,89 @@
                 <w:color w:val="0F172A"/>
                 <w:sz w:val="18"/>
               </w:rPr>
-              <w:t>app/components/GuestLimitModal.tsx</w:t>
-            </w:r>
-            <w:r>
-              <w:rPr>
-                <w:color w:val="1E293B"/>
-                <w:sz w:val="18"/>
-              </w:rPr>
-              <w:t xml:space="preserve"> added</w:t>
+              <w:t>Referrer-Policy: strict-origin-when-cross-origin</w:t>
+            </w:r>
+            <w:r>
+              <w:rPr>
+                <w:color w:val="1E293B"/>
+                <w:sz w:val="18"/>
+              </w:rPr>
+              <w:t xml:space="preserve">, </w:t>
+            </w:r>
+            <w:r>
+              <w:rPr>
+                <w:rFonts w:ascii="Courier New" w:hAnsi="Courier New"/>
+                <w:color w:val="0F172A"/>
+                <w:sz w:val="18"/>
+              </w:rPr>
+              <w:t>Permissions-Policy</w:t>
+            </w:r>
+            <w:r>
+              <w:rPr>
+                <w:color w:val="1E293B"/>
+                <w:sz w:val="18"/>
+              </w:rPr>
+              <w:t xml:space="preserve"> (blocks camera/mic/geo/payment), </w:t>
+            </w:r>
+            <w:r>
+              <w:rPr>
+                <w:rFonts w:ascii="Courier New" w:hAnsi="Courier New"/>
+                <w:color w:val="0F172A"/>
+                <w:sz w:val="18"/>
+              </w:rPr>
+              <w:t>Strict-Transport-Security</w:t>
+            </w:r>
+            <w:r>
+              <w:rPr>
+                <w:color w:val="1E293B"/>
+                <w:sz w:val="18"/>
+              </w:rPr>
+              <w:t xml:space="preserve"> (2yr + preload), </w:t>
+            </w:r>
+            <w:r>
+              <w:rPr>
+                <w:rFonts w:ascii="Courier New" w:hAnsi="Courier New"/>
+                <w:color w:val="0F172A"/>
+                <w:sz w:val="18"/>
+              </w:rPr>
+              <w:t>X-DNS-Prefetch-Control</w:t>
+            </w:r>
+            <w:r>
+              <w:rPr>
+                <w:color w:val="1E293B"/>
+                <w:sz w:val="18"/>
+              </w:rPr>
+              <w:t xml:space="preserve">, and a full </w:t>
+            </w:r>
+            <w:r>
+              <w:rPr>
+                <w:rFonts w:ascii="Courier New" w:hAnsi="Courier New"/>
+                <w:color w:val="0F172A"/>
+                <w:sz w:val="18"/>
+              </w:rPr>
+              <w:t>Content-Security-Policy</w:t>
+            </w:r>
+            <w:r>
+              <w:rPr>
+                <w:color w:val="1E293B"/>
+                <w:sz w:val="18"/>
+              </w:rPr>
+              <w:t xml:space="preserve"> covering script/style/font/img/connect/frame origins for Clerk, Stripe, KaTeX, Google Fonts, and Vercel Analytics. (2) </w:t>
+            </w:r>
+            <w:r>
+              <w:rPr>
+                <w:rFonts w:ascii="Courier New" w:hAnsi="Courier New"/>
+                <w:color w:val="0F172A"/>
+                <w:sz w:val="18"/>
+              </w:rPr>
+              <w:t>scripts/pentest.mjs</w:t>
+            </w:r>
+            <w:r>
+              <w:rPr>
+                <w:color w:val="1E293B"/>
+                <w:sz w:val="18"/>
+              </w:rPr>
+              <w:t xml:space="preserve"> — runnable Node.js audit that checks headers, probes 7 API endpoints for unauthenticated access, runs npm audit, scans codebase for dangerous patterns (dangerouslySetInnerHTML, eval, hardcoded secrets, SQL injection, wildcard CORS, sensitive console.log, NEXT_PUBLIC_ secrets, missing auth on API routes), and checks TLS redirect; outputs structured JSON. (3) Weekly Claude Code agent scheduled trigger (every Monday 18:00 UTC) — runs the audit, auto-fixes CRITICAL/HIGH findings, rebuilds, deploys, re-audits to confirm, updates DESIGN.md, and emails the founder a markdown report</w:t>
             </w:r>
           </w:p>
         </w:tc>
@@ -28385,7 +28601,7 @@
                 <w:b/>
                 <w:color w:val="1E293B"/>
               </w:rPr>
-              <w:t>v0.23.0</w:t>
+              <w:t>v0.24.0</w:t>
             </w:r>
           </w:p>
         </w:tc>
@@ -28435,6 +28651,143 @@
                 <w:color w:val="1E293B"/>
                 <w:sz w:val="18"/>
               </w:rPr>
+              <w:t>Guest 20-questions/day limit — anonymous users (no Clerk session, no child session) are now gated at 20 questions per day via localStorage (</w:t>
+            </w:r>
+            <w:r>
+              <w:rPr>
+                <w:rFonts w:ascii="Courier New" w:hAnsi="Courier New"/>
+                <w:color w:val="0F172A"/>
+                <w:sz w:val="18"/>
+              </w:rPr>
+              <w:t>selected_guest_usage: {count, date}</w:t>
+            </w:r>
+            <w:r>
+              <w:rPr>
+                <w:color w:val="1E293B"/>
+                <w:sz w:val="18"/>
+              </w:rPr>
+              <w:t xml:space="preserve">). On limit hit or locked-mode attempt, </w:t>
+            </w:r>
+            <w:r>
+              <w:rPr>
+                <w:rFonts w:ascii="Courier New" w:hAnsi="Courier New"/>
+                <w:color w:val="0F172A"/>
+                <w:sz w:val="18"/>
+              </w:rPr>
+              <w:t>GuestLimitModal</w:t>
+            </w:r>
+            <w:r>
+              <w:rPr>
+                <w:color w:val="1E293B"/>
+                <w:sz w:val="18"/>
+              </w:rPr>
+              <w:t xml:space="preserve"> opens: shows reset countdown to midnight, "Start free 7-day trial" (Clerk SignUpButton modal) and "I already have an account" (SignInButton modal). Header badge shows </w:t>
+            </w:r>
+            <w:r>
+              <w:rPr>
+                <w:rFonts w:ascii="Courier New" w:hAnsi="Courier New"/>
+                <w:color w:val="0F172A"/>
+                <w:sz w:val="18"/>
+              </w:rPr>
+              <w:t>X/20 questions today</w:t>
+            </w:r>
+            <w:r>
+              <w:rPr>
+                <w:color w:val="1E293B"/>
+                <w:sz w:val="18"/>
+              </w:rPr>
+              <w:t xml:space="preserve"> for guests (turns red at limit). Signed-in parents and child sessions continue to use server-side tracking. </w:t>
+            </w:r>
+            <w:r>
+              <w:rPr>
+                <w:rFonts w:ascii="Courier New" w:hAnsi="Courier New"/>
+                <w:color w:val="0F172A"/>
+                <w:sz w:val="18"/>
+              </w:rPr>
+              <w:t>app/components/GuestLimitModal.tsx</w:t>
+            </w:r>
+            <w:r>
+              <w:rPr>
+                <w:color w:val="1E293B"/>
+                <w:sz w:val="18"/>
+              </w:rPr>
+              <w:t xml:space="preserve"> added</w:t>
+            </w:r>
+          </w:p>
+        </w:tc>
+      </w:tr>
+      <w:tr>
+        <w:tc>
+          <w:tcPr>
+            <w:tcW w:type="dxa" w:w="3024"/>
+            <w:shd w:val="clear" w:color="auto" w:fill="FFFFFF"/>
+            <w:tcBorders>
+              <w:top w:val="single" w:sz="4" w:space="0" w:color="E2E8F0"/>
+              <w:left w:val="single" w:sz="4" w:space="0" w:color="E2E8F0"/>
+              <w:bottom w:val="single" w:sz="4" w:space="0" w:color="E2E8F0"/>
+              <w:right w:val="single" w:sz="4" w:space="0" w:color="E2E8F0"/>
+            </w:tcBorders>
+          </w:tcPr>
+          <w:p>
+            <w:pPr>
+              <w:spacing w:before="30" w:after="30"/>
+            </w:pPr>
+            <w:r/>
+            <w:r>
+              <w:rPr>
+                <w:b/>
+                <w:color w:val="1E293B"/>
+              </w:rPr>
+              <w:t>v0.23.0</w:t>
+            </w:r>
+          </w:p>
+        </w:tc>
+        <w:tc>
+          <w:tcPr>
+            <w:tcW w:type="dxa" w:w="3024"/>
+            <w:shd w:val="clear" w:color="auto" w:fill="FFFFFF"/>
+            <w:tcBorders>
+              <w:top w:val="single" w:sz="4" w:space="0" w:color="E2E8F0"/>
+              <w:left w:val="single" w:sz="4" w:space="0" w:color="E2E8F0"/>
+              <w:bottom w:val="single" w:sz="4" w:space="0" w:color="E2E8F0"/>
+              <w:right w:val="single" w:sz="4" w:space="0" w:color="E2E8F0"/>
+            </w:tcBorders>
+          </w:tcPr>
+          <w:p>
+            <w:pPr>
+              <w:spacing w:before="30" w:after="30"/>
+            </w:pPr>
+            <w:r/>
+            <w:r>
+              <w:rPr>
+                <w:color w:val="1E293B"/>
+                <w:sz w:val="18"/>
+              </w:rPr>
+              <w:t>July 2026</w:t>
+            </w:r>
+          </w:p>
+        </w:tc>
+        <w:tc>
+          <w:tcPr>
+            <w:tcW w:type="dxa" w:w="3024"/>
+            <w:shd w:val="clear" w:color="auto" w:fill="FFFFFF"/>
+            <w:tcBorders>
+              <w:top w:val="single" w:sz="4" w:space="0" w:color="E2E8F0"/>
+              <w:left w:val="single" w:sz="4" w:space="0" w:color="E2E8F0"/>
+              <w:bottom w:val="single" w:sz="4" w:space="0" w:color="E2E8F0"/>
+              <w:right w:val="single" w:sz="4" w:space="0" w:color="E2E8F0"/>
+            </w:tcBorders>
+          </w:tcPr>
+          <w:p>
+            <w:pPr>
+              <w:spacing w:before="30" w:after="30"/>
+            </w:pPr>
+            <w:r/>
+            <w:r>
+              <w:rPr>
+                <w:color w:val="1E293B"/>
+                <w:sz w:val="18"/>
+              </w:rPr>
               <w:t xml:space="preserve">Landing page: exam coverage panel, testimonials section, FAQ accordion — (1) Hero redesigned to two-column layout on desktop: text/CTAs left, exam coverage panel right. Panel shows 8 colour-coded exam badges (AMC, Olympiad, ACER, ICAS, ATAR, NAPLAN, Bebras, KSF) with name, full title, year range, and coloured accent bar. Includes legal disclaimer: "SelectEd is an independent preparation platform. Not affiliated with, endorsed by, or connected to the organisations that administer these assessments." (2) Testimonials section added (after Founder card): 3 hardcoded seed cards + fetched approved DB testimonials; "Share your experience →" opens inline form (name, location, star rating, quote); </w:t>
             </w:r>
             <w:r>
@@ -28539,7 +28892,7 @@
           <w:i/>
           <w:color w:val="1E293B"/>
         </w:rPr>
-        <w:t>Document last updated: 1 July 2026 (v0.27). Updated alongside the codebase whenever routes, components, or UX decisions change.</w:t>
+        <w:t>Document last updated: 1 July 2026 (v0.28). Updated alongside the codebase whenever routes, components, or UX decisions change.</w:t>
       </w:r>
     </w:p>
     <w:p>
@@ -28552,6 +28905,208 @@
           <w:color w:val="1E293B"/>
         </w:rPr>
         <w:t>Author: Santrupta Mishra (San) — Founder, SelectEd</w:t>
+      </w:r>
+    </w:p>
+    <w:p>
+      <w:r>
+        <w:br w:type="page"/>
+      </w:r>
+    </w:p>
+    <w:p>
+      <w:pPr>
+        <w:pStyle w:val="Heading1"/>
+      </w:pPr>
+      <w:r>
+        <w:t>Visual Architecture Diagrams</w:t>
+      </w:r>
+    </w:p>
+    <w:p>
+      <w:pPr>
+        <w:pStyle w:val="Heading2"/>
+      </w:pPr>
+      <w:r>
+        <w:t>System Architecture</w:t>
+      </w:r>
+    </w:p>
+    <w:p>
+      <w:pPr>
+        <w:jc w:val="center"/>
+        <w:spacing w:before="60" w:after="20"/>
+      </w:pPr>
+      <w:r>
+        <w:drawing>
+          <wp:inline xmlns:a="http://schemas.openxmlformats.org/drawingml/2006/main" xmlns:pic="http://schemas.openxmlformats.org/drawingml/2006/picture">
+            <wp:extent cx="5486400" cy="2793830"/>
+            <wp:docPr id="2" name="Picture 2"/>
+            <wp:cNvGraphicFramePr>
+              <a:graphicFrameLocks noChangeAspect="1"/>
+            </wp:cNvGraphicFramePr>
+            <a:graphic>
+              <a:graphicData uri="http://schemas.openxmlformats.org/drawingml/2006/picture">
+                <pic:pic>
+                  <pic:nvPicPr>
+                    <pic:cNvPr id="0" name="image.png"/>
+                    <pic:cNvPicPr/>
+                  </pic:nvPicPr>
+                  <pic:blipFill>
+                    <a:blip r:embed="rId12"/>
+                    <a:stretch>
+                      <a:fillRect/>
+                    </a:stretch>
+                  </pic:blipFill>
+                  <pic:spPr>
+                    <a:xfrm>
+                      <a:off x="0" y="0"/>
+                      <a:ext cx="5486400" cy="2793830"/>
+                    </a:xfrm>
+                    <a:prstGeom prst="rect"/>
+                  </pic:spPr>
+                </pic:pic>
+              </a:graphicData>
+            </a:graphic>
+          </wp:inline>
+        </w:drawing>
+      </w:r>
+    </w:p>
+    <w:p>
+      <w:pPr>
+        <w:jc w:val="center"/>
+        <w:spacing w:before="0" w:after="80"/>
+      </w:pPr>
+      <w:r>
+        <w:rPr>
+          <w:rFonts w:ascii="Calibri" w:hAnsi="Calibri"/>
+          <w:i/>
+          <w:color w:val="475569"/>
+          <w:sz w:val="17"/>
+        </w:rPr>
+        <w:t>Figure 1 — SelectEd system architecture overview</w:t>
+      </w:r>
+    </w:p>
+    <w:p>
+      <w:pPr>
+        <w:pStyle w:val="Heading2"/>
+      </w:pPr>
+      <w:r>
+        <w:t>User Journey &amp; Conversion Funnel</w:t>
+      </w:r>
+    </w:p>
+    <w:p>
+      <w:pPr>
+        <w:jc w:val="center"/>
+        <w:spacing w:before="60" w:after="20"/>
+      </w:pPr>
+      <w:r>
+        <w:drawing>
+          <wp:inline xmlns:a="http://schemas.openxmlformats.org/drawingml/2006/main" xmlns:pic="http://schemas.openxmlformats.org/drawingml/2006/picture">
+            <wp:extent cx="5486400" cy="1946932"/>
+            <wp:docPr id="3" name="Picture 3"/>
+            <wp:cNvGraphicFramePr>
+              <a:graphicFrameLocks noChangeAspect="1"/>
+            </wp:cNvGraphicFramePr>
+            <a:graphic>
+              <a:graphicData uri="http://schemas.openxmlformats.org/drawingml/2006/picture">
+                <pic:pic>
+                  <pic:nvPicPr>
+                    <pic:cNvPr id="0" name="image.png"/>
+                    <pic:cNvPicPr/>
+                  </pic:nvPicPr>
+                  <pic:blipFill>
+                    <a:blip r:embed="rId13"/>
+                    <a:stretch>
+                      <a:fillRect/>
+                    </a:stretch>
+                  </pic:blipFill>
+                  <pic:spPr>
+                    <a:xfrm>
+                      <a:off x="0" y="0"/>
+                      <a:ext cx="5486400" cy="1946932"/>
+                    </a:xfrm>
+                    <a:prstGeom prst="rect"/>
+                  </pic:spPr>
+                </pic:pic>
+              </a:graphicData>
+            </a:graphic>
+          </wp:inline>
+        </w:drawing>
+      </w:r>
+    </w:p>
+    <w:p>
+      <w:pPr>
+        <w:jc w:val="center"/>
+        <w:spacing w:before="0" w:after="80"/>
+      </w:pPr>
+      <w:r>
+        <w:rPr>
+          <w:rFonts w:ascii="Calibri" w:hAnsi="Calibri"/>
+          <w:i/>
+          <w:color w:val="475569"/>
+          <w:sz w:val="17"/>
+        </w:rPr>
+        <w:t>Figure 2 — User journey from guest to premium family plan</w:t>
+      </w:r>
+    </w:p>
+    <w:p>
+      <w:pPr>
+        <w:pStyle w:val="Heading2"/>
+      </w:pPr>
+      <w:r>
+        <w:t>Four Learning Modes</w:t>
+      </w:r>
+    </w:p>
+    <w:p>
+      <w:pPr>
+        <w:jc w:val="center"/>
+        <w:spacing w:before="60" w:after="20"/>
+      </w:pPr>
+      <w:r>
+        <w:drawing>
+          <wp:inline xmlns:a="http://schemas.openxmlformats.org/drawingml/2006/main" xmlns:pic="http://schemas.openxmlformats.org/drawingml/2006/picture">
+            <wp:extent cx="5486400" cy="3472622"/>
+            <wp:docPr id="4" name="Picture 4"/>
+            <wp:cNvGraphicFramePr>
+              <a:graphicFrameLocks noChangeAspect="1"/>
+            </wp:cNvGraphicFramePr>
+            <a:graphic>
+              <a:graphicData uri="http://schemas.openxmlformats.org/drawingml/2006/picture">
+                <pic:pic>
+                  <pic:nvPicPr>
+                    <pic:cNvPr id="0" name="image.png"/>
+                    <pic:cNvPicPr/>
+                  </pic:nvPicPr>
+                  <pic:blipFill>
+                    <a:blip r:embed="rId14"/>
+                    <a:stretch>
+                      <a:fillRect/>
+                    </a:stretch>
+                  </pic:blipFill>
+                  <pic:spPr>
+                    <a:xfrm>
+                      <a:off x="0" y="0"/>
+                      <a:ext cx="5486400" cy="3472622"/>
+                    </a:xfrm>
+                    <a:prstGeom prst="rect"/>
+                  </pic:spPr>
+                </pic:pic>
+              </a:graphicData>
+            </a:graphic>
+          </wp:inline>
+        </w:drawing>
+      </w:r>
+    </w:p>
+    <w:p>
+      <w:pPr>
+        <w:jc w:val="center"/>
+        <w:spacing w:before="0" w:after="80"/>
+      </w:pPr>
+      <w:r>
+        <w:rPr>
+          <w:rFonts w:ascii="Calibri" w:hAnsi="Calibri"/>
+          <w:i/>
+          <w:color w:val="475569"/>
+          <w:sz w:val="17"/>
+        </w:rPr>
+        <w:t>Figure 3 — Overview of the four learning modes</w:t>
       </w:r>
     </w:p>
     <w:sectPr>

</xml_diff>

<commit_message>
feat: reduce guest limit to 10 q/day, add CAPTCHA gate to sign-up flow
- Guest daily limit: 20 -> 10 questions (GUEST_DAILY_LIMIT constant, FAQ, trust badge, rolling banner, parent dashboard label)
- CaptchaSignUpGate component: math challenge modal before openSignUp() fires, used in GuestLimitModal
- /sign-up page: shows CAPTCHA challenge before Clerk SignUp form renders
- DESIGN.md v0.29.0, DESIGN.docx regenerated

Co-Authored-By: Claude Sonnet 4.6 <noreply@anthropic.com>
</commit_message>
<xml_diff>
--- a/DESIGN.docx
+++ b/DESIGN.docx
@@ -27777,7 +27777,7 @@
                 <w:b/>
                 <w:color w:val="1E293B"/>
               </w:rPr>
-              <w:t>v0.28.0</w:t>
+              <w:t>v0.29.0</w:t>
             </w:r>
           </w:p>
         </w:tc>
@@ -27827,21 +27827,7 @@
                 <w:color w:val="1E293B"/>
                 <w:sz w:val="18"/>
               </w:rPr>
-              <w:t xml:space="preserve">Landing page visual overhaul + Adventure Mode game-feel + CAPTCHA + professional diagrams — (1) </w:t>
-            </w:r>
-            <w:r>
-              <w:rPr>
-                <w:b/>
-                <w:color w:val="1E293B"/>
-              </w:rPr>
-              <w:t>Sign-in button</w:t>
-            </w:r>
-            <w:r>
-              <w:rPr>
-                <w:color w:val="1E293B"/>
-                <w:sz w:val="18"/>
-              </w:rPr>
-              <w:t xml:space="preserve"> made prominent: navy-bordered outlined button with </w:t>
+              <w:t xml:space="preserve">Guest limit reduced 20 → 10 questions/day — updated in </w:t>
             </w:r>
             <w:r>
               <w:rPr>
@@ -27849,56 +27835,14 @@
                 <w:color w:val="0F172A"/>
                 <w:sz w:val="18"/>
               </w:rPr>
-              <w:t>Sign in →</w:t>
-            </w:r>
-            <w:r>
-              <w:rPr>
-                <w:color w:val="1E293B"/>
-                <w:sz w:val="18"/>
-              </w:rPr>
-              <w:t xml:space="preserve"> text. (2) </w:t>
-            </w:r>
-            <w:r>
-              <w:rPr>
-                <w:b/>
-                <w:color w:val="1E293B"/>
-              </w:rPr>
-              <w:t>"Our story"</w:t>
-            </w:r>
-            <w:r>
-              <w:rPr>
-                <w:color w:val="1E293B"/>
-                <w:sz w:val="18"/>
-              </w:rPr>
-              <w:t xml:space="preserve"> nav link coloured blue with arrow; </w:t>
-            </w:r>
-            <w:r>
-              <w:rPr>
-                <w:b/>
-                <w:color w:val="1E293B"/>
-              </w:rPr>
-              <w:t>Pricing</w:t>
-            </w:r>
-            <w:r>
-              <w:rPr>
-                <w:color w:val="1E293B"/>
-                <w:sz w:val="18"/>
-              </w:rPr>
-              <w:t xml:space="preserve"> becomes a gold pill button. (3) </w:t>
-            </w:r>
-            <w:r>
-              <w:rPr>
-                <w:b/>
-                <w:color w:val="1E293B"/>
-              </w:rPr>
-              <w:t>Rolling banner</w:t>
-            </w:r>
-            <w:r>
-              <w:rPr>
-                <w:color w:val="1E293B"/>
-                <w:sz w:val="18"/>
-              </w:rPr>
-              <w:t xml:space="preserve"> (navy ticker) below stats strip: auto-scrolling marquee of testimonial snippets, exam names, and feature highlights using CSS </w:t>
+              <w:t>GUEST_DAILY_LIMIT</w:t>
+            </w:r>
+            <w:r>
+              <w:rPr>
+                <w:color w:val="1E293B"/>
+                <w:sz w:val="18"/>
+              </w:rPr>
+              <w:t xml:space="preserve"> constant (</w:t>
             </w:r>
             <w:r>
               <w:rPr>
@@ -27906,28 +27850,14 @@
                 <w:color w:val="0F172A"/>
                 <w:sz w:val="18"/>
               </w:rPr>
-              <w:t>marquee-scroll</w:t>
-            </w:r>
-            <w:r>
-              <w:rPr>
-                <w:color w:val="1E293B"/>
-                <w:sz w:val="18"/>
-              </w:rPr>
-              <w:t xml:space="preserve"> keyframe. (4) </w:t>
-            </w:r>
-            <w:r>
-              <w:rPr>
-                <w:b/>
-                <w:color w:val="1E293B"/>
-              </w:rPr>
-              <w:t>Animated motion background</w:t>
-            </w:r>
-            <w:r>
-              <w:rPr>
-                <w:color w:val="1E293B"/>
-                <w:sz w:val="18"/>
-              </w:rPr>
-              <w:t xml:space="preserve"> on hero: 16 floating maths symbols (π, ∑, √, ∫, Δ, etc.) drift upward with staggered fade using </w:t>
+              <w:t>app/page.tsx</w:t>
+            </w:r>
+            <w:r>
+              <w:rPr>
+                <w:color w:val="1E293B"/>
+                <w:sz w:val="18"/>
+              </w:rPr>
+              <w:t xml:space="preserve">, </w:t>
             </w:r>
             <w:r>
               <w:rPr>
@@ -27935,14 +27865,14 @@
                 <w:color w:val="0F172A"/>
                 <w:sz w:val="18"/>
               </w:rPr>
-              <w:t>float-symbol</w:t>
-            </w:r>
-            <w:r>
-              <w:rPr>
-                <w:color w:val="1E293B"/>
-                <w:sz w:val="18"/>
-              </w:rPr>
-              <w:t xml:space="preserve"> keyframe; three gradient orbs pulse with </w:t>
+              <w:t>GuestLimitModal.tsx</w:t>
+            </w:r>
+            <w:r>
+              <w:rPr>
+                <w:color w:val="1E293B"/>
+                <w:sz w:val="18"/>
+              </w:rPr>
+              <w:t xml:space="preserve">), rolling banner copy, FAQ answer, trust badge, and parent dashboard label. CAPTCHA gate on sign-up — (1) </w:t>
             </w:r>
             <w:r>
               <w:rPr>
@@ -27950,42 +27880,14 @@
                 <w:color w:val="0F172A"/>
                 <w:sz w:val="18"/>
               </w:rPr>
-              <w:t>pulse-orb</w:t>
-            </w:r>
-            <w:r>
-              <w:rPr>
-                <w:color w:val="1E293B"/>
-                <w:sz w:val="18"/>
-              </w:rPr>
-              <w:t xml:space="preserve"> animation. (5) </w:t>
-            </w:r>
-            <w:r>
-              <w:rPr>
-                <w:b/>
-                <w:color w:val="1E293B"/>
-              </w:rPr>
-              <w:t>Visual exam badges</w:t>
-            </w:r>
-            <w:r>
-              <w:rPr>
-                <w:color w:val="1E293B"/>
-                <w:sz w:val="18"/>
-              </w:rPr>
-              <w:t xml:space="preserve">: hero right panel and Exams section now display circular coloured badges with abbreviation text and emoji icon per exam instead of plain text with left-bar accent. (6) </w:t>
-            </w:r>
-            <w:r>
-              <w:rPr>
-                <w:b/>
-                <w:color w:val="1E293B"/>
-              </w:rPr>
-              <w:t>Human verification CAPTCHA</w:t>
-            </w:r>
-            <w:r>
-              <w:rPr>
-                <w:color w:val="1E293B"/>
-                <w:sz w:val="18"/>
-              </w:rPr>
-              <w:t xml:space="preserve"> on testimonial form: math challenge (</w:t>
+              <w:t>/sign-up</w:t>
+            </w:r>
+            <w:r>
+              <w:rPr>
+                <w:color w:val="1E293B"/>
+                <w:sz w:val="18"/>
+              </w:rPr>
+              <w:t xml:space="preserve"> page now shows a math CAPTCHA challenge before the Clerk </w:t>
             </w:r>
             <w:r>
               <w:rPr>
@@ -27993,28 +27895,14 @@
                 <w:color w:val="0F172A"/>
                 <w:sz w:val="18"/>
               </w:rPr>
-              <w:t>What is A + B?</w:t>
-            </w:r>
-            <w:r>
-              <w:rPr>
-                <w:color w:val="1E293B"/>
-                <w:sz w:val="18"/>
-              </w:rPr>
-              <w:t xml:space="preserve">) + invisible honeypot field. Bot submissions rejected client-side before API call. (7) </w:t>
-            </w:r>
-            <w:r>
-              <w:rPr>
-                <w:b/>
-                <w:color w:val="1E293B"/>
-              </w:rPr>
-              <w:t>Adventure Mode overhaul</w:t>
-            </w:r>
-            <w:r>
-              <w:rPr>
-                <w:color w:val="1E293B"/>
-                <w:sz w:val="18"/>
-              </w:rPr>
-              <w:t xml:space="preserve">: rank system (Novice → Explorer → Scholar → Expert → Champion → Legend) with animated rank-glow border and XP progress bar to next rank; combo multiplier system (×2 at 3-streak, ×3 at 5-streak) with </w:t>
+              <w:t>&lt;SignUp /&gt;</w:t>
+            </w:r>
+            <w:r>
+              <w:rPr>
+                <w:color w:val="1E293B"/>
+                <w:sz w:val="18"/>
+              </w:rPr>
+              <w:t xml:space="preserve"> form renders (client component with </w:t>
             </w:r>
             <w:r>
               <w:rPr>
@@ -28022,14 +27910,14 @@
                 <w:color w:val="0F172A"/>
                 <w:sz w:val="18"/>
               </w:rPr>
-              <w:t>combo-pop</w:t>
-            </w:r>
-            <w:r>
-              <w:rPr>
-                <w:color w:val="1E293B"/>
-                <w:sz w:val="18"/>
-              </w:rPr>
-              <w:t xml:space="preserve"> animation in HUD; block shake animation on wrong answer (</w:t>
+              <w:t>useState</w:t>
+            </w:r>
+            <w:r>
+              <w:rPr>
+                <w:color w:val="1E293B"/>
+                <w:sz w:val="18"/>
+              </w:rPr>
+              <w:t xml:space="preserve"> gate). (2) New </w:t>
             </w:r>
             <w:r>
               <w:rPr>
@@ -28037,14 +27925,14 @@
                 <w:color w:val="0F172A"/>
                 <w:sz w:val="18"/>
               </w:rPr>
-              <w:t>shake-x</w:t>
-            </w:r>
-            <w:r>
-              <w:rPr>
-                <w:color w:val="1E293B"/>
-                <w:sz w:val="18"/>
-              </w:rPr>
-              <w:t>); block bounce on correct answer (</w:t>
+              <w:t>CaptchaSignUpGate</w:t>
+            </w:r>
+            <w:r>
+              <w:rPr>
+                <w:color w:val="1E293B"/>
+                <w:sz w:val="18"/>
+              </w:rPr>
+              <w:t xml:space="preserve"> component (</w:t>
             </w:r>
             <w:r>
               <w:rPr>
@@ -28052,28 +27940,14 @@
                 <w:color w:val="0F172A"/>
                 <w:sz w:val="18"/>
               </w:rPr>
-              <w:t>correct-bounce</w:t>
-            </w:r>
-            <w:r>
-              <w:rPr>
-                <w:color w:val="1E293B"/>
-                <w:sz w:val="18"/>
-              </w:rPr>
-              <w:t xml:space="preserve">); spinning loader while fetching questions; chapter numbers in world map; best-combo display on stage-complete and game-over screens; animated sequential star reveal on stage-complete; animated skull bounce on game-over with red-pulse background flash. (8) </w:t>
-            </w:r>
-            <w:r>
-              <w:rPr>
-                <w:b/>
-                <w:color w:val="1E293B"/>
-              </w:rPr>
-              <w:t>DESIGN.docx</w:t>
-            </w:r>
-            <w:r>
-              <w:rPr>
-                <w:color w:val="1E293B"/>
-                <w:sz w:val="18"/>
-              </w:rPr>
-              <w:t xml:space="preserve"> now includes a visual appendix of three matplotlib-generated diagrams: system architecture (component boxes with arrows), user journey funnel, and learning modes overview — auto-generated by </w:t>
+              <w:t>app/components/CaptchaSignUpGate.tsx</w:t>
+            </w:r>
+            <w:r>
+              <w:rPr>
+                <w:color w:val="1E293B"/>
+                <w:sz w:val="18"/>
+              </w:rPr>
+              <w:t xml:space="preserve">) wraps any button with a CAPTCHA modal; uses </w:t>
             </w:r>
             <w:r>
               <w:rPr>
@@ -28081,14 +27955,14 @@
                 <w:color w:val="0F172A"/>
                 <w:sz w:val="18"/>
               </w:rPr>
-              <w:t>scripts/generate_design_doc.py</w:t>
-            </w:r>
-            <w:r>
-              <w:rPr>
-                <w:color w:val="1E293B"/>
-                <w:sz w:val="18"/>
-              </w:rPr>
-              <w:t xml:space="preserve"> when </w:t>
+              <w:t>useClerk().openSignUp()</w:t>
+            </w:r>
+            <w:r>
+              <w:rPr>
+                <w:color w:val="1E293B"/>
+                <w:sz w:val="18"/>
+              </w:rPr>
+              <w:t xml:space="preserve"> to open Clerk's sign-up modal after successful verification. </w:t>
             </w:r>
             <w:r>
               <w:rPr>
@@ -28096,14 +27970,37 @@
                 <w:color w:val="0F172A"/>
                 <w:sz w:val="18"/>
               </w:rPr>
-              <w:t>matplotlib</w:t>
-            </w:r>
-            <w:r>
-              <w:rPr>
-                <w:color w:val="1E293B"/>
-                <w:sz w:val="18"/>
-              </w:rPr>
-              <w:t xml:space="preserve"> is installed</w:t>
+              <w:t>GuestLimitModal</w:t>
+            </w:r>
+            <w:r>
+              <w:rPr>
+                <w:color w:val="1E293B"/>
+                <w:sz w:val="18"/>
+              </w:rPr>
+              <w:t xml:space="preserve">'s "Start free 7-day trial →" button now uses </w:t>
+            </w:r>
+            <w:r>
+              <w:rPr>
+                <w:rFonts w:ascii="Courier New" w:hAnsi="Courier New"/>
+                <w:color w:val="0F172A"/>
+                <w:sz w:val="18"/>
+              </w:rPr>
+              <w:t>CaptchaSignUpGate</w:t>
+            </w:r>
+            <w:r>
+              <w:rPr>
+                <w:color w:val="1E293B"/>
+                <w:sz w:val="18"/>
+              </w:rPr>
+              <w:t xml:space="preserve"> instead of </w:t>
+            </w:r>
+            <w:r>
+              <w:rPr>
+                <w:rFonts w:ascii="Courier New" w:hAnsi="Courier New"/>
+                <w:color w:val="0F172A"/>
+                <w:sz w:val="18"/>
+              </w:rPr>
+              <w:t>&lt;SignUpButton&gt;</w:t>
             </w:r>
           </w:p>
         </w:tc>
@@ -28130,7 +28027,7 @@
                 <w:b/>
                 <w:color w:val="1E293B"/>
               </w:rPr>
-              <w:t>v0.27.0</w:t>
+              <w:t>v0.28.0</w:t>
             </w:r>
           </w:p>
         </w:tc>
@@ -28180,7 +28077,283 @@
                 <w:color w:val="1E293B"/>
                 <w:sz w:val="18"/>
               </w:rPr>
-              <w:t>Landing page copy fixes — FAQ "Do I need an account?" updated to mention 20-question/day guest limit and midnight reset; correctly states Exam Mode and Adventure Mode require an account. Trust badge "Free to use / no premium tier" corrected to "Free to start / 7-day trial then $9.99/month AUD". Guest badge updated to "20 free questions a day"</w:t>
+              <w:t xml:space="preserve">Landing page visual overhaul + Adventure Mode game-feel + CAPTCHA + professional diagrams — (1) </w:t>
+            </w:r>
+            <w:r>
+              <w:rPr>
+                <w:b/>
+                <w:color w:val="1E293B"/>
+              </w:rPr>
+              <w:t>Sign-in button</w:t>
+            </w:r>
+            <w:r>
+              <w:rPr>
+                <w:color w:val="1E293B"/>
+                <w:sz w:val="18"/>
+              </w:rPr>
+              <w:t xml:space="preserve"> made prominent: navy-bordered outlined button with </w:t>
+            </w:r>
+            <w:r>
+              <w:rPr>
+                <w:rFonts w:ascii="Courier New" w:hAnsi="Courier New"/>
+                <w:color w:val="0F172A"/>
+                <w:sz w:val="18"/>
+              </w:rPr>
+              <w:t>Sign in →</w:t>
+            </w:r>
+            <w:r>
+              <w:rPr>
+                <w:color w:val="1E293B"/>
+                <w:sz w:val="18"/>
+              </w:rPr>
+              <w:t xml:space="preserve"> text. (2) </w:t>
+            </w:r>
+            <w:r>
+              <w:rPr>
+                <w:b/>
+                <w:color w:val="1E293B"/>
+              </w:rPr>
+              <w:t>"Our story"</w:t>
+            </w:r>
+            <w:r>
+              <w:rPr>
+                <w:color w:val="1E293B"/>
+                <w:sz w:val="18"/>
+              </w:rPr>
+              <w:t xml:space="preserve"> nav link coloured blue with arrow; </w:t>
+            </w:r>
+            <w:r>
+              <w:rPr>
+                <w:b/>
+                <w:color w:val="1E293B"/>
+              </w:rPr>
+              <w:t>Pricing</w:t>
+            </w:r>
+            <w:r>
+              <w:rPr>
+                <w:color w:val="1E293B"/>
+                <w:sz w:val="18"/>
+              </w:rPr>
+              <w:t xml:space="preserve"> becomes a gold pill button. (3) </w:t>
+            </w:r>
+            <w:r>
+              <w:rPr>
+                <w:b/>
+                <w:color w:val="1E293B"/>
+              </w:rPr>
+              <w:t>Rolling banner</w:t>
+            </w:r>
+            <w:r>
+              <w:rPr>
+                <w:color w:val="1E293B"/>
+                <w:sz w:val="18"/>
+              </w:rPr>
+              <w:t xml:space="preserve"> (navy ticker) below stats strip: auto-scrolling marquee of testimonial snippets, exam names, and feature highlights using CSS </w:t>
+            </w:r>
+            <w:r>
+              <w:rPr>
+                <w:rFonts w:ascii="Courier New" w:hAnsi="Courier New"/>
+                <w:color w:val="0F172A"/>
+                <w:sz w:val="18"/>
+              </w:rPr>
+              <w:t>marquee-scroll</w:t>
+            </w:r>
+            <w:r>
+              <w:rPr>
+                <w:color w:val="1E293B"/>
+                <w:sz w:val="18"/>
+              </w:rPr>
+              <w:t xml:space="preserve"> keyframe. (4) </w:t>
+            </w:r>
+            <w:r>
+              <w:rPr>
+                <w:b/>
+                <w:color w:val="1E293B"/>
+              </w:rPr>
+              <w:t>Animated motion background</w:t>
+            </w:r>
+            <w:r>
+              <w:rPr>
+                <w:color w:val="1E293B"/>
+                <w:sz w:val="18"/>
+              </w:rPr>
+              <w:t xml:space="preserve"> on hero: 16 floating maths symbols (π, ∑, √, ∫, Δ, etc.) drift upward with staggered fade using </w:t>
+            </w:r>
+            <w:r>
+              <w:rPr>
+                <w:rFonts w:ascii="Courier New" w:hAnsi="Courier New"/>
+                <w:color w:val="0F172A"/>
+                <w:sz w:val="18"/>
+              </w:rPr>
+              <w:t>float-symbol</w:t>
+            </w:r>
+            <w:r>
+              <w:rPr>
+                <w:color w:val="1E293B"/>
+                <w:sz w:val="18"/>
+              </w:rPr>
+              <w:t xml:space="preserve"> keyframe; three gradient orbs pulse with </w:t>
+            </w:r>
+            <w:r>
+              <w:rPr>
+                <w:rFonts w:ascii="Courier New" w:hAnsi="Courier New"/>
+                <w:color w:val="0F172A"/>
+                <w:sz w:val="18"/>
+              </w:rPr>
+              <w:t>pulse-orb</w:t>
+            </w:r>
+            <w:r>
+              <w:rPr>
+                <w:color w:val="1E293B"/>
+                <w:sz w:val="18"/>
+              </w:rPr>
+              <w:t xml:space="preserve"> animation. (5) </w:t>
+            </w:r>
+            <w:r>
+              <w:rPr>
+                <w:b/>
+                <w:color w:val="1E293B"/>
+              </w:rPr>
+              <w:t>Visual exam badges</w:t>
+            </w:r>
+            <w:r>
+              <w:rPr>
+                <w:color w:val="1E293B"/>
+                <w:sz w:val="18"/>
+              </w:rPr>
+              <w:t xml:space="preserve">: hero right panel and Exams section now display circular coloured badges with abbreviation text and emoji icon per exam instead of plain text with left-bar accent. (6) </w:t>
+            </w:r>
+            <w:r>
+              <w:rPr>
+                <w:b/>
+                <w:color w:val="1E293B"/>
+              </w:rPr>
+              <w:t>Human verification CAPTCHA</w:t>
+            </w:r>
+            <w:r>
+              <w:rPr>
+                <w:color w:val="1E293B"/>
+                <w:sz w:val="18"/>
+              </w:rPr>
+              <w:t xml:space="preserve"> on testimonial form: math challenge (</w:t>
+            </w:r>
+            <w:r>
+              <w:rPr>
+                <w:rFonts w:ascii="Courier New" w:hAnsi="Courier New"/>
+                <w:color w:val="0F172A"/>
+                <w:sz w:val="18"/>
+              </w:rPr>
+              <w:t>What is A + B?</w:t>
+            </w:r>
+            <w:r>
+              <w:rPr>
+                <w:color w:val="1E293B"/>
+                <w:sz w:val="18"/>
+              </w:rPr>
+              <w:t xml:space="preserve">) + invisible honeypot field. Bot submissions rejected client-side before API call. (7) </w:t>
+            </w:r>
+            <w:r>
+              <w:rPr>
+                <w:b/>
+                <w:color w:val="1E293B"/>
+              </w:rPr>
+              <w:t>Adventure Mode overhaul</w:t>
+            </w:r>
+            <w:r>
+              <w:rPr>
+                <w:color w:val="1E293B"/>
+                <w:sz w:val="18"/>
+              </w:rPr>
+              <w:t xml:space="preserve">: rank system (Novice → Explorer → Scholar → Expert → Champion → Legend) with animated rank-glow border and XP progress bar to next rank; combo multiplier system (×2 at 3-streak, ×3 at 5-streak) with </w:t>
+            </w:r>
+            <w:r>
+              <w:rPr>
+                <w:rFonts w:ascii="Courier New" w:hAnsi="Courier New"/>
+                <w:color w:val="0F172A"/>
+                <w:sz w:val="18"/>
+              </w:rPr>
+              <w:t>combo-pop</w:t>
+            </w:r>
+            <w:r>
+              <w:rPr>
+                <w:color w:val="1E293B"/>
+                <w:sz w:val="18"/>
+              </w:rPr>
+              <w:t xml:space="preserve"> animation in HUD; block shake animation on wrong answer (</w:t>
+            </w:r>
+            <w:r>
+              <w:rPr>
+                <w:rFonts w:ascii="Courier New" w:hAnsi="Courier New"/>
+                <w:color w:val="0F172A"/>
+                <w:sz w:val="18"/>
+              </w:rPr>
+              <w:t>shake-x</w:t>
+            </w:r>
+            <w:r>
+              <w:rPr>
+                <w:color w:val="1E293B"/>
+                <w:sz w:val="18"/>
+              </w:rPr>
+              <w:t>); block bounce on correct answer (</w:t>
+            </w:r>
+            <w:r>
+              <w:rPr>
+                <w:rFonts w:ascii="Courier New" w:hAnsi="Courier New"/>
+                <w:color w:val="0F172A"/>
+                <w:sz w:val="18"/>
+              </w:rPr>
+              <w:t>correct-bounce</w:t>
+            </w:r>
+            <w:r>
+              <w:rPr>
+                <w:color w:val="1E293B"/>
+                <w:sz w:val="18"/>
+              </w:rPr>
+              <w:t xml:space="preserve">); spinning loader while fetching questions; chapter numbers in world map; best-combo display on stage-complete and game-over screens; animated sequential star reveal on stage-complete; animated skull bounce on game-over with red-pulse background flash. (8) </w:t>
+            </w:r>
+            <w:r>
+              <w:rPr>
+                <w:b/>
+                <w:color w:val="1E293B"/>
+              </w:rPr>
+              <w:t>DESIGN.docx</w:t>
+            </w:r>
+            <w:r>
+              <w:rPr>
+                <w:color w:val="1E293B"/>
+                <w:sz w:val="18"/>
+              </w:rPr>
+              <w:t xml:space="preserve"> now includes a visual appendix of three matplotlib-generated diagrams: system architecture (component boxes with arrows), user journey funnel, and learning modes overview — auto-generated by </w:t>
+            </w:r>
+            <w:r>
+              <w:rPr>
+                <w:rFonts w:ascii="Courier New" w:hAnsi="Courier New"/>
+                <w:color w:val="0F172A"/>
+                <w:sz w:val="18"/>
+              </w:rPr>
+              <w:t>scripts/generate_design_doc.py</w:t>
+            </w:r>
+            <w:r>
+              <w:rPr>
+                <w:color w:val="1E293B"/>
+                <w:sz w:val="18"/>
+              </w:rPr>
+              <w:t xml:space="preserve"> when </w:t>
+            </w:r>
+            <w:r>
+              <w:rPr>
+                <w:rFonts w:ascii="Courier New" w:hAnsi="Courier New"/>
+                <w:color w:val="0F172A"/>
+                <w:sz w:val="18"/>
+              </w:rPr>
+              <w:t>matplotlib</w:t>
+            </w:r>
+            <w:r>
+              <w:rPr>
+                <w:color w:val="1E293B"/>
+                <w:sz w:val="18"/>
+              </w:rPr>
+              <w:t xml:space="preserve"> is installed</w:t>
             </w:r>
           </w:p>
         </w:tc>
@@ -28207,7 +28380,7 @@
                 <w:b/>
                 <w:color w:val="1E293B"/>
               </w:rPr>
-              <w:t>v0.26.0</w:t>
+              <w:t>v0.27.0</w:t>
             </w:r>
           </w:p>
         </w:tc>
@@ -28257,112 +28430,7 @@
                 <w:color w:val="1E293B"/>
                 <w:sz w:val="18"/>
               </w:rPr>
-              <w:t xml:space="preserve">DoS protection — three-layer defence: (1) Upstash Redis distributed rate limiting replaces the defunct in-memory </w:t>
-            </w:r>
-            <w:r>
-              <w:rPr>
-                <w:rFonts w:ascii="Courier New" w:hAnsi="Courier New"/>
-                <w:color w:val="0F172A"/>
-                <w:sz w:val="18"/>
-              </w:rPr>
-              <w:t>Map</w:t>
-            </w:r>
-            <w:r>
-              <w:rPr>
-                <w:color w:val="1E293B"/>
-                <w:sz w:val="18"/>
-              </w:rPr>
-              <w:t xml:space="preserve"> in </w:t>
-            </w:r>
-            <w:r>
-              <w:rPr>
-                <w:rFonts w:ascii="Courier New" w:hAnsi="Courier New"/>
-                <w:color w:val="0F172A"/>
-                <w:sz w:val="18"/>
-              </w:rPr>
-              <w:t>lib/ratelimit.ts</w:t>
-            </w:r>
-            <w:r>
-              <w:rPr>
-                <w:color w:val="1E293B"/>
-                <w:sz w:val="18"/>
-              </w:rPr>
-              <w:t xml:space="preserve"> — sliding window, graceful in-memory fallback when env vars absent, unique Redis prefix per endpoint. </w:t>
-            </w:r>
-            <w:r>
-              <w:rPr>
-                <w:rFonts w:ascii="Courier New" w:hAnsi="Courier New"/>
-                <w:color w:val="0F172A"/>
-                <w:sz w:val="18"/>
-              </w:rPr>
-              <w:t>middleware.ts</w:t>
-            </w:r>
-            <w:r>
-              <w:rPr>
-                <w:color w:val="1E293B"/>
-                <w:sz w:val="18"/>
-              </w:rPr>
-              <w:t xml:space="preserve"> deprecated → renamed to </w:t>
-            </w:r>
-            <w:r>
-              <w:rPr>
-                <w:rFonts w:ascii="Courier New" w:hAnsi="Courier New"/>
-                <w:color w:val="0F172A"/>
-                <w:sz w:val="18"/>
-              </w:rPr>
-              <w:t>proxy.ts</w:t>
-            </w:r>
-            <w:r>
-              <w:rPr>
-                <w:color w:val="1E293B"/>
-                <w:sz w:val="18"/>
-              </w:rPr>
-              <w:t xml:space="preserve"> per Next.js 16 proxy convention; proxy runs a blanket 120-req/60s-per-IP gate on all </w:t>
-            </w:r>
-            <w:r>
-              <w:rPr>
-                <w:rFonts w:ascii="Courier New" w:hAnsi="Courier New"/>
-                <w:color w:val="0F172A"/>
-                <w:sz w:val="18"/>
-              </w:rPr>
-              <w:t>/api/*</w:t>
-            </w:r>
-            <w:r>
-              <w:rPr>
-                <w:color w:val="1E293B"/>
-                <w:sz w:val="18"/>
-              </w:rPr>
-              <w:t xml:space="preserve"> routes before any serverless function is invoked. (2) Per-endpoint fine-grained limits: </w:t>
-            </w:r>
-            <w:r>
-              <w:rPr>
-                <w:rFonts w:ascii="Courier New" w:hAnsi="Courier New"/>
-                <w:color w:val="0F172A"/>
-                <w:sz w:val="18"/>
-              </w:rPr>
-              <w:t>/api/chat</w:t>
-            </w:r>
-            <w:r>
-              <w:rPr>
-                <w:color w:val="1E293B"/>
-                <w:sz w:val="18"/>
-              </w:rPr>
-              <w:t xml:space="preserve"> 30/60s, </w:t>
-            </w:r>
-            <w:r>
-              <w:rPr>
-                <w:rFonts w:ascii="Courier New" w:hAnsi="Courier New"/>
-                <w:color w:val="0F172A"/>
-                <w:sz w:val="18"/>
-              </w:rPr>
-              <w:t>/api/trivia</w:t>
-            </w:r>
-            <w:r>
-              <w:rPr>
-                <w:color w:val="1E293B"/>
-                <w:sz w:val="18"/>
-              </w:rPr>
-              <w:t xml:space="preserve"> 10/60s, `/api/exam/generate</w:t>
+              <w:t>Landing page copy fixes — FAQ "Do I need an account?" updated to mention 20-question/day guest limit and midnight reset; correctly states Exam Mode and Adventure Mode require an account. Trust badge "Free to use / no premium tier" corrected to "Free to start / 7-day trial then $9.99/month AUD". Guest badge updated to "20 free questions a day"</w:t>
             </w:r>
           </w:p>
         </w:tc>
@@ -28389,7 +28457,7 @@
                 <w:b/>
                 <w:color w:val="1E293B"/>
               </w:rPr>
-              <w:t>v0.25.0</w:t>
+              <w:t>v0.26.0</w:t>
             </w:r>
           </w:p>
         </w:tc>
@@ -28439,7 +28507,7 @@
                 <w:color w:val="1E293B"/>
                 <w:sz w:val="18"/>
               </w:rPr>
-              <w:t xml:space="preserve">Automated security agent — (1) </w:t>
+              <w:t xml:space="preserve">DoS protection — three-layer defence: (1) Upstash Redis distributed rate limiting replaces the defunct in-memory </w:t>
             </w:r>
             <w:r>
               <w:rPr>
@@ -28447,14 +28515,14 @@
                 <w:color w:val="0F172A"/>
                 <w:sz w:val="18"/>
               </w:rPr>
-              <w:t>next.config.ts</w:t>
-            </w:r>
-            <w:r>
-              <w:rPr>
-                <w:color w:val="1E293B"/>
-                <w:sz w:val="18"/>
-              </w:rPr>
-              <w:t xml:space="preserve"> now sets 7 HTTP security headers on every route: </w:t>
+              <w:t>Map</w:t>
+            </w:r>
+            <w:r>
+              <w:rPr>
+                <w:color w:val="1E293B"/>
+                <w:sz w:val="18"/>
+              </w:rPr>
+              <w:t xml:space="preserve"> in </w:t>
             </w:r>
             <w:r>
               <w:rPr>
@@ -28462,14 +28530,14 @@
                 <w:color w:val="0F172A"/>
                 <w:sz w:val="18"/>
               </w:rPr>
-              <w:t>X-Frame-Options: SAMEORIGIN</w:t>
-            </w:r>
-            <w:r>
-              <w:rPr>
-                <w:color w:val="1E293B"/>
-                <w:sz w:val="18"/>
-              </w:rPr>
-              <w:t xml:space="preserve">, </w:t>
+              <w:t>lib/ratelimit.ts</w:t>
+            </w:r>
+            <w:r>
+              <w:rPr>
+                <w:color w:val="1E293B"/>
+                <w:sz w:val="18"/>
+              </w:rPr>
+              <w:t xml:space="preserve"> — sliding window, graceful in-memory fallback when env vars absent, unique Redis prefix per endpoint. </w:t>
             </w:r>
             <w:r>
               <w:rPr>
@@ -28477,14 +28545,14 @@
                 <w:color w:val="0F172A"/>
                 <w:sz w:val="18"/>
               </w:rPr>
-              <w:t>X-Content-Type-Options: nosniff</w:t>
-            </w:r>
-            <w:r>
-              <w:rPr>
-                <w:color w:val="1E293B"/>
-                <w:sz w:val="18"/>
-              </w:rPr>
-              <w:t xml:space="preserve">, </w:t>
+              <w:t>middleware.ts</w:t>
+            </w:r>
+            <w:r>
+              <w:rPr>
+                <w:color w:val="1E293B"/>
+                <w:sz w:val="18"/>
+              </w:rPr>
+              <w:t xml:space="preserve"> deprecated → renamed to </w:t>
             </w:r>
             <w:r>
               <w:rPr>
@@ -28492,14 +28560,14 @@
                 <w:color w:val="0F172A"/>
                 <w:sz w:val="18"/>
               </w:rPr>
-              <w:t>Referrer-Policy: strict-origin-when-cross-origin</w:t>
-            </w:r>
-            <w:r>
-              <w:rPr>
-                <w:color w:val="1E293B"/>
-                <w:sz w:val="18"/>
-              </w:rPr>
-              <w:t xml:space="preserve">, </w:t>
+              <w:t>proxy.ts</w:t>
+            </w:r>
+            <w:r>
+              <w:rPr>
+                <w:color w:val="1E293B"/>
+                <w:sz w:val="18"/>
+              </w:rPr>
+              <w:t xml:space="preserve"> per Next.js 16 proxy convention; proxy runs a blanket 120-req/60s-per-IP gate on all </w:t>
             </w:r>
             <w:r>
               <w:rPr>
@@ -28507,14 +28575,14 @@
                 <w:color w:val="0F172A"/>
                 <w:sz w:val="18"/>
               </w:rPr>
-              <w:t>Permissions-Policy</w:t>
-            </w:r>
-            <w:r>
-              <w:rPr>
-                <w:color w:val="1E293B"/>
-                <w:sz w:val="18"/>
-              </w:rPr>
-              <w:t xml:space="preserve"> (blocks camera/mic/geo/payment), </w:t>
+              <w:t>/api/*</w:t>
+            </w:r>
+            <w:r>
+              <w:rPr>
+                <w:color w:val="1E293B"/>
+                <w:sz w:val="18"/>
+              </w:rPr>
+              <w:t xml:space="preserve"> routes before any serverless function is invoked. (2) Per-endpoint fine-grained limits: </w:t>
             </w:r>
             <w:r>
               <w:rPr>
@@ -28522,14 +28590,14 @@
                 <w:color w:val="0F172A"/>
                 <w:sz w:val="18"/>
               </w:rPr>
-              <w:t>Strict-Transport-Security</w:t>
-            </w:r>
-            <w:r>
-              <w:rPr>
-                <w:color w:val="1E293B"/>
-                <w:sz w:val="18"/>
-              </w:rPr>
-              <w:t xml:space="preserve"> (2yr + preload), </w:t>
+              <w:t>/api/chat</w:t>
+            </w:r>
+            <w:r>
+              <w:rPr>
+                <w:color w:val="1E293B"/>
+                <w:sz w:val="18"/>
+              </w:rPr>
+              <w:t xml:space="preserve"> 30/60s, </w:t>
             </w:r>
             <w:r>
               <w:rPr>
@@ -28537,44 +28605,14 @@
                 <w:color w:val="0F172A"/>
                 <w:sz w:val="18"/>
               </w:rPr>
-              <w:t>X-DNS-Prefetch-Control</w:t>
-            </w:r>
-            <w:r>
-              <w:rPr>
-                <w:color w:val="1E293B"/>
-                <w:sz w:val="18"/>
-              </w:rPr>
-              <w:t xml:space="preserve">, and a full </w:t>
-            </w:r>
-            <w:r>
-              <w:rPr>
-                <w:rFonts w:ascii="Courier New" w:hAnsi="Courier New"/>
-                <w:color w:val="0F172A"/>
-                <w:sz w:val="18"/>
-              </w:rPr>
-              <w:t>Content-Security-Policy</w:t>
-            </w:r>
-            <w:r>
-              <w:rPr>
-                <w:color w:val="1E293B"/>
-                <w:sz w:val="18"/>
-              </w:rPr>
-              <w:t xml:space="preserve"> covering script/style/font/img/connect/frame origins for Clerk, Stripe, KaTeX, Google Fonts, and Vercel Analytics. (2) </w:t>
-            </w:r>
-            <w:r>
-              <w:rPr>
-                <w:rFonts w:ascii="Courier New" w:hAnsi="Courier New"/>
-                <w:color w:val="0F172A"/>
-                <w:sz w:val="18"/>
-              </w:rPr>
-              <w:t>scripts/pentest.mjs</w:t>
-            </w:r>
-            <w:r>
-              <w:rPr>
-                <w:color w:val="1E293B"/>
-                <w:sz w:val="18"/>
-              </w:rPr>
-              <w:t xml:space="preserve"> — runnable Node.js audit that checks headers, probes 7 API endpoints for unauthenticated access, runs npm audit, scans codebase for dangerous patterns (dangerouslySetInnerHTML, eval, hardcoded secrets, SQL injection, wildcard CORS, sensitive console.log, NEXT_PUBLIC_ secrets, missing auth on API routes), and checks TLS redirect; outputs structured JSON. (3) Weekly Claude Code agent scheduled trigger (every Monday 18:00 UTC) — runs the audit, auto-fixes CRITICAL/HIGH findings, rebuilds, deploys, re-audits to confirm, updates DESIGN.md, and emails the founder a markdown report</w:t>
+              <w:t>/api/trivia</w:t>
+            </w:r>
+            <w:r>
+              <w:rPr>
+                <w:color w:val="1E293B"/>
+                <w:sz w:val="18"/>
+              </w:rPr>
+              <w:t xml:space="preserve"> 10/60s, `/api/exam/generate</w:t>
             </w:r>
           </w:p>
         </w:tc>
@@ -28601,7 +28639,7 @@
                 <w:b/>
                 <w:color w:val="1E293B"/>
               </w:rPr>
-              <w:t>v0.24.0</w:t>
+              <w:t>v0.25.0</w:t>
             </w:r>
           </w:p>
         </w:tc>
@@ -28651,7 +28689,7 @@
                 <w:color w:val="1E293B"/>
                 <w:sz w:val="18"/>
               </w:rPr>
-              <w:t>Guest 20-questions/day limit — anonymous users (no Clerk session, no child session) are now gated at 20 questions per day via localStorage (</w:t>
+              <w:t xml:space="preserve">Automated security agent — (1) </w:t>
             </w:r>
             <w:r>
               <w:rPr>
@@ -28659,14 +28697,14 @@
                 <w:color w:val="0F172A"/>
                 <w:sz w:val="18"/>
               </w:rPr>
-              <w:t>selected_guest_usage: {count, date}</w:t>
-            </w:r>
-            <w:r>
-              <w:rPr>
-                <w:color w:val="1E293B"/>
-                <w:sz w:val="18"/>
-              </w:rPr>
-              <w:t xml:space="preserve">). On limit hit or locked-mode attempt, </w:t>
+              <w:t>next.config.ts</w:t>
+            </w:r>
+            <w:r>
+              <w:rPr>
+                <w:color w:val="1E293B"/>
+                <w:sz w:val="18"/>
+              </w:rPr>
+              <w:t xml:space="preserve"> now sets 7 HTTP security headers on every route: </w:t>
             </w:r>
             <w:r>
               <w:rPr>
@@ -28674,14 +28712,14 @@
                 <w:color w:val="0F172A"/>
                 <w:sz w:val="18"/>
               </w:rPr>
-              <w:t>GuestLimitModal</w:t>
-            </w:r>
-            <w:r>
-              <w:rPr>
-                <w:color w:val="1E293B"/>
-                <w:sz w:val="18"/>
-              </w:rPr>
-              <w:t xml:space="preserve"> opens: shows reset countdown to midnight, "Start free 7-day trial" (Clerk SignUpButton modal) and "I already have an account" (SignInButton modal). Header badge shows </w:t>
+              <w:t>X-Frame-Options: SAMEORIGIN</w:t>
+            </w:r>
+            <w:r>
+              <w:rPr>
+                <w:color w:val="1E293B"/>
+                <w:sz w:val="18"/>
+              </w:rPr>
+              <w:t xml:space="preserve">, </w:t>
             </w:r>
             <w:r>
               <w:rPr>
@@ -28689,14 +28727,14 @@
                 <w:color w:val="0F172A"/>
                 <w:sz w:val="18"/>
               </w:rPr>
-              <w:t>X/20 questions today</w:t>
-            </w:r>
-            <w:r>
-              <w:rPr>
-                <w:color w:val="1E293B"/>
-                <w:sz w:val="18"/>
-              </w:rPr>
-              <w:t xml:space="preserve"> for guests (turns red at limit). Signed-in parents and child sessions continue to use server-side tracking. </w:t>
+              <w:t>X-Content-Type-Options: nosniff</w:t>
+            </w:r>
+            <w:r>
+              <w:rPr>
+                <w:color w:val="1E293B"/>
+                <w:sz w:val="18"/>
+              </w:rPr>
+              <w:t xml:space="preserve">, </w:t>
             </w:r>
             <w:r>
               <w:rPr>
@@ -28704,14 +28742,89 @@
                 <w:color w:val="0F172A"/>
                 <w:sz w:val="18"/>
               </w:rPr>
-              <w:t>app/components/GuestLimitModal.tsx</w:t>
-            </w:r>
-            <w:r>
-              <w:rPr>
-                <w:color w:val="1E293B"/>
-                <w:sz w:val="18"/>
-              </w:rPr>
-              <w:t xml:space="preserve"> added</w:t>
+              <w:t>Referrer-Policy: strict-origin-when-cross-origin</w:t>
+            </w:r>
+            <w:r>
+              <w:rPr>
+                <w:color w:val="1E293B"/>
+                <w:sz w:val="18"/>
+              </w:rPr>
+              <w:t xml:space="preserve">, </w:t>
+            </w:r>
+            <w:r>
+              <w:rPr>
+                <w:rFonts w:ascii="Courier New" w:hAnsi="Courier New"/>
+                <w:color w:val="0F172A"/>
+                <w:sz w:val="18"/>
+              </w:rPr>
+              <w:t>Permissions-Policy</w:t>
+            </w:r>
+            <w:r>
+              <w:rPr>
+                <w:color w:val="1E293B"/>
+                <w:sz w:val="18"/>
+              </w:rPr>
+              <w:t xml:space="preserve"> (blocks camera/mic/geo/payment), </w:t>
+            </w:r>
+            <w:r>
+              <w:rPr>
+                <w:rFonts w:ascii="Courier New" w:hAnsi="Courier New"/>
+                <w:color w:val="0F172A"/>
+                <w:sz w:val="18"/>
+              </w:rPr>
+              <w:t>Strict-Transport-Security</w:t>
+            </w:r>
+            <w:r>
+              <w:rPr>
+                <w:color w:val="1E293B"/>
+                <w:sz w:val="18"/>
+              </w:rPr>
+              <w:t xml:space="preserve"> (2yr + preload), </w:t>
+            </w:r>
+            <w:r>
+              <w:rPr>
+                <w:rFonts w:ascii="Courier New" w:hAnsi="Courier New"/>
+                <w:color w:val="0F172A"/>
+                <w:sz w:val="18"/>
+              </w:rPr>
+              <w:t>X-DNS-Prefetch-Control</w:t>
+            </w:r>
+            <w:r>
+              <w:rPr>
+                <w:color w:val="1E293B"/>
+                <w:sz w:val="18"/>
+              </w:rPr>
+              <w:t xml:space="preserve">, and a full </w:t>
+            </w:r>
+            <w:r>
+              <w:rPr>
+                <w:rFonts w:ascii="Courier New" w:hAnsi="Courier New"/>
+                <w:color w:val="0F172A"/>
+                <w:sz w:val="18"/>
+              </w:rPr>
+              <w:t>Content-Security-Policy</w:t>
+            </w:r>
+            <w:r>
+              <w:rPr>
+                <w:color w:val="1E293B"/>
+                <w:sz w:val="18"/>
+              </w:rPr>
+              <w:t xml:space="preserve"> covering script/style/font/img/connect/frame origins for Clerk, Stripe, KaTeX, Google Fonts, and Vercel Analytics. (2) </w:t>
+            </w:r>
+            <w:r>
+              <w:rPr>
+                <w:rFonts w:ascii="Courier New" w:hAnsi="Courier New"/>
+                <w:color w:val="0F172A"/>
+                <w:sz w:val="18"/>
+              </w:rPr>
+              <w:t>scripts/pentest.mjs</w:t>
+            </w:r>
+            <w:r>
+              <w:rPr>
+                <w:color w:val="1E293B"/>
+                <w:sz w:val="18"/>
+              </w:rPr>
+              <w:t xml:space="preserve"> — runnable Node.js audit that checks headers, probes 7 API endpoints for unauthenticated access, runs npm audit, scans codebase for dangerous patterns (dangerouslySetInnerHTML, eval, hardcoded secrets, SQL injection, wildcard CORS, sensitive console.log, NEXT_PUBLIC_ secrets, missing auth on API routes), and checks TLS redirect; outputs structured JSON. (3) Weekly Claude Code agent scheduled trigger (every Monday 18:00 UTC) — runs the audit, auto-fixes CRITICAL/HIGH findings, rebuilds, deploys, re-audits to confirm, updates DESIGN.md, and emails the founder a markdown report</w:t>
             </w:r>
           </w:p>
         </w:tc>
@@ -28738,7 +28851,7 @@
                 <w:b/>
                 <w:color w:val="1E293B"/>
               </w:rPr>
-              <w:t>v0.23.0</w:t>
+              <w:t>v0.24.0</w:t>
             </w:r>
           </w:p>
         </w:tc>
@@ -28788,6 +28901,143 @@
                 <w:color w:val="1E293B"/>
                 <w:sz w:val="18"/>
               </w:rPr>
+              <w:t>Guest 20-questions/day limit — anonymous users (no Clerk session, no child session) are now gated at 20 questions per day via localStorage (</w:t>
+            </w:r>
+            <w:r>
+              <w:rPr>
+                <w:rFonts w:ascii="Courier New" w:hAnsi="Courier New"/>
+                <w:color w:val="0F172A"/>
+                <w:sz w:val="18"/>
+              </w:rPr>
+              <w:t>selected_guest_usage: {count, date}</w:t>
+            </w:r>
+            <w:r>
+              <w:rPr>
+                <w:color w:val="1E293B"/>
+                <w:sz w:val="18"/>
+              </w:rPr>
+              <w:t xml:space="preserve">). On limit hit or locked-mode attempt, </w:t>
+            </w:r>
+            <w:r>
+              <w:rPr>
+                <w:rFonts w:ascii="Courier New" w:hAnsi="Courier New"/>
+                <w:color w:val="0F172A"/>
+                <w:sz w:val="18"/>
+              </w:rPr>
+              <w:t>GuestLimitModal</w:t>
+            </w:r>
+            <w:r>
+              <w:rPr>
+                <w:color w:val="1E293B"/>
+                <w:sz w:val="18"/>
+              </w:rPr>
+              <w:t xml:space="preserve"> opens: shows reset countdown to midnight, "Start free 7-day trial" (Clerk SignUpButton modal) and "I already have an account" (SignInButton modal). Header badge shows </w:t>
+            </w:r>
+            <w:r>
+              <w:rPr>
+                <w:rFonts w:ascii="Courier New" w:hAnsi="Courier New"/>
+                <w:color w:val="0F172A"/>
+                <w:sz w:val="18"/>
+              </w:rPr>
+              <w:t>X/20 questions today</w:t>
+            </w:r>
+            <w:r>
+              <w:rPr>
+                <w:color w:val="1E293B"/>
+                <w:sz w:val="18"/>
+              </w:rPr>
+              <w:t xml:space="preserve"> for guests (turns red at limit). Signed-in parents and child sessions continue to use server-side tracking. </w:t>
+            </w:r>
+            <w:r>
+              <w:rPr>
+                <w:rFonts w:ascii="Courier New" w:hAnsi="Courier New"/>
+                <w:color w:val="0F172A"/>
+                <w:sz w:val="18"/>
+              </w:rPr>
+              <w:t>app/components/GuestLimitModal.tsx</w:t>
+            </w:r>
+            <w:r>
+              <w:rPr>
+                <w:color w:val="1E293B"/>
+                <w:sz w:val="18"/>
+              </w:rPr>
+              <w:t xml:space="preserve"> added</w:t>
+            </w:r>
+          </w:p>
+        </w:tc>
+      </w:tr>
+      <w:tr>
+        <w:tc>
+          <w:tcPr>
+            <w:tcW w:type="dxa" w:w="3024"/>
+            <w:shd w:val="clear" w:color="auto" w:fill="F8FAFC"/>
+            <w:tcBorders>
+              <w:top w:val="single" w:sz="4" w:space="0" w:color="E2E8F0"/>
+              <w:left w:val="single" w:sz="4" w:space="0" w:color="E2E8F0"/>
+              <w:bottom w:val="single" w:sz="4" w:space="0" w:color="E2E8F0"/>
+              <w:right w:val="single" w:sz="4" w:space="0" w:color="E2E8F0"/>
+            </w:tcBorders>
+          </w:tcPr>
+          <w:p>
+            <w:pPr>
+              <w:spacing w:before="30" w:after="30"/>
+            </w:pPr>
+            <w:r/>
+            <w:r>
+              <w:rPr>
+                <w:b/>
+                <w:color w:val="1E293B"/>
+              </w:rPr>
+              <w:t>v0.23.0</w:t>
+            </w:r>
+          </w:p>
+        </w:tc>
+        <w:tc>
+          <w:tcPr>
+            <w:tcW w:type="dxa" w:w="3024"/>
+            <w:shd w:val="clear" w:color="auto" w:fill="F8FAFC"/>
+            <w:tcBorders>
+              <w:top w:val="single" w:sz="4" w:space="0" w:color="E2E8F0"/>
+              <w:left w:val="single" w:sz="4" w:space="0" w:color="E2E8F0"/>
+              <w:bottom w:val="single" w:sz="4" w:space="0" w:color="E2E8F0"/>
+              <w:right w:val="single" w:sz="4" w:space="0" w:color="E2E8F0"/>
+            </w:tcBorders>
+          </w:tcPr>
+          <w:p>
+            <w:pPr>
+              <w:spacing w:before="30" w:after="30"/>
+            </w:pPr>
+            <w:r/>
+            <w:r>
+              <w:rPr>
+                <w:color w:val="1E293B"/>
+                <w:sz w:val="18"/>
+              </w:rPr>
+              <w:t>July 2026</w:t>
+            </w:r>
+          </w:p>
+        </w:tc>
+        <w:tc>
+          <w:tcPr>
+            <w:tcW w:type="dxa" w:w="3024"/>
+            <w:shd w:val="clear" w:color="auto" w:fill="F8FAFC"/>
+            <w:tcBorders>
+              <w:top w:val="single" w:sz="4" w:space="0" w:color="E2E8F0"/>
+              <w:left w:val="single" w:sz="4" w:space="0" w:color="E2E8F0"/>
+              <w:bottom w:val="single" w:sz="4" w:space="0" w:color="E2E8F0"/>
+              <w:right w:val="single" w:sz="4" w:space="0" w:color="E2E8F0"/>
+            </w:tcBorders>
+          </w:tcPr>
+          <w:p>
+            <w:pPr>
+              <w:spacing w:before="30" w:after="30"/>
+            </w:pPr>
+            <w:r/>
+            <w:r>
+              <w:rPr>
+                <w:color w:val="1E293B"/>
+                <w:sz w:val="18"/>
+              </w:rPr>
               <w:t xml:space="preserve">Landing page: exam coverage panel, testimonials section, FAQ accordion — (1) Hero redesigned to two-column layout on desktop: text/CTAs left, exam coverage panel right. Panel shows 8 colour-coded exam badges (AMC, Olympiad, ACER, ICAS, ATAR, NAPLAN, Bebras, KSF) with name, full title, year range, and coloured accent bar. Includes legal disclaimer: "SelectEd is an independent preparation platform. Not affiliated with, endorsed by, or connected to the organisations that administer these assessments." (2) Testimonials section added (after Founder card): 3 hardcoded seed cards + fetched approved DB testimonials; "Share your experience →" opens inline form (name, location, star rating, quote); </w:t>
             </w:r>
             <w:r>
@@ -28892,7 +29142,7 @@
           <w:i/>
           <w:color w:val="1E293B"/>
         </w:rPr>
-        <w:t>Document last updated: 1 July 2026 (v0.28). Updated alongside the codebase whenever routes, components, or UX decisions change.</w:t>
+        <w:t>Document last updated: 1 July 2026 (v0.29). Updated alongside the codebase whenever routes, components, or UX decisions change.</w:t>
       </w:r>
     </w:p>
     <w:p>

</xml_diff>

<commit_message>
feat(hero): cinematic dark background with CSS animated AI tutor scene + video player
- Replaced light-gradient hero with full dark navy background
- Added HTML5 video player pointing to /public/tutor-bg.mp4 with opacity
  fade-in on canPlay; CSS scene shows as graceful fallback when no video present
- CSS animated scene: 340px AI orb (ai-orb-pulse), 380px warm amber student
  glow (warm-glow), beam-pulse connection line, 20 rising particle dots,
  5 floating maths equations (float-equation), 16 floating maths symbols
- Dark overlay adjusts dynamically; bottom h-28 white fade blends into page
- Hero text redesigned for dark: white headline, sky-blue accent, glass pill badge
- Exam badge right column: frosted glass card with backdropFilter blur(20px)
- 5 new CSS keyframes: ai-orb-pulse, warm-glow, beam-pulse, particle-rise, float-equation
- DESIGN.md v0.30 + DESIGN.docx regenerated

Co-Authored-By: Claude Sonnet 4.6 <noreply@anthropic.com>
</commit_message>
<xml_diff>
--- a/DESIGN.docx
+++ b/DESIGN.docx
@@ -27777,7 +27777,7 @@
                 <w:b/>
                 <w:color w:val="1E293B"/>
               </w:rPr>
-              <w:t>v0.29.0</w:t>
+              <w:t>v0.30.0</w:t>
             </w:r>
           </w:p>
         </w:tc>
@@ -27827,7 +27827,21 @@
                 <w:color w:val="1E293B"/>
                 <w:sz w:val="18"/>
               </w:rPr>
-              <w:t xml:space="preserve">Guest limit reduced 20 → 10 questions/day — updated in </w:t>
+              <w:t xml:space="preserve">Cinematic hero background — (1) </w:t>
+            </w:r>
+            <w:r>
+              <w:rPr>
+                <w:b/>
+                <w:color w:val="1E293B"/>
+              </w:rPr>
+              <w:t>Video background infrastructure</w:t>
+            </w:r>
+            <w:r>
+              <w:rPr>
+                <w:color w:val="1E293B"/>
+                <w:sz w:val="18"/>
+              </w:rPr>
+              <w:t xml:space="preserve">: hero section now mounts an HTML5 </w:t>
             </w:r>
             <w:r>
               <w:rPr>
@@ -27835,14 +27849,14 @@
                 <w:color w:val="0F172A"/>
                 <w:sz w:val="18"/>
               </w:rPr>
-              <w:t>GUEST_DAILY_LIMIT</w:t>
-            </w:r>
-            <w:r>
-              <w:rPr>
-                <w:color w:val="1E293B"/>
-                <w:sz w:val="18"/>
-              </w:rPr>
-              <w:t xml:space="preserve"> constant (</w:t>
+              <w:t>&lt;video autoPlay muted loop playsInline&gt;</w:t>
+            </w:r>
+            <w:r>
+              <w:rPr>
+                <w:color w:val="1E293B"/>
+                <w:sz w:val="18"/>
+              </w:rPr>
+              <w:t xml:space="preserve"> element pointing to </w:t>
             </w:r>
             <w:r>
               <w:rPr>
@@ -27850,14 +27864,14 @@
                 <w:color w:val="0F172A"/>
                 <w:sz w:val="18"/>
               </w:rPr>
-              <w:t>app/page.tsx</w:t>
-            </w:r>
-            <w:r>
-              <w:rPr>
-                <w:color w:val="1E293B"/>
-                <w:sz w:val="18"/>
-              </w:rPr>
-              <w:t xml:space="preserve">, </w:t>
+              <w:t>/public/tutor-bg.mp4</w:t>
+            </w:r>
+            <w:r>
+              <w:rPr>
+                <w:color w:val="1E293B"/>
+                <w:sz w:val="18"/>
+              </w:rPr>
+              <w:t xml:space="preserve">. </w:t>
             </w:r>
             <w:r>
               <w:rPr>
@@ -27865,14 +27879,14 @@
                 <w:color w:val="0F172A"/>
                 <w:sz w:val="18"/>
               </w:rPr>
-              <w:t>GuestLimitModal.tsx</w:t>
-            </w:r>
-            <w:r>
-              <w:rPr>
-                <w:color w:val="1E293B"/>
-                <w:sz w:val="18"/>
-              </w:rPr>
-              <w:t xml:space="preserve">), rolling banner copy, FAQ answer, trust badge, and parent dashboard label. CAPTCHA gate on sign-up — (1) </w:t>
+              <w:t>videoBgReady</w:t>
+            </w:r>
+            <w:r>
+              <w:rPr>
+                <w:color w:val="1E293B"/>
+                <w:sz w:val="18"/>
+              </w:rPr>
+              <w:t xml:space="preserve"> React state tracks </w:t>
             </w:r>
             <w:r>
               <w:rPr>
@@ -27880,14 +27894,14 @@
                 <w:color w:val="0F172A"/>
                 <w:sz w:val="18"/>
               </w:rPr>
-              <w:t>/sign-up</w:t>
-            </w:r>
-            <w:r>
-              <w:rPr>
-                <w:color w:val="1E293B"/>
-                <w:sz w:val="18"/>
-              </w:rPr>
-              <w:t xml:space="preserve"> page now shows a math CAPTCHA challenge before the Clerk </w:t>
+              <w:t>onCanPlay</w:t>
+            </w:r>
+            <w:r>
+              <w:rPr>
+                <w:color w:val="1E293B"/>
+                <w:sz w:val="18"/>
+              </w:rPr>
+              <w:t xml:space="preserve">; the video fades in with a 1.2 s opacity transition once loaded. When no video file is present (or on load failure), </w:t>
             </w:r>
             <w:r>
               <w:rPr>
@@ -27895,14 +27909,14 @@
                 <w:color w:val="0F172A"/>
                 <w:sz w:val="18"/>
               </w:rPr>
-              <w:t>&lt;SignUp /&gt;</w:t>
-            </w:r>
-            <w:r>
-              <w:rPr>
-                <w:color w:val="1E293B"/>
-                <w:sz w:val="18"/>
-              </w:rPr>
-              <w:t xml:space="preserve"> form renders (client component with </w:t>
+              <w:t>videoBgReady</w:t>
+            </w:r>
+            <w:r>
+              <w:rPr>
+                <w:color w:val="1E293B"/>
+                <w:sz w:val="18"/>
+              </w:rPr>
+              <w:t xml:space="preserve"> stays </w:t>
             </w:r>
             <w:r>
               <w:rPr>
@@ -27910,14 +27924,28 @@
                 <w:color w:val="0F172A"/>
                 <w:sz w:val="18"/>
               </w:rPr>
-              <w:t>useState</w:t>
-            </w:r>
-            <w:r>
-              <w:rPr>
-                <w:color w:val="1E293B"/>
-                <w:sz w:val="18"/>
-              </w:rPr>
-              <w:t xml:space="preserve"> gate). (2) New </w:t>
+              <w:t>false</w:t>
+            </w:r>
+            <w:r>
+              <w:rPr>
+                <w:color w:val="1E293B"/>
+                <w:sz w:val="18"/>
+              </w:rPr>
+              <w:t xml:space="preserve"> and the full CSS-animated scene renders instead. (2) </w:t>
+            </w:r>
+            <w:r>
+              <w:rPr>
+                <w:b/>
+                <w:color w:val="1E293B"/>
+              </w:rPr>
+              <w:t>CSS animated tutor scene</w:t>
+            </w:r>
+            <w:r>
+              <w:rPr>
+                <w:color w:val="1E293B"/>
+                <w:sz w:val="18"/>
+              </w:rPr>
+              <w:t xml:space="preserve"> (fallback + always-on decoration): deep navy base gradient (</w:t>
             </w:r>
             <w:r>
               <w:rPr>
@@ -27925,14 +27953,14 @@
                 <w:color w:val="0F172A"/>
                 <w:sz w:val="18"/>
               </w:rPr>
-              <w:t>CaptchaSignUpGate</w:t>
-            </w:r>
-            <w:r>
-              <w:rPr>
-                <w:color w:val="1E293B"/>
-                <w:sz w:val="18"/>
-              </w:rPr>
-              <w:t xml:space="preserve"> component (</w:t>
+              <w:t>#000936 → #060e3f → #0c1848</w:t>
+            </w:r>
+            <w:r>
+              <w:rPr>
+                <w:color w:val="1E293B"/>
+                <w:sz w:val="18"/>
+              </w:rPr>
+              <w:t xml:space="preserve">); a large 340 px blue radial-gradient AI orb (top-left) with </w:t>
             </w:r>
             <w:r>
               <w:rPr>
@@ -27940,14 +27968,14 @@
                 <w:color w:val="0F172A"/>
                 <w:sz w:val="18"/>
               </w:rPr>
-              <w:t>app/components/CaptchaSignUpGate.tsx</w:t>
-            </w:r>
-            <w:r>
-              <w:rPr>
-                <w:color w:val="1E293B"/>
-                <w:sz w:val="18"/>
-              </w:rPr>
-              <w:t xml:space="preserve">) wraps any button with a CAPTCHA modal; uses </w:t>
+              <w:t>ai-orb-pulse</w:t>
+            </w:r>
+            <w:r>
+              <w:rPr>
+                <w:color w:val="1E293B"/>
+                <w:sz w:val="18"/>
+              </w:rPr>
+              <w:t xml:space="preserve"> keyframe (scale 1 → 1.09, opacity pulse); a 520 px outer ambient glow around the orb; a 380 px warm amber/orange </w:t>
             </w:r>
             <w:r>
               <w:rPr>
@@ -27955,14 +27983,14 @@
                 <w:color w:val="0F172A"/>
                 <w:sz w:val="18"/>
               </w:rPr>
-              <w:t>useClerk().openSignUp()</w:t>
-            </w:r>
-            <w:r>
-              <w:rPr>
-                <w:color w:val="1E293B"/>
-                <w:sz w:val="18"/>
-              </w:rPr>
-              <w:t xml:space="preserve"> to open Clerk's sign-up modal after successful verification. </w:t>
+              <w:t>warm-glow</w:t>
+            </w:r>
+            <w:r>
+              <w:rPr>
+                <w:color w:val="1E293B"/>
+                <w:sz w:val="18"/>
+              </w:rPr>
+              <w:t xml:space="preserve"> radial gradient (right, </w:t>
             </w:r>
             <w:r>
               <w:rPr>
@@ -27970,14 +27998,14 @@
                 <w:color w:val="0F172A"/>
                 <w:sz w:val="18"/>
               </w:rPr>
-              <w:t>GuestLimitModal</w:t>
-            </w:r>
-            <w:r>
-              <w:rPr>
-                <w:color w:val="1E293B"/>
-                <w:sz w:val="18"/>
-              </w:rPr>
-              <w:t xml:space="preserve">'s "Start free 7-day trial →" button now uses </w:t>
+              <w:t>warm-glow</w:t>
+            </w:r>
+            <w:r>
+              <w:rPr>
+                <w:color w:val="1E293B"/>
+                <w:sz w:val="18"/>
+              </w:rPr>
+              <w:t xml:space="preserve"> keyframe) representing the student; a 2 px horizontal </w:t>
             </w:r>
             <w:r>
               <w:rPr>
@@ -27985,14 +28013,14 @@
                 <w:color w:val="0F172A"/>
                 <w:sz w:val="18"/>
               </w:rPr>
-              <w:t>CaptchaSignUpGate</w:t>
-            </w:r>
-            <w:r>
-              <w:rPr>
-                <w:color w:val="1E293B"/>
-                <w:sz w:val="18"/>
-              </w:rPr>
-              <w:t xml:space="preserve"> instead of </w:t>
+              <w:t>beam-pulse</w:t>
+            </w:r>
+            <w:r>
+              <w:rPr>
+                <w:color w:val="1E293B"/>
+                <w:sz w:val="18"/>
+              </w:rPr>
+              <w:t xml:space="preserve"> connection line between orb and student; 20 rising dot particles (</w:t>
             </w:r>
             <w:r>
               <w:rPr>
@@ -28000,7 +28028,520 @@
                 <w:color w:val="0F172A"/>
                 <w:sz w:val="18"/>
               </w:rPr>
-              <w:t>&lt;SignUpButton&gt;</w:t>
+              <w:t>particle-rise</w:t>
+            </w:r>
+            <w:r>
+              <w:rPr>
+                <w:color w:val="1E293B"/>
+                <w:sz w:val="18"/>
+              </w:rPr>
+              <w:t xml:space="preserve"> keyframe); 5 floating maths equations (</w:t>
+            </w:r>
+            <w:r>
+              <w:rPr>
+                <w:rFonts w:ascii="Courier New" w:hAnsi="Courier New"/>
+                <w:color w:val="0F172A"/>
+                <w:sz w:val="18"/>
+              </w:rPr>
+              <w:t>float-equation</w:t>
+            </w:r>
+            <w:r>
+              <w:rPr>
+                <w:color w:val="1E293B"/>
+                <w:sz w:val="18"/>
+              </w:rPr>
+              <w:t xml:space="preserve"> keyframe — e.g. </w:t>
+            </w:r>
+            <w:r>
+              <w:rPr>
+                <w:rFonts w:ascii="Courier New" w:hAnsi="Courier New"/>
+                <w:color w:val="0F172A"/>
+                <w:sz w:val="18"/>
+              </w:rPr>
+              <w:t>y = mx + b</w:t>
+            </w:r>
+            <w:r>
+              <w:rPr>
+                <w:color w:val="1E293B"/>
+                <w:sz w:val="18"/>
+              </w:rPr>
+              <w:t xml:space="preserve">, </w:t>
+            </w:r>
+            <w:r>
+              <w:rPr>
+                <w:rFonts w:ascii="Courier New" w:hAnsi="Courier New"/>
+                <w:color w:val="0F172A"/>
+                <w:sz w:val="18"/>
+              </w:rPr>
+              <w:t>E = mc²</w:t>
+            </w:r>
+            <w:r>
+              <w:rPr>
+                <w:color w:val="1E293B"/>
+                <w:sz w:val="18"/>
+              </w:rPr>
+              <w:t xml:space="preserve">, </w:t>
+            </w:r>
+            <w:r>
+              <w:rPr>
+                <w:rFonts w:ascii="Courier New" w:hAnsi="Courier New"/>
+                <w:color w:val="0F172A"/>
+                <w:sz w:val="18"/>
+              </w:rPr>
+              <w:t>P(A) = n(A)/n(S)</w:t>
+            </w:r>
+            <w:r>
+              <w:rPr>
+                <w:color w:val="1E293B"/>
+                <w:sz w:val="18"/>
+              </w:rPr>
+              <w:t xml:space="preserve">, </w:t>
+            </w:r>
+            <w:r>
+              <w:rPr>
+                <w:rFonts w:ascii="Courier New" w:hAnsi="Courier New"/>
+                <w:color w:val="0F172A"/>
+                <w:sz w:val="18"/>
+              </w:rPr>
+              <w:t>∫₀¹ f(x) dx</w:t>
+            </w:r>
+            <w:r>
+              <w:rPr>
+                <w:color w:val="1E293B"/>
+                <w:sz w:val="18"/>
+              </w:rPr>
+              <w:t xml:space="preserve">, </w:t>
+            </w:r>
+            <w:r>
+              <w:rPr>
+                <w:rFonts w:ascii="Courier New" w:hAnsi="Courier New"/>
+                <w:color w:val="0F172A"/>
+                <w:sz w:val="18"/>
+              </w:rPr>
+              <w:t>ax² + bx + c = 0</w:t>
+            </w:r>
+            <w:r>
+              <w:rPr>
+                <w:color w:val="1E293B"/>
+                <w:sz w:val="18"/>
+              </w:rPr>
+              <w:t>); 16 floating maths symbols (</w:t>
+            </w:r>
+            <w:r>
+              <w:rPr>
+                <w:rFonts w:ascii="Courier New" w:hAnsi="Courier New"/>
+                <w:color w:val="0F172A"/>
+                <w:sz w:val="18"/>
+              </w:rPr>
+              <w:t>float-symbol</w:t>
+            </w:r>
+            <w:r>
+              <w:rPr>
+                <w:color w:val="1E293B"/>
+                <w:sz w:val="18"/>
+              </w:rPr>
+              <w:t xml:space="preserve">, unchanged from v0.28, but colour-shifted to semi-transparent RGBA values for dark background). (3) </w:t>
+            </w:r>
+            <w:r>
+              <w:rPr>
+                <w:b/>
+                <w:color w:val="1E293B"/>
+              </w:rPr>
+              <w:t>Dark overlay</w:t>
+            </w:r>
+            <w:r>
+              <w:rPr>
+                <w:color w:val="1E293B"/>
+                <w:sz w:val="18"/>
+              </w:rPr>
+              <w:t xml:space="preserve">: linear-gradient overlay adjusts dynamically — thick dark when CSS scene shows, semi-transparent when video plays. (4) </w:t>
+            </w:r>
+            <w:r>
+              <w:rPr>
+                <w:b/>
+                <w:color w:val="1E293B"/>
+              </w:rPr>
+              <w:t>Bottom white fade</w:t>
+            </w:r>
+            <w:r>
+              <w:rPr>
+                <w:color w:val="1E293B"/>
+                <w:sz w:val="18"/>
+              </w:rPr>
+              <w:t xml:space="preserve">: 28-rem </w:t>
+            </w:r>
+            <w:r>
+              <w:rPr>
+                <w:rFonts w:ascii="Courier New" w:hAnsi="Courier New"/>
+                <w:color w:val="0F172A"/>
+                <w:sz w:val="18"/>
+              </w:rPr>
+              <w:t>h-28</w:t>
+            </w:r>
+            <w:r>
+              <w:rPr>
+                <w:color w:val="1E293B"/>
+                <w:sz w:val="18"/>
+              </w:rPr>
+              <w:t xml:space="preserve"> gradient </w:t>
+            </w:r>
+            <w:r>
+              <w:rPr>
+                <w:rFonts w:ascii="Courier New" w:hAnsi="Courier New"/>
+                <w:color w:val="0F172A"/>
+                <w:sz w:val="18"/>
+              </w:rPr>
+              <w:t>transparent → #ffffff</w:t>
+            </w:r>
+            <w:r>
+              <w:rPr>
+                <w:color w:val="1E293B"/>
+                <w:sz w:val="18"/>
+              </w:rPr>
+              <w:t xml:space="preserve"> at hero bottom so hero blends into the white sections below. (5) </w:t>
+            </w:r>
+            <w:r>
+              <w:rPr>
+                <w:b/>
+                <w:color w:val="1E293B"/>
+              </w:rPr>
+              <w:t>Hero text redesigned for dark background</w:t>
+            </w:r>
+            <w:r>
+              <w:rPr>
+                <w:color w:val="1E293B"/>
+                <w:sz w:val="18"/>
+              </w:rPr>
+              <w:t xml:space="preserve">: headline in white </w:t>
+            </w:r>
+            <w:r>
+              <w:rPr>
+                <w:rFonts w:ascii="Courier New" w:hAnsi="Courier New"/>
+                <w:color w:val="0F172A"/>
+                <w:sz w:val="18"/>
+              </w:rPr>
+              <w:t>#ffffff</w:t>
+            </w:r>
+            <w:r>
+              <w:rPr>
+                <w:color w:val="1E293B"/>
+                <w:sz w:val="18"/>
+              </w:rPr>
+              <w:t xml:space="preserve">, accent span in sky-blue </w:t>
+            </w:r>
+            <w:r>
+              <w:rPr>
+                <w:rFonts w:ascii="Courier New" w:hAnsi="Courier New"/>
+                <w:color w:val="0F172A"/>
+                <w:sz w:val="18"/>
+              </w:rPr>
+              <w:t>#56DBFF</w:t>
+            </w:r>
+            <w:r>
+              <w:rPr>
+                <w:color w:val="1E293B"/>
+                <w:sz w:val="18"/>
+              </w:rPr>
+              <w:t xml:space="preserve">; subheadline at </w:t>
+            </w:r>
+            <w:r>
+              <w:rPr>
+                <w:rFonts w:ascii="Courier New" w:hAnsi="Courier New"/>
+                <w:color w:val="0F172A"/>
+                <w:sz w:val="18"/>
+              </w:rPr>
+              <w:t>rgba(255,255,255,0.72)</w:t>
+            </w:r>
+            <w:r>
+              <w:rPr>
+                <w:color w:val="1E293B"/>
+                <w:sz w:val="18"/>
+              </w:rPr>
+              <w:t>; "Australia's AI-powered exam prep platform" badge uses glass pill (</w:t>
+            </w:r>
+            <w:r>
+              <w:rPr>
+                <w:rFonts w:ascii="Courier New" w:hAnsi="Courier New"/>
+                <w:color w:val="0F172A"/>
+                <w:sz w:val="18"/>
+              </w:rPr>
+              <w:t>rgba(255,255,255,0.08)</w:t>
+            </w:r>
+            <w:r>
+              <w:rPr>
+                <w:color w:val="1E293B"/>
+                <w:sz w:val="18"/>
+              </w:rPr>
+              <w:t xml:space="preserve"> bg + </w:t>
+            </w:r>
+            <w:r>
+              <w:rPr>
+                <w:rFonts w:ascii="Courier New" w:hAnsi="Courier New"/>
+                <w:color w:val="0F172A"/>
+                <w:sz w:val="18"/>
+              </w:rPr>
+              <w:t>rgba(255,255,255,0.20)</w:t>
+            </w:r>
+            <w:r>
+              <w:rPr>
+                <w:color w:val="1E293B"/>
+                <w:sz w:val="18"/>
+              </w:rPr>
+              <w:t xml:space="preserve"> border + </w:t>
+            </w:r>
+            <w:r>
+              <w:rPr>
+                <w:rFonts w:ascii="Courier New" w:hAnsi="Courier New"/>
+                <w:color w:val="0F172A"/>
+                <w:sz w:val="18"/>
+              </w:rPr>
+              <w:t>backdropFilter: blur(8px)</w:t>
+            </w:r>
+            <w:r>
+              <w:rPr>
+                <w:color w:val="1E293B"/>
+                <w:sz w:val="18"/>
+              </w:rPr>
+              <w:t xml:space="preserve">); primary CTA changed from navy/gold to gold </w:t>
+            </w:r>
+            <w:r>
+              <w:rPr>
+                <w:rFonts w:ascii="Courier New" w:hAnsi="Courier New"/>
+                <w:color w:val="0F172A"/>
+                <w:sz w:val="18"/>
+              </w:rPr>
+              <w:t>#FDC800</w:t>
+            </w:r>
+            <w:r>
+              <w:rPr>
+                <w:color w:val="1E293B"/>
+                <w:sz w:val="18"/>
+              </w:rPr>
+              <w:t xml:space="preserve">/navy for maximum contrast on dark; secondary CTA ("I'm a student") uses </w:t>
+            </w:r>
+            <w:r>
+              <w:rPr>
+                <w:rFonts w:ascii="Courier New" w:hAnsi="Courier New"/>
+                <w:color w:val="0F172A"/>
+                <w:sz w:val="18"/>
+              </w:rPr>
+              <w:t>rgba(255,255,255,0.28)</w:t>
+            </w:r>
+            <w:r>
+              <w:rPr>
+                <w:color w:val="1E293B"/>
+                <w:sz w:val="18"/>
+              </w:rPr>
+              <w:t xml:space="preserve"> border and glass bg. (6) </w:t>
+            </w:r>
+            <w:r>
+              <w:rPr>
+                <w:b/>
+                <w:color w:val="1E293B"/>
+              </w:rPr>
+              <w:t>Frosted glass exam badge panel</w:t>
+            </w:r>
+            <w:r>
+              <w:rPr>
+                <w:color w:val="1E293B"/>
+                <w:sz w:val="18"/>
+              </w:rPr>
+              <w:t xml:space="preserve">: right column redesigned with </w:t>
+            </w:r>
+            <w:r>
+              <w:rPr>
+                <w:rFonts w:ascii="Courier New" w:hAnsi="Courier New"/>
+                <w:color w:val="0F172A"/>
+                <w:sz w:val="18"/>
+              </w:rPr>
+              <w:t>backdropFilter: blur(20px)</w:t>
+            </w:r>
+            <w:r>
+              <w:rPr>
+                <w:color w:val="1E293B"/>
+                <w:sz w:val="18"/>
+              </w:rPr>
+              <w:t xml:space="preserve"> + </w:t>
+            </w:r>
+            <w:r>
+              <w:rPr>
+                <w:rFonts w:ascii="Courier New" w:hAnsi="Courier New"/>
+                <w:color w:val="0F172A"/>
+                <w:sz w:val="18"/>
+              </w:rPr>
+              <w:t>-webkit-backdrop-filter</w:t>
+            </w:r>
+            <w:r>
+              <w:rPr>
+                <w:color w:val="1E293B"/>
+                <w:sz w:val="18"/>
+              </w:rPr>
+              <w:t xml:space="preserve"> glass card (</w:t>
+            </w:r>
+            <w:r>
+              <w:rPr>
+                <w:rFonts w:ascii="Courier New" w:hAnsi="Courier New"/>
+                <w:color w:val="0F172A"/>
+                <w:sz w:val="18"/>
+              </w:rPr>
+              <w:t>rgba(255,255,255,0.07)</w:t>
+            </w:r>
+            <w:r>
+              <w:rPr>
+                <w:color w:val="1E293B"/>
+                <w:sz w:val="18"/>
+              </w:rPr>
+              <w:t xml:space="preserve"> bg, </w:t>
+            </w:r>
+            <w:r>
+              <w:rPr>
+                <w:rFonts w:ascii="Courier New" w:hAnsi="Courier New"/>
+                <w:color w:val="0F172A"/>
+                <w:sz w:val="18"/>
+              </w:rPr>
+              <w:t>rgba(255,255,255,0.13)</w:t>
+            </w:r>
+            <w:r>
+              <w:rPr>
+                <w:color w:val="1E293B"/>
+                <w:sz w:val="18"/>
+              </w:rPr>
+              <w:t xml:space="preserve"> border, deep box-shadow </w:t>
+            </w:r>
+            <w:r>
+              <w:rPr>
+                <w:rFonts w:ascii="Courier New" w:hAnsi="Courier New"/>
+                <w:color w:val="0F172A"/>
+                <w:sz w:val="18"/>
+              </w:rPr>
+              <w:t>0 8px 48px rgba(0,0,0,0.45)</w:t>
+            </w:r>
+            <w:r>
+              <w:rPr>
+                <w:color w:val="1E293B"/>
+                <w:sz w:val="18"/>
+              </w:rPr>
+              <w:t xml:space="preserve">); badge card backgrounds changed to </w:t>
+            </w:r>
+            <w:r>
+              <w:rPr>
+                <w:rFonts w:ascii="Courier New" w:hAnsi="Courier New"/>
+                <w:color w:val="0F172A"/>
+                <w:sz w:val="18"/>
+              </w:rPr>
+              <w:t>rgba(255,255,255,0.05)</w:t>
+            </w:r>
+            <w:r>
+              <w:rPr>
+                <w:color w:val="1E293B"/>
+                <w:sz w:val="18"/>
+              </w:rPr>
+              <w:t xml:space="preserve">; badge circle glows use per-exam colour box-shadow; label text uses </w:t>
+            </w:r>
+            <w:r>
+              <w:rPr>
+                <w:rFonts w:ascii="Courier New" w:hAnsi="Courier New"/>
+                <w:color w:val="0F172A"/>
+                <w:sz w:val="18"/>
+              </w:rPr>
+              <w:t>rgba(255,255,255,0.6)</w:t>
+            </w:r>
+            <w:r>
+              <w:rPr>
+                <w:color w:val="1E293B"/>
+                <w:sz w:val="18"/>
+              </w:rPr>
+              <w:t xml:space="preserve">. New CSS keyframes added: </w:t>
+            </w:r>
+            <w:r>
+              <w:rPr>
+                <w:rFonts w:ascii="Courier New" w:hAnsi="Courier New"/>
+                <w:color w:val="0F172A"/>
+                <w:sz w:val="18"/>
+              </w:rPr>
+              <w:t>ai-orb-pulse</w:t>
+            </w:r>
+            <w:r>
+              <w:rPr>
+                <w:color w:val="1E293B"/>
+                <w:sz w:val="18"/>
+              </w:rPr>
+              <w:t xml:space="preserve">, </w:t>
+            </w:r>
+            <w:r>
+              <w:rPr>
+                <w:rFonts w:ascii="Courier New" w:hAnsi="Courier New"/>
+                <w:color w:val="0F172A"/>
+                <w:sz w:val="18"/>
+              </w:rPr>
+              <w:t>warm-glow</w:t>
+            </w:r>
+            <w:r>
+              <w:rPr>
+                <w:color w:val="1E293B"/>
+                <w:sz w:val="18"/>
+              </w:rPr>
+              <w:t xml:space="preserve">, </w:t>
+            </w:r>
+            <w:r>
+              <w:rPr>
+                <w:rFonts w:ascii="Courier New" w:hAnsi="Courier New"/>
+                <w:color w:val="0F172A"/>
+                <w:sz w:val="18"/>
+              </w:rPr>
+              <w:t>beam-pulse</w:t>
+            </w:r>
+            <w:r>
+              <w:rPr>
+                <w:color w:val="1E293B"/>
+                <w:sz w:val="18"/>
+              </w:rPr>
+              <w:t xml:space="preserve">, </w:t>
+            </w:r>
+            <w:r>
+              <w:rPr>
+                <w:rFonts w:ascii="Courier New" w:hAnsi="Courier New"/>
+                <w:color w:val="0F172A"/>
+                <w:sz w:val="18"/>
+              </w:rPr>
+              <w:t>particle-rise</w:t>
+            </w:r>
+            <w:r>
+              <w:rPr>
+                <w:color w:val="1E293B"/>
+                <w:sz w:val="18"/>
+              </w:rPr>
+              <w:t xml:space="preserve">, </w:t>
+            </w:r>
+            <w:r>
+              <w:rPr>
+                <w:rFonts w:ascii="Courier New" w:hAnsi="Courier New"/>
+                <w:color w:val="0F172A"/>
+                <w:sz w:val="18"/>
+              </w:rPr>
+              <w:t>float-equation</w:t>
+            </w:r>
+            <w:r>
+              <w:rPr>
+                <w:color w:val="1E293B"/>
+                <w:sz w:val="18"/>
+              </w:rPr>
+              <w:t xml:space="preserve">. To use a real AI-generated video: generate a 10–15 s looping MP4 (recommended prompt: "Serene warm study scene, soft-glowing blue AI hologram tutor floating near a desk, happy 10-year-old child looking up with curiosity, floating maths equations drifting around them, ambient film-quality lighting, cinematic, 4K, seamlessly loopable") using Runway Gen-3, Kling AI, or Sora; place the file at </w:t>
+            </w:r>
+            <w:r>
+              <w:rPr>
+                <w:rFonts w:ascii="Courier New" w:hAnsi="Courier New"/>
+                <w:color w:val="0F172A"/>
+                <w:sz w:val="18"/>
+              </w:rPr>
+              <w:t>public/tutor-bg.mp4</w:t>
+            </w:r>
+            <w:r>
+              <w:rPr>
+                <w:color w:val="1E293B"/>
+                <w:sz w:val="18"/>
+              </w:rPr>
+              <w:t>; no code change needed — the player activates automatically</w:t>
             </w:r>
           </w:p>
         </w:tc>
@@ -28027,7 +28568,7 @@
                 <w:b/>
                 <w:color w:val="1E293B"/>
               </w:rPr>
-              <w:t>v0.28.0</w:t>
+              <w:t>v0.29.0</w:t>
             </w:r>
           </w:p>
         </w:tc>
@@ -28077,21 +28618,7 @@
                 <w:color w:val="1E293B"/>
                 <w:sz w:val="18"/>
               </w:rPr>
-              <w:t xml:space="preserve">Landing page visual overhaul + Adventure Mode game-feel + CAPTCHA + professional diagrams — (1) </w:t>
-            </w:r>
-            <w:r>
-              <w:rPr>
-                <w:b/>
-                <w:color w:val="1E293B"/>
-              </w:rPr>
-              <w:t>Sign-in button</w:t>
-            </w:r>
-            <w:r>
-              <w:rPr>
-                <w:color w:val="1E293B"/>
-                <w:sz w:val="18"/>
-              </w:rPr>
-              <w:t xml:space="preserve"> made prominent: navy-bordered outlined button with </w:t>
+              <w:t xml:space="preserve">Guest limit reduced 20 → 10 questions/day — updated in </w:t>
             </w:r>
             <w:r>
               <w:rPr>
@@ -28099,56 +28626,14 @@
                 <w:color w:val="0F172A"/>
                 <w:sz w:val="18"/>
               </w:rPr>
-              <w:t>Sign in →</w:t>
-            </w:r>
-            <w:r>
-              <w:rPr>
-                <w:color w:val="1E293B"/>
-                <w:sz w:val="18"/>
-              </w:rPr>
-              <w:t xml:space="preserve"> text. (2) </w:t>
-            </w:r>
-            <w:r>
-              <w:rPr>
-                <w:b/>
-                <w:color w:val="1E293B"/>
-              </w:rPr>
-              <w:t>"Our story"</w:t>
-            </w:r>
-            <w:r>
-              <w:rPr>
-                <w:color w:val="1E293B"/>
-                <w:sz w:val="18"/>
-              </w:rPr>
-              <w:t xml:space="preserve"> nav link coloured blue with arrow; </w:t>
-            </w:r>
-            <w:r>
-              <w:rPr>
-                <w:b/>
-                <w:color w:val="1E293B"/>
-              </w:rPr>
-              <w:t>Pricing</w:t>
-            </w:r>
-            <w:r>
-              <w:rPr>
-                <w:color w:val="1E293B"/>
-                <w:sz w:val="18"/>
-              </w:rPr>
-              <w:t xml:space="preserve"> becomes a gold pill button. (3) </w:t>
-            </w:r>
-            <w:r>
-              <w:rPr>
-                <w:b/>
-                <w:color w:val="1E293B"/>
-              </w:rPr>
-              <w:t>Rolling banner</w:t>
-            </w:r>
-            <w:r>
-              <w:rPr>
-                <w:color w:val="1E293B"/>
-                <w:sz w:val="18"/>
-              </w:rPr>
-              <w:t xml:space="preserve"> (navy ticker) below stats strip: auto-scrolling marquee of testimonial snippets, exam names, and feature highlights using CSS </w:t>
+              <w:t>GUEST_DAILY_LIMIT</w:t>
+            </w:r>
+            <w:r>
+              <w:rPr>
+                <w:color w:val="1E293B"/>
+                <w:sz w:val="18"/>
+              </w:rPr>
+              <w:t xml:space="preserve"> constant (</w:t>
             </w:r>
             <w:r>
               <w:rPr>
@@ -28156,28 +28641,14 @@
                 <w:color w:val="0F172A"/>
                 <w:sz w:val="18"/>
               </w:rPr>
-              <w:t>marquee-scroll</w:t>
-            </w:r>
-            <w:r>
-              <w:rPr>
-                <w:color w:val="1E293B"/>
-                <w:sz w:val="18"/>
-              </w:rPr>
-              <w:t xml:space="preserve"> keyframe. (4) </w:t>
-            </w:r>
-            <w:r>
-              <w:rPr>
-                <w:b/>
-                <w:color w:val="1E293B"/>
-              </w:rPr>
-              <w:t>Animated motion background</w:t>
-            </w:r>
-            <w:r>
-              <w:rPr>
-                <w:color w:val="1E293B"/>
-                <w:sz w:val="18"/>
-              </w:rPr>
-              <w:t xml:space="preserve"> on hero: 16 floating maths symbols (π, ∑, √, ∫, Δ, etc.) drift upward with staggered fade using </w:t>
+              <w:t>app/page.tsx</w:t>
+            </w:r>
+            <w:r>
+              <w:rPr>
+                <w:color w:val="1E293B"/>
+                <w:sz w:val="18"/>
+              </w:rPr>
+              <w:t xml:space="preserve">, </w:t>
             </w:r>
             <w:r>
               <w:rPr>
@@ -28185,14 +28656,14 @@
                 <w:color w:val="0F172A"/>
                 <w:sz w:val="18"/>
               </w:rPr>
-              <w:t>float-symbol</w:t>
-            </w:r>
-            <w:r>
-              <w:rPr>
-                <w:color w:val="1E293B"/>
-                <w:sz w:val="18"/>
-              </w:rPr>
-              <w:t xml:space="preserve"> keyframe; three gradient orbs pulse with </w:t>
+              <w:t>GuestLimitModal.tsx</w:t>
+            </w:r>
+            <w:r>
+              <w:rPr>
+                <w:color w:val="1E293B"/>
+                <w:sz w:val="18"/>
+              </w:rPr>
+              <w:t xml:space="preserve">), rolling banner copy, FAQ answer, trust badge, and parent dashboard label. CAPTCHA gate on sign-up — (1) </w:t>
             </w:r>
             <w:r>
               <w:rPr>
@@ -28200,42 +28671,14 @@
                 <w:color w:val="0F172A"/>
                 <w:sz w:val="18"/>
               </w:rPr>
-              <w:t>pulse-orb</w:t>
-            </w:r>
-            <w:r>
-              <w:rPr>
-                <w:color w:val="1E293B"/>
-                <w:sz w:val="18"/>
-              </w:rPr>
-              <w:t xml:space="preserve"> animation. (5) </w:t>
-            </w:r>
-            <w:r>
-              <w:rPr>
-                <w:b/>
-                <w:color w:val="1E293B"/>
-              </w:rPr>
-              <w:t>Visual exam badges</w:t>
-            </w:r>
-            <w:r>
-              <w:rPr>
-                <w:color w:val="1E293B"/>
-                <w:sz w:val="18"/>
-              </w:rPr>
-              <w:t xml:space="preserve">: hero right panel and Exams section now display circular coloured badges with abbreviation text and emoji icon per exam instead of plain text with left-bar accent. (6) </w:t>
-            </w:r>
-            <w:r>
-              <w:rPr>
-                <w:b/>
-                <w:color w:val="1E293B"/>
-              </w:rPr>
-              <w:t>Human verification CAPTCHA</w:t>
-            </w:r>
-            <w:r>
-              <w:rPr>
-                <w:color w:val="1E293B"/>
-                <w:sz w:val="18"/>
-              </w:rPr>
-              <w:t xml:space="preserve"> on testimonial form: math challenge (</w:t>
+              <w:t>/sign-up</w:t>
+            </w:r>
+            <w:r>
+              <w:rPr>
+                <w:color w:val="1E293B"/>
+                <w:sz w:val="18"/>
+              </w:rPr>
+              <w:t xml:space="preserve"> page now shows a math CAPTCHA challenge before the Clerk </w:t>
             </w:r>
             <w:r>
               <w:rPr>
@@ -28243,28 +28686,14 @@
                 <w:color w:val="0F172A"/>
                 <w:sz w:val="18"/>
               </w:rPr>
-              <w:t>What is A + B?</w:t>
-            </w:r>
-            <w:r>
-              <w:rPr>
-                <w:color w:val="1E293B"/>
-                <w:sz w:val="18"/>
-              </w:rPr>
-              <w:t xml:space="preserve">) + invisible honeypot field. Bot submissions rejected client-side before API call. (7) </w:t>
-            </w:r>
-            <w:r>
-              <w:rPr>
-                <w:b/>
-                <w:color w:val="1E293B"/>
-              </w:rPr>
-              <w:t>Adventure Mode overhaul</w:t>
-            </w:r>
-            <w:r>
-              <w:rPr>
-                <w:color w:val="1E293B"/>
-                <w:sz w:val="18"/>
-              </w:rPr>
-              <w:t xml:space="preserve">: rank system (Novice → Explorer → Scholar → Expert → Champion → Legend) with animated rank-glow border and XP progress bar to next rank; combo multiplier system (×2 at 3-streak, ×3 at 5-streak) with </w:t>
+              <w:t>&lt;SignUp /&gt;</w:t>
+            </w:r>
+            <w:r>
+              <w:rPr>
+                <w:color w:val="1E293B"/>
+                <w:sz w:val="18"/>
+              </w:rPr>
+              <w:t xml:space="preserve"> form renders (client component with </w:t>
             </w:r>
             <w:r>
               <w:rPr>
@@ -28272,14 +28701,14 @@
                 <w:color w:val="0F172A"/>
                 <w:sz w:val="18"/>
               </w:rPr>
-              <w:t>combo-pop</w:t>
-            </w:r>
-            <w:r>
-              <w:rPr>
-                <w:color w:val="1E293B"/>
-                <w:sz w:val="18"/>
-              </w:rPr>
-              <w:t xml:space="preserve"> animation in HUD; block shake animation on wrong answer (</w:t>
+              <w:t>useState</w:t>
+            </w:r>
+            <w:r>
+              <w:rPr>
+                <w:color w:val="1E293B"/>
+                <w:sz w:val="18"/>
+              </w:rPr>
+              <w:t xml:space="preserve"> gate). (2) New </w:t>
             </w:r>
             <w:r>
               <w:rPr>
@@ -28287,14 +28716,14 @@
                 <w:color w:val="0F172A"/>
                 <w:sz w:val="18"/>
               </w:rPr>
-              <w:t>shake-x</w:t>
-            </w:r>
-            <w:r>
-              <w:rPr>
-                <w:color w:val="1E293B"/>
-                <w:sz w:val="18"/>
-              </w:rPr>
-              <w:t>); block bounce on correct answer (</w:t>
+              <w:t>CaptchaSignUpGate</w:t>
+            </w:r>
+            <w:r>
+              <w:rPr>
+                <w:color w:val="1E293B"/>
+                <w:sz w:val="18"/>
+              </w:rPr>
+              <w:t xml:space="preserve"> component (</w:t>
             </w:r>
             <w:r>
               <w:rPr>
@@ -28302,28 +28731,14 @@
                 <w:color w:val="0F172A"/>
                 <w:sz w:val="18"/>
               </w:rPr>
-              <w:t>correct-bounce</w:t>
-            </w:r>
-            <w:r>
-              <w:rPr>
-                <w:color w:val="1E293B"/>
-                <w:sz w:val="18"/>
-              </w:rPr>
-              <w:t xml:space="preserve">); spinning loader while fetching questions; chapter numbers in world map; best-combo display on stage-complete and game-over screens; animated sequential star reveal on stage-complete; animated skull bounce on game-over with red-pulse background flash. (8) </w:t>
-            </w:r>
-            <w:r>
-              <w:rPr>
-                <w:b/>
-                <w:color w:val="1E293B"/>
-              </w:rPr>
-              <w:t>DESIGN.docx</w:t>
-            </w:r>
-            <w:r>
-              <w:rPr>
-                <w:color w:val="1E293B"/>
-                <w:sz w:val="18"/>
-              </w:rPr>
-              <w:t xml:space="preserve"> now includes a visual appendix of three matplotlib-generated diagrams: system architecture (component boxes with arrows), user journey funnel, and learning modes overview — auto-generated by </w:t>
+              <w:t>app/components/CaptchaSignUpGate.tsx</w:t>
+            </w:r>
+            <w:r>
+              <w:rPr>
+                <w:color w:val="1E293B"/>
+                <w:sz w:val="18"/>
+              </w:rPr>
+              <w:t xml:space="preserve">) wraps any button with a CAPTCHA modal; uses </w:t>
             </w:r>
             <w:r>
               <w:rPr>
@@ -28331,14 +28746,14 @@
                 <w:color w:val="0F172A"/>
                 <w:sz w:val="18"/>
               </w:rPr>
-              <w:t>scripts/generate_design_doc.py</w:t>
-            </w:r>
-            <w:r>
-              <w:rPr>
-                <w:color w:val="1E293B"/>
-                <w:sz w:val="18"/>
-              </w:rPr>
-              <w:t xml:space="preserve"> when </w:t>
+              <w:t>useClerk().openSignUp()</w:t>
+            </w:r>
+            <w:r>
+              <w:rPr>
+                <w:color w:val="1E293B"/>
+                <w:sz w:val="18"/>
+              </w:rPr>
+              <w:t xml:space="preserve"> to open Clerk's sign-up modal after successful verification. </w:t>
             </w:r>
             <w:r>
               <w:rPr>
@@ -28346,14 +28761,37 @@
                 <w:color w:val="0F172A"/>
                 <w:sz w:val="18"/>
               </w:rPr>
-              <w:t>matplotlib</w:t>
-            </w:r>
-            <w:r>
-              <w:rPr>
-                <w:color w:val="1E293B"/>
-                <w:sz w:val="18"/>
-              </w:rPr>
-              <w:t xml:space="preserve"> is installed</w:t>
+              <w:t>GuestLimitModal</w:t>
+            </w:r>
+            <w:r>
+              <w:rPr>
+                <w:color w:val="1E293B"/>
+                <w:sz w:val="18"/>
+              </w:rPr>
+              <w:t xml:space="preserve">'s "Start free 7-day trial →" button now uses </w:t>
+            </w:r>
+            <w:r>
+              <w:rPr>
+                <w:rFonts w:ascii="Courier New" w:hAnsi="Courier New"/>
+                <w:color w:val="0F172A"/>
+                <w:sz w:val="18"/>
+              </w:rPr>
+              <w:t>CaptchaSignUpGate</w:t>
+            </w:r>
+            <w:r>
+              <w:rPr>
+                <w:color w:val="1E293B"/>
+                <w:sz w:val="18"/>
+              </w:rPr>
+              <w:t xml:space="preserve"> instead of </w:t>
+            </w:r>
+            <w:r>
+              <w:rPr>
+                <w:rFonts w:ascii="Courier New" w:hAnsi="Courier New"/>
+                <w:color w:val="0F172A"/>
+                <w:sz w:val="18"/>
+              </w:rPr>
+              <w:t>&lt;SignUpButton&gt;</w:t>
             </w:r>
           </w:p>
         </w:tc>
@@ -28380,7 +28818,7 @@
                 <w:b/>
                 <w:color w:val="1E293B"/>
               </w:rPr>
-              <w:t>v0.27.0</w:t>
+              <w:t>v0.28.0</w:t>
             </w:r>
           </w:p>
         </w:tc>
@@ -28430,7 +28868,283 @@
                 <w:color w:val="1E293B"/>
                 <w:sz w:val="18"/>
               </w:rPr>
-              <w:t>Landing page copy fixes — FAQ "Do I need an account?" updated to mention 20-question/day guest limit and midnight reset; correctly states Exam Mode and Adventure Mode require an account. Trust badge "Free to use / no premium tier" corrected to "Free to start / 7-day trial then $9.99/month AUD". Guest badge updated to "20 free questions a day"</w:t>
+              <w:t xml:space="preserve">Landing page visual overhaul + Adventure Mode game-feel + CAPTCHA + professional diagrams — (1) </w:t>
+            </w:r>
+            <w:r>
+              <w:rPr>
+                <w:b/>
+                <w:color w:val="1E293B"/>
+              </w:rPr>
+              <w:t>Sign-in button</w:t>
+            </w:r>
+            <w:r>
+              <w:rPr>
+                <w:color w:val="1E293B"/>
+                <w:sz w:val="18"/>
+              </w:rPr>
+              <w:t xml:space="preserve"> made prominent: navy-bordered outlined button with </w:t>
+            </w:r>
+            <w:r>
+              <w:rPr>
+                <w:rFonts w:ascii="Courier New" w:hAnsi="Courier New"/>
+                <w:color w:val="0F172A"/>
+                <w:sz w:val="18"/>
+              </w:rPr>
+              <w:t>Sign in →</w:t>
+            </w:r>
+            <w:r>
+              <w:rPr>
+                <w:color w:val="1E293B"/>
+                <w:sz w:val="18"/>
+              </w:rPr>
+              <w:t xml:space="preserve"> text. (2) </w:t>
+            </w:r>
+            <w:r>
+              <w:rPr>
+                <w:b/>
+                <w:color w:val="1E293B"/>
+              </w:rPr>
+              <w:t>"Our story"</w:t>
+            </w:r>
+            <w:r>
+              <w:rPr>
+                <w:color w:val="1E293B"/>
+                <w:sz w:val="18"/>
+              </w:rPr>
+              <w:t xml:space="preserve"> nav link coloured blue with arrow; </w:t>
+            </w:r>
+            <w:r>
+              <w:rPr>
+                <w:b/>
+                <w:color w:val="1E293B"/>
+              </w:rPr>
+              <w:t>Pricing</w:t>
+            </w:r>
+            <w:r>
+              <w:rPr>
+                <w:color w:val="1E293B"/>
+                <w:sz w:val="18"/>
+              </w:rPr>
+              <w:t xml:space="preserve"> becomes a gold pill button. (3) </w:t>
+            </w:r>
+            <w:r>
+              <w:rPr>
+                <w:b/>
+                <w:color w:val="1E293B"/>
+              </w:rPr>
+              <w:t>Rolling banner</w:t>
+            </w:r>
+            <w:r>
+              <w:rPr>
+                <w:color w:val="1E293B"/>
+                <w:sz w:val="18"/>
+              </w:rPr>
+              <w:t xml:space="preserve"> (navy ticker) below stats strip: auto-scrolling marquee of testimonial snippets, exam names, and feature highlights using CSS </w:t>
+            </w:r>
+            <w:r>
+              <w:rPr>
+                <w:rFonts w:ascii="Courier New" w:hAnsi="Courier New"/>
+                <w:color w:val="0F172A"/>
+                <w:sz w:val="18"/>
+              </w:rPr>
+              <w:t>marquee-scroll</w:t>
+            </w:r>
+            <w:r>
+              <w:rPr>
+                <w:color w:val="1E293B"/>
+                <w:sz w:val="18"/>
+              </w:rPr>
+              <w:t xml:space="preserve"> keyframe. (4) </w:t>
+            </w:r>
+            <w:r>
+              <w:rPr>
+                <w:b/>
+                <w:color w:val="1E293B"/>
+              </w:rPr>
+              <w:t>Animated motion background</w:t>
+            </w:r>
+            <w:r>
+              <w:rPr>
+                <w:color w:val="1E293B"/>
+                <w:sz w:val="18"/>
+              </w:rPr>
+              <w:t xml:space="preserve"> on hero: 16 floating maths symbols (π, ∑, √, ∫, Δ, etc.) drift upward with staggered fade using </w:t>
+            </w:r>
+            <w:r>
+              <w:rPr>
+                <w:rFonts w:ascii="Courier New" w:hAnsi="Courier New"/>
+                <w:color w:val="0F172A"/>
+                <w:sz w:val="18"/>
+              </w:rPr>
+              <w:t>float-symbol</w:t>
+            </w:r>
+            <w:r>
+              <w:rPr>
+                <w:color w:val="1E293B"/>
+                <w:sz w:val="18"/>
+              </w:rPr>
+              <w:t xml:space="preserve"> keyframe; three gradient orbs pulse with </w:t>
+            </w:r>
+            <w:r>
+              <w:rPr>
+                <w:rFonts w:ascii="Courier New" w:hAnsi="Courier New"/>
+                <w:color w:val="0F172A"/>
+                <w:sz w:val="18"/>
+              </w:rPr>
+              <w:t>pulse-orb</w:t>
+            </w:r>
+            <w:r>
+              <w:rPr>
+                <w:color w:val="1E293B"/>
+                <w:sz w:val="18"/>
+              </w:rPr>
+              <w:t xml:space="preserve"> animation. (5) </w:t>
+            </w:r>
+            <w:r>
+              <w:rPr>
+                <w:b/>
+                <w:color w:val="1E293B"/>
+              </w:rPr>
+              <w:t>Visual exam badges</w:t>
+            </w:r>
+            <w:r>
+              <w:rPr>
+                <w:color w:val="1E293B"/>
+                <w:sz w:val="18"/>
+              </w:rPr>
+              <w:t xml:space="preserve">: hero right panel and Exams section now display circular coloured badges with abbreviation text and emoji icon per exam instead of plain text with left-bar accent. (6) </w:t>
+            </w:r>
+            <w:r>
+              <w:rPr>
+                <w:b/>
+                <w:color w:val="1E293B"/>
+              </w:rPr>
+              <w:t>Human verification CAPTCHA</w:t>
+            </w:r>
+            <w:r>
+              <w:rPr>
+                <w:color w:val="1E293B"/>
+                <w:sz w:val="18"/>
+              </w:rPr>
+              <w:t xml:space="preserve"> on testimonial form: math challenge (</w:t>
+            </w:r>
+            <w:r>
+              <w:rPr>
+                <w:rFonts w:ascii="Courier New" w:hAnsi="Courier New"/>
+                <w:color w:val="0F172A"/>
+                <w:sz w:val="18"/>
+              </w:rPr>
+              <w:t>What is A + B?</w:t>
+            </w:r>
+            <w:r>
+              <w:rPr>
+                <w:color w:val="1E293B"/>
+                <w:sz w:val="18"/>
+              </w:rPr>
+              <w:t xml:space="preserve">) + invisible honeypot field. Bot submissions rejected client-side before API call. (7) </w:t>
+            </w:r>
+            <w:r>
+              <w:rPr>
+                <w:b/>
+                <w:color w:val="1E293B"/>
+              </w:rPr>
+              <w:t>Adventure Mode overhaul</w:t>
+            </w:r>
+            <w:r>
+              <w:rPr>
+                <w:color w:val="1E293B"/>
+                <w:sz w:val="18"/>
+              </w:rPr>
+              <w:t xml:space="preserve">: rank system (Novice → Explorer → Scholar → Expert → Champion → Legend) with animated rank-glow border and XP progress bar to next rank; combo multiplier system (×2 at 3-streak, ×3 at 5-streak) with </w:t>
+            </w:r>
+            <w:r>
+              <w:rPr>
+                <w:rFonts w:ascii="Courier New" w:hAnsi="Courier New"/>
+                <w:color w:val="0F172A"/>
+                <w:sz w:val="18"/>
+              </w:rPr>
+              <w:t>combo-pop</w:t>
+            </w:r>
+            <w:r>
+              <w:rPr>
+                <w:color w:val="1E293B"/>
+                <w:sz w:val="18"/>
+              </w:rPr>
+              <w:t xml:space="preserve"> animation in HUD; block shake animation on wrong answer (</w:t>
+            </w:r>
+            <w:r>
+              <w:rPr>
+                <w:rFonts w:ascii="Courier New" w:hAnsi="Courier New"/>
+                <w:color w:val="0F172A"/>
+                <w:sz w:val="18"/>
+              </w:rPr>
+              <w:t>shake-x</w:t>
+            </w:r>
+            <w:r>
+              <w:rPr>
+                <w:color w:val="1E293B"/>
+                <w:sz w:val="18"/>
+              </w:rPr>
+              <w:t>); block bounce on correct answer (</w:t>
+            </w:r>
+            <w:r>
+              <w:rPr>
+                <w:rFonts w:ascii="Courier New" w:hAnsi="Courier New"/>
+                <w:color w:val="0F172A"/>
+                <w:sz w:val="18"/>
+              </w:rPr>
+              <w:t>correct-bounce</w:t>
+            </w:r>
+            <w:r>
+              <w:rPr>
+                <w:color w:val="1E293B"/>
+                <w:sz w:val="18"/>
+              </w:rPr>
+              <w:t xml:space="preserve">); spinning loader while fetching questions; chapter numbers in world map; best-combo display on stage-complete and game-over screens; animated sequential star reveal on stage-complete; animated skull bounce on game-over with red-pulse background flash. (8) </w:t>
+            </w:r>
+            <w:r>
+              <w:rPr>
+                <w:b/>
+                <w:color w:val="1E293B"/>
+              </w:rPr>
+              <w:t>DESIGN.docx</w:t>
+            </w:r>
+            <w:r>
+              <w:rPr>
+                <w:color w:val="1E293B"/>
+                <w:sz w:val="18"/>
+              </w:rPr>
+              <w:t xml:space="preserve"> now includes a visual appendix of three matplotlib-generated diagrams: system architecture (component boxes with arrows), user journey funnel, and learning modes overview — auto-generated by </w:t>
+            </w:r>
+            <w:r>
+              <w:rPr>
+                <w:rFonts w:ascii="Courier New" w:hAnsi="Courier New"/>
+                <w:color w:val="0F172A"/>
+                <w:sz w:val="18"/>
+              </w:rPr>
+              <w:t>scripts/generate_design_doc.py</w:t>
+            </w:r>
+            <w:r>
+              <w:rPr>
+                <w:color w:val="1E293B"/>
+                <w:sz w:val="18"/>
+              </w:rPr>
+              <w:t xml:space="preserve"> when </w:t>
+            </w:r>
+            <w:r>
+              <w:rPr>
+                <w:rFonts w:ascii="Courier New" w:hAnsi="Courier New"/>
+                <w:color w:val="0F172A"/>
+                <w:sz w:val="18"/>
+              </w:rPr>
+              <w:t>matplotlib</w:t>
+            </w:r>
+            <w:r>
+              <w:rPr>
+                <w:color w:val="1E293B"/>
+                <w:sz w:val="18"/>
+              </w:rPr>
+              <w:t xml:space="preserve"> is installed</w:t>
             </w:r>
           </w:p>
         </w:tc>
@@ -28457,7 +29171,7 @@
                 <w:b/>
                 <w:color w:val="1E293B"/>
               </w:rPr>
-              <w:t>v0.26.0</w:t>
+              <w:t>v0.27.0</w:t>
             </w:r>
           </w:p>
         </w:tc>
@@ -28507,112 +29221,7 @@
                 <w:color w:val="1E293B"/>
                 <w:sz w:val="18"/>
               </w:rPr>
-              <w:t xml:space="preserve">DoS protection — three-layer defence: (1) Upstash Redis distributed rate limiting replaces the defunct in-memory </w:t>
-            </w:r>
-            <w:r>
-              <w:rPr>
-                <w:rFonts w:ascii="Courier New" w:hAnsi="Courier New"/>
-                <w:color w:val="0F172A"/>
-                <w:sz w:val="18"/>
-              </w:rPr>
-              <w:t>Map</w:t>
-            </w:r>
-            <w:r>
-              <w:rPr>
-                <w:color w:val="1E293B"/>
-                <w:sz w:val="18"/>
-              </w:rPr>
-              <w:t xml:space="preserve"> in </w:t>
-            </w:r>
-            <w:r>
-              <w:rPr>
-                <w:rFonts w:ascii="Courier New" w:hAnsi="Courier New"/>
-                <w:color w:val="0F172A"/>
-                <w:sz w:val="18"/>
-              </w:rPr>
-              <w:t>lib/ratelimit.ts</w:t>
-            </w:r>
-            <w:r>
-              <w:rPr>
-                <w:color w:val="1E293B"/>
-                <w:sz w:val="18"/>
-              </w:rPr>
-              <w:t xml:space="preserve"> — sliding window, graceful in-memory fallback when env vars absent, unique Redis prefix per endpoint. </w:t>
-            </w:r>
-            <w:r>
-              <w:rPr>
-                <w:rFonts w:ascii="Courier New" w:hAnsi="Courier New"/>
-                <w:color w:val="0F172A"/>
-                <w:sz w:val="18"/>
-              </w:rPr>
-              <w:t>middleware.ts</w:t>
-            </w:r>
-            <w:r>
-              <w:rPr>
-                <w:color w:val="1E293B"/>
-                <w:sz w:val="18"/>
-              </w:rPr>
-              <w:t xml:space="preserve"> deprecated → renamed to </w:t>
-            </w:r>
-            <w:r>
-              <w:rPr>
-                <w:rFonts w:ascii="Courier New" w:hAnsi="Courier New"/>
-                <w:color w:val="0F172A"/>
-                <w:sz w:val="18"/>
-              </w:rPr>
-              <w:t>proxy.ts</w:t>
-            </w:r>
-            <w:r>
-              <w:rPr>
-                <w:color w:val="1E293B"/>
-                <w:sz w:val="18"/>
-              </w:rPr>
-              <w:t xml:space="preserve"> per Next.js 16 proxy convention; proxy runs a blanket 120-req/60s-per-IP gate on all </w:t>
-            </w:r>
-            <w:r>
-              <w:rPr>
-                <w:rFonts w:ascii="Courier New" w:hAnsi="Courier New"/>
-                <w:color w:val="0F172A"/>
-                <w:sz w:val="18"/>
-              </w:rPr>
-              <w:t>/api/*</w:t>
-            </w:r>
-            <w:r>
-              <w:rPr>
-                <w:color w:val="1E293B"/>
-                <w:sz w:val="18"/>
-              </w:rPr>
-              <w:t xml:space="preserve"> routes before any serverless function is invoked. (2) Per-endpoint fine-grained limits: </w:t>
-            </w:r>
-            <w:r>
-              <w:rPr>
-                <w:rFonts w:ascii="Courier New" w:hAnsi="Courier New"/>
-                <w:color w:val="0F172A"/>
-                <w:sz w:val="18"/>
-              </w:rPr>
-              <w:t>/api/chat</w:t>
-            </w:r>
-            <w:r>
-              <w:rPr>
-                <w:color w:val="1E293B"/>
-                <w:sz w:val="18"/>
-              </w:rPr>
-              <w:t xml:space="preserve"> 30/60s, </w:t>
-            </w:r>
-            <w:r>
-              <w:rPr>
-                <w:rFonts w:ascii="Courier New" w:hAnsi="Courier New"/>
-                <w:color w:val="0F172A"/>
-                <w:sz w:val="18"/>
-              </w:rPr>
-              <w:t>/api/trivia</w:t>
-            </w:r>
-            <w:r>
-              <w:rPr>
-                <w:color w:val="1E293B"/>
-                <w:sz w:val="18"/>
-              </w:rPr>
-              <w:t xml:space="preserve"> 10/60s, `/api/exam/generate</w:t>
+              <w:t>Landing page copy fixes — FAQ "Do I need an account?" updated to mention 20-question/day guest limit and midnight reset; correctly states Exam Mode and Adventure Mode require an account. Trust badge "Free to use / no premium tier" corrected to "Free to start / 7-day trial then $9.99/month AUD". Guest badge updated to "20 free questions a day"</w:t>
             </w:r>
           </w:p>
         </w:tc>
@@ -28639,7 +29248,7 @@
                 <w:b/>
                 <w:color w:val="1E293B"/>
               </w:rPr>
-              <w:t>v0.25.0</w:t>
+              <w:t>v0.26.0</w:t>
             </w:r>
           </w:p>
         </w:tc>
@@ -28689,7 +29298,7 @@
                 <w:color w:val="1E293B"/>
                 <w:sz w:val="18"/>
               </w:rPr>
-              <w:t xml:space="preserve">Automated security agent — (1) </w:t>
+              <w:t xml:space="preserve">DoS protection — three-layer defence: (1) Upstash Redis distributed rate limiting replaces the defunct in-memory </w:t>
             </w:r>
             <w:r>
               <w:rPr>
@@ -28697,14 +29306,14 @@
                 <w:color w:val="0F172A"/>
                 <w:sz w:val="18"/>
               </w:rPr>
-              <w:t>next.config.ts</w:t>
-            </w:r>
-            <w:r>
-              <w:rPr>
-                <w:color w:val="1E293B"/>
-                <w:sz w:val="18"/>
-              </w:rPr>
-              <w:t xml:space="preserve"> now sets 7 HTTP security headers on every route: </w:t>
+              <w:t>Map</w:t>
+            </w:r>
+            <w:r>
+              <w:rPr>
+                <w:color w:val="1E293B"/>
+                <w:sz w:val="18"/>
+              </w:rPr>
+              <w:t xml:space="preserve"> in </w:t>
             </w:r>
             <w:r>
               <w:rPr>
@@ -28712,14 +29321,14 @@
                 <w:color w:val="0F172A"/>
                 <w:sz w:val="18"/>
               </w:rPr>
-              <w:t>X-Frame-Options: SAMEORIGIN</w:t>
-            </w:r>
-            <w:r>
-              <w:rPr>
-                <w:color w:val="1E293B"/>
-                <w:sz w:val="18"/>
-              </w:rPr>
-              <w:t xml:space="preserve">, </w:t>
+              <w:t>lib/ratelimit.ts</w:t>
+            </w:r>
+            <w:r>
+              <w:rPr>
+                <w:color w:val="1E293B"/>
+                <w:sz w:val="18"/>
+              </w:rPr>
+              <w:t xml:space="preserve"> — sliding window, graceful in-memory fallback when env vars absent, unique Redis prefix per endpoint. </w:t>
             </w:r>
             <w:r>
               <w:rPr>
@@ -28727,14 +29336,14 @@
                 <w:color w:val="0F172A"/>
                 <w:sz w:val="18"/>
               </w:rPr>
-              <w:t>X-Content-Type-Options: nosniff</w:t>
-            </w:r>
-            <w:r>
-              <w:rPr>
-                <w:color w:val="1E293B"/>
-                <w:sz w:val="18"/>
-              </w:rPr>
-              <w:t xml:space="preserve">, </w:t>
+              <w:t>middleware.ts</w:t>
+            </w:r>
+            <w:r>
+              <w:rPr>
+                <w:color w:val="1E293B"/>
+                <w:sz w:val="18"/>
+              </w:rPr>
+              <w:t xml:space="preserve"> deprecated → renamed to </w:t>
             </w:r>
             <w:r>
               <w:rPr>
@@ -28742,14 +29351,14 @@
                 <w:color w:val="0F172A"/>
                 <w:sz w:val="18"/>
               </w:rPr>
-              <w:t>Referrer-Policy: strict-origin-when-cross-origin</w:t>
-            </w:r>
-            <w:r>
-              <w:rPr>
-                <w:color w:val="1E293B"/>
-                <w:sz w:val="18"/>
-              </w:rPr>
-              <w:t xml:space="preserve">, </w:t>
+              <w:t>proxy.ts</w:t>
+            </w:r>
+            <w:r>
+              <w:rPr>
+                <w:color w:val="1E293B"/>
+                <w:sz w:val="18"/>
+              </w:rPr>
+              <w:t xml:space="preserve"> per Next.js 16 proxy convention; proxy runs a blanket 120-req/60s-per-IP gate on all </w:t>
             </w:r>
             <w:r>
               <w:rPr>
@@ -28757,14 +29366,14 @@
                 <w:color w:val="0F172A"/>
                 <w:sz w:val="18"/>
               </w:rPr>
-              <w:t>Permissions-Policy</w:t>
-            </w:r>
-            <w:r>
-              <w:rPr>
-                <w:color w:val="1E293B"/>
-                <w:sz w:val="18"/>
-              </w:rPr>
-              <w:t xml:space="preserve"> (blocks camera/mic/geo/payment), </w:t>
+              <w:t>/api/*</w:t>
+            </w:r>
+            <w:r>
+              <w:rPr>
+                <w:color w:val="1E293B"/>
+                <w:sz w:val="18"/>
+              </w:rPr>
+              <w:t xml:space="preserve"> routes before any serverless function is invoked. (2) Per-endpoint fine-grained limits: </w:t>
             </w:r>
             <w:r>
               <w:rPr>
@@ -28772,14 +29381,14 @@
                 <w:color w:val="0F172A"/>
                 <w:sz w:val="18"/>
               </w:rPr>
-              <w:t>Strict-Transport-Security</w:t>
-            </w:r>
-            <w:r>
-              <w:rPr>
-                <w:color w:val="1E293B"/>
-                <w:sz w:val="18"/>
-              </w:rPr>
-              <w:t xml:space="preserve"> (2yr + preload), </w:t>
+              <w:t>/api/chat</w:t>
+            </w:r>
+            <w:r>
+              <w:rPr>
+                <w:color w:val="1E293B"/>
+                <w:sz w:val="18"/>
+              </w:rPr>
+              <w:t xml:space="preserve"> 30/60s, </w:t>
             </w:r>
             <w:r>
               <w:rPr>
@@ -28787,44 +29396,14 @@
                 <w:color w:val="0F172A"/>
                 <w:sz w:val="18"/>
               </w:rPr>
-              <w:t>X-DNS-Prefetch-Control</w:t>
-            </w:r>
-            <w:r>
-              <w:rPr>
-                <w:color w:val="1E293B"/>
-                <w:sz w:val="18"/>
-              </w:rPr>
-              <w:t xml:space="preserve">, and a full </w:t>
-            </w:r>
-            <w:r>
-              <w:rPr>
-                <w:rFonts w:ascii="Courier New" w:hAnsi="Courier New"/>
-                <w:color w:val="0F172A"/>
-                <w:sz w:val="18"/>
-              </w:rPr>
-              <w:t>Content-Security-Policy</w:t>
-            </w:r>
-            <w:r>
-              <w:rPr>
-                <w:color w:val="1E293B"/>
-                <w:sz w:val="18"/>
-              </w:rPr>
-              <w:t xml:space="preserve"> covering script/style/font/img/connect/frame origins for Clerk, Stripe, KaTeX, Google Fonts, and Vercel Analytics. (2) </w:t>
-            </w:r>
-            <w:r>
-              <w:rPr>
-                <w:rFonts w:ascii="Courier New" w:hAnsi="Courier New"/>
-                <w:color w:val="0F172A"/>
-                <w:sz w:val="18"/>
-              </w:rPr>
-              <w:t>scripts/pentest.mjs</w:t>
-            </w:r>
-            <w:r>
-              <w:rPr>
-                <w:color w:val="1E293B"/>
-                <w:sz w:val="18"/>
-              </w:rPr>
-              <w:t xml:space="preserve"> — runnable Node.js audit that checks headers, probes 7 API endpoints for unauthenticated access, runs npm audit, scans codebase for dangerous patterns (dangerouslySetInnerHTML, eval, hardcoded secrets, SQL injection, wildcard CORS, sensitive console.log, NEXT_PUBLIC_ secrets, missing auth on API routes), and checks TLS redirect; outputs structured JSON. (3) Weekly Claude Code agent scheduled trigger (every Monday 18:00 UTC) — runs the audit, auto-fixes CRITICAL/HIGH findings, rebuilds, deploys, re-audits to confirm, updates DESIGN.md, and emails the founder a markdown report</w:t>
+              <w:t>/api/trivia</w:t>
+            </w:r>
+            <w:r>
+              <w:rPr>
+                <w:color w:val="1E293B"/>
+                <w:sz w:val="18"/>
+              </w:rPr>
+              <w:t xml:space="preserve"> 10/60s, `/api/exam/generate</w:t>
             </w:r>
           </w:p>
         </w:tc>
@@ -28851,7 +29430,7 @@
                 <w:b/>
                 <w:color w:val="1E293B"/>
               </w:rPr>
-              <w:t>v0.24.0</w:t>
+              <w:t>v0.25.0</w:t>
             </w:r>
           </w:p>
         </w:tc>
@@ -28901,7 +29480,7 @@
                 <w:color w:val="1E293B"/>
                 <w:sz w:val="18"/>
               </w:rPr>
-              <w:t>Guest 20-questions/day limit — anonymous users (no Clerk session, no child session) are now gated at 20 questions per day via localStorage (</w:t>
+              <w:t xml:space="preserve">Automated security agent — (1) </w:t>
             </w:r>
             <w:r>
               <w:rPr>
@@ -28909,14 +29488,14 @@
                 <w:color w:val="0F172A"/>
                 <w:sz w:val="18"/>
               </w:rPr>
-              <w:t>selected_guest_usage: {count, date}</w:t>
-            </w:r>
-            <w:r>
-              <w:rPr>
-                <w:color w:val="1E293B"/>
-                <w:sz w:val="18"/>
-              </w:rPr>
-              <w:t xml:space="preserve">). On limit hit or locked-mode attempt, </w:t>
+              <w:t>next.config.ts</w:t>
+            </w:r>
+            <w:r>
+              <w:rPr>
+                <w:color w:val="1E293B"/>
+                <w:sz w:val="18"/>
+              </w:rPr>
+              <w:t xml:space="preserve"> now sets 7 HTTP security headers on every route: </w:t>
             </w:r>
             <w:r>
               <w:rPr>
@@ -28924,14 +29503,14 @@
                 <w:color w:val="0F172A"/>
                 <w:sz w:val="18"/>
               </w:rPr>
-              <w:t>GuestLimitModal</w:t>
-            </w:r>
-            <w:r>
-              <w:rPr>
-                <w:color w:val="1E293B"/>
-                <w:sz w:val="18"/>
-              </w:rPr>
-              <w:t xml:space="preserve"> opens: shows reset countdown to midnight, "Start free 7-day trial" (Clerk SignUpButton modal) and "I already have an account" (SignInButton modal). Header badge shows </w:t>
+              <w:t>X-Frame-Options: SAMEORIGIN</w:t>
+            </w:r>
+            <w:r>
+              <w:rPr>
+                <w:color w:val="1E293B"/>
+                <w:sz w:val="18"/>
+              </w:rPr>
+              <w:t xml:space="preserve">, </w:t>
             </w:r>
             <w:r>
               <w:rPr>
@@ -28939,14 +29518,14 @@
                 <w:color w:val="0F172A"/>
                 <w:sz w:val="18"/>
               </w:rPr>
-              <w:t>X/20 questions today</w:t>
-            </w:r>
-            <w:r>
-              <w:rPr>
-                <w:color w:val="1E293B"/>
-                <w:sz w:val="18"/>
-              </w:rPr>
-              <w:t xml:space="preserve"> for guests (turns red at limit). Signed-in parents and child sessions continue to use server-side tracking. </w:t>
+              <w:t>X-Content-Type-Options: nosniff</w:t>
+            </w:r>
+            <w:r>
+              <w:rPr>
+                <w:color w:val="1E293B"/>
+                <w:sz w:val="18"/>
+              </w:rPr>
+              <w:t xml:space="preserve">, </w:t>
             </w:r>
             <w:r>
               <w:rPr>
@@ -28954,14 +29533,89 @@
                 <w:color w:val="0F172A"/>
                 <w:sz w:val="18"/>
               </w:rPr>
-              <w:t>app/components/GuestLimitModal.tsx</w:t>
-            </w:r>
-            <w:r>
-              <w:rPr>
-                <w:color w:val="1E293B"/>
-                <w:sz w:val="18"/>
-              </w:rPr>
-              <w:t xml:space="preserve"> added</w:t>
+              <w:t>Referrer-Policy: strict-origin-when-cross-origin</w:t>
+            </w:r>
+            <w:r>
+              <w:rPr>
+                <w:color w:val="1E293B"/>
+                <w:sz w:val="18"/>
+              </w:rPr>
+              <w:t xml:space="preserve">, </w:t>
+            </w:r>
+            <w:r>
+              <w:rPr>
+                <w:rFonts w:ascii="Courier New" w:hAnsi="Courier New"/>
+                <w:color w:val="0F172A"/>
+                <w:sz w:val="18"/>
+              </w:rPr>
+              <w:t>Permissions-Policy</w:t>
+            </w:r>
+            <w:r>
+              <w:rPr>
+                <w:color w:val="1E293B"/>
+                <w:sz w:val="18"/>
+              </w:rPr>
+              <w:t xml:space="preserve"> (blocks camera/mic/geo/payment), </w:t>
+            </w:r>
+            <w:r>
+              <w:rPr>
+                <w:rFonts w:ascii="Courier New" w:hAnsi="Courier New"/>
+                <w:color w:val="0F172A"/>
+                <w:sz w:val="18"/>
+              </w:rPr>
+              <w:t>Strict-Transport-Security</w:t>
+            </w:r>
+            <w:r>
+              <w:rPr>
+                <w:color w:val="1E293B"/>
+                <w:sz w:val="18"/>
+              </w:rPr>
+              <w:t xml:space="preserve"> (2yr + preload), </w:t>
+            </w:r>
+            <w:r>
+              <w:rPr>
+                <w:rFonts w:ascii="Courier New" w:hAnsi="Courier New"/>
+                <w:color w:val="0F172A"/>
+                <w:sz w:val="18"/>
+              </w:rPr>
+              <w:t>X-DNS-Prefetch-Control</w:t>
+            </w:r>
+            <w:r>
+              <w:rPr>
+                <w:color w:val="1E293B"/>
+                <w:sz w:val="18"/>
+              </w:rPr>
+              <w:t xml:space="preserve">, and a full </w:t>
+            </w:r>
+            <w:r>
+              <w:rPr>
+                <w:rFonts w:ascii="Courier New" w:hAnsi="Courier New"/>
+                <w:color w:val="0F172A"/>
+                <w:sz w:val="18"/>
+              </w:rPr>
+              <w:t>Content-Security-Policy</w:t>
+            </w:r>
+            <w:r>
+              <w:rPr>
+                <w:color w:val="1E293B"/>
+                <w:sz w:val="18"/>
+              </w:rPr>
+              <w:t xml:space="preserve"> covering script/style/font/img/connect/frame origins for Clerk, Stripe, KaTeX, Google Fonts, and Vercel Analytics. (2) </w:t>
+            </w:r>
+            <w:r>
+              <w:rPr>
+                <w:rFonts w:ascii="Courier New" w:hAnsi="Courier New"/>
+                <w:color w:val="0F172A"/>
+                <w:sz w:val="18"/>
+              </w:rPr>
+              <w:t>scripts/pentest.mjs</w:t>
+            </w:r>
+            <w:r>
+              <w:rPr>
+                <w:color w:val="1E293B"/>
+                <w:sz w:val="18"/>
+              </w:rPr>
+              <w:t xml:space="preserve"> — runnable Node.js audit that checks headers, probes 7 API endpoints for unauthenticated access, runs npm audit, scans codebase for dangerous patterns (dangerouslySetInnerHTML, eval, hardcoded secrets, SQL injection, wildcard CORS, sensitive console.log, NEXT_PUBLIC_ secrets, missing auth on API routes), and checks TLS redirect; outputs structured JSON. (3) Weekly Claude Code agent scheduled trigger (every Monday 18:00 UTC) — runs the audit, auto-fixes CRITICAL/HIGH findings, rebuilds, deploys, re-audits to confirm, updates DESIGN.md, and emails the founder a markdown report</w:t>
             </w:r>
           </w:p>
         </w:tc>
@@ -28988,7 +29642,7 @@
                 <w:b/>
                 <w:color w:val="1E293B"/>
               </w:rPr>
-              <w:t>v0.23.0</w:t>
+              <w:t>v0.24.0</w:t>
             </w:r>
           </w:p>
         </w:tc>
@@ -29038,6 +29692,143 @@
                 <w:color w:val="1E293B"/>
                 <w:sz w:val="18"/>
               </w:rPr>
+              <w:t>Guest 20-questions/day limit — anonymous users (no Clerk session, no child session) are now gated at 20 questions per day via localStorage (</w:t>
+            </w:r>
+            <w:r>
+              <w:rPr>
+                <w:rFonts w:ascii="Courier New" w:hAnsi="Courier New"/>
+                <w:color w:val="0F172A"/>
+                <w:sz w:val="18"/>
+              </w:rPr>
+              <w:t>selected_guest_usage: {count, date}</w:t>
+            </w:r>
+            <w:r>
+              <w:rPr>
+                <w:color w:val="1E293B"/>
+                <w:sz w:val="18"/>
+              </w:rPr>
+              <w:t xml:space="preserve">). On limit hit or locked-mode attempt, </w:t>
+            </w:r>
+            <w:r>
+              <w:rPr>
+                <w:rFonts w:ascii="Courier New" w:hAnsi="Courier New"/>
+                <w:color w:val="0F172A"/>
+                <w:sz w:val="18"/>
+              </w:rPr>
+              <w:t>GuestLimitModal</w:t>
+            </w:r>
+            <w:r>
+              <w:rPr>
+                <w:color w:val="1E293B"/>
+                <w:sz w:val="18"/>
+              </w:rPr>
+              <w:t xml:space="preserve"> opens: shows reset countdown to midnight, "Start free 7-day trial" (Clerk SignUpButton modal) and "I already have an account" (SignInButton modal). Header badge shows </w:t>
+            </w:r>
+            <w:r>
+              <w:rPr>
+                <w:rFonts w:ascii="Courier New" w:hAnsi="Courier New"/>
+                <w:color w:val="0F172A"/>
+                <w:sz w:val="18"/>
+              </w:rPr>
+              <w:t>X/20 questions today</w:t>
+            </w:r>
+            <w:r>
+              <w:rPr>
+                <w:color w:val="1E293B"/>
+                <w:sz w:val="18"/>
+              </w:rPr>
+              <w:t xml:space="preserve"> for guests (turns red at limit). Signed-in parents and child sessions continue to use server-side tracking. </w:t>
+            </w:r>
+            <w:r>
+              <w:rPr>
+                <w:rFonts w:ascii="Courier New" w:hAnsi="Courier New"/>
+                <w:color w:val="0F172A"/>
+                <w:sz w:val="18"/>
+              </w:rPr>
+              <w:t>app/components/GuestLimitModal.tsx</w:t>
+            </w:r>
+            <w:r>
+              <w:rPr>
+                <w:color w:val="1E293B"/>
+                <w:sz w:val="18"/>
+              </w:rPr>
+              <w:t xml:space="preserve"> added</w:t>
+            </w:r>
+          </w:p>
+        </w:tc>
+      </w:tr>
+      <w:tr>
+        <w:tc>
+          <w:tcPr>
+            <w:tcW w:type="dxa" w:w="3024"/>
+            <w:shd w:val="clear" w:color="auto" w:fill="FFFFFF"/>
+            <w:tcBorders>
+              <w:top w:val="single" w:sz="4" w:space="0" w:color="E2E8F0"/>
+              <w:left w:val="single" w:sz="4" w:space="0" w:color="E2E8F0"/>
+              <w:bottom w:val="single" w:sz="4" w:space="0" w:color="E2E8F0"/>
+              <w:right w:val="single" w:sz="4" w:space="0" w:color="E2E8F0"/>
+            </w:tcBorders>
+          </w:tcPr>
+          <w:p>
+            <w:pPr>
+              <w:spacing w:before="30" w:after="30"/>
+            </w:pPr>
+            <w:r/>
+            <w:r>
+              <w:rPr>
+                <w:b/>
+                <w:color w:val="1E293B"/>
+              </w:rPr>
+              <w:t>v0.23.0</w:t>
+            </w:r>
+          </w:p>
+        </w:tc>
+        <w:tc>
+          <w:tcPr>
+            <w:tcW w:type="dxa" w:w="3024"/>
+            <w:shd w:val="clear" w:color="auto" w:fill="FFFFFF"/>
+            <w:tcBorders>
+              <w:top w:val="single" w:sz="4" w:space="0" w:color="E2E8F0"/>
+              <w:left w:val="single" w:sz="4" w:space="0" w:color="E2E8F0"/>
+              <w:bottom w:val="single" w:sz="4" w:space="0" w:color="E2E8F0"/>
+              <w:right w:val="single" w:sz="4" w:space="0" w:color="E2E8F0"/>
+            </w:tcBorders>
+          </w:tcPr>
+          <w:p>
+            <w:pPr>
+              <w:spacing w:before="30" w:after="30"/>
+            </w:pPr>
+            <w:r/>
+            <w:r>
+              <w:rPr>
+                <w:color w:val="1E293B"/>
+                <w:sz w:val="18"/>
+              </w:rPr>
+              <w:t>July 2026</w:t>
+            </w:r>
+          </w:p>
+        </w:tc>
+        <w:tc>
+          <w:tcPr>
+            <w:tcW w:type="dxa" w:w="3024"/>
+            <w:shd w:val="clear" w:color="auto" w:fill="FFFFFF"/>
+            <w:tcBorders>
+              <w:top w:val="single" w:sz="4" w:space="0" w:color="E2E8F0"/>
+              <w:left w:val="single" w:sz="4" w:space="0" w:color="E2E8F0"/>
+              <w:bottom w:val="single" w:sz="4" w:space="0" w:color="E2E8F0"/>
+              <w:right w:val="single" w:sz="4" w:space="0" w:color="E2E8F0"/>
+            </w:tcBorders>
+          </w:tcPr>
+          <w:p>
+            <w:pPr>
+              <w:spacing w:before="30" w:after="30"/>
+            </w:pPr>
+            <w:r/>
+            <w:r>
+              <w:rPr>
+                <w:color w:val="1E293B"/>
+                <w:sz w:val="18"/>
+              </w:rPr>
               <w:t xml:space="preserve">Landing page: exam coverage panel, testimonials section, FAQ accordion — (1) Hero redesigned to two-column layout on desktop: text/CTAs left, exam coverage panel right. Panel shows 8 colour-coded exam badges (AMC, Olympiad, ACER, ICAS, ATAR, NAPLAN, Bebras, KSF) with name, full title, year range, and coloured accent bar. Includes legal disclaimer: "SelectEd is an independent preparation platform. Not affiliated with, endorsed by, or connected to the organisations that administer these assessments." (2) Testimonials section added (after Founder card): 3 hardcoded seed cards + fetched approved DB testimonials; "Share your experience →" opens inline form (name, location, star rating, quote); </w:t>
             </w:r>
             <w:r>
@@ -29142,7 +29933,7 @@
           <w:i/>
           <w:color w:val="1E293B"/>
         </w:rPr>
-        <w:t>Document last updated: 1 July 2026 (v0.29). Updated alongside the codebase whenever routes, components, or UX decisions change.</w:t>
+        <w:t>Document last updated: 1 July 2026 (v0.30). Updated alongside the codebase whenever routes, components, or UX decisions change.</w:t>
       </w:r>
     </w:p>
     <w:p>

</xml_diff>

<commit_message>
docs: v0.31.0 — custom sign-up form entry in version history
Co-Authored-By: Claude Sonnet 4.6 <noreply@anthropic.com>
</commit_message>
<xml_diff>
--- a/DESIGN.docx
+++ b/DESIGN.docx
@@ -27777,7 +27777,7 @@
                 <w:b/>
                 <w:color w:val="1E293B"/>
               </w:rPr>
-              <w:t>v0.30.0</w:t>
+              <w:t>v0.31.0</w:t>
             </w:r>
           </w:p>
         </w:tc>
@@ -27827,21 +27827,7 @@
                 <w:color w:val="1E293B"/>
                 <w:sz w:val="18"/>
               </w:rPr>
-              <w:t xml:space="preserve">Cinematic hero background — (1) </w:t>
-            </w:r>
-            <w:r>
-              <w:rPr>
-                <w:b/>
-                <w:color w:val="1E293B"/>
-              </w:rPr>
-              <w:t>Video background infrastructure</w:t>
-            </w:r>
-            <w:r>
-              <w:rPr>
-                <w:color w:val="1E293B"/>
-                <w:sz w:val="18"/>
-              </w:rPr>
-              <w:t xml:space="preserve">: hero section now mounts an HTML5 </w:t>
+              <w:t xml:space="preserve">Custom sign-up form — phone number removal and Clerk v7 Future API migration. Replaced Clerk's built-in </w:t>
             </w:r>
             <w:r>
               <w:rPr>
@@ -27849,14 +27835,14 @@
                 <w:color w:val="0F172A"/>
                 <w:sz w:val="18"/>
               </w:rPr>
-              <w:t>&lt;video autoPlay muted loop playsInline&gt;</w:t>
-            </w:r>
-            <w:r>
-              <w:rPr>
-                <w:color w:val="1E293B"/>
-                <w:sz w:val="18"/>
-              </w:rPr>
-              <w:t xml:space="preserve"> element pointing to </w:t>
+              <w:t>&lt;SignUp /&gt;</w:t>
+            </w:r>
+            <w:r>
+              <w:rPr>
+                <w:color w:val="1E293B"/>
+                <w:sz w:val="18"/>
+              </w:rPr>
+              <w:t xml:space="preserve"> modal with a fully custom sign-up page (</w:t>
             </w:r>
             <w:r>
               <w:rPr>
@@ -27864,14 +27850,14 @@
                 <w:color w:val="0F172A"/>
                 <w:sz w:val="18"/>
               </w:rPr>
-              <w:t>/public/tutor-bg.mp4</w:t>
-            </w:r>
-            <w:r>
-              <w:rPr>
-                <w:color w:val="1E293B"/>
-                <w:sz w:val="18"/>
-              </w:rPr>
-              <w:t xml:space="preserve">. </w:t>
+              <w:t>app/sign-up/[[...sign-up]]/page.tsx</w:t>
+            </w:r>
+            <w:r>
+              <w:rPr>
+                <w:color w:val="1E293B"/>
+                <w:sz w:val="18"/>
+              </w:rPr>
+              <w:t>) using Clerk's programmatic Future API (</w:t>
             </w:r>
             <w:r>
               <w:rPr>
@@ -27879,14 +27865,14 @@
                 <w:color w:val="0F172A"/>
                 <w:sz w:val="18"/>
               </w:rPr>
-              <w:t>videoBgReady</w:t>
-            </w:r>
-            <w:r>
-              <w:rPr>
-                <w:color w:val="1E293B"/>
-                <w:sz w:val="18"/>
-              </w:rPr>
-              <w:t xml:space="preserve"> React state tracks </w:t>
+              <w:t>useSignUp()</w:t>
+            </w:r>
+            <w:r>
+              <w:rPr>
+                <w:color w:val="1E293B"/>
+                <w:sz w:val="18"/>
+              </w:rPr>
+              <w:t xml:space="preserve"> returning </w:t>
             </w:r>
             <w:r>
               <w:rPr>
@@ -27894,14 +27880,14 @@
                 <w:color w:val="0F172A"/>
                 <w:sz w:val="18"/>
               </w:rPr>
-              <w:t>onCanPlay</w:t>
-            </w:r>
-            <w:r>
-              <w:rPr>
-                <w:color w:val="1E293B"/>
-                <w:sz w:val="18"/>
-              </w:rPr>
-              <w:t xml:space="preserve">; the video fades in with a 1.2 s opacity transition once loaded. When no video file is present (or on load failure), </w:t>
+              <w:t>{ signUp, fetchStatus }</w:t>
+            </w:r>
+            <w:r>
+              <w:rPr>
+                <w:color w:val="1E293B"/>
+                <w:sz w:val="18"/>
+              </w:rPr>
+              <w:t xml:space="preserve">). Flow: email + password + optional name → </w:t>
             </w:r>
             <w:r>
               <w:rPr>
@@ -27909,14 +27895,14 @@
                 <w:color w:val="0F172A"/>
                 <w:sz w:val="18"/>
               </w:rPr>
-              <w:t>videoBgReady</w:t>
-            </w:r>
-            <w:r>
-              <w:rPr>
-                <w:color w:val="1E293B"/>
-                <w:sz w:val="18"/>
-              </w:rPr>
-              <w:t xml:space="preserve"> stays </w:t>
+              <w:t>signUp.password()</w:t>
+            </w:r>
+            <w:r>
+              <w:rPr>
+                <w:color w:val="1E293B"/>
+                <w:sz w:val="18"/>
+              </w:rPr>
+              <w:t xml:space="preserve"> → </w:t>
             </w:r>
             <w:r>
               <w:rPr>
@@ -27924,28 +27910,14 @@
                 <w:color w:val="0F172A"/>
                 <w:sz w:val="18"/>
               </w:rPr>
-              <w:t>false</w:t>
-            </w:r>
-            <w:r>
-              <w:rPr>
-                <w:color w:val="1E293B"/>
-                <w:sz w:val="18"/>
-              </w:rPr>
-              <w:t xml:space="preserve"> and the full CSS-animated scene renders instead. (2) </w:t>
-            </w:r>
-            <w:r>
-              <w:rPr>
-                <w:b/>
-                <w:color w:val="1E293B"/>
-              </w:rPr>
-              <w:t>CSS animated tutor scene</w:t>
-            </w:r>
-            <w:r>
-              <w:rPr>
-                <w:color w:val="1E293B"/>
-                <w:sz w:val="18"/>
-              </w:rPr>
-              <w:t xml:space="preserve"> (fallback + always-on decoration): deep navy base gradient (</w:t>
+              <w:t>signUp.verifications.sendEmailCode()</w:t>
+            </w:r>
+            <w:r>
+              <w:rPr>
+                <w:color w:val="1E293B"/>
+                <w:sz w:val="18"/>
+              </w:rPr>
+              <w:t xml:space="preserve"> → 6-digit OTP screen → </w:t>
             </w:r>
             <w:r>
               <w:rPr>
@@ -27953,14 +27925,14 @@
                 <w:color w:val="0F172A"/>
                 <w:sz w:val="18"/>
               </w:rPr>
-              <w:t>#000936 → #060e3f → #0c1848</w:t>
-            </w:r>
-            <w:r>
-              <w:rPr>
-                <w:color w:val="1E293B"/>
-                <w:sz w:val="18"/>
-              </w:rPr>
-              <w:t xml:space="preserve">); a large 340 px blue radial-gradient AI orb (top-left) with </w:t>
+              <w:t>signUp.verifications.verifyEmailCode({ code })</w:t>
+            </w:r>
+            <w:r>
+              <w:rPr>
+                <w:color w:val="1E293B"/>
+                <w:sz w:val="18"/>
+              </w:rPr>
+              <w:t xml:space="preserve"> → </w:t>
             </w:r>
             <w:r>
               <w:rPr>
@@ -27968,14 +27940,14 @@
                 <w:color w:val="0F172A"/>
                 <w:sz w:val="18"/>
               </w:rPr>
-              <w:t>ai-orb-pulse</w:t>
-            </w:r>
-            <w:r>
-              <w:rPr>
-                <w:color w:val="1E293B"/>
-                <w:sz w:val="18"/>
-              </w:rPr>
-              <w:t xml:space="preserve"> keyframe (scale 1 → 1.09, opacity pulse); a 520 px outer ambient glow around the orb; a 380 px warm amber/orange </w:t>
+              <w:t>signUp.finalize()</w:t>
+            </w:r>
+            <w:r>
+              <w:rPr>
+                <w:color w:val="1E293B"/>
+                <w:sz w:val="18"/>
+              </w:rPr>
+              <w:t xml:space="preserve"> → redirect to </w:t>
             </w:r>
             <w:r>
               <w:rPr>
@@ -27983,14 +27955,14 @@
                 <w:color w:val="0F172A"/>
                 <w:sz w:val="18"/>
               </w:rPr>
-              <w:t>warm-glow</w:t>
-            </w:r>
-            <w:r>
-              <w:rPr>
-                <w:color w:val="1E293B"/>
-                <w:sz w:val="18"/>
-              </w:rPr>
-              <w:t xml:space="preserve"> radial gradient (right, </w:t>
+              <w:t>/</w:t>
+            </w:r>
+            <w:r>
+              <w:rPr>
+                <w:color w:val="1E293B"/>
+                <w:sz w:val="18"/>
+              </w:rPr>
+              <w:t xml:space="preserve">. Google OAuth via </w:t>
             </w:r>
             <w:r>
               <w:rPr>
@@ -27998,14 +27970,14 @@
                 <w:color w:val="0F172A"/>
                 <w:sz w:val="18"/>
               </w:rPr>
-              <w:t>warm-glow</w:t>
-            </w:r>
-            <w:r>
-              <w:rPr>
-                <w:color w:val="1E293B"/>
-                <w:sz w:val="18"/>
-              </w:rPr>
-              <w:t xml:space="preserve"> keyframe) representing the student; a 2 px horizontal </w:t>
+              <w:t>signUp.sso({ strategy: "oauth_google", redirectUrl: "/sso-callback", redirectCallbackUrl: "/sso-callback" })</w:t>
+            </w:r>
+            <w:r>
+              <w:rPr>
+                <w:color w:val="1E293B"/>
+                <w:sz w:val="18"/>
+              </w:rPr>
+              <w:t xml:space="preserve">. </w:t>
             </w:r>
             <w:r>
               <w:rPr>
@@ -28013,14 +27985,14 @@
                 <w:color w:val="0F172A"/>
                 <w:sz w:val="18"/>
               </w:rPr>
-              <w:t>beam-pulse</w:t>
-            </w:r>
-            <w:r>
-              <w:rPr>
-                <w:color w:val="1E293B"/>
-                <w:sz w:val="18"/>
-              </w:rPr>
-              <w:t xml:space="preserve"> connection line between orb and student; 20 rising dot particles (</w:t>
+              <w:t>CaptchaSignUpGate</w:t>
+            </w:r>
+            <w:r>
+              <w:rPr>
+                <w:color w:val="1E293B"/>
+                <w:sz w:val="18"/>
+              </w:rPr>
+              <w:t xml:space="preserve"> updated to </w:t>
             </w:r>
             <w:r>
               <w:rPr>
@@ -28028,14 +28000,14 @@
                 <w:color w:val="0F172A"/>
                 <w:sz w:val="18"/>
               </w:rPr>
-              <w:t>particle-rise</w:t>
-            </w:r>
-            <w:r>
-              <w:rPr>
-                <w:color w:val="1E293B"/>
-                <w:sz w:val="18"/>
-              </w:rPr>
-              <w:t xml:space="preserve"> keyframe); 5 floating maths equations (</w:t>
+              <w:t>router.push("/sign-up")</w:t>
+            </w:r>
+            <w:r>
+              <w:rPr>
+                <w:color w:val="1E293B"/>
+                <w:sz w:val="18"/>
+              </w:rPr>
+              <w:t xml:space="preserve"> instead of </w:t>
             </w:r>
             <w:r>
               <w:rPr>
@@ -28043,14 +28015,14 @@
                 <w:color w:val="0F172A"/>
                 <w:sz w:val="18"/>
               </w:rPr>
-              <w:t>float-equation</w:t>
-            </w:r>
-            <w:r>
-              <w:rPr>
-                <w:color w:val="1E293B"/>
-                <w:sz w:val="18"/>
-              </w:rPr>
-              <w:t xml:space="preserve"> keyframe — e.g. </w:t>
+              <w:t>openSignUp()</w:t>
+            </w:r>
+            <w:r>
+              <w:rPr>
+                <w:color w:val="1E293B"/>
+                <w:sz w:val="18"/>
+              </w:rPr>
+              <w:t xml:space="preserve"> modal (modal had phone issue too). </w:t>
             </w:r>
             <w:r>
               <w:rPr>
@@ -28058,14 +28030,14 @@
                 <w:color w:val="0F172A"/>
                 <w:sz w:val="18"/>
               </w:rPr>
-              <w:t>y = mx + b</w:t>
-            </w:r>
-            <w:r>
-              <w:rPr>
-                <w:color w:val="1E293B"/>
-                <w:sz w:val="18"/>
-              </w:rPr>
-              <w:t xml:space="preserve">, </w:t>
+              <w:t>/sso-callback</w:t>
+            </w:r>
+            <w:r>
+              <w:rPr>
+                <w:color w:val="1E293B"/>
+                <w:sz w:val="18"/>
+              </w:rPr>
+              <w:t xml:space="preserve"> page (</w:t>
             </w:r>
             <w:r>
               <w:rPr>
@@ -28073,475 +28045,14 @@
                 <w:color w:val="0F172A"/>
                 <w:sz w:val="18"/>
               </w:rPr>
-              <w:t>E = mc²</w:t>
-            </w:r>
-            <w:r>
-              <w:rPr>
-                <w:color w:val="1E293B"/>
-                <w:sz w:val="18"/>
-              </w:rPr>
-              <w:t xml:space="preserve">, </w:t>
-            </w:r>
-            <w:r>
-              <w:rPr>
-                <w:rFonts w:ascii="Courier New" w:hAnsi="Courier New"/>
-                <w:color w:val="0F172A"/>
-                <w:sz w:val="18"/>
-              </w:rPr>
-              <w:t>P(A) = n(A)/n(S)</w:t>
-            </w:r>
-            <w:r>
-              <w:rPr>
-                <w:color w:val="1E293B"/>
-                <w:sz w:val="18"/>
-              </w:rPr>
-              <w:t xml:space="preserve">, </w:t>
-            </w:r>
-            <w:r>
-              <w:rPr>
-                <w:rFonts w:ascii="Courier New" w:hAnsi="Courier New"/>
-                <w:color w:val="0F172A"/>
-                <w:sz w:val="18"/>
-              </w:rPr>
-              <w:t>∫₀¹ f(x) dx</w:t>
-            </w:r>
-            <w:r>
-              <w:rPr>
-                <w:color w:val="1E293B"/>
-                <w:sz w:val="18"/>
-              </w:rPr>
-              <w:t xml:space="preserve">, </w:t>
-            </w:r>
-            <w:r>
-              <w:rPr>
-                <w:rFonts w:ascii="Courier New" w:hAnsi="Courier New"/>
-                <w:color w:val="0F172A"/>
-                <w:sz w:val="18"/>
-              </w:rPr>
-              <w:t>ax² + bx + c = 0</w:t>
-            </w:r>
-            <w:r>
-              <w:rPr>
-                <w:color w:val="1E293B"/>
-                <w:sz w:val="18"/>
-              </w:rPr>
-              <w:t>); 16 floating maths symbols (</w:t>
-            </w:r>
-            <w:r>
-              <w:rPr>
-                <w:rFonts w:ascii="Courier New" w:hAnsi="Courier New"/>
-                <w:color w:val="0F172A"/>
-                <w:sz w:val="18"/>
-              </w:rPr>
-              <w:t>float-symbol</w:t>
-            </w:r>
-            <w:r>
-              <w:rPr>
-                <w:color w:val="1E293B"/>
-                <w:sz w:val="18"/>
-              </w:rPr>
-              <w:t xml:space="preserve">, unchanged from v0.28, but colour-shifted to semi-transparent RGBA values for dark background). (3) </w:t>
-            </w:r>
-            <w:r>
-              <w:rPr>
-                <w:b/>
-                <w:color w:val="1E293B"/>
-              </w:rPr>
-              <w:t>Dark overlay</w:t>
-            </w:r>
-            <w:r>
-              <w:rPr>
-                <w:color w:val="1E293B"/>
-                <w:sz w:val="18"/>
-              </w:rPr>
-              <w:t xml:space="preserve">: linear-gradient overlay adjusts dynamically — thick dark when CSS scene shows, semi-transparent when video plays. (4) </w:t>
-            </w:r>
-            <w:r>
-              <w:rPr>
-                <w:b/>
-                <w:color w:val="1E293B"/>
-              </w:rPr>
-              <w:t>Bottom white fade</w:t>
-            </w:r>
-            <w:r>
-              <w:rPr>
-                <w:color w:val="1E293B"/>
-                <w:sz w:val="18"/>
-              </w:rPr>
-              <w:t xml:space="preserve">: 28-rem </w:t>
-            </w:r>
-            <w:r>
-              <w:rPr>
-                <w:rFonts w:ascii="Courier New" w:hAnsi="Courier New"/>
-                <w:color w:val="0F172A"/>
-                <w:sz w:val="18"/>
-              </w:rPr>
-              <w:t>h-28</w:t>
-            </w:r>
-            <w:r>
-              <w:rPr>
-                <w:color w:val="1E293B"/>
-                <w:sz w:val="18"/>
-              </w:rPr>
-              <w:t xml:space="preserve"> gradient </w:t>
-            </w:r>
-            <w:r>
-              <w:rPr>
-                <w:rFonts w:ascii="Courier New" w:hAnsi="Courier New"/>
-                <w:color w:val="0F172A"/>
-                <w:sz w:val="18"/>
-              </w:rPr>
-              <w:t>transparent → #ffffff</w:t>
-            </w:r>
-            <w:r>
-              <w:rPr>
-                <w:color w:val="1E293B"/>
-                <w:sz w:val="18"/>
-              </w:rPr>
-              <w:t xml:space="preserve"> at hero bottom so hero blends into the white sections below. (5) </w:t>
-            </w:r>
-            <w:r>
-              <w:rPr>
-                <w:b/>
-                <w:color w:val="1E293B"/>
-              </w:rPr>
-              <w:t>Hero text redesigned for dark background</w:t>
-            </w:r>
-            <w:r>
-              <w:rPr>
-                <w:color w:val="1E293B"/>
-                <w:sz w:val="18"/>
-              </w:rPr>
-              <w:t xml:space="preserve">: headline in white </w:t>
-            </w:r>
-            <w:r>
-              <w:rPr>
-                <w:rFonts w:ascii="Courier New" w:hAnsi="Courier New"/>
-                <w:color w:val="0F172A"/>
-                <w:sz w:val="18"/>
-              </w:rPr>
-              <w:t>#ffffff</w:t>
-            </w:r>
-            <w:r>
-              <w:rPr>
-                <w:color w:val="1E293B"/>
-                <w:sz w:val="18"/>
-              </w:rPr>
-              <w:t xml:space="preserve">, accent span in sky-blue </w:t>
-            </w:r>
-            <w:r>
-              <w:rPr>
-                <w:rFonts w:ascii="Courier New" w:hAnsi="Courier New"/>
-                <w:color w:val="0F172A"/>
-                <w:sz w:val="18"/>
-              </w:rPr>
-              <w:t>#56DBFF</w:t>
-            </w:r>
-            <w:r>
-              <w:rPr>
-                <w:color w:val="1E293B"/>
-                <w:sz w:val="18"/>
-              </w:rPr>
-              <w:t xml:space="preserve">; subheadline at </w:t>
-            </w:r>
-            <w:r>
-              <w:rPr>
-                <w:rFonts w:ascii="Courier New" w:hAnsi="Courier New"/>
-                <w:color w:val="0F172A"/>
-                <w:sz w:val="18"/>
-              </w:rPr>
-              <w:t>rgba(255,255,255,0.72)</w:t>
-            </w:r>
-            <w:r>
-              <w:rPr>
-                <w:color w:val="1E293B"/>
-                <w:sz w:val="18"/>
-              </w:rPr>
-              <w:t>; "Australia's AI-powered exam prep platform" badge uses glass pill (</w:t>
-            </w:r>
-            <w:r>
-              <w:rPr>
-                <w:rFonts w:ascii="Courier New" w:hAnsi="Courier New"/>
-                <w:color w:val="0F172A"/>
-                <w:sz w:val="18"/>
-              </w:rPr>
-              <w:t>rgba(255,255,255,0.08)</w:t>
-            </w:r>
-            <w:r>
-              <w:rPr>
-                <w:color w:val="1E293B"/>
-                <w:sz w:val="18"/>
-              </w:rPr>
-              <w:t xml:space="preserve"> bg + </w:t>
-            </w:r>
-            <w:r>
-              <w:rPr>
-                <w:rFonts w:ascii="Courier New" w:hAnsi="Courier New"/>
-                <w:color w:val="0F172A"/>
-                <w:sz w:val="18"/>
-              </w:rPr>
-              <w:t>rgba(255,255,255,0.20)</w:t>
-            </w:r>
-            <w:r>
-              <w:rPr>
-                <w:color w:val="1E293B"/>
-                <w:sz w:val="18"/>
-              </w:rPr>
-              <w:t xml:space="preserve"> border + </w:t>
-            </w:r>
-            <w:r>
-              <w:rPr>
-                <w:rFonts w:ascii="Courier New" w:hAnsi="Courier New"/>
-                <w:color w:val="0F172A"/>
-                <w:sz w:val="18"/>
-              </w:rPr>
-              <w:t>backdropFilter: blur(8px)</w:t>
-            </w:r>
-            <w:r>
-              <w:rPr>
-                <w:color w:val="1E293B"/>
-                <w:sz w:val="18"/>
-              </w:rPr>
-              <w:t xml:space="preserve">); primary CTA changed from navy/gold to gold </w:t>
-            </w:r>
-            <w:r>
-              <w:rPr>
-                <w:rFonts w:ascii="Courier New" w:hAnsi="Courier New"/>
-                <w:color w:val="0F172A"/>
-                <w:sz w:val="18"/>
-              </w:rPr>
-              <w:t>#FDC800</w:t>
-            </w:r>
-            <w:r>
-              <w:rPr>
-                <w:color w:val="1E293B"/>
-                <w:sz w:val="18"/>
-              </w:rPr>
-              <w:t xml:space="preserve">/navy for maximum contrast on dark; secondary CTA ("I'm a student") uses </w:t>
-            </w:r>
-            <w:r>
-              <w:rPr>
-                <w:rFonts w:ascii="Courier New" w:hAnsi="Courier New"/>
-                <w:color w:val="0F172A"/>
-                <w:sz w:val="18"/>
-              </w:rPr>
-              <w:t>rgba(255,255,255,0.28)</w:t>
-            </w:r>
-            <w:r>
-              <w:rPr>
-                <w:color w:val="1E293B"/>
-                <w:sz w:val="18"/>
-              </w:rPr>
-              <w:t xml:space="preserve"> border and glass bg. (6) </w:t>
-            </w:r>
-            <w:r>
-              <w:rPr>
-                <w:b/>
-                <w:color w:val="1E293B"/>
-              </w:rPr>
-              <w:t>Frosted glass exam badge panel</w:t>
-            </w:r>
-            <w:r>
-              <w:rPr>
-                <w:color w:val="1E293B"/>
-                <w:sz w:val="18"/>
-              </w:rPr>
-              <w:t xml:space="preserve">: right column redesigned with </w:t>
-            </w:r>
-            <w:r>
-              <w:rPr>
-                <w:rFonts w:ascii="Courier New" w:hAnsi="Courier New"/>
-                <w:color w:val="0F172A"/>
-                <w:sz w:val="18"/>
-              </w:rPr>
-              <w:t>backdropFilter: blur(20px)</w:t>
-            </w:r>
-            <w:r>
-              <w:rPr>
-                <w:color w:val="1E293B"/>
-                <w:sz w:val="18"/>
-              </w:rPr>
-              <w:t xml:space="preserve"> + </w:t>
-            </w:r>
-            <w:r>
-              <w:rPr>
-                <w:rFonts w:ascii="Courier New" w:hAnsi="Courier New"/>
-                <w:color w:val="0F172A"/>
-                <w:sz w:val="18"/>
-              </w:rPr>
-              <w:t>-webkit-backdrop-filter</w:t>
-            </w:r>
-            <w:r>
-              <w:rPr>
-                <w:color w:val="1E293B"/>
-                <w:sz w:val="18"/>
-              </w:rPr>
-              <w:t xml:space="preserve"> glass card (</w:t>
-            </w:r>
-            <w:r>
-              <w:rPr>
-                <w:rFonts w:ascii="Courier New" w:hAnsi="Courier New"/>
-                <w:color w:val="0F172A"/>
-                <w:sz w:val="18"/>
-              </w:rPr>
-              <w:t>rgba(255,255,255,0.07)</w:t>
-            </w:r>
-            <w:r>
-              <w:rPr>
-                <w:color w:val="1E293B"/>
-                <w:sz w:val="18"/>
-              </w:rPr>
-              <w:t xml:space="preserve"> bg, </w:t>
-            </w:r>
-            <w:r>
-              <w:rPr>
-                <w:rFonts w:ascii="Courier New" w:hAnsi="Courier New"/>
-                <w:color w:val="0F172A"/>
-                <w:sz w:val="18"/>
-              </w:rPr>
-              <w:t>rgba(255,255,255,0.13)</w:t>
-            </w:r>
-            <w:r>
-              <w:rPr>
-                <w:color w:val="1E293B"/>
-                <w:sz w:val="18"/>
-              </w:rPr>
-              <w:t xml:space="preserve"> border, deep box-shadow </w:t>
-            </w:r>
-            <w:r>
-              <w:rPr>
-                <w:rFonts w:ascii="Courier New" w:hAnsi="Courier New"/>
-                <w:color w:val="0F172A"/>
-                <w:sz w:val="18"/>
-              </w:rPr>
-              <w:t>0 8px 48px rgba(0,0,0,0.45)</w:t>
-            </w:r>
-            <w:r>
-              <w:rPr>
-                <w:color w:val="1E293B"/>
-                <w:sz w:val="18"/>
-              </w:rPr>
-              <w:t xml:space="preserve">); badge card backgrounds changed to </w:t>
-            </w:r>
-            <w:r>
-              <w:rPr>
-                <w:rFonts w:ascii="Courier New" w:hAnsi="Courier New"/>
-                <w:color w:val="0F172A"/>
-                <w:sz w:val="18"/>
-              </w:rPr>
-              <w:t>rgba(255,255,255,0.05)</w:t>
-            </w:r>
-            <w:r>
-              <w:rPr>
-                <w:color w:val="1E293B"/>
-                <w:sz w:val="18"/>
-              </w:rPr>
-              <w:t xml:space="preserve">; badge circle glows use per-exam colour box-shadow; label text uses </w:t>
-            </w:r>
-            <w:r>
-              <w:rPr>
-                <w:rFonts w:ascii="Courier New" w:hAnsi="Courier New"/>
-                <w:color w:val="0F172A"/>
-                <w:sz w:val="18"/>
-              </w:rPr>
-              <w:t>rgba(255,255,255,0.6)</w:t>
-            </w:r>
-            <w:r>
-              <w:rPr>
-                <w:color w:val="1E293B"/>
-                <w:sz w:val="18"/>
-              </w:rPr>
-              <w:t xml:space="preserve">. New CSS keyframes added: </w:t>
-            </w:r>
-            <w:r>
-              <w:rPr>
-                <w:rFonts w:ascii="Courier New" w:hAnsi="Courier New"/>
-                <w:color w:val="0F172A"/>
-                <w:sz w:val="18"/>
-              </w:rPr>
-              <w:t>ai-orb-pulse</w:t>
-            </w:r>
-            <w:r>
-              <w:rPr>
-                <w:color w:val="1E293B"/>
-                <w:sz w:val="18"/>
-              </w:rPr>
-              <w:t xml:space="preserve">, </w:t>
-            </w:r>
-            <w:r>
-              <w:rPr>
-                <w:rFonts w:ascii="Courier New" w:hAnsi="Courier New"/>
-                <w:color w:val="0F172A"/>
-                <w:sz w:val="18"/>
-              </w:rPr>
-              <w:t>warm-glow</w:t>
-            </w:r>
-            <w:r>
-              <w:rPr>
-                <w:color w:val="1E293B"/>
-                <w:sz w:val="18"/>
-              </w:rPr>
-              <w:t xml:space="preserve">, </w:t>
-            </w:r>
-            <w:r>
-              <w:rPr>
-                <w:rFonts w:ascii="Courier New" w:hAnsi="Courier New"/>
-                <w:color w:val="0F172A"/>
-                <w:sz w:val="18"/>
-              </w:rPr>
-              <w:t>beam-pulse</w:t>
-            </w:r>
-            <w:r>
-              <w:rPr>
-                <w:color w:val="1E293B"/>
-                <w:sz w:val="18"/>
-              </w:rPr>
-              <w:t xml:space="preserve">, </w:t>
-            </w:r>
-            <w:r>
-              <w:rPr>
-                <w:rFonts w:ascii="Courier New" w:hAnsi="Courier New"/>
-                <w:color w:val="0F172A"/>
-                <w:sz w:val="18"/>
-              </w:rPr>
-              <w:t>particle-rise</w:t>
-            </w:r>
-            <w:r>
-              <w:rPr>
-                <w:color w:val="1E293B"/>
-                <w:sz w:val="18"/>
-              </w:rPr>
-              <w:t xml:space="preserve">, </w:t>
-            </w:r>
-            <w:r>
-              <w:rPr>
-                <w:rFonts w:ascii="Courier New" w:hAnsi="Courier New"/>
-                <w:color w:val="0F172A"/>
-                <w:sz w:val="18"/>
-              </w:rPr>
-              <w:t>float-equation</w:t>
-            </w:r>
-            <w:r>
-              <w:rPr>
-                <w:color w:val="1E293B"/>
-                <w:sz w:val="18"/>
-              </w:rPr>
-              <w:t xml:space="preserve">. To use a real AI-generated video: generate a 10–15 s looping MP4 (recommended prompt: "Serene warm study scene, soft-glowing blue AI hologram tutor floating near a desk, happy 10-year-old child looking up with curiosity, floating maths equations drifting around them, ambient film-quality lighting, cinematic, 4K, seamlessly loopable") using Runway Gen-3, Kling AI, or Sora; place the file at </w:t>
-            </w:r>
-            <w:r>
-              <w:rPr>
-                <w:rFonts w:ascii="Courier New" w:hAnsi="Courier New"/>
-                <w:color w:val="0F172A"/>
-                <w:sz w:val="18"/>
-              </w:rPr>
-              <w:t>public/tutor-bg.mp4</w:t>
-            </w:r>
-            <w:r>
-              <w:rPr>
-                <w:color w:val="1E293B"/>
-                <w:sz w:val="18"/>
-              </w:rPr>
-              <w:t>; no code change needed — the player activates automatically</w:t>
+              <w:t>AuthenticateWithRedirectCallback</w:t>
+            </w:r>
+            <w:r>
+              <w:rPr>
+                <w:color w:val="1E293B"/>
+                <w:sz w:val="18"/>
+              </w:rPr>
+              <w:t>) handles OAuth redirect completion. No phone number field at any step — eliminates "phone numbers from this country are not supported" error for Australian users. Form is fully branded (SelectEd wordmark, navy/gold CTAs, white card on dark background)</w:t>
             </w:r>
           </w:p>
         </w:tc>
@@ -28568,7 +28079,7 @@
                 <w:b/>
                 <w:color w:val="1E293B"/>
               </w:rPr>
-              <w:t>v0.29.0</w:t>
+              <w:t>v0.30.0</w:t>
             </w:r>
           </w:p>
         </w:tc>
@@ -28618,7 +28129,21 @@
                 <w:color w:val="1E293B"/>
                 <w:sz w:val="18"/>
               </w:rPr>
-              <w:t xml:space="preserve">Guest limit reduced 20 → 10 questions/day — updated in </w:t>
+              <w:t xml:space="preserve">Cinematic hero background — (1) </w:t>
+            </w:r>
+            <w:r>
+              <w:rPr>
+                <w:b/>
+                <w:color w:val="1E293B"/>
+              </w:rPr>
+              <w:t>Video background infrastructure</w:t>
+            </w:r>
+            <w:r>
+              <w:rPr>
+                <w:color w:val="1E293B"/>
+                <w:sz w:val="18"/>
+              </w:rPr>
+              <w:t xml:space="preserve">: hero section now mounts an HTML5 </w:t>
             </w:r>
             <w:r>
               <w:rPr>
@@ -28626,14 +28151,14 @@
                 <w:color w:val="0F172A"/>
                 <w:sz w:val="18"/>
               </w:rPr>
-              <w:t>GUEST_DAILY_LIMIT</w:t>
-            </w:r>
-            <w:r>
-              <w:rPr>
-                <w:color w:val="1E293B"/>
-                <w:sz w:val="18"/>
-              </w:rPr>
-              <w:t xml:space="preserve"> constant (</w:t>
+              <w:t>&lt;video autoPlay muted loop playsInline&gt;</w:t>
+            </w:r>
+            <w:r>
+              <w:rPr>
+                <w:color w:val="1E293B"/>
+                <w:sz w:val="18"/>
+              </w:rPr>
+              <w:t xml:space="preserve"> element pointing to </w:t>
             </w:r>
             <w:r>
               <w:rPr>
@@ -28641,14 +28166,14 @@
                 <w:color w:val="0F172A"/>
                 <w:sz w:val="18"/>
               </w:rPr>
-              <w:t>app/page.tsx</w:t>
-            </w:r>
-            <w:r>
-              <w:rPr>
-                <w:color w:val="1E293B"/>
-                <w:sz w:val="18"/>
-              </w:rPr>
-              <w:t xml:space="preserve">, </w:t>
+              <w:t>/public/tutor-bg.mp4</w:t>
+            </w:r>
+            <w:r>
+              <w:rPr>
+                <w:color w:val="1E293B"/>
+                <w:sz w:val="18"/>
+              </w:rPr>
+              <w:t xml:space="preserve">. </w:t>
             </w:r>
             <w:r>
               <w:rPr>
@@ -28656,14 +28181,14 @@
                 <w:color w:val="0F172A"/>
                 <w:sz w:val="18"/>
               </w:rPr>
-              <w:t>GuestLimitModal.tsx</w:t>
-            </w:r>
-            <w:r>
-              <w:rPr>
-                <w:color w:val="1E293B"/>
-                <w:sz w:val="18"/>
-              </w:rPr>
-              <w:t xml:space="preserve">), rolling banner copy, FAQ answer, trust badge, and parent dashboard label. CAPTCHA gate on sign-up — (1) </w:t>
+              <w:t>videoBgReady</w:t>
+            </w:r>
+            <w:r>
+              <w:rPr>
+                <w:color w:val="1E293B"/>
+                <w:sz w:val="18"/>
+              </w:rPr>
+              <w:t xml:space="preserve"> React state tracks </w:t>
             </w:r>
             <w:r>
               <w:rPr>
@@ -28671,14 +28196,14 @@
                 <w:color w:val="0F172A"/>
                 <w:sz w:val="18"/>
               </w:rPr>
-              <w:t>/sign-up</w:t>
-            </w:r>
-            <w:r>
-              <w:rPr>
-                <w:color w:val="1E293B"/>
-                <w:sz w:val="18"/>
-              </w:rPr>
-              <w:t xml:space="preserve"> page now shows a math CAPTCHA challenge before the Clerk </w:t>
+              <w:t>onCanPlay</w:t>
+            </w:r>
+            <w:r>
+              <w:rPr>
+                <w:color w:val="1E293B"/>
+                <w:sz w:val="18"/>
+              </w:rPr>
+              <w:t xml:space="preserve">; the video fades in with a 1.2 s opacity transition once loaded. When no video file is present (or on load failure), </w:t>
             </w:r>
             <w:r>
               <w:rPr>
@@ -28686,14 +28211,14 @@
                 <w:color w:val="0F172A"/>
                 <w:sz w:val="18"/>
               </w:rPr>
-              <w:t>&lt;SignUp /&gt;</w:t>
-            </w:r>
-            <w:r>
-              <w:rPr>
-                <w:color w:val="1E293B"/>
-                <w:sz w:val="18"/>
-              </w:rPr>
-              <w:t xml:space="preserve"> form renders (client component with </w:t>
+              <w:t>videoBgReady</w:t>
+            </w:r>
+            <w:r>
+              <w:rPr>
+                <w:color w:val="1E293B"/>
+                <w:sz w:val="18"/>
+              </w:rPr>
+              <w:t xml:space="preserve"> stays </w:t>
             </w:r>
             <w:r>
               <w:rPr>
@@ -28701,14 +28226,28 @@
                 <w:color w:val="0F172A"/>
                 <w:sz w:val="18"/>
               </w:rPr>
-              <w:t>useState</w:t>
-            </w:r>
-            <w:r>
-              <w:rPr>
-                <w:color w:val="1E293B"/>
-                <w:sz w:val="18"/>
-              </w:rPr>
-              <w:t xml:space="preserve"> gate). (2) New </w:t>
+              <w:t>false</w:t>
+            </w:r>
+            <w:r>
+              <w:rPr>
+                <w:color w:val="1E293B"/>
+                <w:sz w:val="18"/>
+              </w:rPr>
+              <w:t xml:space="preserve"> and the full CSS-animated scene renders instead. (2) </w:t>
+            </w:r>
+            <w:r>
+              <w:rPr>
+                <w:b/>
+                <w:color w:val="1E293B"/>
+              </w:rPr>
+              <w:t>CSS animated tutor scene</w:t>
+            </w:r>
+            <w:r>
+              <w:rPr>
+                <w:color w:val="1E293B"/>
+                <w:sz w:val="18"/>
+              </w:rPr>
+              <w:t xml:space="preserve"> (fallback + always-on decoration): deep navy base gradient (</w:t>
             </w:r>
             <w:r>
               <w:rPr>
@@ -28716,14 +28255,14 @@
                 <w:color w:val="0F172A"/>
                 <w:sz w:val="18"/>
               </w:rPr>
-              <w:t>CaptchaSignUpGate</w:t>
-            </w:r>
-            <w:r>
-              <w:rPr>
-                <w:color w:val="1E293B"/>
-                <w:sz w:val="18"/>
-              </w:rPr>
-              <w:t xml:space="preserve"> component (</w:t>
+              <w:t>#000936 → #060e3f → #0c1848</w:t>
+            </w:r>
+            <w:r>
+              <w:rPr>
+                <w:color w:val="1E293B"/>
+                <w:sz w:val="18"/>
+              </w:rPr>
+              <w:t xml:space="preserve">); a large 340 px blue radial-gradient AI orb (top-left) with </w:t>
             </w:r>
             <w:r>
               <w:rPr>
@@ -28731,14 +28270,14 @@
                 <w:color w:val="0F172A"/>
                 <w:sz w:val="18"/>
               </w:rPr>
-              <w:t>app/components/CaptchaSignUpGate.tsx</w:t>
-            </w:r>
-            <w:r>
-              <w:rPr>
-                <w:color w:val="1E293B"/>
-                <w:sz w:val="18"/>
-              </w:rPr>
-              <w:t xml:space="preserve">) wraps any button with a CAPTCHA modal; uses </w:t>
+              <w:t>ai-orb-pulse</w:t>
+            </w:r>
+            <w:r>
+              <w:rPr>
+                <w:color w:val="1E293B"/>
+                <w:sz w:val="18"/>
+              </w:rPr>
+              <w:t xml:space="preserve"> keyframe (scale 1 → 1.09, opacity pulse); a 520 px outer ambient glow around the orb; a 380 px warm amber/orange </w:t>
             </w:r>
             <w:r>
               <w:rPr>
@@ -28746,14 +28285,14 @@
                 <w:color w:val="0F172A"/>
                 <w:sz w:val="18"/>
               </w:rPr>
-              <w:t>useClerk().openSignUp()</w:t>
-            </w:r>
-            <w:r>
-              <w:rPr>
-                <w:color w:val="1E293B"/>
-                <w:sz w:val="18"/>
-              </w:rPr>
-              <w:t xml:space="preserve"> to open Clerk's sign-up modal after successful verification. </w:t>
+              <w:t>warm-glow</w:t>
+            </w:r>
+            <w:r>
+              <w:rPr>
+                <w:color w:val="1E293B"/>
+                <w:sz w:val="18"/>
+              </w:rPr>
+              <w:t xml:space="preserve"> radial gradient (right, </w:t>
             </w:r>
             <w:r>
               <w:rPr>
@@ -28761,14 +28300,14 @@
                 <w:color w:val="0F172A"/>
                 <w:sz w:val="18"/>
               </w:rPr>
-              <w:t>GuestLimitModal</w:t>
-            </w:r>
-            <w:r>
-              <w:rPr>
-                <w:color w:val="1E293B"/>
-                <w:sz w:val="18"/>
-              </w:rPr>
-              <w:t xml:space="preserve">'s "Start free 7-day trial →" button now uses </w:t>
+              <w:t>warm-glow</w:t>
+            </w:r>
+            <w:r>
+              <w:rPr>
+                <w:color w:val="1E293B"/>
+                <w:sz w:val="18"/>
+              </w:rPr>
+              <w:t xml:space="preserve"> keyframe) representing the student; a 2 px horizontal </w:t>
             </w:r>
             <w:r>
               <w:rPr>
@@ -28776,14 +28315,14 @@
                 <w:color w:val="0F172A"/>
                 <w:sz w:val="18"/>
               </w:rPr>
-              <w:t>CaptchaSignUpGate</w:t>
-            </w:r>
-            <w:r>
-              <w:rPr>
-                <w:color w:val="1E293B"/>
-                <w:sz w:val="18"/>
-              </w:rPr>
-              <w:t xml:space="preserve"> instead of </w:t>
+              <w:t>beam-pulse</w:t>
+            </w:r>
+            <w:r>
+              <w:rPr>
+                <w:color w:val="1E293B"/>
+                <w:sz w:val="18"/>
+              </w:rPr>
+              <w:t xml:space="preserve"> connection line between orb and student; 20 rising dot particles (</w:t>
             </w:r>
             <w:r>
               <w:rPr>
@@ -28791,7 +28330,520 @@
                 <w:color w:val="0F172A"/>
                 <w:sz w:val="18"/>
               </w:rPr>
-              <w:t>&lt;SignUpButton&gt;</w:t>
+              <w:t>particle-rise</w:t>
+            </w:r>
+            <w:r>
+              <w:rPr>
+                <w:color w:val="1E293B"/>
+                <w:sz w:val="18"/>
+              </w:rPr>
+              <w:t xml:space="preserve"> keyframe); 5 floating maths equations (</w:t>
+            </w:r>
+            <w:r>
+              <w:rPr>
+                <w:rFonts w:ascii="Courier New" w:hAnsi="Courier New"/>
+                <w:color w:val="0F172A"/>
+                <w:sz w:val="18"/>
+              </w:rPr>
+              <w:t>float-equation</w:t>
+            </w:r>
+            <w:r>
+              <w:rPr>
+                <w:color w:val="1E293B"/>
+                <w:sz w:val="18"/>
+              </w:rPr>
+              <w:t xml:space="preserve"> keyframe — e.g. </w:t>
+            </w:r>
+            <w:r>
+              <w:rPr>
+                <w:rFonts w:ascii="Courier New" w:hAnsi="Courier New"/>
+                <w:color w:val="0F172A"/>
+                <w:sz w:val="18"/>
+              </w:rPr>
+              <w:t>y = mx + b</w:t>
+            </w:r>
+            <w:r>
+              <w:rPr>
+                <w:color w:val="1E293B"/>
+                <w:sz w:val="18"/>
+              </w:rPr>
+              <w:t xml:space="preserve">, </w:t>
+            </w:r>
+            <w:r>
+              <w:rPr>
+                <w:rFonts w:ascii="Courier New" w:hAnsi="Courier New"/>
+                <w:color w:val="0F172A"/>
+                <w:sz w:val="18"/>
+              </w:rPr>
+              <w:t>E = mc²</w:t>
+            </w:r>
+            <w:r>
+              <w:rPr>
+                <w:color w:val="1E293B"/>
+                <w:sz w:val="18"/>
+              </w:rPr>
+              <w:t xml:space="preserve">, </w:t>
+            </w:r>
+            <w:r>
+              <w:rPr>
+                <w:rFonts w:ascii="Courier New" w:hAnsi="Courier New"/>
+                <w:color w:val="0F172A"/>
+                <w:sz w:val="18"/>
+              </w:rPr>
+              <w:t>P(A) = n(A)/n(S)</w:t>
+            </w:r>
+            <w:r>
+              <w:rPr>
+                <w:color w:val="1E293B"/>
+                <w:sz w:val="18"/>
+              </w:rPr>
+              <w:t xml:space="preserve">, </w:t>
+            </w:r>
+            <w:r>
+              <w:rPr>
+                <w:rFonts w:ascii="Courier New" w:hAnsi="Courier New"/>
+                <w:color w:val="0F172A"/>
+                <w:sz w:val="18"/>
+              </w:rPr>
+              <w:t>∫₀¹ f(x) dx</w:t>
+            </w:r>
+            <w:r>
+              <w:rPr>
+                <w:color w:val="1E293B"/>
+                <w:sz w:val="18"/>
+              </w:rPr>
+              <w:t xml:space="preserve">, </w:t>
+            </w:r>
+            <w:r>
+              <w:rPr>
+                <w:rFonts w:ascii="Courier New" w:hAnsi="Courier New"/>
+                <w:color w:val="0F172A"/>
+                <w:sz w:val="18"/>
+              </w:rPr>
+              <w:t>ax² + bx + c = 0</w:t>
+            </w:r>
+            <w:r>
+              <w:rPr>
+                <w:color w:val="1E293B"/>
+                <w:sz w:val="18"/>
+              </w:rPr>
+              <w:t>); 16 floating maths symbols (</w:t>
+            </w:r>
+            <w:r>
+              <w:rPr>
+                <w:rFonts w:ascii="Courier New" w:hAnsi="Courier New"/>
+                <w:color w:val="0F172A"/>
+                <w:sz w:val="18"/>
+              </w:rPr>
+              <w:t>float-symbol</w:t>
+            </w:r>
+            <w:r>
+              <w:rPr>
+                <w:color w:val="1E293B"/>
+                <w:sz w:val="18"/>
+              </w:rPr>
+              <w:t xml:space="preserve">, unchanged from v0.28, but colour-shifted to semi-transparent RGBA values for dark background). (3) </w:t>
+            </w:r>
+            <w:r>
+              <w:rPr>
+                <w:b/>
+                <w:color w:val="1E293B"/>
+              </w:rPr>
+              <w:t>Dark overlay</w:t>
+            </w:r>
+            <w:r>
+              <w:rPr>
+                <w:color w:val="1E293B"/>
+                <w:sz w:val="18"/>
+              </w:rPr>
+              <w:t xml:space="preserve">: linear-gradient overlay adjusts dynamically — thick dark when CSS scene shows, semi-transparent when video plays. (4) </w:t>
+            </w:r>
+            <w:r>
+              <w:rPr>
+                <w:b/>
+                <w:color w:val="1E293B"/>
+              </w:rPr>
+              <w:t>Bottom white fade</w:t>
+            </w:r>
+            <w:r>
+              <w:rPr>
+                <w:color w:val="1E293B"/>
+                <w:sz w:val="18"/>
+              </w:rPr>
+              <w:t xml:space="preserve">: 28-rem </w:t>
+            </w:r>
+            <w:r>
+              <w:rPr>
+                <w:rFonts w:ascii="Courier New" w:hAnsi="Courier New"/>
+                <w:color w:val="0F172A"/>
+                <w:sz w:val="18"/>
+              </w:rPr>
+              <w:t>h-28</w:t>
+            </w:r>
+            <w:r>
+              <w:rPr>
+                <w:color w:val="1E293B"/>
+                <w:sz w:val="18"/>
+              </w:rPr>
+              <w:t xml:space="preserve"> gradient </w:t>
+            </w:r>
+            <w:r>
+              <w:rPr>
+                <w:rFonts w:ascii="Courier New" w:hAnsi="Courier New"/>
+                <w:color w:val="0F172A"/>
+                <w:sz w:val="18"/>
+              </w:rPr>
+              <w:t>transparent → #ffffff</w:t>
+            </w:r>
+            <w:r>
+              <w:rPr>
+                <w:color w:val="1E293B"/>
+                <w:sz w:val="18"/>
+              </w:rPr>
+              <w:t xml:space="preserve"> at hero bottom so hero blends into the white sections below. (5) </w:t>
+            </w:r>
+            <w:r>
+              <w:rPr>
+                <w:b/>
+                <w:color w:val="1E293B"/>
+              </w:rPr>
+              <w:t>Hero text redesigned for dark background</w:t>
+            </w:r>
+            <w:r>
+              <w:rPr>
+                <w:color w:val="1E293B"/>
+                <w:sz w:val="18"/>
+              </w:rPr>
+              <w:t xml:space="preserve">: headline in white </w:t>
+            </w:r>
+            <w:r>
+              <w:rPr>
+                <w:rFonts w:ascii="Courier New" w:hAnsi="Courier New"/>
+                <w:color w:val="0F172A"/>
+                <w:sz w:val="18"/>
+              </w:rPr>
+              <w:t>#ffffff</w:t>
+            </w:r>
+            <w:r>
+              <w:rPr>
+                <w:color w:val="1E293B"/>
+                <w:sz w:val="18"/>
+              </w:rPr>
+              <w:t xml:space="preserve">, accent span in sky-blue </w:t>
+            </w:r>
+            <w:r>
+              <w:rPr>
+                <w:rFonts w:ascii="Courier New" w:hAnsi="Courier New"/>
+                <w:color w:val="0F172A"/>
+                <w:sz w:val="18"/>
+              </w:rPr>
+              <w:t>#56DBFF</w:t>
+            </w:r>
+            <w:r>
+              <w:rPr>
+                <w:color w:val="1E293B"/>
+                <w:sz w:val="18"/>
+              </w:rPr>
+              <w:t xml:space="preserve">; subheadline at </w:t>
+            </w:r>
+            <w:r>
+              <w:rPr>
+                <w:rFonts w:ascii="Courier New" w:hAnsi="Courier New"/>
+                <w:color w:val="0F172A"/>
+                <w:sz w:val="18"/>
+              </w:rPr>
+              <w:t>rgba(255,255,255,0.72)</w:t>
+            </w:r>
+            <w:r>
+              <w:rPr>
+                <w:color w:val="1E293B"/>
+                <w:sz w:val="18"/>
+              </w:rPr>
+              <w:t>; "Australia's AI-powered exam prep platform" badge uses glass pill (</w:t>
+            </w:r>
+            <w:r>
+              <w:rPr>
+                <w:rFonts w:ascii="Courier New" w:hAnsi="Courier New"/>
+                <w:color w:val="0F172A"/>
+                <w:sz w:val="18"/>
+              </w:rPr>
+              <w:t>rgba(255,255,255,0.08)</w:t>
+            </w:r>
+            <w:r>
+              <w:rPr>
+                <w:color w:val="1E293B"/>
+                <w:sz w:val="18"/>
+              </w:rPr>
+              <w:t xml:space="preserve"> bg + </w:t>
+            </w:r>
+            <w:r>
+              <w:rPr>
+                <w:rFonts w:ascii="Courier New" w:hAnsi="Courier New"/>
+                <w:color w:val="0F172A"/>
+                <w:sz w:val="18"/>
+              </w:rPr>
+              <w:t>rgba(255,255,255,0.20)</w:t>
+            </w:r>
+            <w:r>
+              <w:rPr>
+                <w:color w:val="1E293B"/>
+                <w:sz w:val="18"/>
+              </w:rPr>
+              <w:t xml:space="preserve"> border + </w:t>
+            </w:r>
+            <w:r>
+              <w:rPr>
+                <w:rFonts w:ascii="Courier New" w:hAnsi="Courier New"/>
+                <w:color w:val="0F172A"/>
+                <w:sz w:val="18"/>
+              </w:rPr>
+              <w:t>backdropFilter: blur(8px)</w:t>
+            </w:r>
+            <w:r>
+              <w:rPr>
+                <w:color w:val="1E293B"/>
+                <w:sz w:val="18"/>
+              </w:rPr>
+              <w:t xml:space="preserve">); primary CTA changed from navy/gold to gold </w:t>
+            </w:r>
+            <w:r>
+              <w:rPr>
+                <w:rFonts w:ascii="Courier New" w:hAnsi="Courier New"/>
+                <w:color w:val="0F172A"/>
+                <w:sz w:val="18"/>
+              </w:rPr>
+              <w:t>#FDC800</w:t>
+            </w:r>
+            <w:r>
+              <w:rPr>
+                <w:color w:val="1E293B"/>
+                <w:sz w:val="18"/>
+              </w:rPr>
+              <w:t xml:space="preserve">/navy for maximum contrast on dark; secondary CTA ("I'm a student") uses </w:t>
+            </w:r>
+            <w:r>
+              <w:rPr>
+                <w:rFonts w:ascii="Courier New" w:hAnsi="Courier New"/>
+                <w:color w:val="0F172A"/>
+                <w:sz w:val="18"/>
+              </w:rPr>
+              <w:t>rgba(255,255,255,0.28)</w:t>
+            </w:r>
+            <w:r>
+              <w:rPr>
+                <w:color w:val="1E293B"/>
+                <w:sz w:val="18"/>
+              </w:rPr>
+              <w:t xml:space="preserve"> border and glass bg. (6) </w:t>
+            </w:r>
+            <w:r>
+              <w:rPr>
+                <w:b/>
+                <w:color w:val="1E293B"/>
+              </w:rPr>
+              <w:t>Frosted glass exam badge panel</w:t>
+            </w:r>
+            <w:r>
+              <w:rPr>
+                <w:color w:val="1E293B"/>
+                <w:sz w:val="18"/>
+              </w:rPr>
+              <w:t xml:space="preserve">: right column redesigned with </w:t>
+            </w:r>
+            <w:r>
+              <w:rPr>
+                <w:rFonts w:ascii="Courier New" w:hAnsi="Courier New"/>
+                <w:color w:val="0F172A"/>
+                <w:sz w:val="18"/>
+              </w:rPr>
+              <w:t>backdropFilter: blur(20px)</w:t>
+            </w:r>
+            <w:r>
+              <w:rPr>
+                <w:color w:val="1E293B"/>
+                <w:sz w:val="18"/>
+              </w:rPr>
+              <w:t xml:space="preserve"> + </w:t>
+            </w:r>
+            <w:r>
+              <w:rPr>
+                <w:rFonts w:ascii="Courier New" w:hAnsi="Courier New"/>
+                <w:color w:val="0F172A"/>
+                <w:sz w:val="18"/>
+              </w:rPr>
+              <w:t>-webkit-backdrop-filter</w:t>
+            </w:r>
+            <w:r>
+              <w:rPr>
+                <w:color w:val="1E293B"/>
+                <w:sz w:val="18"/>
+              </w:rPr>
+              <w:t xml:space="preserve"> glass card (</w:t>
+            </w:r>
+            <w:r>
+              <w:rPr>
+                <w:rFonts w:ascii="Courier New" w:hAnsi="Courier New"/>
+                <w:color w:val="0F172A"/>
+                <w:sz w:val="18"/>
+              </w:rPr>
+              <w:t>rgba(255,255,255,0.07)</w:t>
+            </w:r>
+            <w:r>
+              <w:rPr>
+                <w:color w:val="1E293B"/>
+                <w:sz w:val="18"/>
+              </w:rPr>
+              <w:t xml:space="preserve"> bg, </w:t>
+            </w:r>
+            <w:r>
+              <w:rPr>
+                <w:rFonts w:ascii="Courier New" w:hAnsi="Courier New"/>
+                <w:color w:val="0F172A"/>
+                <w:sz w:val="18"/>
+              </w:rPr>
+              <w:t>rgba(255,255,255,0.13)</w:t>
+            </w:r>
+            <w:r>
+              <w:rPr>
+                <w:color w:val="1E293B"/>
+                <w:sz w:val="18"/>
+              </w:rPr>
+              <w:t xml:space="preserve"> border, deep box-shadow </w:t>
+            </w:r>
+            <w:r>
+              <w:rPr>
+                <w:rFonts w:ascii="Courier New" w:hAnsi="Courier New"/>
+                <w:color w:val="0F172A"/>
+                <w:sz w:val="18"/>
+              </w:rPr>
+              <w:t>0 8px 48px rgba(0,0,0,0.45)</w:t>
+            </w:r>
+            <w:r>
+              <w:rPr>
+                <w:color w:val="1E293B"/>
+                <w:sz w:val="18"/>
+              </w:rPr>
+              <w:t xml:space="preserve">); badge card backgrounds changed to </w:t>
+            </w:r>
+            <w:r>
+              <w:rPr>
+                <w:rFonts w:ascii="Courier New" w:hAnsi="Courier New"/>
+                <w:color w:val="0F172A"/>
+                <w:sz w:val="18"/>
+              </w:rPr>
+              <w:t>rgba(255,255,255,0.05)</w:t>
+            </w:r>
+            <w:r>
+              <w:rPr>
+                <w:color w:val="1E293B"/>
+                <w:sz w:val="18"/>
+              </w:rPr>
+              <w:t xml:space="preserve">; badge circle glows use per-exam colour box-shadow; label text uses </w:t>
+            </w:r>
+            <w:r>
+              <w:rPr>
+                <w:rFonts w:ascii="Courier New" w:hAnsi="Courier New"/>
+                <w:color w:val="0F172A"/>
+                <w:sz w:val="18"/>
+              </w:rPr>
+              <w:t>rgba(255,255,255,0.6)</w:t>
+            </w:r>
+            <w:r>
+              <w:rPr>
+                <w:color w:val="1E293B"/>
+                <w:sz w:val="18"/>
+              </w:rPr>
+              <w:t xml:space="preserve">. New CSS keyframes added: </w:t>
+            </w:r>
+            <w:r>
+              <w:rPr>
+                <w:rFonts w:ascii="Courier New" w:hAnsi="Courier New"/>
+                <w:color w:val="0F172A"/>
+                <w:sz w:val="18"/>
+              </w:rPr>
+              <w:t>ai-orb-pulse</w:t>
+            </w:r>
+            <w:r>
+              <w:rPr>
+                <w:color w:val="1E293B"/>
+                <w:sz w:val="18"/>
+              </w:rPr>
+              <w:t xml:space="preserve">, </w:t>
+            </w:r>
+            <w:r>
+              <w:rPr>
+                <w:rFonts w:ascii="Courier New" w:hAnsi="Courier New"/>
+                <w:color w:val="0F172A"/>
+                <w:sz w:val="18"/>
+              </w:rPr>
+              <w:t>warm-glow</w:t>
+            </w:r>
+            <w:r>
+              <w:rPr>
+                <w:color w:val="1E293B"/>
+                <w:sz w:val="18"/>
+              </w:rPr>
+              <w:t xml:space="preserve">, </w:t>
+            </w:r>
+            <w:r>
+              <w:rPr>
+                <w:rFonts w:ascii="Courier New" w:hAnsi="Courier New"/>
+                <w:color w:val="0F172A"/>
+                <w:sz w:val="18"/>
+              </w:rPr>
+              <w:t>beam-pulse</w:t>
+            </w:r>
+            <w:r>
+              <w:rPr>
+                <w:color w:val="1E293B"/>
+                <w:sz w:val="18"/>
+              </w:rPr>
+              <w:t xml:space="preserve">, </w:t>
+            </w:r>
+            <w:r>
+              <w:rPr>
+                <w:rFonts w:ascii="Courier New" w:hAnsi="Courier New"/>
+                <w:color w:val="0F172A"/>
+                <w:sz w:val="18"/>
+              </w:rPr>
+              <w:t>particle-rise</w:t>
+            </w:r>
+            <w:r>
+              <w:rPr>
+                <w:color w:val="1E293B"/>
+                <w:sz w:val="18"/>
+              </w:rPr>
+              <w:t xml:space="preserve">, </w:t>
+            </w:r>
+            <w:r>
+              <w:rPr>
+                <w:rFonts w:ascii="Courier New" w:hAnsi="Courier New"/>
+                <w:color w:val="0F172A"/>
+                <w:sz w:val="18"/>
+              </w:rPr>
+              <w:t>float-equation</w:t>
+            </w:r>
+            <w:r>
+              <w:rPr>
+                <w:color w:val="1E293B"/>
+                <w:sz w:val="18"/>
+              </w:rPr>
+              <w:t xml:space="preserve">. To use a real AI-generated video: generate a 10–15 s looping MP4 (recommended prompt: "Serene warm study scene, soft-glowing blue AI hologram tutor floating near a desk, happy 10-year-old child looking up with curiosity, floating maths equations drifting around them, ambient film-quality lighting, cinematic, 4K, seamlessly loopable") using Runway Gen-3, Kling AI, or Sora; place the file at </w:t>
+            </w:r>
+            <w:r>
+              <w:rPr>
+                <w:rFonts w:ascii="Courier New" w:hAnsi="Courier New"/>
+                <w:color w:val="0F172A"/>
+                <w:sz w:val="18"/>
+              </w:rPr>
+              <w:t>public/tutor-bg.mp4</w:t>
+            </w:r>
+            <w:r>
+              <w:rPr>
+                <w:color w:val="1E293B"/>
+                <w:sz w:val="18"/>
+              </w:rPr>
+              <w:t>; no code change needed — the player activates automatically</w:t>
             </w:r>
           </w:p>
         </w:tc>
@@ -28818,7 +28870,7 @@
                 <w:b/>
                 <w:color w:val="1E293B"/>
               </w:rPr>
-              <w:t>v0.28.0</w:t>
+              <w:t>v0.29.0</w:t>
             </w:r>
           </w:p>
         </w:tc>
@@ -28868,21 +28920,7 @@
                 <w:color w:val="1E293B"/>
                 <w:sz w:val="18"/>
               </w:rPr>
-              <w:t xml:space="preserve">Landing page visual overhaul + Adventure Mode game-feel + CAPTCHA + professional diagrams — (1) </w:t>
-            </w:r>
-            <w:r>
-              <w:rPr>
-                <w:b/>
-                <w:color w:val="1E293B"/>
-              </w:rPr>
-              <w:t>Sign-in button</w:t>
-            </w:r>
-            <w:r>
-              <w:rPr>
-                <w:color w:val="1E293B"/>
-                <w:sz w:val="18"/>
-              </w:rPr>
-              <w:t xml:space="preserve"> made prominent: navy-bordered outlined button with </w:t>
+              <w:t xml:space="preserve">Guest limit reduced 20 → 10 questions/day — updated in </w:t>
             </w:r>
             <w:r>
               <w:rPr>
@@ -28890,56 +28928,14 @@
                 <w:color w:val="0F172A"/>
                 <w:sz w:val="18"/>
               </w:rPr>
-              <w:t>Sign in →</w:t>
-            </w:r>
-            <w:r>
-              <w:rPr>
-                <w:color w:val="1E293B"/>
-                <w:sz w:val="18"/>
-              </w:rPr>
-              <w:t xml:space="preserve"> text. (2) </w:t>
-            </w:r>
-            <w:r>
-              <w:rPr>
-                <w:b/>
-                <w:color w:val="1E293B"/>
-              </w:rPr>
-              <w:t>"Our story"</w:t>
-            </w:r>
-            <w:r>
-              <w:rPr>
-                <w:color w:val="1E293B"/>
-                <w:sz w:val="18"/>
-              </w:rPr>
-              <w:t xml:space="preserve"> nav link coloured blue with arrow; </w:t>
-            </w:r>
-            <w:r>
-              <w:rPr>
-                <w:b/>
-                <w:color w:val="1E293B"/>
-              </w:rPr>
-              <w:t>Pricing</w:t>
-            </w:r>
-            <w:r>
-              <w:rPr>
-                <w:color w:val="1E293B"/>
-                <w:sz w:val="18"/>
-              </w:rPr>
-              <w:t xml:space="preserve"> becomes a gold pill button. (3) </w:t>
-            </w:r>
-            <w:r>
-              <w:rPr>
-                <w:b/>
-                <w:color w:val="1E293B"/>
-              </w:rPr>
-              <w:t>Rolling banner</w:t>
-            </w:r>
-            <w:r>
-              <w:rPr>
-                <w:color w:val="1E293B"/>
-                <w:sz w:val="18"/>
-              </w:rPr>
-              <w:t xml:space="preserve"> (navy ticker) below stats strip: auto-scrolling marquee of testimonial snippets, exam names, and feature highlights using CSS </w:t>
+              <w:t>GUEST_DAILY_LIMIT</w:t>
+            </w:r>
+            <w:r>
+              <w:rPr>
+                <w:color w:val="1E293B"/>
+                <w:sz w:val="18"/>
+              </w:rPr>
+              <w:t xml:space="preserve"> constant (</w:t>
             </w:r>
             <w:r>
               <w:rPr>
@@ -28947,28 +28943,14 @@
                 <w:color w:val="0F172A"/>
                 <w:sz w:val="18"/>
               </w:rPr>
-              <w:t>marquee-scroll</w:t>
-            </w:r>
-            <w:r>
-              <w:rPr>
-                <w:color w:val="1E293B"/>
-                <w:sz w:val="18"/>
-              </w:rPr>
-              <w:t xml:space="preserve"> keyframe. (4) </w:t>
-            </w:r>
-            <w:r>
-              <w:rPr>
-                <w:b/>
-                <w:color w:val="1E293B"/>
-              </w:rPr>
-              <w:t>Animated motion background</w:t>
-            </w:r>
-            <w:r>
-              <w:rPr>
-                <w:color w:val="1E293B"/>
-                <w:sz w:val="18"/>
-              </w:rPr>
-              <w:t xml:space="preserve"> on hero: 16 floating maths symbols (π, ∑, √, ∫, Δ, etc.) drift upward with staggered fade using </w:t>
+              <w:t>app/page.tsx</w:t>
+            </w:r>
+            <w:r>
+              <w:rPr>
+                <w:color w:val="1E293B"/>
+                <w:sz w:val="18"/>
+              </w:rPr>
+              <w:t xml:space="preserve">, </w:t>
             </w:r>
             <w:r>
               <w:rPr>
@@ -28976,14 +28958,14 @@
                 <w:color w:val="0F172A"/>
                 <w:sz w:val="18"/>
               </w:rPr>
-              <w:t>float-symbol</w:t>
-            </w:r>
-            <w:r>
-              <w:rPr>
-                <w:color w:val="1E293B"/>
-                <w:sz w:val="18"/>
-              </w:rPr>
-              <w:t xml:space="preserve"> keyframe; three gradient orbs pulse with </w:t>
+              <w:t>GuestLimitModal.tsx</w:t>
+            </w:r>
+            <w:r>
+              <w:rPr>
+                <w:color w:val="1E293B"/>
+                <w:sz w:val="18"/>
+              </w:rPr>
+              <w:t xml:space="preserve">), rolling banner copy, FAQ answer, trust badge, and parent dashboard label. CAPTCHA gate on sign-up — (1) </w:t>
             </w:r>
             <w:r>
               <w:rPr>
@@ -28991,42 +28973,14 @@
                 <w:color w:val="0F172A"/>
                 <w:sz w:val="18"/>
               </w:rPr>
-              <w:t>pulse-orb</w:t>
-            </w:r>
-            <w:r>
-              <w:rPr>
-                <w:color w:val="1E293B"/>
-                <w:sz w:val="18"/>
-              </w:rPr>
-              <w:t xml:space="preserve"> animation. (5) </w:t>
-            </w:r>
-            <w:r>
-              <w:rPr>
-                <w:b/>
-                <w:color w:val="1E293B"/>
-              </w:rPr>
-              <w:t>Visual exam badges</w:t>
-            </w:r>
-            <w:r>
-              <w:rPr>
-                <w:color w:val="1E293B"/>
-                <w:sz w:val="18"/>
-              </w:rPr>
-              <w:t xml:space="preserve">: hero right panel and Exams section now display circular coloured badges with abbreviation text and emoji icon per exam instead of plain text with left-bar accent. (6) </w:t>
-            </w:r>
-            <w:r>
-              <w:rPr>
-                <w:b/>
-                <w:color w:val="1E293B"/>
-              </w:rPr>
-              <w:t>Human verification CAPTCHA</w:t>
-            </w:r>
-            <w:r>
-              <w:rPr>
-                <w:color w:val="1E293B"/>
-                <w:sz w:val="18"/>
-              </w:rPr>
-              <w:t xml:space="preserve"> on testimonial form: math challenge (</w:t>
+              <w:t>/sign-up</w:t>
+            </w:r>
+            <w:r>
+              <w:rPr>
+                <w:color w:val="1E293B"/>
+                <w:sz w:val="18"/>
+              </w:rPr>
+              <w:t xml:space="preserve"> page now shows a math CAPTCHA challenge before the Clerk </w:t>
             </w:r>
             <w:r>
               <w:rPr>
@@ -29034,28 +28988,14 @@
                 <w:color w:val="0F172A"/>
                 <w:sz w:val="18"/>
               </w:rPr>
-              <w:t>What is A + B?</w:t>
-            </w:r>
-            <w:r>
-              <w:rPr>
-                <w:color w:val="1E293B"/>
-                <w:sz w:val="18"/>
-              </w:rPr>
-              <w:t xml:space="preserve">) + invisible honeypot field. Bot submissions rejected client-side before API call. (7) </w:t>
-            </w:r>
-            <w:r>
-              <w:rPr>
-                <w:b/>
-                <w:color w:val="1E293B"/>
-              </w:rPr>
-              <w:t>Adventure Mode overhaul</w:t>
-            </w:r>
-            <w:r>
-              <w:rPr>
-                <w:color w:val="1E293B"/>
-                <w:sz w:val="18"/>
-              </w:rPr>
-              <w:t xml:space="preserve">: rank system (Novice → Explorer → Scholar → Expert → Champion → Legend) with animated rank-glow border and XP progress bar to next rank; combo multiplier system (×2 at 3-streak, ×3 at 5-streak) with </w:t>
+              <w:t>&lt;SignUp /&gt;</w:t>
+            </w:r>
+            <w:r>
+              <w:rPr>
+                <w:color w:val="1E293B"/>
+                <w:sz w:val="18"/>
+              </w:rPr>
+              <w:t xml:space="preserve"> form renders (client component with </w:t>
             </w:r>
             <w:r>
               <w:rPr>
@@ -29063,14 +29003,14 @@
                 <w:color w:val="0F172A"/>
                 <w:sz w:val="18"/>
               </w:rPr>
-              <w:t>combo-pop</w:t>
-            </w:r>
-            <w:r>
-              <w:rPr>
-                <w:color w:val="1E293B"/>
-                <w:sz w:val="18"/>
-              </w:rPr>
-              <w:t xml:space="preserve"> animation in HUD; block shake animation on wrong answer (</w:t>
+              <w:t>useState</w:t>
+            </w:r>
+            <w:r>
+              <w:rPr>
+                <w:color w:val="1E293B"/>
+                <w:sz w:val="18"/>
+              </w:rPr>
+              <w:t xml:space="preserve"> gate). (2) New </w:t>
             </w:r>
             <w:r>
               <w:rPr>
@@ -29078,14 +29018,14 @@
                 <w:color w:val="0F172A"/>
                 <w:sz w:val="18"/>
               </w:rPr>
-              <w:t>shake-x</w:t>
-            </w:r>
-            <w:r>
-              <w:rPr>
-                <w:color w:val="1E293B"/>
-                <w:sz w:val="18"/>
-              </w:rPr>
-              <w:t>); block bounce on correct answer (</w:t>
+              <w:t>CaptchaSignUpGate</w:t>
+            </w:r>
+            <w:r>
+              <w:rPr>
+                <w:color w:val="1E293B"/>
+                <w:sz w:val="18"/>
+              </w:rPr>
+              <w:t xml:space="preserve"> component (</w:t>
             </w:r>
             <w:r>
               <w:rPr>
@@ -29093,28 +29033,14 @@
                 <w:color w:val="0F172A"/>
                 <w:sz w:val="18"/>
               </w:rPr>
-              <w:t>correct-bounce</w:t>
-            </w:r>
-            <w:r>
-              <w:rPr>
-                <w:color w:val="1E293B"/>
-                <w:sz w:val="18"/>
-              </w:rPr>
-              <w:t xml:space="preserve">); spinning loader while fetching questions; chapter numbers in world map; best-combo display on stage-complete and game-over screens; animated sequential star reveal on stage-complete; animated skull bounce on game-over with red-pulse background flash. (8) </w:t>
-            </w:r>
-            <w:r>
-              <w:rPr>
-                <w:b/>
-                <w:color w:val="1E293B"/>
-              </w:rPr>
-              <w:t>DESIGN.docx</w:t>
-            </w:r>
-            <w:r>
-              <w:rPr>
-                <w:color w:val="1E293B"/>
-                <w:sz w:val="18"/>
-              </w:rPr>
-              <w:t xml:space="preserve"> now includes a visual appendix of three matplotlib-generated diagrams: system architecture (component boxes with arrows), user journey funnel, and learning modes overview — auto-generated by </w:t>
+              <w:t>app/components/CaptchaSignUpGate.tsx</w:t>
+            </w:r>
+            <w:r>
+              <w:rPr>
+                <w:color w:val="1E293B"/>
+                <w:sz w:val="18"/>
+              </w:rPr>
+              <w:t xml:space="preserve">) wraps any button with a CAPTCHA modal; uses </w:t>
             </w:r>
             <w:r>
               <w:rPr>
@@ -29122,14 +29048,14 @@
                 <w:color w:val="0F172A"/>
                 <w:sz w:val="18"/>
               </w:rPr>
-              <w:t>scripts/generate_design_doc.py</w:t>
-            </w:r>
-            <w:r>
-              <w:rPr>
-                <w:color w:val="1E293B"/>
-                <w:sz w:val="18"/>
-              </w:rPr>
-              <w:t xml:space="preserve"> when </w:t>
+              <w:t>useClerk().openSignUp()</w:t>
+            </w:r>
+            <w:r>
+              <w:rPr>
+                <w:color w:val="1E293B"/>
+                <w:sz w:val="18"/>
+              </w:rPr>
+              <w:t xml:space="preserve"> to open Clerk's sign-up modal after successful verification. </w:t>
             </w:r>
             <w:r>
               <w:rPr>
@@ -29137,14 +29063,37 @@
                 <w:color w:val="0F172A"/>
                 <w:sz w:val="18"/>
               </w:rPr>
-              <w:t>matplotlib</w:t>
-            </w:r>
-            <w:r>
-              <w:rPr>
-                <w:color w:val="1E293B"/>
-                <w:sz w:val="18"/>
-              </w:rPr>
-              <w:t xml:space="preserve"> is installed</w:t>
+              <w:t>GuestLimitModal</w:t>
+            </w:r>
+            <w:r>
+              <w:rPr>
+                <w:color w:val="1E293B"/>
+                <w:sz w:val="18"/>
+              </w:rPr>
+              <w:t xml:space="preserve">'s "Start free 7-day trial →" button now uses </w:t>
+            </w:r>
+            <w:r>
+              <w:rPr>
+                <w:rFonts w:ascii="Courier New" w:hAnsi="Courier New"/>
+                <w:color w:val="0F172A"/>
+                <w:sz w:val="18"/>
+              </w:rPr>
+              <w:t>CaptchaSignUpGate</w:t>
+            </w:r>
+            <w:r>
+              <w:rPr>
+                <w:color w:val="1E293B"/>
+                <w:sz w:val="18"/>
+              </w:rPr>
+              <w:t xml:space="preserve"> instead of </w:t>
+            </w:r>
+            <w:r>
+              <w:rPr>
+                <w:rFonts w:ascii="Courier New" w:hAnsi="Courier New"/>
+                <w:color w:val="0F172A"/>
+                <w:sz w:val="18"/>
+              </w:rPr>
+              <w:t>&lt;SignUpButton&gt;</w:t>
             </w:r>
           </w:p>
         </w:tc>
@@ -29171,7 +29120,7 @@
                 <w:b/>
                 <w:color w:val="1E293B"/>
               </w:rPr>
-              <w:t>v0.27.0</w:t>
+              <w:t>v0.28.0</w:t>
             </w:r>
           </w:p>
         </w:tc>
@@ -29221,7 +29170,283 @@
                 <w:color w:val="1E293B"/>
                 <w:sz w:val="18"/>
               </w:rPr>
-              <w:t>Landing page copy fixes — FAQ "Do I need an account?" updated to mention 20-question/day guest limit and midnight reset; correctly states Exam Mode and Adventure Mode require an account. Trust badge "Free to use / no premium tier" corrected to "Free to start / 7-day trial then $9.99/month AUD". Guest badge updated to "20 free questions a day"</w:t>
+              <w:t xml:space="preserve">Landing page visual overhaul + Adventure Mode game-feel + CAPTCHA + professional diagrams — (1) </w:t>
+            </w:r>
+            <w:r>
+              <w:rPr>
+                <w:b/>
+                <w:color w:val="1E293B"/>
+              </w:rPr>
+              <w:t>Sign-in button</w:t>
+            </w:r>
+            <w:r>
+              <w:rPr>
+                <w:color w:val="1E293B"/>
+                <w:sz w:val="18"/>
+              </w:rPr>
+              <w:t xml:space="preserve"> made prominent: navy-bordered outlined button with </w:t>
+            </w:r>
+            <w:r>
+              <w:rPr>
+                <w:rFonts w:ascii="Courier New" w:hAnsi="Courier New"/>
+                <w:color w:val="0F172A"/>
+                <w:sz w:val="18"/>
+              </w:rPr>
+              <w:t>Sign in →</w:t>
+            </w:r>
+            <w:r>
+              <w:rPr>
+                <w:color w:val="1E293B"/>
+                <w:sz w:val="18"/>
+              </w:rPr>
+              <w:t xml:space="preserve"> text. (2) </w:t>
+            </w:r>
+            <w:r>
+              <w:rPr>
+                <w:b/>
+                <w:color w:val="1E293B"/>
+              </w:rPr>
+              <w:t>"Our story"</w:t>
+            </w:r>
+            <w:r>
+              <w:rPr>
+                <w:color w:val="1E293B"/>
+                <w:sz w:val="18"/>
+              </w:rPr>
+              <w:t xml:space="preserve"> nav link coloured blue with arrow; </w:t>
+            </w:r>
+            <w:r>
+              <w:rPr>
+                <w:b/>
+                <w:color w:val="1E293B"/>
+              </w:rPr>
+              <w:t>Pricing</w:t>
+            </w:r>
+            <w:r>
+              <w:rPr>
+                <w:color w:val="1E293B"/>
+                <w:sz w:val="18"/>
+              </w:rPr>
+              <w:t xml:space="preserve"> becomes a gold pill button. (3) </w:t>
+            </w:r>
+            <w:r>
+              <w:rPr>
+                <w:b/>
+                <w:color w:val="1E293B"/>
+              </w:rPr>
+              <w:t>Rolling banner</w:t>
+            </w:r>
+            <w:r>
+              <w:rPr>
+                <w:color w:val="1E293B"/>
+                <w:sz w:val="18"/>
+              </w:rPr>
+              <w:t xml:space="preserve"> (navy ticker) below stats strip: auto-scrolling marquee of testimonial snippets, exam names, and feature highlights using CSS </w:t>
+            </w:r>
+            <w:r>
+              <w:rPr>
+                <w:rFonts w:ascii="Courier New" w:hAnsi="Courier New"/>
+                <w:color w:val="0F172A"/>
+                <w:sz w:val="18"/>
+              </w:rPr>
+              <w:t>marquee-scroll</w:t>
+            </w:r>
+            <w:r>
+              <w:rPr>
+                <w:color w:val="1E293B"/>
+                <w:sz w:val="18"/>
+              </w:rPr>
+              <w:t xml:space="preserve"> keyframe. (4) </w:t>
+            </w:r>
+            <w:r>
+              <w:rPr>
+                <w:b/>
+                <w:color w:val="1E293B"/>
+              </w:rPr>
+              <w:t>Animated motion background</w:t>
+            </w:r>
+            <w:r>
+              <w:rPr>
+                <w:color w:val="1E293B"/>
+                <w:sz w:val="18"/>
+              </w:rPr>
+              <w:t xml:space="preserve"> on hero: 16 floating maths symbols (π, ∑, √, ∫, Δ, etc.) drift upward with staggered fade using </w:t>
+            </w:r>
+            <w:r>
+              <w:rPr>
+                <w:rFonts w:ascii="Courier New" w:hAnsi="Courier New"/>
+                <w:color w:val="0F172A"/>
+                <w:sz w:val="18"/>
+              </w:rPr>
+              <w:t>float-symbol</w:t>
+            </w:r>
+            <w:r>
+              <w:rPr>
+                <w:color w:val="1E293B"/>
+                <w:sz w:val="18"/>
+              </w:rPr>
+              <w:t xml:space="preserve"> keyframe; three gradient orbs pulse with </w:t>
+            </w:r>
+            <w:r>
+              <w:rPr>
+                <w:rFonts w:ascii="Courier New" w:hAnsi="Courier New"/>
+                <w:color w:val="0F172A"/>
+                <w:sz w:val="18"/>
+              </w:rPr>
+              <w:t>pulse-orb</w:t>
+            </w:r>
+            <w:r>
+              <w:rPr>
+                <w:color w:val="1E293B"/>
+                <w:sz w:val="18"/>
+              </w:rPr>
+              <w:t xml:space="preserve"> animation. (5) </w:t>
+            </w:r>
+            <w:r>
+              <w:rPr>
+                <w:b/>
+                <w:color w:val="1E293B"/>
+              </w:rPr>
+              <w:t>Visual exam badges</w:t>
+            </w:r>
+            <w:r>
+              <w:rPr>
+                <w:color w:val="1E293B"/>
+                <w:sz w:val="18"/>
+              </w:rPr>
+              <w:t xml:space="preserve">: hero right panel and Exams section now display circular coloured badges with abbreviation text and emoji icon per exam instead of plain text with left-bar accent. (6) </w:t>
+            </w:r>
+            <w:r>
+              <w:rPr>
+                <w:b/>
+                <w:color w:val="1E293B"/>
+              </w:rPr>
+              <w:t>Human verification CAPTCHA</w:t>
+            </w:r>
+            <w:r>
+              <w:rPr>
+                <w:color w:val="1E293B"/>
+                <w:sz w:val="18"/>
+              </w:rPr>
+              <w:t xml:space="preserve"> on testimonial form: math challenge (</w:t>
+            </w:r>
+            <w:r>
+              <w:rPr>
+                <w:rFonts w:ascii="Courier New" w:hAnsi="Courier New"/>
+                <w:color w:val="0F172A"/>
+                <w:sz w:val="18"/>
+              </w:rPr>
+              <w:t>What is A + B?</w:t>
+            </w:r>
+            <w:r>
+              <w:rPr>
+                <w:color w:val="1E293B"/>
+                <w:sz w:val="18"/>
+              </w:rPr>
+              <w:t xml:space="preserve">) + invisible honeypot field. Bot submissions rejected client-side before API call. (7) </w:t>
+            </w:r>
+            <w:r>
+              <w:rPr>
+                <w:b/>
+                <w:color w:val="1E293B"/>
+              </w:rPr>
+              <w:t>Adventure Mode overhaul</w:t>
+            </w:r>
+            <w:r>
+              <w:rPr>
+                <w:color w:val="1E293B"/>
+                <w:sz w:val="18"/>
+              </w:rPr>
+              <w:t xml:space="preserve">: rank system (Novice → Explorer → Scholar → Expert → Champion → Legend) with animated rank-glow border and XP progress bar to next rank; combo multiplier system (×2 at 3-streak, ×3 at 5-streak) with </w:t>
+            </w:r>
+            <w:r>
+              <w:rPr>
+                <w:rFonts w:ascii="Courier New" w:hAnsi="Courier New"/>
+                <w:color w:val="0F172A"/>
+                <w:sz w:val="18"/>
+              </w:rPr>
+              <w:t>combo-pop</w:t>
+            </w:r>
+            <w:r>
+              <w:rPr>
+                <w:color w:val="1E293B"/>
+                <w:sz w:val="18"/>
+              </w:rPr>
+              <w:t xml:space="preserve"> animation in HUD; block shake animation on wrong answer (</w:t>
+            </w:r>
+            <w:r>
+              <w:rPr>
+                <w:rFonts w:ascii="Courier New" w:hAnsi="Courier New"/>
+                <w:color w:val="0F172A"/>
+                <w:sz w:val="18"/>
+              </w:rPr>
+              <w:t>shake-x</w:t>
+            </w:r>
+            <w:r>
+              <w:rPr>
+                <w:color w:val="1E293B"/>
+                <w:sz w:val="18"/>
+              </w:rPr>
+              <w:t>); block bounce on correct answer (</w:t>
+            </w:r>
+            <w:r>
+              <w:rPr>
+                <w:rFonts w:ascii="Courier New" w:hAnsi="Courier New"/>
+                <w:color w:val="0F172A"/>
+                <w:sz w:val="18"/>
+              </w:rPr>
+              <w:t>correct-bounce</w:t>
+            </w:r>
+            <w:r>
+              <w:rPr>
+                <w:color w:val="1E293B"/>
+                <w:sz w:val="18"/>
+              </w:rPr>
+              <w:t xml:space="preserve">); spinning loader while fetching questions; chapter numbers in world map; best-combo display on stage-complete and game-over screens; animated sequential star reveal on stage-complete; animated skull bounce on game-over with red-pulse background flash. (8) </w:t>
+            </w:r>
+            <w:r>
+              <w:rPr>
+                <w:b/>
+                <w:color w:val="1E293B"/>
+              </w:rPr>
+              <w:t>DESIGN.docx</w:t>
+            </w:r>
+            <w:r>
+              <w:rPr>
+                <w:color w:val="1E293B"/>
+                <w:sz w:val="18"/>
+              </w:rPr>
+              <w:t xml:space="preserve"> now includes a visual appendix of three matplotlib-generated diagrams: system architecture (component boxes with arrows), user journey funnel, and learning modes overview — auto-generated by </w:t>
+            </w:r>
+            <w:r>
+              <w:rPr>
+                <w:rFonts w:ascii="Courier New" w:hAnsi="Courier New"/>
+                <w:color w:val="0F172A"/>
+                <w:sz w:val="18"/>
+              </w:rPr>
+              <w:t>scripts/generate_design_doc.py</w:t>
+            </w:r>
+            <w:r>
+              <w:rPr>
+                <w:color w:val="1E293B"/>
+                <w:sz w:val="18"/>
+              </w:rPr>
+              <w:t xml:space="preserve"> when </w:t>
+            </w:r>
+            <w:r>
+              <w:rPr>
+                <w:rFonts w:ascii="Courier New" w:hAnsi="Courier New"/>
+                <w:color w:val="0F172A"/>
+                <w:sz w:val="18"/>
+              </w:rPr>
+              <w:t>matplotlib</w:t>
+            </w:r>
+            <w:r>
+              <w:rPr>
+                <w:color w:val="1E293B"/>
+                <w:sz w:val="18"/>
+              </w:rPr>
+              <w:t xml:space="preserve"> is installed</w:t>
             </w:r>
           </w:p>
         </w:tc>
@@ -29248,7 +29473,7 @@
                 <w:b/>
                 <w:color w:val="1E293B"/>
               </w:rPr>
-              <w:t>v0.26.0</w:t>
+              <w:t>v0.27.0</w:t>
             </w:r>
           </w:p>
         </w:tc>
@@ -29298,112 +29523,7 @@
                 <w:color w:val="1E293B"/>
                 <w:sz w:val="18"/>
               </w:rPr>
-              <w:t xml:space="preserve">DoS protection — three-layer defence: (1) Upstash Redis distributed rate limiting replaces the defunct in-memory </w:t>
-            </w:r>
-            <w:r>
-              <w:rPr>
-                <w:rFonts w:ascii="Courier New" w:hAnsi="Courier New"/>
-                <w:color w:val="0F172A"/>
-                <w:sz w:val="18"/>
-              </w:rPr>
-              <w:t>Map</w:t>
-            </w:r>
-            <w:r>
-              <w:rPr>
-                <w:color w:val="1E293B"/>
-                <w:sz w:val="18"/>
-              </w:rPr>
-              <w:t xml:space="preserve"> in </w:t>
-            </w:r>
-            <w:r>
-              <w:rPr>
-                <w:rFonts w:ascii="Courier New" w:hAnsi="Courier New"/>
-                <w:color w:val="0F172A"/>
-                <w:sz w:val="18"/>
-              </w:rPr>
-              <w:t>lib/ratelimit.ts</w:t>
-            </w:r>
-            <w:r>
-              <w:rPr>
-                <w:color w:val="1E293B"/>
-                <w:sz w:val="18"/>
-              </w:rPr>
-              <w:t xml:space="preserve"> — sliding window, graceful in-memory fallback when env vars absent, unique Redis prefix per endpoint. </w:t>
-            </w:r>
-            <w:r>
-              <w:rPr>
-                <w:rFonts w:ascii="Courier New" w:hAnsi="Courier New"/>
-                <w:color w:val="0F172A"/>
-                <w:sz w:val="18"/>
-              </w:rPr>
-              <w:t>middleware.ts</w:t>
-            </w:r>
-            <w:r>
-              <w:rPr>
-                <w:color w:val="1E293B"/>
-                <w:sz w:val="18"/>
-              </w:rPr>
-              <w:t xml:space="preserve"> deprecated → renamed to </w:t>
-            </w:r>
-            <w:r>
-              <w:rPr>
-                <w:rFonts w:ascii="Courier New" w:hAnsi="Courier New"/>
-                <w:color w:val="0F172A"/>
-                <w:sz w:val="18"/>
-              </w:rPr>
-              <w:t>proxy.ts</w:t>
-            </w:r>
-            <w:r>
-              <w:rPr>
-                <w:color w:val="1E293B"/>
-                <w:sz w:val="18"/>
-              </w:rPr>
-              <w:t xml:space="preserve"> per Next.js 16 proxy convention; proxy runs a blanket 120-req/60s-per-IP gate on all </w:t>
-            </w:r>
-            <w:r>
-              <w:rPr>
-                <w:rFonts w:ascii="Courier New" w:hAnsi="Courier New"/>
-                <w:color w:val="0F172A"/>
-                <w:sz w:val="18"/>
-              </w:rPr>
-              <w:t>/api/*</w:t>
-            </w:r>
-            <w:r>
-              <w:rPr>
-                <w:color w:val="1E293B"/>
-                <w:sz w:val="18"/>
-              </w:rPr>
-              <w:t xml:space="preserve"> routes before any serverless function is invoked. (2) Per-endpoint fine-grained limits: </w:t>
-            </w:r>
-            <w:r>
-              <w:rPr>
-                <w:rFonts w:ascii="Courier New" w:hAnsi="Courier New"/>
-                <w:color w:val="0F172A"/>
-                <w:sz w:val="18"/>
-              </w:rPr>
-              <w:t>/api/chat</w:t>
-            </w:r>
-            <w:r>
-              <w:rPr>
-                <w:color w:val="1E293B"/>
-                <w:sz w:val="18"/>
-              </w:rPr>
-              <w:t xml:space="preserve"> 30/60s, </w:t>
-            </w:r>
-            <w:r>
-              <w:rPr>
-                <w:rFonts w:ascii="Courier New" w:hAnsi="Courier New"/>
-                <w:color w:val="0F172A"/>
-                <w:sz w:val="18"/>
-              </w:rPr>
-              <w:t>/api/trivia</w:t>
-            </w:r>
-            <w:r>
-              <w:rPr>
-                <w:color w:val="1E293B"/>
-                <w:sz w:val="18"/>
-              </w:rPr>
-              <w:t xml:space="preserve"> 10/60s, `/api/exam/generate</w:t>
+              <w:t>Landing page copy fixes — FAQ "Do I need an account?" updated to mention 20-question/day guest limit and midnight reset; correctly states Exam Mode and Adventure Mode require an account. Trust badge "Free to use / no premium tier" corrected to "Free to start / 7-day trial then $9.99/month AUD". Guest badge updated to "20 free questions a day"</w:t>
             </w:r>
           </w:p>
         </w:tc>
@@ -29430,7 +29550,7 @@
                 <w:b/>
                 <w:color w:val="1E293B"/>
               </w:rPr>
-              <w:t>v0.25.0</w:t>
+              <w:t>v0.26.0</w:t>
             </w:r>
           </w:p>
         </w:tc>
@@ -29480,7 +29600,7 @@
                 <w:color w:val="1E293B"/>
                 <w:sz w:val="18"/>
               </w:rPr>
-              <w:t xml:space="preserve">Automated security agent — (1) </w:t>
+              <w:t xml:space="preserve">DoS protection — three-layer defence: (1) Upstash Redis distributed rate limiting replaces the defunct in-memory </w:t>
             </w:r>
             <w:r>
               <w:rPr>
@@ -29488,14 +29608,14 @@
                 <w:color w:val="0F172A"/>
                 <w:sz w:val="18"/>
               </w:rPr>
-              <w:t>next.config.ts</w:t>
-            </w:r>
-            <w:r>
-              <w:rPr>
-                <w:color w:val="1E293B"/>
-                <w:sz w:val="18"/>
-              </w:rPr>
-              <w:t xml:space="preserve"> now sets 7 HTTP security headers on every route: </w:t>
+              <w:t>Map</w:t>
+            </w:r>
+            <w:r>
+              <w:rPr>
+                <w:color w:val="1E293B"/>
+                <w:sz w:val="18"/>
+              </w:rPr>
+              <w:t xml:space="preserve"> in </w:t>
             </w:r>
             <w:r>
               <w:rPr>
@@ -29503,14 +29623,14 @@
                 <w:color w:val="0F172A"/>
                 <w:sz w:val="18"/>
               </w:rPr>
-              <w:t>X-Frame-Options: SAMEORIGIN</w:t>
-            </w:r>
-            <w:r>
-              <w:rPr>
-                <w:color w:val="1E293B"/>
-                <w:sz w:val="18"/>
-              </w:rPr>
-              <w:t xml:space="preserve">, </w:t>
+              <w:t>lib/ratelimit.ts</w:t>
+            </w:r>
+            <w:r>
+              <w:rPr>
+                <w:color w:val="1E293B"/>
+                <w:sz w:val="18"/>
+              </w:rPr>
+              <w:t xml:space="preserve"> — sliding window, graceful in-memory fallback when env vars absent, unique Redis prefix per endpoint. </w:t>
             </w:r>
             <w:r>
               <w:rPr>
@@ -29518,14 +29638,14 @@
                 <w:color w:val="0F172A"/>
                 <w:sz w:val="18"/>
               </w:rPr>
-              <w:t>X-Content-Type-Options: nosniff</w:t>
-            </w:r>
-            <w:r>
-              <w:rPr>
-                <w:color w:val="1E293B"/>
-                <w:sz w:val="18"/>
-              </w:rPr>
-              <w:t xml:space="preserve">, </w:t>
+              <w:t>middleware.ts</w:t>
+            </w:r>
+            <w:r>
+              <w:rPr>
+                <w:color w:val="1E293B"/>
+                <w:sz w:val="18"/>
+              </w:rPr>
+              <w:t xml:space="preserve"> deprecated → renamed to </w:t>
             </w:r>
             <w:r>
               <w:rPr>
@@ -29533,14 +29653,14 @@
                 <w:color w:val="0F172A"/>
                 <w:sz w:val="18"/>
               </w:rPr>
-              <w:t>Referrer-Policy: strict-origin-when-cross-origin</w:t>
-            </w:r>
-            <w:r>
-              <w:rPr>
-                <w:color w:val="1E293B"/>
-                <w:sz w:val="18"/>
-              </w:rPr>
-              <w:t xml:space="preserve">, </w:t>
+              <w:t>proxy.ts</w:t>
+            </w:r>
+            <w:r>
+              <w:rPr>
+                <w:color w:val="1E293B"/>
+                <w:sz w:val="18"/>
+              </w:rPr>
+              <w:t xml:space="preserve"> per Next.js 16 proxy convention; proxy runs a blanket 120-req/60s-per-IP gate on all </w:t>
             </w:r>
             <w:r>
               <w:rPr>
@@ -29548,14 +29668,14 @@
                 <w:color w:val="0F172A"/>
                 <w:sz w:val="18"/>
               </w:rPr>
-              <w:t>Permissions-Policy</w:t>
-            </w:r>
-            <w:r>
-              <w:rPr>
-                <w:color w:val="1E293B"/>
-                <w:sz w:val="18"/>
-              </w:rPr>
-              <w:t xml:space="preserve"> (blocks camera/mic/geo/payment), </w:t>
+              <w:t>/api/*</w:t>
+            </w:r>
+            <w:r>
+              <w:rPr>
+                <w:color w:val="1E293B"/>
+                <w:sz w:val="18"/>
+              </w:rPr>
+              <w:t xml:space="preserve"> routes before any serverless function is invoked. (2) Per-endpoint fine-grained limits: </w:t>
             </w:r>
             <w:r>
               <w:rPr>
@@ -29563,14 +29683,14 @@
                 <w:color w:val="0F172A"/>
                 <w:sz w:val="18"/>
               </w:rPr>
-              <w:t>Strict-Transport-Security</w:t>
-            </w:r>
-            <w:r>
-              <w:rPr>
-                <w:color w:val="1E293B"/>
-                <w:sz w:val="18"/>
-              </w:rPr>
-              <w:t xml:space="preserve"> (2yr + preload), </w:t>
+              <w:t>/api/chat</w:t>
+            </w:r>
+            <w:r>
+              <w:rPr>
+                <w:color w:val="1E293B"/>
+                <w:sz w:val="18"/>
+              </w:rPr>
+              <w:t xml:space="preserve"> 30/60s, </w:t>
             </w:r>
             <w:r>
               <w:rPr>
@@ -29578,44 +29698,14 @@
                 <w:color w:val="0F172A"/>
                 <w:sz w:val="18"/>
               </w:rPr>
-              <w:t>X-DNS-Prefetch-Control</w:t>
-            </w:r>
-            <w:r>
-              <w:rPr>
-                <w:color w:val="1E293B"/>
-                <w:sz w:val="18"/>
-              </w:rPr>
-              <w:t xml:space="preserve">, and a full </w:t>
-            </w:r>
-            <w:r>
-              <w:rPr>
-                <w:rFonts w:ascii="Courier New" w:hAnsi="Courier New"/>
-                <w:color w:val="0F172A"/>
-                <w:sz w:val="18"/>
-              </w:rPr>
-              <w:t>Content-Security-Policy</w:t>
-            </w:r>
-            <w:r>
-              <w:rPr>
-                <w:color w:val="1E293B"/>
-                <w:sz w:val="18"/>
-              </w:rPr>
-              <w:t xml:space="preserve"> covering script/style/font/img/connect/frame origins for Clerk, Stripe, KaTeX, Google Fonts, and Vercel Analytics. (2) </w:t>
-            </w:r>
-            <w:r>
-              <w:rPr>
-                <w:rFonts w:ascii="Courier New" w:hAnsi="Courier New"/>
-                <w:color w:val="0F172A"/>
-                <w:sz w:val="18"/>
-              </w:rPr>
-              <w:t>scripts/pentest.mjs</w:t>
-            </w:r>
-            <w:r>
-              <w:rPr>
-                <w:color w:val="1E293B"/>
-                <w:sz w:val="18"/>
-              </w:rPr>
-              <w:t xml:space="preserve"> — runnable Node.js audit that checks headers, probes 7 API endpoints for unauthenticated access, runs npm audit, scans codebase for dangerous patterns (dangerouslySetInnerHTML, eval, hardcoded secrets, SQL injection, wildcard CORS, sensitive console.log, NEXT_PUBLIC_ secrets, missing auth on API routes), and checks TLS redirect; outputs structured JSON. (3) Weekly Claude Code agent scheduled trigger (every Monday 18:00 UTC) — runs the audit, auto-fixes CRITICAL/HIGH findings, rebuilds, deploys, re-audits to confirm, updates DESIGN.md, and emails the founder a markdown report</w:t>
+              <w:t>/api/trivia</w:t>
+            </w:r>
+            <w:r>
+              <w:rPr>
+                <w:color w:val="1E293B"/>
+                <w:sz w:val="18"/>
+              </w:rPr>
+              <w:t xml:space="preserve"> 10/60s, `/api/exam/generate</w:t>
             </w:r>
           </w:p>
         </w:tc>
@@ -29642,7 +29732,7 @@
                 <w:b/>
                 <w:color w:val="1E293B"/>
               </w:rPr>
-              <w:t>v0.24.0</w:t>
+              <w:t>v0.25.0</w:t>
             </w:r>
           </w:p>
         </w:tc>
@@ -29692,7 +29782,7 @@
                 <w:color w:val="1E293B"/>
                 <w:sz w:val="18"/>
               </w:rPr>
-              <w:t>Guest 20-questions/day limit — anonymous users (no Clerk session, no child session) are now gated at 20 questions per day via localStorage (</w:t>
+              <w:t xml:space="preserve">Automated security agent — (1) </w:t>
             </w:r>
             <w:r>
               <w:rPr>
@@ -29700,14 +29790,14 @@
                 <w:color w:val="0F172A"/>
                 <w:sz w:val="18"/>
               </w:rPr>
-              <w:t>selected_guest_usage: {count, date}</w:t>
-            </w:r>
-            <w:r>
-              <w:rPr>
-                <w:color w:val="1E293B"/>
-                <w:sz w:val="18"/>
-              </w:rPr>
-              <w:t xml:space="preserve">). On limit hit or locked-mode attempt, </w:t>
+              <w:t>next.config.ts</w:t>
+            </w:r>
+            <w:r>
+              <w:rPr>
+                <w:color w:val="1E293B"/>
+                <w:sz w:val="18"/>
+              </w:rPr>
+              <w:t xml:space="preserve"> now sets 7 HTTP security headers on every route: </w:t>
             </w:r>
             <w:r>
               <w:rPr>
@@ -29715,14 +29805,14 @@
                 <w:color w:val="0F172A"/>
                 <w:sz w:val="18"/>
               </w:rPr>
-              <w:t>GuestLimitModal</w:t>
-            </w:r>
-            <w:r>
-              <w:rPr>
-                <w:color w:val="1E293B"/>
-                <w:sz w:val="18"/>
-              </w:rPr>
-              <w:t xml:space="preserve"> opens: shows reset countdown to midnight, "Start free 7-day trial" (Clerk SignUpButton modal) and "I already have an account" (SignInButton modal). Header badge shows </w:t>
+              <w:t>X-Frame-Options: SAMEORIGIN</w:t>
+            </w:r>
+            <w:r>
+              <w:rPr>
+                <w:color w:val="1E293B"/>
+                <w:sz w:val="18"/>
+              </w:rPr>
+              <w:t xml:space="preserve">, </w:t>
             </w:r>
             <w:r>
               <w:rPr>
@@ -29730,14 +29820,14 @@
                 <w:color w:val="0F172A"/>
                 <w:sz w:val="18"/>
               </w:rPr>
-              <w:t>X/20 questions today</w:t>
-            </w:r>
-            <w:r>
-              <w:rPr>
-                <w:color w:val="1E293B"/>
-                <w:sz w:val="18"/>
-              </w:rPr>
-              <w:t xml:space="preserve"> for guests (turns red at limit). Signed-in parents and child sessions continue to use server-side tracking. </w:t>
+              <w:t>X-Content-Type-Options: nosniff</w:t>
+            </w:r>
+            <w:r>
+              <w:rPr>
+                <w:color w:val="1E293B"/>
+                <w:sz w:val="18"/>
+              </w:rPr>
+              <w:t xml:space="preserve">, </w:t>
             </w:r>
             <w:r>
               <w:rPr>
@@ -29745,14 +29835,89 @@
                 <w:color w:val="0F172A"/>
                 <w:sz w:val="18"/>
               </w:rPr>
-              <w:t>app/components/GuestLimitModal.tsx</w:t>
-            </w:r>
-            <w:r>
-              <w:rPr>
-                <w:color w:val="1E293B"/>
-                <w:sz w:val="18"/>
-              </w:rPr>
-              <w:t xml:space="preserve"> added</w:t>
+              <w:t>Referrer-Policy: strict-origin-when-cross-origin</w:t>
+            </w:r>
+            <w:r>
+              <w:rPr>
+                <w:color w:val="1E293B"/>
+                <w:sz w:val="18"/>
+              </w:rPr>
+              <w:t xml:space="preserve">, </w:t>
+            </w:r>
+            <w:r>
+              <w:rPr>
+                <w:rFonts w:ascii="Courier New" w:hAnsi="Courier New"/>
+                <w:color w:val="0F172A"/>
+                <w:sz w:val="18"/>
+              </w:rPr>
+              <w:t>Permissions-Policy</w:t>
+            </w:r>
+            <w:r>
+              <w:rPr>
+                <w:color w:val="1E293B"/>
+                <w:sz w:val="18"/>
+              </w:rPr>
+              <w:t xml:space="preserve"> (blocks camera/mic/geo/payment), </w:t>
+            </w:r>
+            <w:r>
+              <w:rPr>
+                <w:rFonts w:ascii="Courier New" w:hAnsi="Courier New"/>
+                <w:color w:val="0F172A"/>
+                <w:sz w:val="18"/>
+              </w:rPr>
+              <w:t>Strict-Transport-Security</w:t>
+            </w:r>
+            <w:r>
+              <w:rPr>
+                <w:color w:val="1E293B"/>
+                <w:sz w:val="18"/>
+              </w:rPr>
+              <w:t xml:space="preserve"> (2yr + preload), </w:t>
+            </w:r>
+            <w:r>
+              <w:rPr>
+                <w:rFonts w:ascii="Courier New" w:hAnsi="Courier New"/>
+                <w:color w:val="0F172A"/>
+                <w:sz w:val="18"/>
+              </w:rPr>
+              <w:t>X-DNS-Prefetch-Control</w:t>
+            </w:r>
+            <w:r>
+              <w:rPr>
+                <w:color w:val="1E293B"/>
+                <w:sz w:val="18"/>
+              </w:rPr>
+              <w:t xml:space="preserve">, and a full </w:t>
+            </w:r>
+            <w:r>
+              <w:rPr>
+                <w:rFonts w:ascii="Courier New" w:hAnsi="Courier New"/>
+                <w:color w:val="0F172A"/>
+                <w:sz w:val="18"/>
+              </w:rPr>
+              <w:t>Content-Security-Policy</w:t>
+            </w:r>
+            <w:r>
+              <w:rPr>
+                <w:color w:val="1E293B"/>
+                <w:sz w:val="18"/>
+              </w:rPr>
+              <w:t xml:space="preserve"> covering script/style/font/img/connect/frame origins for Clerk, Stripe, KaTeX, Google Fonts, and Vercel Analytics. (2) </w:t>
+            </w:r>
+            <w:r>
+              <w:rPr>
+                <w:rFonts w:ascii="Courier New" w:hAnsi="Courier New"/>
+                <w:color w:val="0F172A"/>
+                <w:sz w:val="18"/>
+              </w:rPr>
+              <w:t>scripts/pentest.mjs</w:t>
+            </w:r>
+            <w:r>
+              <w:rPr>
+                <w:color w:val="1E293B"/>
+                <w:sz w:val="18"/>
+              </w:rPr>
+              <w:t xml:space="preserve"> — runnable Node.js audit that checks headers, probes 7 API endpoints for unauthenticated access, runs npm audit, scans codebase for dangerous patterns (dangerouslySetInnerHTML, eval, hardcoded secrets, SQL injection, wildcard CORS, sensitive console.log, NEXT_PUBLIC_ secrets, missing auth on API routes), and checks TLS redirect; outputs structured JSON. (3) Weekly Claude Code agent scheduled trigger (every Monday 18:00 UTC) — runs the audit, auto-fixes CRITICAL/HIGH findings, rebuilds, deploys, re-audits to confirm, updates DESIGN.md, and emails the founder a markdown report</w:t>
             </w:r>
           </w:p>
         </w:tc>
@@ -29779,7 +29944,7 @@
                 <w:b/>
                 <w:color w:val="1E293B"/>
               </w:rPr>
-              <w:t>v0.23.0</w:t>
+              <w:t>v0.24.0</w:t>
             </w:r>
           </w:p>
         </w:tc>
@@ -29829,6 +29994,143 @@
                 <w:color w:val="1E293B"/>
                 <w:sz w:val="18"/>
               </w:rPr>
+              <w:t>Guest 20-questions/day limit — anonymous users (no Clerk session, no child session) are now gated at 20 questions per day via localStorage (</w:t>
+            </w:r>
+            <w:r>
+              <w:rPr>
+                <w:rFonts w:ascii="Courier New" w:hAnsi="Courier New"/>
+                <w:color w:val="0F172A"/>
+                <w:sz w:val="18"/>
+              </w:rPr>
+              <w:t>selected_guest_usage: {count, date}</w:t>
+            </w:r>
+            <w:r>
+              <w:rPr>
+                <w:color w:val="1E293B"/>
+                <w:sz w:val="18"/>
+              </w:rPr>
+              <w:t xml:space="preserve">). On limit hit or locked-mode attempt, </w:t>
+            </w:r>
+            <w:r>
+              <w:rPr>
+                <w:rFonts w:ascii="Courier New" w:hAnsi="Courier New"/>
+                <w:color w:val="0F172A"/>
+                <w:sz w:val="18"/>
+              </w:rPr>
+              <w:t>GuestLimitModal</w:t>
+            </w:r>
+            <w:r>
+              <w:rPr>
+                <w:color w:val="1E293B"/>
+                <w:sz w:val="18"/>
+              </w:rPr>
+              <w:t xml:space="preserve"> opens: shows reset countdown to midnight, "Start free 7-day trial" (Clerk SignUpButton modal) and "I already have an account" (SignInButton modal). Header badge shows </w:t>
+            </w:r>
+            <w:r>
+              <w:rPr>
+                <w:rFonts w:ascii="Courier New" w:hAnsi="Courier New"/>
+                <w:color w:val="0F172A"/>
+                <w:sz w:val="18"/>
+              </w:rPr>
+              <w:t>X/20 questions today</w:t>
+            </w:r>
+            <w:r>
+              <w:rPr>
+                <w:color w:val="1E293B"/>
+                <w:sz w:val="18"/>
+              </w:rPr>
+              <w:t xml:space="preserve"> for guests (turns red at limit). Signed-in parents and child sessions continue to use server-side tracking. </w:t>
+            </w:r>
+            <w:r>
+              <w:rPr>
+                <w:rFonts w:ascii="Courier New" w:hAnsi="Courier New"/>
+                <w:color w:val="0F172A"/>
+                <w:sz w:val="18"/>
+              </w:rPr>
+              <w:t>app/components/GuestLimitModal.tsx</w:t>
+            </w:r>
+            <w:r>
+              <w:rPr>
+                <w:color w:val="1E293B"/>
+                <w:sz w:val="18"/>
+              </w:rPr>
+              <w:t xml:space="preserve"> added</w:t>
+            </w:r>
+          </w:p>
+        </w:tc>
+      </w:tr>
+      <w:tr>
+        <w:tc>
+          <w:tcPr>
+            <w:tcW w:type="dxa" w:w="3024"/>
+            <w:shd w:val="clear" w:color="auto" w:fill="F8FAFC"/>
+            <w:tcBorders>
+              <w:top w:val="single" w:sz="4" w:space="0" w:color="E2E8F0"/>
+              <w:left w:val="single" w:sz="4" w:space="0" w:color="E2E8F0"/>
+              <w:bottom w:val="single" w:sz="4" w:space="0" w:color="E2E8F0"/>
+              <w:right w:val="single" w:sz="4" w:space="0" w:color="E2E8F0"/>
+            </w:tcBorders>
+          </w:tcPr>
+          <w:p>
+            <w:pPr>
+              <w:spacing w:before="30" w:after="30"/>
+            </w:pPr>
+            <w:r/>
+            <w:r>
+              <w:rPr>
+                <w:b/>
+                <w:color w:val="1E293B"/>
+              </w:rPr>
+              <w:t>v0.23.0</w:t>
+            </w:r>
+          </w:p>
+        </w:tc>
+        <w:tc>
+          <w:tcPr>
+            <w:tcW w:type="dxa" w:w="3024"/>
+            <w:shd w:val="clear" w:color="auto" w:fill="F8FAFC"/>
+            <w:tcBorders>
+              <w:top w:val="single" w:sz="4" w:space="0" w:color="E2E8F0"/>
+              <w:left w:val="single" w:sz="4" w:space="0" w:color="E2E8F0"/>
+              <w:bottom w:val="single" w:sz="4" w:space="0" w:color="E2E8F0"/>
+              <w:right w:val="single" w:sz="4" w:space="0" w:color="E2E8F0"/>
+            </w:tcBorders>
+          </w:tcPr>
+          <w:p>
+            <w:pPr>
+              <w:spacing w:before="30" w:after="30"/>
+            </w:pPr>
+            <w:r/>
+            <w:r>
+              <w:rPr>
+                <w:color w:val="1E293B"/>
+                <w:sz w:val="18"/>
+              </w:rPr>
+              <w:t>July 2026</w:t>
+            </w:r>
+          </w:p>
+        </w:tc>
+        <w:tc>
+          <w:tcPr>
+            <w:tcW w:type="dxa" w:w="3024"/>
+            <w:shd w:val="clear" w:color="auto" w:fill="F8FAFC"/>
+            <w:tcBorders>
+              <w:top w:val="single" w:sz="4" w:space="0" w:color="E2E8F0"/>
+              <w:left w:val="single" w:sz="4" w:space="0" w:color="E2E8F0"/>
+              <w:bottom w:val="single" w:sz="4" w:space="0" w:color="E2E8F0"/>
+              <w:right w:val="single" w:sz="4" w:space="0" w:color="E2E8F0"/>
+            </w:tcBorders>
+          </w:tcPr>
+          <w:p>
+            <w:pPr>
+              <w:spacing w:before="30" w:after="30"/>
+            </w:pPr>
+            <w:r/>
+            <w:r>
+              <w:rPr>
+                <w:color w:val="1E293B"/>
+                <w:sz w:val="18"/>
+              </w:rPr>
               <w:t xml:space="preserve">Landing page: exam coverage panel, testimonials section, FAQ accordion — (1) Hero redesigned to two-column layout on desktop: text/CTAs left, exam coverage panel right. Panel shows 8 colour-coded exam badges (AMC, Olympiad, ACER, ICAS, ATAR, NAPLAN, Bebras, KSF) with name, full title, year range, and coloured accent bar. Includes legal disclaimer: "SelectEd is an independent preparation platform. Not affiliated with, endorsed by, or connected to the organisations that administer these assessments." (2) Testimonials section added (after Founder card): 3 hardcoded seed cards + fetched approved DB testimonials; "Share your experience →" opens inline form (name, location, star rating, quote); </w:t>
             </w:r>
             <w:r>
@@ -29933,7 +30235,7 @@
           <w:i/>
           <w:color w:val="1E293B"/>
         </w:rPr>
-        <w:t>Document last updated: 1 July 2026 (v0.30). Updated alongside the codebase whenever routes, components, or UX decisions change.</w:t>
+        <w:t>Document last updated: 1 July 2026 (v0.31). Updated alongside the codebase whenever routes, components, or UX decisions change.</w:t>
       </w:r>
     </w:p>
     <w:p>

</xml_diff>

<commit_message>
docs: v0.32.0 start-choice modal in version history
Co-Authored-By: Claude Sonnet 4.6 <noreply@anthropic.com>
</commit_message>
<xml_diff>
--- a/DESIGN.docx
+++ b/DESIGN.docx
@@ -27777,7 +27777,7 @@
                 <w:b/>
                 <w:color w:val="1E293B"/>
               </w:rPr>
-              <w:t>v0.31.0</w:t>
+              <w:t>v0.32.0</w:t>
             </w:r>
           </w:p>
         </w:tc>
@@ -27827,7 +27827,7 @@
                 <w:color w:val="1E293B"/>
                 <w:sz w:val="18"/>
               </w:rPr>
-              <w:t xml:space="preserve">Custom sign-up form — phone number removal and Clerk v7 Future API migration. Replaced Clerk's built-in </w:t>
+              <w:t xml:space="preserve">Start-choice modal — all landing CTAs ("Get started", "Start free trial", "Try it free", pricing buttons) now open a modal offering two options: "Create account — 7-day free trial" (math CAPTCHA gate → </w:t>
             </w:r>
             <w:r>
               <w:rPr>
@@ -27835,224 +27835,14 @@
                 <w:color w:val="0F172A"/>
                 <w:sz w:val="18"/>
               </w:rPr>
-              <w:t>&lt;SignUp /&gt;</w:t>
-            </w:r>
-            <w:r>
-              <w:rPr>
-                <w:color w:val="1E293B"/>
-                <w:sz w:val="18"/>
-              </w:rPr>
-              <w:t xml:space="preserve"> modal with a fully custom sign-up page (</w:t>
-            </w:r>
-            <w:r>
-              <w:rPr>
-                <w:rFonts w:ascii="Courier New" w:hAnsi="Courier New"/>
-                <w:color w:val="0F172A"/>
-                <w:sz w:val="18"/>
-              </w:rPr>
-              <w:t>app/sign-up/[[...sign-up]]/page.tsx</w:t>
-            </w:r>
-            <w:r>
-              <w:rPr>
-                <w:color w:val="1E293B"/>
-                <w:sz w:val="18"/>
-              </w:rPr>
-              <w:t>) using Clerk's programmatic Future API (</w:t>
-            </w:r>
-            <w:r>
-              <w:rPr>
-                <w:rFonts w:ascii="Courier New" w:hAnsi="Courier New"/>
-                <w:color w:val="0F172A"/>
-                <w:sz w:val="18"/>
-              </w:rPr>
-              <w:t>useSignUp()</w:t>
-            </w:r>
-            <w:r>
-              <w:rPr>
-                <w:color w:val="1E293B"/>
-                <w:sz w:val="18"/>
-              </w:rPr>
-              <w:t xml:space="preserve"> returning </w:t>
-            </w:r>
-            <w:r>
-              <w:rPr>
-                <w:rFonts w:ascii="Courier New" w:hAnsi="Courier New"/>
-                <w:color w:val="0F172A"/>
-                <w:sz w:val="18"/>
-              </w:rPr>
-              <w:t>{ signUp, fetchStatus }</w:t>
-            </w:r>
-            <w:r>
-              <w:rPr>
-                <w:color w:val="1E293B"/>
-                <w:sz w:val="18"/>
-              </w:rPr>
-              <w:t xml:space="preserve">). Flow: email + password + optional name → </w:t>
-            </w:r>
-            <w:r>
-              <w:rPr>
-                <w:rFonts w:ascii="Courier New" w:hAnsi="Courier New"/>
-                <w:color w:val="0F172A"/>
-                <w:sz w:val="18"/>
-              </w:rPr>
-              <w:t>signUp.password()</w:t>
-            </w:r>
-            <w:r>
-              <w:rPr>
-                <w:color w:val="1E293B"/>
-                <w:sz w:val="18"/>
-              </w:rPr>
-              <w:t xml:space="preserve"> → </w:t>
-            </w:r>
-            <w:r>
-              <w:rPr>
-                <w:rFonts w:ascii="Courier New" w:hAnsi="Courier New"/>
-                <w:color w:val="0F172A"/>
-                <w:sz w:val="18"/>
-              </w:rPr>
-              <w:t>signUp.verifications.sendEmailCode()</w:t>
-            </w:r>
-            <w:r>
-              <w:rPr>
-                <w:color w:val="1E293B"/>
-                <w:sz w:val="18"/>
-              </w:rPr>
-              <w:t xml:space="preserve"> → 6-digit OTP screen → </w:t>
-            </w:r>
-            <w:r>
-              <w:rPr>
-                <w:rFonts w:ascii="Courier New" w:hAnsi="Courier New"/>
-                <w:color w:val="0F172A"/>
-                <w:sz w:val="18"/>
-              </w:rPr>
-              <w:t>signUp.verifications.verifyEmailCode({ code })</w:t>
-            </w:r>
-            <w:r>
-              <w:rPr>
-                <w:color w:val="1E293B"/>
-                <w:sz w:val="18"/>
-              </w:rPr>
-              <w:t xml:space="preserve"> → </w:t>
-            </w:r>
-            <w:r>
-              <w:rPr>
-                <w:rFonts w:ascii="Courier New" w:hAnsi="Courier New"/>
-                <w:color w:val="0F172A"/>
-                <w:sz w:val="18"/>
-              </w:rPr>
-              <w:t>signUp.finalize()</w:t>
-            </w:r>
-            <w:r>
-              <w:rPr>
-                <w:color w:val="1E293B"/>
-                <w:sz w:val="18"/>
-              </w:rPr>
-              <w:t xml:space="preserve"> → redirect to </w:t>
-            </w:r>
-            <w:r>
-              <w:rPr>
-                <w:rFonts w:ascii="Courier New" w:hAnsi="Courier New"/>
-                <w:color w:val="0F172A"/>
-                <w:sz w:val="18"/>
-              </w:rPr>
-              <w:t>/</w:t>
-            </w:r>
-            <w:r>
-              <w:rPr>
-                <w:color w:val="1E293B"/>
-                <w:sz w:val="18"/>
-              </w:rPr>
-              <w:t xml:space="preserve">. Google OAuth via </w:t>
-            </w:r>
-            <w:r>
-              <w:rPr>
-                <w:rFonts w:ascii="Courier New" w:hAnsi="Courier New"/>
-                <w:color w:val="0F172A"/>
-                <w:sz w:val="18"/>
-              </w:rPr>
-              <w:t>signUp.sso({ strategy: "oauth_google", redirectUrl: "/sso-callback", redirectCallbackUrl: "/sso-callback" })</w:t>
-            </w:r>
-            <w:r>
-              <w:rPr>
-                <w:color w:val="1E293B"/>
-                <w:sz w:val="18"/>
-              </w:rPr>
-              <w:t xml:space="preserve">. </w:t>
-            </w:r>
-            <w:r>
-              <w:rPr>
-                <w:rFonts w:ascii="Courier New" w:hAnsi="Courier New"/>
-                <w:color w:val="0F172A"/>
-                <w:sz w:val="18"/>
-              </w:rPr>
-              <w:t>CaptchaSignUpGate</w:t>
-            </w:r>
-            <w:r>
-              <w:rPr>
-                <w:color w:val="1E293B"/>
-                <w:sz w:val="18"/>
-              </w:rPr>
-              <w:t xml:space="preserve"> updated to </w:t>
-            </w:r>
-            <w:r>
-              <w:rPr>
-                <w:rFonts w:ascii="Courier New" w:hAnsi="Courier New"/>
-                <w:color w:val="0F172A"/>
-                <w:sz w:val="18"/>
-              </w:rPr>
-              <w:t>router.push("/sign-up")</w:t>
-            </w:r>
-            <w:r>
-              <w:rPr>
-                <w:color w:val="1E293B"/>
-                <w:sz w:val="18"/>
-              </w:rPr>
-              <w:t xml:space="preserve"> instead of </w:t>
-            </w:r>
-            <w:r>
-              <w:rPr>
-                <w:rFonts w:ascii="Courier New" w:hAnsi="Courier New"/>
-                <w:color w:val="0F172A"/>
-                <w:sz w:val="18"/>
-              </w:rPr>
-              <w:t>openSignUp()</w:t>
-            </w:r>
-            <w:r>
-              <w:rPr>
-                <w:color w:val="1E293B"/>
-                <w:sz w:val="18"/>
-              </w:rPr>
-              <w:t xml:space="preserve"> modal (modal had phone issue too). </w:t>
-            </w:r>
-            <w:r>
-              <w:rPr>
-                <w:rFonts w:ascii="Courier New" w:hAnsi="Courier New"/>
-                <w:color w:val="0F172A"/>
-                <w:sz w:val="18"/>
-              </w:rPr>
-              <w:t>/sso-callback</w:t>
-            </w:r>
-            <w:r>
-              <w:rPr>
-                <w:color w:val="1E293B"/>
-                <w:sz w:val="18"/>
-              </w:rPr>
-              <w:t xml:space="preserve"> page (</w:t>
-            </w:r>
-            <w:r>
-              <w:rPr>
-                <w:rFonts w:ascii="Courier New" w:hAnsi="Courier New"/>
-                <w:color w:val="0F172A"/>
-                <w:sz w:val="18"/>
-              </w:rPr>
-              <w:t>AuthenticateWithRedirectCallback</w:t>
-            </w:r>
-            <w:r>
-              <w:rPr>
-                <w:color w:val="1E293B"/>
-                <w:sz w:val="18"/>
-              </w:rPr>
-              <w:t>) handles OAuth redirect completion. No phone number field at any step — eliminates "phone numbers from this country are not supported" error for Australian users. Form is fully branded (SelectEd wordmark, navy/gold CTAs, white card on dark background)</w:t>
+              <w:t>/sign-up</w:t>
+            </w:r>
+            <w:r>
+              <w:rPr>
+                <w:color w:val="1E293B"/>
+                <w:sz w:val="18"/>
+              </w:rPr>
+              <w:t>) or "Continue as guest (10 questions/day)" (enters app directly). Previously, every CTA bypassed to guest mode with no sign-up prompt. Signed-in users' "Open app →" button is unchanged. Phone number removed from Clerk auth (disabled in Clerk Dashboard: User &amp; Authentication → Email, Phone, Username → Phone number toggled off)</w:t>
             </w:r>
           </w:p>
         </w:tc>
@@ -28079,7 +27869,7 @@
                 <w:b/>
                 <w:color w:val="1E293B"/>
               </w:rPr>
-              <w:t>v0.30.0</w:t>
+              <w:t>v0.31.0</w:t>
             </w:r>
           </w:p>
         </w:tc>
@@ -28129,21 +27919,7 @@
                 <w:color w:val="1E293B"/>
                 <w:sz w:val="18"/>
               </w:rPr>
-              <w:t xml:space="preserve">Cinematic hero background — (1) </w:t>
-            </w:r>
-            <w:r>
-              <w:rPr>
-                <w:b/>
-                <w:color w:val="1E293B"/>
-              </w:rPr>
-              <w:t>Video background infrastructure</w:t>
-            </w:r>
-            <w:r>
-              <w:rPr>
-                <w:color w:val="1E293B"/>
-                <w:sz w:val="18"/>
-              </w:rPr>
-              <w:t xml:space="preserve">: hero section now mounts an HTML5 </w:t>
+              <w:t xml:space="preserve">Custom sign-up form — phone number removal and Clerk v7 Future API migration. Replaced Clerk's built-in </w:t>
             </w:r>
             <w:r>
               <w:rPr>
@@ -28151,14 +27927,14 @@
                 <w:color w:val="0F172A"/>
                 <w:sz w:val="18"/>
               </w:rPr>
-              <w:t>&lt;video autoPlay muted loop playsInline&gt;</w:t>
-            </w:r>
-            <w:r>
-              <w:rPr>
-                <w:color w:val="1E293B"/>
-                <w:sz w:val="18"/>
-              </w:rPr>
-              <w:t xml:space="preserve"> element pointing to </w:t>
+              <w:t>&lt;SignUp /&gt;</w:t>
+            </w:r>
+            <w:r>
+              <w:rPr>
+                <w:color w:val="1E293B"/>
+                <w:sz w:val="18"/>
+              </w:rPr>
+              <w:t xml:space="preserve"> modal with a fully custom sign-up page (</w:t>
             </w:r>
             <w:r>
               <w:rPr>
@@ -28166,14 +27942,14 @@
                 <w:color w:val="0F172A"/>
                 <w:sz w:val="18"/>
               </w:rPr>
-              <w:t>/public/tutor-bg.mp4</w:t>
-            </w:r>
-            <w:r>
-              <w:rPr>
-                <w:color w:val="1E293B"/>
-                <w:sz w:val="18"/>
-              </w:rPr>
-              <w:t xml:space="preserve">. </w:t>
+              <w:t>app/sign-up/[[...sign-up]]/page.tsx</w:t>
+            </w:r>
+            <w:r>
+              <w:rPr>
+                <w:color w:val="1E293B"/>
+                <w:sz w:val="18"/>
+              </w:rPr>
+              <w:t>) using Clerk's programmatic Future API (</w:t>
             </w:r>
             <w:r>
               <w:rPr>
@@ -28181,14 +27957,14 @@
                 <w:color w:val="0F172A"/>
                 <w:sz w:val="18"/>
               </w:rPr>
-              <w:t>videoBgReady</w:t>
-            </w:r>
-            <w:r>
-              <w:rPr>
-                <w:color w:val="1E293B"/>
-                <w:sz w:val="18"/>
-              </w:rPr>
-              <w:t xml:space="preserve"> React state tracks </w:t>
+              <w:t>useSignUp()</w:t>
+            </w:r>
+            <w:r>
+              <w:rPr>
+                <w:color w:val="1E293B"/>
+                <w:sz w:val="18"/>
+              </w:rPr>
+              <w:t xml:space="preserve"> returning </w:t>
             </w:r>
             <w:r>
               <w:rPr>
@@ -28196,14 +27972,14 @@
                 <w:color w:val="0F172A"/>
                 <w:sz w:val="18"/>
               </w:rPr>
-              <w:t>onCanPlay</w:t>
-            </w:r>
-            <w:r>
-              <w:rPr>
-                <w:color w:val="1E293B"/>
-                <w:sz w:val="18"/>
-              </w:rPr>
-              <w:t xml:space="preserve">; the video fades in with a 1.2 s opacity transition once loaded. When no video file is present (or on load failure), </w:t>
+              <w:t>{ signUp, fetchStatus }</w:t>
+            </w:r>
+            <w:r>
+              <w:rPr>
+                <w:color w:val="1E293B"/>
+                <w:sz w:val="18"/>
+              </w:rPr>
+              <w:t xml:space="preserve">). Flow: email + password + optional name → </w:t>
             </w:r>
             <w:r>
               <w:rPr>
@@ -28211,14 +27987,14 @@
                 <w:color w:val="0F172A"/>
                 <w:sz w:val="18"/>
               </w:rPr>
-              <w:t>videoBgReady</w:t>
-            </w:r>
-            <w:r>
-              <w:rPr>
-                <w:color w:val="1E293B"/>
-                <w:sz w:val="18"/>
-              </w:rPr>
-              <w:t xml:space="preserve"> stays </w:t>
+              <w:t>signUp.password()</w:t>
+            </w:r>
+            <w:r>
+              <w:rPr>
+                <w:color w:val="1E293B"/>
+                <w:sz w:val="18"/>
+              </w:rPr>
+              <w:t xml:space="preserve"> → </w:t>
             </w:r>
             <w:r>
               <w:rPr>
@@ -28226,28 +28002,14 @@
                 <w:color w:val="0F172A"/>
                 <w:sz w:val="18"/>
               </w:rPr>
-              <w:t>false</w:t>
-            </w:r>
-            <w:r>
-              <w:rPr>
-                <w:color w:val="1E293B"/>
-                <w:sz w:val="18"/>
-              </w:rPr>
-              <w:t xml:space="preserve"> and the full CSS-animated scene renders instead. (2) </w:t>
-            </w:r>
-            <w:r>
-              <w:rPr>
-                <w:b/>
-                <w:color w:val="1E293B"/>
-              </w:rPr>
-              <w:t>CSS animated tutor scene</w:t>
-            </w:r>
-            <w:r>
-              <w:rPr>
-                <w:color w:val="1E293B"/>
-                <w:sz w:val="18"/>
-              </w:rPr>
-              <w:t xml:space="preserve"> (fallback + always-on decoration): deep navy base gradient (</w:t>
+              <w:t>signUp.verifications.sendEmailCode()</w:t>
+            </w:r>
+            <w:r>
+              <w:rPr>
+                <w:color w:val="1E293B"/>
+                <w:sz w:val="18"/>
+              </w:rPr>
+              <w:t xml:space="preserve"> → 6-digit OTP screen → </w:t>
             </w:r>
             <w:r>
               <w:rPr>
@@ -28255,14 +28017,14 @@
                 <w:color w:val="0F172A"/>
                 <w:sz w:val="18"/>
               </w:rPr>
-              <w:t>#000936 → #060e3f → #0c1848</w:t>
-            </w:r>
-            <w:r>
-              <w:rPr>
-                <w:color w:val="1E293B"/>
-                <w:sz w:val="18"/>
-              </w:rPr>
-              <w:t xml:space="preserve">); a large 340 px blue radial-gradient AI orb (top-left) with </w:t>
+              <w:t>signUp.verifications.verifyEmailCode({ code })</w:t>
+            </w:r>
+            <w:r>
+              <w:rPr>
+                <w:color w:val="1E293B"/>
+                <w:sz w:val="18"/>
+              </w:rPr>
+              <w:t xml:space="preserve"> → </w:t>
             </w:r>
             <w:r>
               <w:rPr>
@@ -28270,14 +28032,14 @@
                 <w:color w:val="0F172A"/>
                 <w:sz w:val="18"/>
               </w:rPr>
-              <w:t>ai-orb-pulse</w:t>
-            </w:r>
-            <w:r>
-              <w:rPr>
-                <w:color w:val="1E293B"/>
-                <w:sz w:val="18"/>
-              </w:rPr>
-              <w:t xml:space="preserve"> keyframe (scale 1 → 1.09, opacity pulse); a 520 px outer ambient glow around the orb; a 380 px warm amber/orange </w:t>
+              <w:t>signUp.finalize()</w:t>
+            </w:r>
+            <w:r>
+              <w:rPr>
+                <w:color w:val="1E293B"/>
+                <w:sz w:val="18"/>
+              </w:rPr>
+              <w:t xml:space="preserve"> → redirect to </w:t>
             </w:r>
             <w:r>
               <w:rPr>
@@ -28285,14 +28047,14 @@
                 <w:color w:val="0F172A"/>
                 <w:sz w:val="18"/>
               </w:rPr>
-              <w:t>warm-glow</w:t>
-            </w:r>
-            <w:r>
-              <w:rPr>
-                <w:color w:val="1E293B"/>
-                <w:sz w:val="18"/>
-              </w:rPr>
-              <w:t xml:space="preserve"> radial gradient (right, </w:t>
+              <w:t>/</w:t>
+            </w:r>
+            <w:r>
+              <w:rPr>
+                <w:color w:val="1E293B"/>
+                <w:sz w:val="18"/>
+              </w:rPr>
+              <w:t xml:space="preserve">. Google OAuth via </w:t>
             </w:r>
             <w:r>
               <w:rPr>
@@ -28300,14 +28062,14 @@
                 <w:color w:val="0F172A"/>
                 <w:sz w:val="18"/>
               </w:rPr>
-              <w:t>warm-glow</w:t>
-            </w:r>
-            <w:r>
-              <w:rPr>
-                <w:color w:val="1E293B"/>
-                <w:sz w:val="18"/>
-              </w:rPr>
-              <w:t xml:space="preserve"> keyframe) representing the student; a 2 px horizontal </w:t>
+              <w:t>signUp.sso({ strategy: "oauth_google", redirectUrl: "/sso-callback", redirectCallbackUrl: "/sso-callback" })</w:t>
+            </w:r>
+            <w:r>
+              <w:rPr>
+                <w:color w:val="1E293B"/>
+                <w:sz w:val="18"/>
+              </w:rPr>
+              <w:t xml:space="preserve">. </w:t>
             </w:r>
             <w:r>
               <w:rPr>
@@ -28315,14 +28077,14 @@
                 <w:color w:val="0F172A"/>
                 <w:sz w:val="18"/>
               </w:rPr>
-              <w:t>beam-pulse</w:t>
-            </w:r>
-            <w:r>
-              <w:rPr>
-                <w:color w:val="1E293B"/>
-                <w:sz w:val="18"/>
-              </w:rPr>
-              <w:t xml:space="preserve"> connection line between orb and student; 20 rising dot particles (</w:t>
+              <w:t>CaptchaSignUpGate</w:t>
+            </w:r>
+            <w:r>
+              <w:rPr>
+                <w:color w:val="1E293B"/>
+                <w:sz w:val="18"/>
+              </w:rPr>
+              <w:t xml:space="preserve"> updated to </w:t>
             </w:r>
             <w:r>
               <w:rPr>
@@ -28330,14 +28092,14 @@
                 <w:color w:val="0F172A"/>
                 <w:sz w:val="18"/>
               </w:rPr>
-              <w:t>particle-rise</w:t>
-            </w:r>
-            <w:r>
-              <w:rPr>
-                <w:color w:val="1E293B"/>
-                <w:sz w:val="18"/>
-              </w:rPr>
-              <w:t xml:space="preserve"> keyframe); 5 floating maths equations (</w:t>
+              <w:t>router.push("/sign-up")</w:t>
+            </w:r>
+            <w:r>
+              <w:rPr>
+                <w:color w:val="1E293B"/>
+                <w:sz w:val="18"/>
+              </w:rPr>
+              <w:t xml:space="preserve"> instead of </w:t>
             </w:r>
             <w:r>
               <w:rPr>
@@ -28345,14 +28107,14 @@
                 <w:color w:val="0F172A"/>
                 <w:sz w:val="18"/>
               </w:rPr>
-              <w:t>float-equation</w:t>
-            </w:r>
-            <w:r>
-              <w:rPr>
-                <w:color w:val="1E293B"/>
-                <w:sz w:val="18"/>
-              </w:rPr>
-              <w:t xml:space="preserve"> keyframe — e.g. </w:t>
+              <w:t>openSignUp()</w:t>
+            </w:r>
+            <w:r>
+              <w:rPr>
+                <w:color w:val="1E293B"/>
+                <w:sz w:val="18"/>
+              </w:rPr>
+              <w:t xml:space="preserve"> modal (modal had phone issue too). </w:t>
             </w:r>
             <w:r>
               <w:rPr>
@@ -28360,14 +28122,14 @@
                 <w:color w:val="0F172A"/>
                 <w:sz w:val="18"/>
               </w:rPr>
-              <w:t>y = mx + b</w:t>
-            </w:r>
-            <w:r>
-              <w:rPr>
-                <w:color w:val="1E293B"/>
-                <w:sz w:val="18"/>
-              </w:rPr>
-              <w:t xml:space="preserve">, </w:t>
+              <w:t>/sso-callback</w:t>
+            </w:r>
+            <w:r>
+              <w:rPr>
+                <w:color w:val="1E293B"/>
+                <w:sz w:val="18"/>
+              </w:rPr>
+              <w:t xml:space="preserve"> page (</w:t>
             </w:r>
             <w:r>
               <w:rPr>
@@ -28375,475 +28137,14 @@
                 <w:color w:val="0F172A"/>
                 <w:sz w:val="18"/>
               </w:rPr>
-              <w:t>E = mc²</w:t>
-            </w:r>
-            <w:r>
-              <w:rPr>
-                <w:color w:val="1E293B"/>
-                <w:sz w:val="18"/>
-              </w:rPr>
-              <w:t xml:space="preserve">, </w:t>
-            </w:r>
-            <w:r>
-              <w:rPr>
-                <w:rFonts w:ascii="Courier New" w:hAnsi="Courier New"/>
-                <w:color w:val="0F172A"/>
-                <w:sz w:val="18"/>
-              </w:rPr>
-              <w:t>P(A) = n(A)/n(S)</w:t>
-            </w:r>
-            <w:r>
-              <w:rPr>
-                <w:color w:val="1E293B"/>
-                <w:sz w:val="18"/>
-              </w:rPr>
-              <w:t xml:space="preserve">, </w:t>
-            </w:r>
-            <w:r>
-              <w:rPr>
-                <w:rFonts w:ascii="Courier New" w:hAnsi="Courier New"/>
-                <w:color w:val="0F172A"/>
-                <w:sz w:val="18"/>
-              </w:rPr>
-              <w:t>∫₀¹ f(x) dx</w:t>
-            </w:r>
-            <w:r>
-              <w:rPr>
-                <w:color w:val="1E293B"/>
-                <w:sz w:val="18"/>
-              </w:rPr>
-              <w:t xml:space="preserve">, </w:t>
-            </w:r>
-            <w:r>
-              <w:rPr>
-                <w:rFonts w:ascii="Courier New" w:hAnsi="Courier New"/>
-                <w:color w:val="0F172A"/>
-                <w:sz w:val="18"/>
-              </w:rPr>
-              <w:t>ax² + bx + c = 0</w:t>
-            </w:r>
-            <w:r>
-              <w:rPr>
-                <w:color w:val="1E293B"/>
-                <w:sz w:val="18"/>
-              </w:rPr>
-              <w:t>); 16 floating maths symbols (</w:t>
-            </w:r>
-            <w:r>
-              <w:rPr>
-                <w:rFonts w:ascii="Courier New" w:hAnsi="Courier New"/>
-                <w:color w:val="0F172A"/>
-                <w:sz w:val="18"/>
-              </w:rPr>
-              <w:t>float-symbol</w:t>
-            </w:r>
-            <w:r>
-              <w:rPr>
-                <w:color w:val="1E293B"/>
-                <w:sz w:val="18"/>
-              </w:rPr>
-              <w:t xml:space="preserve">, unchanged from v0.28, but colour-shifted to semi-transparent RGBA values for dark background). (3) </w:t>
-            </w:r>
-            <w:r>
-              <w:rPr>
-                <w:b/>
-                <w:color w:val="1E293B"/>
-              </w:rPr>
-              <w:t>Dark overlay</w:t>
-            </w:r>
-            <w:r>
-              <w:rPr>
-                <w:color w:val="1E293B"/>
-                <w:sz w:val="18"/>
-              </w:rPr>
-              <w:t xml:space="preserve">: linear-gradient overlay adjusts dynamically — thick dark when CSS scene shows, semi-transparent when video plays. (4) </w:t>
-            </w:r>
-            <w:r>
-              <w:rPr>
-                <w:b/>
-                <w:color w:val="1E293B"/>
-              </w:rPr>
-              <w:t>Bottom white fade</w:t>
-            </w:r>
-            <w:r>
-              <w:rPr>
-                <w:color w:val="1E293B"/>
-                <w:sz w:val="18"/>
-              </w:rPr>
-              <w:t xml:space="preserve">: 28-rem </w:t>
-            </w:r>
-            <w:r>
-              <w:rPr>
-                <w:rFonts w:ascii="Courier New" w:hAnsi="Courier New"/>
-                <w:color w:val="0F172A"/>
-                <w:sz w:val="18"/>
-              </w:rPr>
-              <w:t>h-28</w:t>
-            </w:r>
-            <w:r>
-              <w:rPr>
-                <w:color w:val="1E293B"/>
-                <w:sz w:val="18"/>
-              </w:rPr>
-              <w:t xml:space="preserve"> gradient </w:t>
-            </w:r>
-            <w:r>
-              <w:rPr>
-                <w:rFonts w:ascii="Courier New" w:hAnsi="Courier New"/>
-                <w:color w:val="0F172A"/>
-                <w:sz w:val="18"/>
-              </w:rPr>
-              <w:t>transparent → #ffffff</w:t>
-            </w:r>
-            <w:r>
-              <w:rPr>
-                <w:color w:val="1E293B"/>
-                <w:sz w:val="18"/>
-              </w:rPr>
-              <w:t xml:space="preserve"> at hero bottom so hero blends into the white sections below. (5) </w:t>
-            </w:r>
-            <w:r>
-              <w:rPr>
-                <w:b/>
-                <w:color w:val="1E293B"/>
-              </w:rPr>
-              <w:t>Hero text redesigned for dark background</w:t>
-            </w:r>
-            <w:r>
-              <w:rPr>
-                <w:color w:val="1E293B"/>
-                <w:sz w:val="18"/>
-              </w:rPr>
-              <w:t xml:space="preserve">: headline in white </w:t>
-            </w:r>
-            <w:r>
-              <w:rPr>
-                <w:rFonts w:ascii="Courier New" w:hAnsi="Courier New"/>
-                <w:color w:val="0F172A"/>
-                <w:sz w:val="18"/>
-              </w:rPr>
-              <w:t>#ffffff</w:t>
-            </w:r>
-            <w:r>
-              <w:rPr>
-                <w:color w:val="1E293B"/>
-                <w:sz w:val="18"/>
-              </w:rPr>
-              <w:t xml:space="preserve">, accent span in sky-blue </w:t>
-            </w:r>
-            <w:r>
-              <w:rPr>
-                <w:rFonts w:ascii="Courier New" w:hAnsi="Courier New"/>
-                <w:color w:val="0F172A"/>
-                <w:sz w:val="18"/>
-              </w:rPr>
-              <w:t>#56DBFF</w:t>
-            </w:r>
-            <w:r>
-              <w:rPr>
-                <w:color w:val="1E293B"/>
-                <w:sz w:val="18"/>
-              </w:rPr>
-              <w:t xml:space="preserve">; subheadline at </w:t>
-            </w:r>
-            <w:r>
-              <w:rPr>
-                <w:rFonts w:ascii="Courier New" w:hAnsi="Courier New"/>
-                <w:color w:val="0F172A"/>
-                <w:sz w:val="18"/>
-              </w:rPr>
-              <w:t>rgba(255,255,255,0.72)</w:t>
-            </w:r>
-            <w:r>
-              <w:rPr>
-                <w:color w:val="1E293B"/>
-                <w:sz w:val="18"/>
-              </w:rPr>
-              <w:t>; "Australia's AI-powered exam prep platform" badge uses glass pill (</w:t>
-            </w:r>
-            <w:r>
-              <w:rPr>
-                <w:rFonts w:ascii="Courier New" w:hAnsi="Courier New"/>
-                <w:color w:val="0F172A"/>
-                <w:sz w:val="18"/>
-              </w:rPr>
-              <w:t>rgba(255,255,255,0.08)</w:t>
-            </w:r>
-            <w:r>
-              <w:rPr>
-                <w:color w:val="1E293B"/>
-                <w:sz w:val="18"/>
-              </w:rPr>
-              <w:t xml:space="preserve"> bg + </w:t>
-            </w:r>
-            <w:r>
-              <w:rPr>
-                <w:rFonts w:ascii="Courier New" w:hAnsi="Courier New"/>
-                <w:color w:val="0F172A"/>
-                <w:sz w:val="18"/>
-              </w:rPr>
-              <w:t>rgba(255,255,255,0.20)</w:t>
-            </w:r>
-            <w:r>
-              <w:rPr>
-                <w:color w:val="1E293B"/>
-                <w:sz w:val="18"/>
-              </w:rPr>
-              <w:t xml:space="preserve"> border + </w:t>
-            </w:r>
-            <w:r>
-              <w:rPr>
-                <w:rFonts w:ascii="Courier New" w:hAnsi="Courier New"/>
-                <w:color w:val="0F172A"/>
-                <w:sz w:val="18"/>
-              </w:rPr>
-              <w:t>backdropFilter: blur(8px)</w:t>
-            </w:r>
-            <w:r>
-              <w:rPr>
-                <w:color w:val="1E293B"/>
-                <w:sz w:val="18"/>
-              </w:rPr>
-              <w:t xml:space="preserve">); primary CTA changed from navy/gold to gold </w:t>
-            </w:r>
-            <w:r>
-              <w:rPr>
-                <w:rFonts w:ascii="Courier New" w:hAnsi="Courier New"/>
-                <w:color w:val="0F172A"/>
-                <w:sz w:val="18"/>
-              </w:rPr>
-              <w:t>#FDC800</w:t>
-            </w:r>
-            <w:r>
-              <w:rPr>
-                <w:color w:val="1E293B"/>
-                <w:sz w:val="18"/>
-              </w:rPr>
-              <w:t xml:space="preserve">/navy for maximum contrast on dark; secondary CTA ("I'm a student") uses </w:t>
-            </w:r>
-            <w:r>
-              <w:rPr>
-                <w:rFonts w:ascii="Courier New" w:hAnsi="Courier New"/>
-                <w:color w:val="0F172A"/>
-                <w:sz w:val="18"/>
-              </w:rPr>
-              <w:t>rgba(255,255,255,0.28)</w:t>
-            </w:r>
-            <w:r>
-              <w:rPr>
-                <w:color w:val="1E293B"/>
-                <w:sz w:val="18"/>
-              </w:rPr>
-              <w:t xml:space="preserve"> border and glass bg. (6) </w:t>
-            </w:r>
-            <w:r>
-              <w:rPr>
-                <w:b/>
-                <w:color w:val="1E293B"/>
-              </w:rPr>
-              <w:t>Frosted glass exam badge panel</w:t>
-            </w:r>
-            <w:r>
-              <w:rPr>
-                <w:color w:val="1E293B"/>
-                <w:sz w:val="18"/>
-              </w:rPr>
-              <w:t xml:space="preserve">: right column redesigned with </w:t>
-            </w:r>
-            <w:r>
-              <w:rPr>
-                <w:rFonts w:ascii="Courier New" w:hAnsi="Courier New"/>
-                <w:color w:val="0F172A"/>
-                <w:sz w:val="18"/>
-              </w:rPr>
-              <w:t>backdropFilter: blur(20px)</w:t>
-            </w:r>
-            <w:r>
-              <w:rPr>
-                <w:color w:val="1E293B"/>
-                <w:sz w:val="18"/>
-              </w:rPr>
-              <w:t xml:space="preserve"> + </w:t>
-            </w:r>
-            <w:r>
-              <w:rPr>
-                <w:rFonts w:ascii="Courier New" w:hAnsi="Courier New"/>
-                <w:color w:val="0F172A"/>
-                <w:sz w:val="18"/>
-              </w:rPr>
-              <w:t>-webkit-backdrop-filter</w:t>
-            </w:r>
-            <w:r>
-              <w:rPr>
-                <w:color w:val="1E293B"/>
-                <w:sz w:val="18"/>
-              </w:rPr>
-              <w:t xml:space="preserve"> glass card (</w:t>
-            </w:r>
-            <w:r>
-              <w:rPr>
-                <w:rFonts w:ascii="Courier New" w:hAnsi="Courier New"/>
-                <w:color w:val="0F172A"/>
-                <w:sz w:val="18"/>
-              </w:rPr>
-              <w:t>rgba(255,255,255,0.07)</w:t>
-            </w:r>
-            <w:r>
-              <w:rPr>
-                <w:color w:val="1E293B"/>
-                <w:sz w:val="18"/>
-              </w:rPr>
-              <w:t xml:space="preserve"> bg, </w:t>
-            </w:r>
-            <w:r>
-              <w:rPr>
-                <w:rFonts w:ascii="Courier New" w:hAnsi="Courier New"/>
-                <w:color w:val="0F172A"/>
-                <w:sz w:val="18"/>
-              </w:rPr>
-              <w:t>rgba(255,255,255,0.13)</w:t>
-            </w:r>
-            <w:r>
-              <w:rPr>
-                <w:color w:val="1E293B"/>
-                <w:sz w:val="18"/>
-              </w:rPr>
-              <w:t xml:space="preserve"> border, deep box-shadow </w:t>
-            </w:r>
-            <w:r>
-              <w:rPr>
-                <w:rFonts w:ascii="Courier New" w:hAnsi="Courier New"/>
-                <w:color w:val="0F172A"/>
-                <w:sz w:val="18"/>
-              </w:rPr>
-              <w:t>0 8px 48px rgba(0,0,0,0.45)</w:t>
-            </w:r>
-            <w:r>
-              <w:rPr>
-                <w:color w:val="1E293B"/>
-                <w:sz w:val="18"/>
-              </w:rPr>
-              <w:t xml:space="preserve">); badge card backgrounds changed to </w:t>
-            </w:r>
-            <w:r>
-              <w:rPr>
-                <w:rFonts w:ascii="Courier New" w:hAnsi="Courier New"/>
-                <w:color w:val="0F172A"/>
-                <w:sz w:val="18"/>
-              </w:rPr>
-              <w:t>rgba(255,255,255,0.05)</w:t>
-            </w:r>
-            <w:r>
-              <w:rPr>
-                <w:color w:val="1E293B"/>
-                <w:sz w:val="18"/>
-              </w:rPr>
-              <w:t xml:space="preserve">; badge circle glows use per-exam colour box-shadow; label text uses </w:t>
-            </w:r>
-            <w:r>
-              <w:rPr>
-                <w:rFonts w:ascii="Courier New" w:hAnsi="Courier New"/>
-                <w:color w:val="0F172A"/>
-                <w:sz w:val="18"/>
-              </w:rPr>
-              <w:t>rgba(255,255,255,0.6)</w:t>
-            </w:r>
-            <w:r>
-              <w:rPr>
-                <w:color w:val="1E293B"/>
-                <w:sz w:val="18"/>
-              </w:rPr>
-              <w:t xml:space="preserve">. New CSS keyframes added: </w:t>
-            </w:r>
-            <w:r>
-              <w:rPr>
-                <w:rFonts w:ascii="Courier New" w:hAnsi="Courier New"/>
-                <w:color w:val="0F172A"/>
-                <w:sz w:val="18"/>
-              </w:rPr>
-              <w:t>ai-orb-pulse</w:t>
-            </w:r>
-            <w:r>
-              <w:rPr>
-                <w:color w:val="1E293B"/>
-                <w:sz w:val="18"/>
-              </w:rPr>
-              <w:t xml:space="preserve">, </w:t>
-            </w:r>
-            <w:r>
-              <w:rPr>
-                <w:rFonts w:ascii="Courier New" w:hAnsi="Courier New"/>
-                <w:color w:val="0F172A"/>
-                <w:sz w:val="18"/>
-              </w:rPr>
-              <w:t>warm-glow</w:t>
-            </w:r>
-            <w:r>
-              <w:rPr>
-                <w:color w:val="1E293B"/>
-                <w:sz w:val="18"/>
-              </w:rPr>
-              <w:t xml:space="preserve">, </w:t>
-            </w:r>
-            <w:r>
-              <w:rPr>
-                <w:rFonts w:ascii="Courier New" w:hAnsi="Courier New"/>
-                <w:color w:val="0F172A"/>
-                <w:sz w:val="18"/>
-              </w:rPr>
-              <w:t>beam-pulse</w:t>
-            </w:r>
-            <w:r>
-              <w:rPr>
-                <w:color w:val="1E293B"/>
-                <w:sz w:val="18"/>
-              </w:rPr>
-              <w:t xml:space="preserve">, </w:t>
-            </w:r>
-            <w:r>
-              <w:rPr>
-                <w:rFonts w:ascii="Courier New" w:hAnsi="Courier New"/>
-                <w:color w:val="0F172A"/>
-                <w:sz w:val="18"/>
-              </w:rPr>
-              <w:t>particle-rise</w:t>
-            </w:r>
-            <w:r>
-              <w:rPr>
-                <w:color w:val="1E293B"/>
-                <w:sz w:val="18"/>
-              </w:rPr>
-              <w:t xml:space="preserve">, </w:t>
-            </w:r>
-            <w:r>
-              <w:rPr>
-                <w:rFonts w:ascii="Courier New" w:hAnsi="Courier New"/>
-                <w:color w:val="0F172A"/>
-                <w:sz w:val="18"/>
-              </w:rPr>
-              <w:t>float-equation</w:t>
-            </w:r>
-            <w:r>
-              <w:rPr>
-                <w:color w:val="1E293B"/>
-                <w:sz w:val="18"/>
-              </w:rPr>
-              <w:t xml:space="preserve">. To use a real AI-generated video: generate a 10–15 s looping MP4 (recommended prompt: "Serene warm study scene, soft-glowing blue AI hologram tutor floating near a desk, happy 10-year-old child looking up with curiosity, floating maths equations drifting around them, ambient film-quality lighting, cinematic, 4K, seamlessly loopable") using Runway Gen-3, Kling AI, or Sora; place the file at </w:t>
-            </w:r>
-            <w:r>
-              <w:rPr>
-                <w:rFonts w:ascii="Courier New" w:hAnsi="Courier New"/>
-                <w:color w:val="0F172A"/>
-                <w:sz w:val="18"/>
-              </w:rPr>
-              <w:t>public/tutor-bg.mp4</w:t>
-            </w:r>
-            <w:r>
-              <w:rPr>
-                <w:color w:val="1E293B"/>
-                <w:sz w:val="18"/>
-              </w:rPr>
-              <w:t>; no code change needed — the player activates automatically</w:t>
+              <w:t>AuthenticateWithRedirectCallback</w:t>
+            </w:r>
+            <w:r>
+              <w:rPr>
+                <w:color w:val="1E293B"/>
+                <w:sz w:val="18"/>
+              </w:rPr>
+              <w:t>) handles OAuth redirect completion. No phone number field at any step — eliminates "phone numbers from this country are not supported" error for Australian users. Form is fully branded (SelectEd wordmark, navy/gold CTAs, white card on dark background)</w:t>
             </w:r>
           </w:p>
         </w:tc>
@@ -28870,7 +28171,7 @@
                 <w:b/>
                 <w:color w:val="1E293B"/>
               </w:rPr>
-              <w:t>v0.29.0</w:t>
+              <w:t>v0.30.0</w:t>
             </w:r>
           </w:p>
         </w:tc>
@@ -28920,7 +28221,21 @@
                 <w:color w:val="1E293B"/>
                 <w:sz w:val="18"/>
               </w:rPr>
-              <w:t xml:space="preserve">Guest limit reduced 20 → 10 questions/day — updated in </w:t>
+              <w:t xml:space="preserve">Cinematic hero background — (1) </w:t>
+            </w:r>
+            <w:r>
+              <w:rPr>
+                <w:b/>
+                <w:color w:val="1E293B"/>
+              </w:rPr>
+              <w:t>Video background infrastructure</w:t>
+            </w:r>
+            <w:r>
+              <w:rPr>
+                <w:color w:val="1E293B"/>
+                <w:sz w:val="18"/>
+              </w:rPr>
+              <w:t xml:space="preserve">: hero section now mounts an HTML5 </w:t>
             </w:r>
             <w:r>
               <w:rPr>
@@ -28928,14 +28243,14 @@
                 <w:color w:val="0F172A"/>
                 <w:sz w:val="18"/>
               </w:rPr>
-              <w:t>GUEST_DAILY_LIMIT</w:t>
-            </w:r>
-            <w:r>
-              <w:rPr>
-                <w:color w:val="1E293B"/>
-                <w:sz w:val="18"/>
-              </w:rPr>
-              <w:t xml:space="preserve"> constant (</w:t>
+              <w:t>&lt;video autoPlay muted loop playsInline&gt;</w:t>
+            </w:r>
+            <w:r>
+              <w:rPr>
+                <w:color w:val="1E293B"/>
+                <w:sz w:val="18"/>
+              </w:rPr>
+              <w:t xml:space="preserve"> element pointing to </w:t>
             </w:r>
             <w:r>
               <w:rPr>
@@ -28943,14 +28258,14 @@
                 <w:color w:val="0F172A"/>
                 <w:sz w:val="18"/>
               </w:rPr>
-              <w:t>app/page.tsx</w:t>
-            </w:r>
-            <w:r>
-              <w:rPr>
-                <w:color w:val="1E293B"/>
-                <w:sz w:val="18"/>
-              </w:rPr>
-              <w:t xml:space="preserve">, </w:t>
+              <w:t>/public/tutor-bg.mp4</w:t>
+            </w:r>
+            <w:r>
+              <w:rPr>
+                <w:color w:val="1E293B"/>
+                <w:sz w:val="18"/>
+              </w:rPr>
+              <w:t xml:space="preserve">. </w:t>
             </w:r>
             <w:r>
               <w:rPr>
@@ -28958,14 +28273,14 @@
                 <w:color w:val="0F172A"/>
                 <w:sz w:val="18"/>
               </w:rPr>
-              <w:t>GuestLimitModal.tsx</w:t>
-            </w:r>
-            <w:r>
-              <w:rPr>
-                <w:color w:val="1E293B"/>
-                <w:sz w:val="18"/>
-              </w:rPr>
-              <w:t xml:space="preserve">), rolling banner copy, FAQ answer, trust badge, and parent dashboard label. CAPTCHA gate on sign-up — (1) </w:t>
+              <w:t>videoBgReady</w:t>
+            </w:r>
+            <w:r>
+              <w:rPr>
+                <w:color w:val="1E293B"/>
+                <w:sz w:val="18"/>
+              </w:rPr>
+              <w:t xml:space="preserve"> React state tracks </w:t>
             </w:r>
             <w:r>
               <w:rPr>
@@ -28973,14 +28288,14 @@
                 <w:color w:val="0F172A"/>
                 <w:sz w:val="18"/>
               </w:rPr>
-              <w:t>/sign-up</w:t>
-            </w:r>
-            <w:r>
-              <w:rPr>
-                <w:color w:val="1E293B"/>
-                <w:sz w:val="18"/>
-              </w:rPr>
-              <w:t xml:space="preserve"> page now shows a math CAPTCHA challenge before the Clerk </w:t>
+              <w:t>onCanPlay</w:t>
+            </w:r>
+            <w:r>
+              <w:rPr>
+                <w:color w:val="1E293B"/>
+                <w:sz w:val="18"/>
+              </w:rPr>
+              <w:t xml:space="preserve">; the video fades in with a 1.2 s opacity transition once loaded. When no video file is present (or on load failure), </w:t>
             </w:r>
             <w:r>
               <w:rPr>
@@ -28988,14 +28303,14 @@
                 <w:color w:val="0F172A"/>
                 <w:sz w:val="18"/>
               </w:rPr>
-              <w:t>&lt;SignUp /&gt;</w:t>
-            </w:r>
-            <w:r>
-              <w:rPr>
-                <w:color w:val="1E293B"/>
-                <w:sz w:val="18"/>
-              </w:rPr>
-              <w:t xml:space="preserve"> form renders (client component with </w:t>
+              <w:t>videoBgReady</w:t>
+            </w:r>
+            <w:r>
+              <w:rPr>
+                <w:color w:val="1E293B"/>
+                <w:sz w:val="18"/>
+              </w:rPr>
+              <w:t xml:space="preserve"> stays </w:t>
             </w:r>
             <w:r>
               <w:rPr>
@@ -29003,14 +28318,28 @@
                 <w:color w:val="0F172A"/>
                 <w:sz w:val="18"/>
               </w:rPr>
-              <w:t>useState</w:t>
-            </w:r>
-            <w:r>
-              <w:rPr>
-                <w:color w:val="1E293B"/>
-                <w:sz w:val="18"/>
-              </w:rPr>
-              <w:t xml:space="preserve"> gate). (2) New </w:t>
+              <w:t>false</w:t>
+            </w:r>
+            <w:r>
+              <w:rPr>
+                <w:color w:val="1E293B"/>
+                <w:sz w:val="18"/>
+              </w:rPr>
+              <w:t xml:space="preserve"> and the full CSS-animated scene renders instead. (2) </w:t>
+            </w:r>
+            <w:r>
+              <w:rPr>
+                <w:b/>
+                <w:color w:val="1E293B"/>
+              </w:rPr>
+              <w:t>CSS animated tutor scene</w:t>
+            </w:r>
+            <w:r>
+              <w:rPr>
+                <w:color w:val="1E293B"/>
+                <w:sz w:val="18"/>
+              </w:rPr>
+              <w:t xml:space="preserve"> (fallback + always-on decoration): deep navy base gradient (</w:t>
             </w:r>
             <w:r>
               <w:rPr>
@@ -29018,14 +28347,14 @@
                 <w:color w:val="0F172A"/>
                 <w:sz w:val="18"/>
               </w:rPr>
-              <w:t>CaptchaSignUpGate</w:t>
-            </w:r>
-            <w:r>
-              <w:rPr>
-                <w:color w:val="1E293B"/>
-                <w:sz w:val="18"/>
-              </w:rPr>
-              <w:t xml:space="preserve"> component (</w:t>
+              <w:t>#000936 → #060e3f → #0c1848</w:t>
+            </w:r>
+            <w:r>
+              <w:rPr>
+                <w:color w:val="1E293B"/>
+                <w:sz w:val="18"/>
+              </w:rPr>
+              <w:t xml:space="preserve">); a large 340 px blue radial-gradient AI orb (top-left) with </w:t>
             </w:r>
             <w:r>
               <w:rPr>
@@ -29033,14 +28362,14 @@
                 <w:color w:val="0F172A"/>
                 <w:sz w:val="18"/>
               </w:rPr>
-              <w:t>app/components/CaptchaSignUpGate.tsx</w:t>
-            </w:r>
-            <w:r>
-              <w:rPr>
-                <w:color w:val="1E293B"/>
-                <w:sz w:val="18"/>
-              </w:rPr>
-              <w:t xml:space="preserve">) wraps any button with a CAPTCHA modal; uses </w:t>
+              <w:t>ai-orb-pulse</w:t>
+            </w:r>
+            <w:r>
+              <w:rPr>
+                <w:color w:val="1E293B"/>
+                <w:sz w:val="18"/>
+              </w:rPr>
+              <w:t xml:space="preserve"> keyframe (scale 1 → 1.09, opacity pulse); a 520 px outer ambient glow around the orb; a 380 px warm amber/orange </w:t>
             </w:r>
             <w:r>
               <w:rPr>
@@ -29048,14 +28377,14 @@
                 <w:color w:val="0F172A"/>
                 <w:sz w:val="18"/>
               </w:rPr>
-              <w:t>useClerk().openSignUp()</w:t>
-            </w:r>
-            <w:r>
-              <w:rPr>
-                <w:color w:val="1E293B"/>
-                <w:sz w:val="18"/>
-              </w:rPr>
-              <w:t xml:space="preserve"> to open Clerk's sign-up modal after successful verification. </w:t>
+              <w:t>warm-glow</w:t>
+            </w:r>
+            <w:r>
+              <w:rPr>
+                <w:color w:val="1E293B"/>
+                <w:sz w:val="18"/>
+              </w:rPr>
+              <w:t xml:space="preserve"> radial gradient (right, </w:t>
             </w:r>
             <w:r>
               <w:rPr>
@@ -29063,14 +28392,14 @@
                 <w:color w:val="0F172A"/>
                 <w:sz w:val="18"/>
               </w:rPr>
-              <w:t>GuestLimitModal</w:t>
-            </w:r>
-            <w:r>
-              <w:rPr>
-                <w:color w:val="1E293B"/>
-                <w:sz w:val="18"/>
-              </w:rPr>
-              <w:t xml:space="preserve">'s "Start free 7-day trial →" button now uses </w:t>
+              <w:t>warm-glow</w:t>
+            </w:r>
+            <w:r>
+              <w:rPr>
+                <w:color w:val="1E293B"/>
+                <w:sz w:val="18"/>
+              </w:rPr>
+              <w:t xml:space="preserve"> keyframe) representing the student; a 2 px horizontal </w:t>
             </w:r>
             <w:r>
               <w:rPr>
@@ -29078,14 +28407,14 @@
                 <w:color w:val="0F172A"/>
                 <w:sz w:val="18"/>
               </w:rPr>
-              <w:t>CaptchaSignUpGate</w:t>
-            </w:r>
-            <w:r>
-              <w:rPr>
-                <w:color w:val="1E293B"/>
-                <w:sz w:val="18"/>
-              </w:rPr>
-              <w:t xml:space="preserve"> instead of </w:t>
+              <w:t>beam-pulse</w:t>
+            </w:r>
+            <w:r>
+              <w:rPr>
+                <w:color w:val="1E293B"/>
+                <w:sz w:val="18"/>
+              </w:rPr>
+              <w:t xml:space="preserve"> connection line between orb and student; 20 rising dot particles (</w:t>
             </w:r>
             <w:r>
               <w:rPr>
@@ -29093,7 +28422,520 @@
                 <w:color w:val="0F172A"/>
                 <w:sz w:val="18"/>
               </w:rPr>
-              <w:t>&lt;SignUpButton&gt;</w:t>
+              <w:t>particle-rise</w:t>
+            </w:r>
+            <w:r>
+              <w:rPr>
+                <w:color w:val="1E293B"/>
+                <w:sz w:val="18"/>
+              </w:rPr>
+              <w:t xml:space="preserve"> keyframe); 5 floating maths equations (</w:t>
+            </w:r>
+            <w:r>
+              <w:rPr>
+                <w:rFonts w:ascii="Courier New" w:hAnsi="Courier New"/>
+                <w:color w:val="0F172A"/>
+                <w:sz w:val="18"/>
+              </w:rPr>
+              <w:t>float-equation</w:t>
+            </w:r>
+            <w:r>
+              <w:rPr>
+                <w:color w:val="1E293B"/>
+                <w:sz w:val="18"/>
+              </w:rPr>
+              <w:t xml:space="preserve"> keyframe — e.g. </w:t>
+            </w:r>
+            <w:r>
+              <w:rPr>
+                <w:rFonts w:ascii="Courier New" w:hAnsi="Courier New"/>
+                <w:color w:val="0F172A"/>
+                <w:sz w:val="18"/>
+              </w:rPr>
+              <w:t>y = mx + b</w:t>
+            </w:r>
+            <w:r>
+              <w:rPr>
+                <w:color w:val="1E293B"/>
+                <w:sz w:val="18"/>
+              </w:rPr>
+              <w:t xml:space="preserve">, </w:t>
+            </w:r>
+            <w:r>
+              <w:rPr>
+                <w:rFonts w:ascii="Courier New" w:hAnsi="Courier New"/>
+                <w:color w:val="0F172A"/>
+                <w:sz w:val="18"/>
+              </w:rPr>
+              <w:t>E = mc²</w:t>
+            </w:r>
+            <w:r>
+              <w:rPr>
+                <w:color w:val="1E293B"/>
+                <w:sz w:val="18"/>
+              </w:rPr>
+              <w:t xml:space="preserve">, </w:t>
+            </w:r>
+            <w:r>
+              <w:rPr>
+                <w:rFonts w:ascii="Courier New" w:hAnsi="Courier New"/>
+                <w:color w:val="0F172A"/>
+                <w:sz w:val="18"/>
+              </w:rPr>
+              <w:t>P(A) = n(A)/n(S)</w:t>
+            </w:r>
+            <w:r>
+              <w:rPr>
+                <w:color w:val="1E293B"/>
+                <w:sz w:val="18"/>
+              </w:rPr>
+              <w:t xml:space="preserve">, </w:t>
+            </w:r>
+            <w:r>
+              <w:rPr>
+                <w:rFonts w:ascii="Courier New" w:hAnsi="Courier New"/>
+                <w:color w:val="0F172A"/>
+                <w:sz w:val="18"/>
+              </w:rPr>
+              <w:t>∫₀¹ f(x) dx</w:t>
+            </w:r>
+            <w:r>
+              <w:rPr>
+                <w:color w:val="1E293B"/>
+                <w:sz w:val="18"/>
+              </w:rPr>
+              <w:t xml:space="preserve">, </w:t>
+            </w:r>
+            <w:r>
+              <w:rPr>
+                <w:rFonts w:ascii="Courier New" w:hAnsi="Courier New"/>
+                <w:color w:val="0F172A"/>
+                <w:sz w:val="18"/>
+              </w:rPr>
+              <w:t>ax² + bx + c = 0</w:t>
+            </w:r>
+            <w:r>
+              <w:rPr>
+                <w:color w:val="1E293B"/>
+                <w:sz w:val="18"/>
+              </w:rPr>
+              <w:t>); 16 floating maths symbols (</w:t>
+            </w:r>
+            <w:r>
+              <w:rPr>
+                <w:rFonts w:ascii="Courier New" w:hAnsi="Courier New"/>
+                <w:color w:val="0F172A"/>
+                <w:sz w:val="18"/>
+              </w:rPr>
+              <w:t>float-symbol</w:t>
+            </w:r>
+            <w:r>
+              <w:rPr>
+                <w:color w:val="1E293B"/>
+                <w:sz w:val="18"/>
+              </w:rPr>
+              <w:t xml:space="preserve">, unchanged from v0.28, but colour-shifted to semi-transparent RGBA values for dark background). (3) </w:t>
+            </w:r>
+            <w:r>
+              <w:rPr>
+                <w:b/>
+                <w:color w:val="1E293B"/>
+              </w:rPr>
+              <w:t>Dark overlay</w:t>
+            </w:r>
+            <w:r>
+              <w:rPr>
+                <w:color w:val="1E293B"/>
+                <w:sz w:val="18"/>
+              </w:rPr>
+              <w:t xml:space="preserve">: linear-gradient overlay adjusts dynamically — thick dark when CSS scene shows, semi-transparent when video plays. (4) </w:t>
+            </w:r>
+            <w:r>
+              <w:rPr>
+                <w:b/>
+                <w:color w:val="1E293B"/>
+              </w:rPr>
+              <w:t>Bottom white fade</w:t>
+            </w:r>
+            <w:r>
+              <w:rPr>
+                <w:color w:val="1E293B"/>
+                <w:sz w:val="18"/>
+              </w:rPr>
+              <w:t xml:space="preserve">: 28-rem </w:t>
+            </w:r>
+            <w:r>
+              <w:rPr>
+                <w:rFonts w:ascii="Courier New" w:hAnsi="Courier New"/>
+                <w:color w:val="0F172A"/>
+                <w:sz w:val="18"/>
+              </w:rPr>
+              <w:t>h-28</w:t>
+            </w:r>
+            <w:r>
+              <w:rPr>
+                <w:color w:val="1E293B"/>
+                <w:sz w:val="18"/>
+              </w:rPr>
+              <w:t xml:space="preserve"> gradient </w:t>
+            </w:r>
+            <w:r>
+              <w:rPr>
+                <w:rFonts w:ascii="Courier New" w:hAnsi="Courier New"/>
+                <w:color w:val="0F172A"/>
+                <w:sz w:val="18"/>
+              </w:rPr>
+              <w:t>transparent → #ffffff</w:t>
+            </w:r>
+            <w:r>
+              <w:rPr>
+                <w:color w:val="1E293B"/>
+                <w:sz w:val="18"/>
+              </w:rPr>
+              <w:t xml:space="preserve"> at hero bottom so hero blends into the white sections below. (5) </w:t>
+            </w:r>
+            <w:r>
+              <w:rPr>
+                <w:b/>
+                <w:color w:val="1E293B"/>
+              </w:rPr>
+              <w:t>Hero text redesigned for dark background</w:t>
+            </w:r>
+            <w:r>
+              <w:rPr>
+                <w:color w:val="1E293B"/>
+                <w:sz w:val="18"/>
+              </w:rPr>
+              <w:t xml:space="preserve">: headline in white </w:t>
+            </w:r>
+            <w:r>
+              <w:rPr>
+                <w:rFonts w:ascii="Courier New" w:hAnsi="Courier New"/>
+                <w:color w:val="0F172A"/>
+                <w:sz w:val="18"/>
+              </w:rPr>
+              <w:t>#ffffff</w:t>
+            </w:r>
+            <w:r>
+              <w:rPr>
+                <w:color w:val="1E293B"/>
+                <w:sz w:val="18"/>
+              </w:rPr>
+              <w:t xml:space="preserve">, accent span in sky-blue </w:t>
+            </w:r>
+            <w:r>
+              <w:rPr>
+                <w:rFonts w:ascii="Courier New" w:hAnsi="Courier New"/>
+                <w:color w:val="0F172A"/>
+                <w:sz w:val="18"/>
+              </w:rPr>
+              <w:t>#56DBFF</w:t>
+            </w:r>
+            <w:r>
+              <w:rPr>
+                <w:color w:val="1E293B"/>
+                <w:sz w:val="18"/>
+              </w:rPr>
+              <w:t xml:space="preserve">; subheadline at </w:t>
+            </w:r>
+            <w:r>
+              <w:rPr>
+                <w:rFonts w:ascii="Courier New" w:hAnsi="Courier New"/>
+                <w:color w:val="0F172A"/>
+                <w:sz w:val="18"/>
+              </w:rPr>
+              <w:t>rgba(255,255,255,0.72)</w:t>
+            </w:r>
+            <w:r>
+              <w:rPr>
+                <w:color w:val="1E293B"/>
+                <w:sz w:val="18"/>
+              </w:rPr>
+              <w:t>; "Australia's AI-powered exam prep platform" badge uses glass pill (</w:t>
+            </w:r>
+            <w:r>
+              <w:rPr>
+                <w:rFonts w:ascii="Courier New" w:hAnsi="Courier New"/>
+                <w:color w:val="0F172A"/>
+                <w:sz w:val="18"/>
+              </w:rPr>
+              <w:t>rgba(255,255,255,0.08)</w:t>
+            </w:r>
+            <w:r>
+              <w:rPr>
+                <w:color w:val="1E293B"/>
+                <w:sz w:val="18"/>
+              </w:rPr>
+              <w:t xml:space="preserve"> bg + </w:t>
+            </w:r>
+            <w:r>
+              <w:rPr>
+                <w:rFonts w:ascii="Courier New" w:hAnsi="Courier New"/>
+                <w:color w:val="0F172A"/>
+                <w:sz w:val="18"/>
+              </w:rPr>
+              <w:t>rgba(255,255,255,0.20)</w:t>
+            </w:r>
+            <w:r>
+              <w:rPr>
+                <w:color w:val="1E293B"/>
+                <w:sz w:val="18"/>
+              </w:rPr>
+              <w:t xml:space="preserve"> border + </w:t>
+            </w:r>
+            <w:r>
+              <w:rPr>
+                <w:rFonts w:ascii="Courier New" w:hAnsi="Courier New"/>
+                <w:color w:val="0F172A"/>
+                <w:sz w:val="18"/>
+              </w:rPr>
+              <w:t>backdropFilter: blur(8px)</w:t>
+            </w:r>
+            <w:r>
+              <w:rPr>
+                <w:color w:val="1E293B"/>
+                <w:sz w:val="18"/>
+              </w:rPr>
+              <w:t xml:space="preserve">); primary CTA changed from navy/gold to gold </w:t>
+            </w:r>
+            <w:r>
+              <w:rPr>
+                <w:rFonts w:ascii="Courier New" w:hAnsi="Courier New"/>
+                <w:color w:val="0F172A"/>
+                <w:sz w:val="18"/>
+              </w:rPr>
+              <w:t>#FDC800</w:t>
+            </w:r>
+            <w:r>
+              <w:rPr>
+                <w:color w:val="1E293B"/>
+                <w:sz w:val="18"/>
+              </w:rPr>
+              <w:t xml:space="preserve">/navy for maximum contrast on dark; secondary CTA ("I'm a student") uses </w:t>
+            </w:r>
+            <w:r>
+              <w:rPr>
+                <w:rFonts w:ascii="Courier New" w:hAnsi="Courier New"/>
+                <w:color w:val="0F172A"/>
+                <w:sz w:val="18"/>
+              </w:rPr>
+              <w:t>rgba(255,255,255,0.28)</w:t>
+            </w:r>
+            <w:r>
+              <w:rPr>
+                <w:color w:val="1E293B"/>
+                <w:sz w:val="18"/>
+              </w:rPr>
+              <w:t xml:space="preserve"> border and glass bg. (6) </w:t>
+            </w:r>
+            <w:r>
+              <w:rPr>
+                <w:b/>
+                <w:color w:val="1E293B"/>
+              </w:rPr>
+              <w:t>Frosted glass exam badge panel</w:t>
+            </w:r>
+            <w:r>
+              <w:rPr>
+                <w:color w:val="1E293B"/>
+                <w:sz w:val="18"/>
+              </w:rPr>
+              <w:t xml:space="preserve">: right column redesigned with </w:t>
+            </w:r>
+            <w:r>
+              <w:rPr>
+                <w:rFonts w:ascii="Courier New" w:hAnsi="Courier New"/>
+                <w:color w:val="0F172A"/>
+                <w:sz w:val="18"/>
+              </w:rPr>
+              <w:t>backdropFilter: blur(20px)</w:t>
+            </w:r>
+            <w:r>
+              <w:rPr>
+                <w:color w:val="1E293B"/>
+                <w:sz w:val="18"/>
+              </w:rPr>
+              <w:t xml:space="preserve"> + </w:t>
+            </w:r>
+            <w:r>
+              <w:rPr>
+                <w:rFonts w:ascii="Courier New" w:hAnsi="Courier New"/>
+                <w:color w:val="0F172A"/>
+                <w:sz w:val="18"/>
+              </w:rPr>
+              <w:t>-webkit-backdrop-filter</w:t>
+            </w:r>
+            <w:r>
+              <w:rPr>
+                <w:color w:val="1E293B"/>
+                <w:sz w:val="18"/>
+              </w:rPr>
+              <w:t xml:space="preserve"> glass card (</w:t>
+            </w:r>
+            <w:r>
+              <w:rPr>
+                <w:rFonts w:ascii="Courier New" w:hAnsi="Courier New"/>
+                <w:color w:val="0F172A"/>
+                <w:sz w:val="18"/>
+              </w:rPr>
+              <w:t>rgba(255,255,255,0.07)</w:t>
+            </w:r>
+            <w:r>
+              <w:rPr>
+                <w:color w:val="1E293B"/>
+                <w:sz w:val="18"/>
+              </w:rPr>
+              <w:t xml:space="preserve"> bg, </w:t>
+            </w:r>
+            <w:r>
+              <w:rPr>
+                <w:rFonts w:ascii="Courier New" w:hAnsi="Courier New"/>
+                <w:color w:val="0F172A"/>
+                <w:sz w:val="18"/>
+              </w:rPr>
+              <w:t>rgba(255,255,255,0.13)</w:t>
+            </w:r>
+            <w:r>
+              <w:rPr>
+                <w:color w:val="1E293B"/>
+                <w:sz w:val="18"/>
+              </w:rPr>
+              <w:t xml:space="preserve"> border, deep box-shadow </w:t>
+            </w:r>
+            <w:r>
+              <w:rPr>
+                <w:rFonts w:ascii="Courier New" w:hAnsi="Courier New"/>
+                <w:color w:val="0F172A"/>
+                <w:sz w:val="18"/>
+              </w:rPr>
+              <w:t>0 8px 48px rgba(0,0,0,0.45)</w:t>
+            </w:r>
+            <w:r>
+              <w:rPr>
+                <w:color w:val="1E293B"/>
+                <w:sz w:val="18"/>
+              </w:rPr>
+              <w:t xml:space="preserve">); badge card backgrounds changed to </w:t>
+            </w:r>
+            <w:r>
+              <w:rPr>
+                <w:rFonts w:ascii="Courier New" w:hAnsi="Courier New"/>
+                <w:color w:val="0F172A"/>
+                <w:sz w:val="18"/>
+              </w:rPr>
+              <w:t>rgba(255,255,255,0.05)</w:t>
+            </w:r>
+            <w:r>
+              <w:rPr>
+                <w:color w:val="1E293B"/>
+                <w:sz w:val="18"/>
+              </w:rPr>
+              <w:t xml:space="preserve">; badge circle glows use per-exam colour box-shadow; label text uses </w:t>
+            </w:r>
+            <w:r>
+              <w:rPr>
+                <w:rFonts w:ascii="Courier New" w:hAnsi="Courier New"/>
+                <w:color w:val="0F172A"/>
+                <w:sz w:val="18"/>
+              </w:rPr>
+              <w:t>rgba(255,255,255,0.6)</w:t>
+            </w:r>
+            <w:r>
+              <w:rPr>
+                <w:color w:val="1E293B"/>
+                <w:sz w:val="18"/>
+              </w:rPr>
+              <w:t xml:space="preserve">. New CSS keyframes added: </w:t>
+            </w:r>
+            <w:r>
+              <w:rPr>
+                <w:rFonts w:ascii="Courier New" w:hAnsi="Courier New"/>
+                <w:color w:val="0F172A"/>
+                <w:sz w:val="18"/>
+              </w:rPr>
+              <w:t>ai-orb-pulse</w:t>
+            </w:r>
+            <w:r>
+              <w:rPr>
+                <w:color w:val="1E293B"/>
+                <w:sz w:val="18"/>
+              </w:rPr>
+              <w:t xml:space="preserve">, </w:t>
+            </w:r>
+            <w:r>
+              <w:rPr>
+                <w:rFonts w:ascii="Courier New" w:hAnsi="Courier New"/>
+                <w:color w:val="0F172A"/>
+                <w:sz w:val="18"/>
+              </w:rPr>
+              <w:t>warm-glow</w:t>
+            </w:r>
+            <w:r>
+              <w:rPr>
+                <w:color w:val="1E293B"/>
+                <w:sz w:val="18"/>
+              </w:rPr>
+              <w:t xml:space="preserve">, </w:t>
+            </w:r>
+            <w:r>
+              <w:rPr>
+                <w:rFonts w:ascii="Courier New" w:hAnsi="Courier New"/>
+                <w:color w:val="0F172A"/>
+                <w:sz w:val="18"/>
+              </w:rPr>
+              <w:t>beam-pulse</w:t>
+            </w:r>
+            <w:r>
+              <w:rPr>
+                <w:color w:val="1E293B"/>
+                <w:sz w:val="18"/>
+              </w:rPr>
+              <w:t xml:space="preserve">, </w:t>
+            </w:r>
+            <w:r>
+              <w:rPr>
+                <w:rFonts w:ascii="Courier New" w:hAnsi="Courier New"/>
+                <w:color w:val="0F172A"/>
+                <w:sz w:val="18"/>
+              </w:rPr>
+              <w:t>particle-rise</w:t>
+            </w:r>
+            <w:r>
+              <w:rPr>
+                <w:color w:val="1E293B"/>
+                <w:sz w:val="18"/>
+              </w:rPr>
+              <w:t xml:space="preserve">, </w:t>
+            </w:r>
+            <w:r>
+              <w:rPr>
+                <w:rFonts w:ascii="Courier New" w:hAnsi="Courier New"/>
+                <w:color w:val="0F172A"/>
+                <w:sz w:val="18"/>
+              </w:rPr>
+              <w:t>float-equation</w:t>
+            </w:r>
+            <w:r>
+              <w:rPr>
+                <w:color w:val="1E293B"/>
+                <w:sz w:val="18"/>
+              </w:rPr>
+              <w:t xml:space="preserve">. To use a real AI-generated video: generate a 10–15 s looping MP4 (recommended prompt: "Serene warm study scene, soft-glowing blue AI hologram tutor floating near a desk, happy 10-year-old child looking up with curiosity, floating maths equations drifting around them, ambient film-quality lighting, cinematic, 4K, seamlessly loopable") using Runway Gen-3, Kling AI, or Sora; place the file at </w:t>
+            </w:r>
+            <w:r>
+              <w:rPr>
+                <w:rFonts w:ascii="Courier New" w:hAnsi="Courier New"/>
+                <w:color w:val="0F172A"/>
+                <w:sz w:val="18"/>
+              </w:rPr>
+              <w:t>public/tutor-bg.mp4</w:t>
+            </w:r>
+            <w:r>
+              <w:rPr>
+                <w:color w:val="1E293B"/>
+                <w:sz w:val="18"/>
+              </w:rPr>
+              <w:t>; no code change needed — the player activates automatically</w:t>
             </w:r>
           </w:p>
         </w:tc>
@@ -29120,7 +28962,7 @@
                 <w:b/>
                 <w:color w:val="1E293B"/>
               </w:rPr>
-              <w:t>v0.28.0</w:t>
+              <w:t>v0.29.0</w:t>
             </w:r>
           </w:p>
         </w:tc>
@@ -29170,21 +29012,7 @@
                 <w:color w:val="1E293B"/>
                 <w:sz w:val="18"/>
               </w:rPr>
-              <w:t xml:space="preserve">Landing page visual overhaul + Adventure Mode game-feel + CAPTCHA + professional diagrams — (1) </w:t>
-            </w:r>
-            <w:r>
-              <w:rPr>
-                <w:b/>
-                <w:color w:val="1E293B"/>
-              </w:rPr>
-              <w:t>Sign-in button</w:t>
-            </w:r>
-            <w:r>
-              <w:rPr>
-                <w:color w:val="1E293B"/>
-                <w:sz w:val="18"/>
-              </w:rPr>
-              <w:t xml:space="preserve"> made prominent: navy-bordered outlined button with </w:t>
+              <w:t xml:space="preserve">Guest limit reduced 20 → 10 questions/day — updated in </w:t>
             </w:r>
             <w:r>
               <w:rPr>
@@ -29192,56 +29020,14 @@
                 <w:color w:val="0F172A"/>
                 <w:sz w:val="18"/>
               </w:rPr>
-              <w:t>Sign in →</w:t>
-            </w:r>
-            <w:r>
-              <w:rPr>
-                <w:color w:val="1E293B"/>
-                <w:sz w:val="18"/>
-              </w:rPr>
-              <w:t xml:space="preserve"> text. (2) </w:t>
-            </w:r>
-            <w:r>
-              <w:rPr>
-                <w:b/>
-                <w:color w:val="1E293B"/>
-              </w:rPr>
-              <w:t>"Our story"</w:t>
-            </w:r>
-            <w:r>
-              <w:rPr>
-                <w:color w:val="1E293B"/>
-                <w:sz w:val="18"/>
-              </w:rPr>
-              <w:t xml:space="preserve"> nav link coloured blue with arrow; </w:t>
-            </w:r>
-            <w:r>
-              <w:rPr>
-                <w:b/>
-                <w:color w:val="1E293B"/>
-              </w:rPr>
-              <w:t>Pricing</w:t>
-            </w:r>
-            <w:r>
-              <w:rPr>
-                <w:color w:val="1E293B"/>
-                <w:sz w:val="18"/>
-              </w:rPr>
-              <w:t xml:space="preserve"> becomes a gold pill button. (3) </w:t>
-            </w:r>
-            <w:r>
-              <w:rPr>
-                <w:b/>
-                <w:color w:val="1E293B"/>
-              </w:rPr>
-              <w:t>Rolling banner</w:t>
-            </w:r>
-            <w:r>
-              <w:rPr>
-                <w:color w:val="1E293B"/>
-                <w:sz w:val="18"/>
-              </w:rPr>
-              <w:t xml:space="preserve"> (navy ticker) below stats strip: auto-scrolling marquee of testimonial snippets, exam names, and feature highlights using CSS </w:t>
+              <w:t>GUEST_DAILY_LIMIT</w:t>
+            </w:r>
+            <w:r>
+              <w:rPr>
+                <w:color w:val="1E293B"/>
+                <w:sz w:val="18"/>
+              </w:rPr>
+              <w:t xml:space="preserve"> constant (</w:t>
             </w:r>
             <w:r>
               <w:rPr>
@@ -29249,28 +29035,14 @@
                 <w:color w:val="0F172A"/>
                 <w:sz w:val="18"/>
               </w:rPr>
-              <w:t>marquee-scroll</w:t>
-            </w:r>
-            <w:r>
-              <w:rPr>
-                <w:color w:val="1E293B"/>
-                <w:sz w:val="18"/>
-              </w:rPr>
-              <w:t xml:space="preserve"> keyframe. (4) </w:t>
-            </w:r>
-            <w:r>
-              <w:rPr>
-                <w:b/>
-                <w:color w:val="1E293B"/>
-              </w:rPr>
-              <w:t>Animated motion background</w:t>
-            </w:r>
-            <w:r>
-              <w:rPr>
-                <w:color w:val="1E293B"/>
-                <w:sz w:val="18"/>
-              </w:rPr>
-              <w:t xml:space="preserve"> on hero: 16 floating maths symbols (π, ∑, √, ∫, Δ, etc.) drift upward with staggered fade using </w:t>
+              <w:t>app/page.tsx</w:t>
+            </w:r>
+            <w:r>
+              <w:rPr>
+                <w:color w:val="1E293B"/>
+                <w:sz w:val="18"/>
+              </w:rPr>
+              <w:t xml:space="preserve">, </w:t>
             </w:r>
             <w:r>
               <w:rPr>
@@ -29278,14 +29050,14 @@
                 <w:color w:val="0F172A"/>
                 <w:sz w:val="18"/>
               </w:rPr>
-              <w:t>float-symbol</w:t>
-            </w:r>
-            <w:r>
-              <w:rPr>
-                <w:color w:val="1E293B"/>
-                <w:sz w:val="18"/>
-              </w:rPr>
-              <w:t xml:space="preserve"> keyframe; three gradient orbs pulse with </w:t>
+              <w:t>GuestLimitModal.tsx</w:t>
+            </w:r>
+            <w:r>
+              <w:rPr>
+                <w:color w:val="1E293B"/>
+                <w:sz w:val="18"/>
+              </w:rPr>
+              <w:t xml:space="preserve">), rolling banner copy, FAQ answer, trust badge, and parent dashboard label. CAPTCHA gate on sign-up — (1) </w:t>
             </w:r>
             <w:r>
               <w:rPr>
@@ -29293,42 +29065,14 @@
                 <w:color w:val="0F172A"/>
                 <w:sz w:val="18"/>
               </w:rPr>
-              <w:t>pulse-orb</w:t>
-            </w:r>
-            <w:r>
-              <w:rPr>
-                <w:color w:val="1E293B"/>
-                <w:sz w:val="18"/>
-              </w:rPr>
-              <w:t xml:space="preserve"> animation. (5) </w:t>
-            </w:r>
-            <w:r>
-              <w:rPr>
-                <w:b/>
-                <w:color w:val="1E293B"/>
-              </w:rPr>
-              <w:t>Visual exam badges</w:t>
-            </w:r>
-            <w:r>
-              <w:rPr>
-                <w:color w:val="1E293B"/>
-                <w:sz w:val="18"/>
-              </w:rPr>
-              <w:t xml:space="preserve">: hero right panel and Exams section now display circular coloured badges with abbreviation text and emoji icon per exam instead of plain text with left-bar accent. (6) </w:t>
-            </w:r>
-            <w:r>
-              <w:rPr>
-                <w:b/>
-                <w:color w:val="1E293B"/>
-              </w:rPr>
-              <w:t>Human verification CAPTCHA</w:t>
-            </w:r>
-            <w:r>
-              <w:rPr>
-                <w:color w:val="1E293B"/>
-                <w:sz w:val="18"/>
-              </w:rPr>
-              <w:t xml:space="preserve"> on testimonial form: math challenge (</w:t>
+              <w:t>/sign-up</w:t>
+            </w:r>
+            <w:r>
+              <w:rPr>
+                <w:color w:val="1E293B"/>
+                <w:sz w:val="18"/>
+              </w:rPr>
+              <w:t xml:space="preserve"> page now shows a math CAPTCHA challenge before the Clerk </w:t>
             </w:r>
             <w:r>
               <w:rPr>
@@ -29336,28 +29080,14 @@
                 <w:color w:val="0F172A"/>
                 <w:sz w:val="18"/>
               </w:rPr>
-              <w:t>What is A + B?</w:t>
-            </w:r>
-            <w:r>
-              <w:rPr>
-                <w:color w:val="1E293B"/>
-                <w:sz w:val="18"/>
-              </w:rPr>
-              <w:t xml:space="preserve">) + invisible honeypot field. Bot submissions rejected client-side before API call. (7) </w:t>
-            </w:r>
-            <w:r>
-              <w:rPr>
-                <w:b/>
-                <w:color w:val="1E293B"/>
-              </w:rPr>
-              <w:t>Adventure Mode overhaul</w:t>
-            </w:r>
-            <w:r>
-              <w:rPr>
-                <w:color w:val="1E293B"/>
-                <w:sz w:val="18"/>
-              </w:rPr>
-              <w:t xml:space="preserve">: rank system (Novice → Explorer → Scholar → Expert → Champion → Legend) with animated rank-glow border and XP progress bar to next rank; combo multiplier system (×2 at 3-streak, ×3 at 5-streak) with </w:t>
+              <w:t>&lt;SignUp /&gt;</w:t>
+            </w:r>
+            <w:r>
+              <w:rPr>
+                <w:color w:val="1E293B"/>
+                <w:sz w:val="18"/>
+              </w:rPr>
+              <w:t xml:space="preserve"> form renders (client component with </w:t>
             </w:r>
             <w:r>
               <w:rPr>
@@ -29365,14 +29095,14 @@
                 <w:color w:val="0F172A"/>
                 <w:sz w:val="18"/>
               </w:rPr>
-              <w:t>combo-pop</w:t>
-            </w:r>
-            <w:r>
-              <w:rPr>
-                <w:color w:val="1E293B"/>
-                <w:sz w:val="18"/>
-              </w:rPr>
-              <w:t xml:space="preserve"> animation in HUD; block shake animation on wrong answer (</w:t>
+              <w:t>useState</w:t>
+            </w:r>
+            <w:r>
+              <w:rPr>
+                <w:color w:val="1E293B"/>
+                <w:sz w:val="18"/>
+              </w:rPr>
+              <w:t xml:space="preserve"> gate). (2) New </w:t>
             </w:r>
             <w:r>
               <w:rPr>
@@ -29380,14 +29110,14 @@
                 <w:color w:val="0F172A"/>
                 <w:sz w:val="18"/>
               </w:rPr>
-              <w:t>shake-x</w:t>
-            </w:r>
-            <w:r>
-              <w:rPr>
-                <w:color w:val="1E293B"/>
-                <w:sz w:val="18"/>
-              </w:rPr>
-              <w:t>); block bounce on correct answer (</w:t>
+              <w:t>CaptchaSignUpGate</w:t>
+            </w:r>
+            <w:r>
+              <w:rPr>
+                <w:color w:val="1E293B"/>
+                <w:sz w:val="18"/>
+              </w:rPr>
+              <w:t xml:space="preserve"> component (</w:t>
             </w:r>
             <w:r>
               <w:rPr>
@@ -29395,28 +29125,14 @@
                 <w:color w:val="0F172A"/>
                 <w:sz w:val="18"/>
               </w:rPr>
-              <w:t>correct-bounce</w:t>
-            </w:r>
-            <w:r>
-              <w:rPr>
-                <w:color w:val="1E293B"/>
-                <w:sz w:val="18"/>
-              </w:rPr>
-              <w:t xml:space="preserve">); spinning loader while fetching questions; chapter numbers in world map; best-combo display on stage-complete and game-over screens; animated sequential star reveal on stage-complete; animated skull bounce on game-over with red-pulse background flash. (8) </w:t>
-            </w:r>
-            <w:r>
-              <w:rPr>
-                <w:b/>
-                <w:color w:val="1E293B"/>
-              </w:rPr>
-              <w:t>DESIGN.docx</w:t>
-            </w:r>
-            <w:r>
-              <w:rPr>
-                <w:color w:val="1E293B"/>
-                <w:sz w:val="18"/>
-              </w:rPr>
-              <w:t xml:space="preserve"> now includes a visual appendix of three matplotlib-generated diagrams: system architecture (component boxes with arrows), user journey funnel, and learning modes overview — auto-generated by </w:t>
+              <w:t>app/components/CaptchaSignUpGate.tsx</w:t>
+            </w:r>
+            <w:r>
+              <w:rPr>
+                <w:color w:val="1E293B"/>
+                <w:sz w:val="18"/>
+              </w:rPr>
+              <w:t xml:space="preserve">) wraps any button with a CAPTCHA modal; uses </w:t>
             </w:r>
             <w:r>
               <w:rPr>
@@ -29424,14 +29140,14 @@
                 <w:color w:val="0F172A"/>
                 <w:sz w:val="18"/>
               </w:rPr>
-              <w:t>scripts/generate_design_doc.py</w:t>
-            </w:r>
-            <w:r>
-              <w:rPr>
-                <w:color w:val="1E293B"/>
-                <w:sz w:val="18"/>
-              </w:rPr>
-              <w:t xml:space="preserve"> when </w:t>
+              <w:t>useClerk().openSignUp()</w:t>
+            </w:r>
+            <w:r>
+              <w:rPr>
+                <w:color w:val="1E293B"/>
+                <w:sz w:val="18"/>
+              </w:rPr>
+              <w:t xml:space="preserve"> to open Clerk's sign-up modal after successful verification. </w:t>
             </w:r>
             <w:r>
               <w:rPr>
@@ -29439,14 +29155,37 @@
                 <w:color w:val="0F172A"/>
                 <w:sz w:val="18"/>
               </w:rPr>
-              <w:t>matplotlib</w:t>
-            </w:r>
-            <w:r>
-              <w:rPr>
-                <w:color w:val="1E293B"/>
-                <w:sz w:val="18"/>
-              </w:rPr>
-              <w:t xml:space="preserve"> is installed</w:t>
+              <w:t>GuestLimitModal</w:t>
+            </w:r>
+            <w:r>
+              <w:rPr>
+                <w:color w:val="1E293B"/>
+                <w:sz w:val="18"/>
+              </w:rPr>
+              <w:t xml:space="preserve">'s "Start free 7-day trial →" button now uses </w:t>
+            </w:r>
+            <w:r>
+              <w:rPr>
+                <w:rFonts w:ascii="Courier New" w:hAnsi="Courier New"/>
+                <w:color w:val="0F172A"/>
+                <w:sz w:val="18"/>
+              </w:rPr>
+              <w:t>CaptchaSignUpGate</w:t>
+            </w:r>
+            <w:r>
+              <w:rPr>
+                <w:color w:val="1E293B"/>
+                <w:sz w:val="18"/>
+              </w:rPr>
+              <w:t xml:space="preserve"> instead of </w:t>
+            </w:r>
+            <w:r>
+              <w:rPr>
+                <w:rFonts w:ascii="Courier New" w:hAnsi="Courier New"/>
+                <w:color w:val="0F172A"/>
+                <w:sz w:val="18"/>
+              </w:rPr>
+              <w:t>&lt;SignUpButton&gt;</w:t>
             </w:r>
           </w:p>
         </w:tc>
@@ -29473,7 +29212,7 @@
                 <w:b/>
                 <w:color w:val="1E293B"/>
               </w:rPr>
-              <w:t>v0.27.0</w:t>
+              <w:t>v0.28.0</w:t>
             </w:r>
           </w:p>
         </w:tc>
@@ -29523,7 +29262,283 @@
                 <w:color w:val="1E293B"/>
                 <w:sz w:val="18"/>
               </w:rPr>
-              <w:t>Landing page copy fixes — FAQ "Do I need an account?" updated to mention 20-question/day guest limit and midnight reset; correctly states Exam Mode and Adventure Mode require an account. Trust badge "Free to use / no premium tier" corrected to "Free to start / 7-day trial then $9.99/month AUD". Guest badge updated to "20 free questions a day"</w:t>
+              <w:t xml:space="preserve">Landing page visual overhaul + Adventure Mode game-feel + CAPTCHA + professional diagrams — (1) </w:t>
+            </w:r>
+            <w:r>
+              <w:rPr>
+                <w:b/>
+                <w:color w:val="1E293B"/>
+              </w:rPr>
+              <w:t>Sign-in button</w:t>
+            </w:r>
+            <w:r>
+              <w:rPr>
+                <w:color w:val="1E293B"/>
+                <w:sz w:val="18"/>
+              </w:rPr>
+              <w:t xml:space="preserve"> made prominent: navy-bordered outlined button with </w:t>
+            </w:r>
+            <w:r>
+              <w:rPr>
+                <w:rFonts w:ascii="Courier New" w:hAnsi="Courier New"/>
+                <w:color w:val="0F172A"/>
+                <w:sz w:val="18"/>
+              </w:rPr>
+              <w:t>Sign in →</w:t>
+            </w:r>
+            <w:r>
+              <w:rPr>
+                <w:color w:val="1E293B"/>
+                <w:sz w:val="18"/>
+              </w:rPr>
+              <w:t xml:space="preserve"> text. (2) </w:t>
+            </w:r>
+            <w:r>
+              <w:rPr>
+                <w:b/>
+                <w:color w:val="1E293B"/>
+              </w:rPr>
+              <w:t>"Our story"</w:t>
+            </w:r>
+            <w:r>
+              <w:rPr>
+                <w:color w:val="1E293B"/>
+                <w:sz w:val="18"/>
+              </w:rPr>
+              <w:t xml:space="preserve"> nav link coloured blue with arrow; </w:t>
+            </w:r>
+            <w:r>
+              <w:rPr>
+                <w:b/>
+                <w:color w:val="1E293B"/>
+              </w:rPr>
+              <w:t>Pricing</w:t>
+            </w:r>
+            <w:r>
+              <w:rPr>
+                <w:color w:val="1E293B"/>
+                <w:sz w:val="18"/>
+              </w:rPr>
+              <w:t xml:space="preserve"> becomes a gold pill button. (3) </w:t>
+            </w:r>
+            <w:r>
+              <w:rPr>
+                <w:b/>
+                <w:color w:val="1E293B"/>
+              </w:rPr>
+              <w:t>Rolling banner</w:t>
+            </w:r>
+            <w:r>
+              <w:rPr>
+                <w:color w:val="1E293B"/>
+                <w:sz w:val="18"/>
+              </w:rPr>
+              <w:t xml:space="preserve"> (navy ticker) below stats strip: auto-scrolling marquee of testimonial snippets, exam names, and feature highlights using CSS </w:t>
+            </w:r>
+            <w:r>
+              <w:rPr>
+                <w:rFonts w:ascii="Courier New" w:hAnsi="Courier New"/>
+                <w:color w:val="0F172A"/>
+                <w:sz w:val="18"/>
+              </w:rPr>
+              <w:t>marquee-scroll</w:t>
+            </w:r>
+            <w:r>
+              <w:rPr>
+                <w:color w:val="1E293B"/>
+                <w:sz w:val="18"/>
+              </w:rPr>
+              <w:t xml:space="preserve"> keyframe. (4) </w:t>
+            </w:r>
+            <w:r>
+              <w:rPr>
+                <w:b/>
+                <w:color w:val="1E293B"/>
+              </w:rPr>
+              <w:t>Animated motion background</w:t>
+            </w:r>
+            <w:r>
+              <w:rPr>
+                <w:color w:val="1E293B"/>
+                <w:sz w:val="18"/>
+              </w:rPr>
+              <w:t xml:space="preserve"> on hero: 16 floating maths symbols (π, ∑, √, ∫, Δ, etc.) drift upward with staggered fade using </w:t>
+            </w:r>
+            <w:r>
+              <w:rPr>
+                <w:rFonts w:ascii="Courier New" w:hAnsi="Courier New"/>
+                <w:color w:val="0F172A"/>
+                <w:sz w:val="18"/>
+              </w:rPr>
+              <w:t>float-symbol</w:t>
+            </w:r>
+            <w:r>
+              <w:rPr>
+                <w:color w:val="1E293B"/>
+                <w:sz w:val="18"/>
+              </w:rPr>
+              <w:t xml:space="preserve"> keyframe; three gradient orbs pulse with </w:t>
+            </w:r>
+            <w:r>
+              <w:rPr>
+                <w:rFonts w:ascii="Courier New" w:hAnsi="Courier New"/>
+                <w:color w:val="0F172A"/>
+                <w:sz w:val="18"/>
+              </w:rPr>
+              <w:t>pulse-orb</w:t>
+            </w:r>
+            <w:r>
+              <w:rPr>
+                <w:color w:val="1E293B"/>
+                <w:sz w:val="18"/>
+              </w:rPr>
+              <w:t xml:space="preserve"> animation. (5) </w:t>
+            </w:r>
+            <w:r>
+              <w:rPr>
+                <w:b/>
+                <w:color w:val="1E293B"/>
+              </w:rPr>
+              <w:t>Visual exam badges</w:t>
+            </w:r>
+            <w:r>
+              <w:rPr>
+                <w:color w:val="1E293B"/>
+                <w:sz w:val="18"/>
+              </w:rPr>
+              <w:t xml:space="preserve">: hero right panel and Exams section now display circular coloured badges with abbreviation text and emoji icon per exam instead of plain text with left-bar accent. (6) </w:t>
+            </w:r>
+            <w:r>
+              <w:rPr>
+                <w:b/>
+                <w:color w:val="1E293B"/>
+              </w:rPr>
+              <w:t>Human verification CAPTCHA</w:t>
+            </w:r>
+            <w:r>
+              <w:rPr>
+                <w:color w:val="1E293B"/>
+                <w:sz w:val="18"/>
+              </w:rPr>
+              <w:t xml:space="preserve"> on testimonial form: math challenge (</w:t>
+            </w:r>
+            <w:r>
+              <w:rPr>
+                <w:rFonts w:ascii="Courier New" w:hAnsi="Courier New"/>
+                <w:color w:val="0F172A"/>
+                <w:sz w:val="18"/>
+              </w:rPr>
+              <w:t>What is A + B?</w:t>
+            </w:r>
+            <w:r>
+              <w:rPr>
+                <w:color w:val="1E293B"/>
+                <w:sz w:val="18"/>
+              </w:rPr>
+              <w:t xml:space="preserve">) + invisible honeypot field. Bot submissions rejected client-side before API call. (7) </w:t>
+            </w:r>
+            <w:r>
+              <w:rPr>
+                <w:b/>
+                <w:color w:val="1E293B"/>
+              </w:rPr>
+              <w:t>Adventure Mode overhaul</w:t>
+            </w:r>
+            <w:r>
+              <w:rPr>
+                <w:color w:val="1E293B"/>
+                <w:sz w:val="18"/>
+              </w:rPr>
+              <w:t xml:space="preserve">: rank system (Novice → Explorer → Scholar → Expert → Champion → Legend) with animated rank-glow border and XP progress bar to next rank; combo multiplier system (×2 at 3-streak, ×3 at 5-streak) with </w:t>
+            </w:r>
+            <w:r>
+              <w:rPr>
+                <w:rFonts w:ascii="Courier New" w:hAnsi="Courier New"/>
+                <w:color w:val="0F172A"/>
+                <w:sz w:val="18"/>
+              </w:rPr>
+              <w:t>combo-pop</w:t>
+            </w:r>
+            <w:r>
+              <w:rPr>
+                <w:color w:val="1E293B"/>
+                <w:sz w:val="18"/>
+              </w:rPr>
+              <w:t xml:space="preserve"> animation in HUD; block shake animation on wrong answer (</w:t>
+            </w:r>
+            <w:r>
+              <w:rPr>
+                <w:rFonts w:ascii="Courier New" w:hAnsi="Courier New"/>
+                <w:color w:val="0F172A"/>
+                <w:sz w:val="18"/>
+              </w:rPr>
+              <w:t>shake-x</w:t>
+            </w:r>
+            <w:r>
+              <w:rPr>
+                <w:color w:val="1E293B"/>
+                <w:sz w:val="18"/>
+              </w:rPr>
+              <w:t>); block bounce on correct answer (</w:t>
+            </w:r>
+            <w:r>
+              <w:rPr>
+                <w:rFonts w:ascii="Courier New" w:hAnsi="Courier New"/>
+                <w:color w:val="0F172A"/>
+                <w:sz w:val="18"/>
+              </w:rPr>
+              <w:t>correct-bounce</w:t>
+            </w:r>
+            <w:r>
+              <w:rPr>
+                <w:color w:val="1E293B"/>
+                <w:sz w:val="18"/>
+              </w:rPr>
+              <w:t xml:space="preserve">); spinning loader while fetching questions; chapter numbers in world map; best-combo display on stage-complete and game-over screens; animated sequential star reveal on stage-complete; animated skull bounce on game-over with red-pulse background flash. (8) </w:t>
+            </w:r>
+            <w:r>
+              <w:rPr>
+                <w:b/>
+                <w:color w:val="1E293B"/>
+              </w:rPr>
+              <w:t>DESIGN.docx</w:t>
+            </w:r>
+            <w:r>
+              <w:rPr>
+                <w:color w:val="1E293B"/>
+                <w:sz w:val="18"/>
+              </w:rPr>
+              <w:t xml:space="preserve"> now includes a visual appendix of three matplotlib-generated diagrams: system architecture (component boxes with arrows), user journey funnel, and learning modes overview — auto-generated by </w:t>
+            </w:r>
+            <w:r>
+              <w:rPr>
+                <w:rFonts w:ascii="Courier New" w:hAnsi="Courier New"/>
+                <w:color w:val="0F172A"/>
+                <w:sz w:val="18"/>
+              </w:rPr>
+              <w:t>scripts/generate_design_doc.py</w:t>
+            </w:r>
+            <w:r>
+              <w:rPr>
+                <w:color w:val="1E293B"/>
+                <w:sz w:val="18"/>
+              </w:rPr>
+              <w:t xml:space="preserve"> when </w:t>
+            </w:r>
+            <w:r>
+              <w:rPr>
+                <w:rFonts w:ascii="Courier New" w:hAnsi="Courier New"/>
+                <w:color w:val="0F172A"/>
+                <w:sz w:val="18"/>
+              </w:rPr>
+              <w:t>matplotlib</w:t>
+            </w:r>
+            <w:r>
+              <w:rPr>
+                <w:color w:val="1E293B"/>
+                <w:sz w:val="18"/>
+              </w:rPr>
+              <w:t xml:space="preserve"> is installed</w:t>
             </w:r>
           </w:p>
         </w:tc>
@@ -29550,7 +29565,7 @@
                 <w:b/>
                 <w:color w:val="1E293B"/>
               </w:rPr>
-              <w:t>v0.26.0</w:t>
+              <w:t>v0.27.0</w:t>
             </w:r>
           </w:p>
         </w:tc>
@@ -29600,112 +29615,7 @@
                 <w:color w:val="1E293B"/>
                 <w:sz w:val="18"/>
               </w:rPr>
-              <w:t xml:space="preserve">DoS protection — three-layer defence: (1) Upstash Redis distributed rate limiting replaces the defunct in-memory </w:t>
-            </w:r>
-            <w:r>
-              <w:rPr>
-                <w:rFonts w:ascii="Courier New" w:hAnsi="Courier New"/>
-                <w:color w:val="0F172A"/>
-                <w:sz w:val="18"/>
-              </w:rPr>
-              <w:t>Map</w:t>
-            </w:r>
-            <w:r>
-              <w:rPr>
-                <w:color w:val="1E293B"/>
-                <w:sz w:val="18"/>
-              </w:rPr>
-              <w:t xml:space="preserve"> in </w:t>
-            </w:r>
-            <w:r>
-              <w:rPr>
-                <w:rFonts w:ascii="Courier New" w:hAnsi="Courier New"/>
-                <w:color w:val="0F172A"/>
-                <w:sz w:val="18"/>
-              </w:rPr>
-              <w:t>lib/ratelimit.ts</w:t>
-            </w:r>
-            <w:r>
-              <w:rPr>
-                <w:color w:val="1E293B"/>
-                <w:sz w:val="18"/>
-              </w:rPr>
-              <w:t xml:space="preserve"> — sliding window, graceful in-memory fallback when env vars absent, unique Redis prefix per endpoint. </w:t>
-            </w:r>
-            <w:r>
-              <w:rPr>
-                <w:rFonts w:ascii="Courier New" w:hAnsi="Courier New"/>
-                <w:color w:val="0F172A"/>
-                <w:sz w:val="18"/>
-              </w:rPr>
-              <w:t>middleware.ts</w:t>
-            </w:r>
-            <w:r>
-              <w:rPr>
-                <w:color w:val="1E293B"/>
-                <w:sz w:val="18"/>
-              </w:rPr>
-              <w:t xml:space="preserve"> deprecated → renamed to </w:t>
-            </w:r>
-            <w:r>
-              <w:rPr>
-                <w:rFonts w:ascii="Courier New" w:hAnsi="Courier New"/>
-                <w:color w:val="0F172A"/>
-                <w:sz w:val="18"/>
-              </w:rPr>
-              <w:t>proxy.ts</w:t>
-            </w:r>
-            <w:r>
-              <w:rPr>
-                <w:color w:val="1E293B"/>
-                <w:sz w:val="18"/>
-              </w:rPr>
-              <w:t xml:space="preserve"> per Next.js 16 proxy convention; proxy runs a blanket 120-req/60s-per-IP gate on all </w:t>
-            </w:r>
-            <w:r>
-              <w:rPr>
-                <w:rFonts w:ascii="Courier New" w:hAnsi="Courier New"/>
-                <w:color w:val="0F172A"/>
-                <w:sz w:val="18"/>
-              </w:rPr>
-              <w:t>/api/*</w:t>
-            </w:r>
-            <w:r>
-              <w:rPr>
-                <w:color w:val="1E293B"/>
-                <w:sz w:val="18"/>
-              </w:rPr>
-              <w:t xml:space="preserve"> routes before any serverless function is invoked. (2) Per-endpoint fine-grained limits: </w:t>
-            </w:r>
-            <w:r>
-              <w:rPr>
-                <w:rFonts w:ascii="Courier New" w:hAnsi="Courier New"/>
-                <w:color w:val="0F172A"/>
-                <w:sz w:val="18"/>
-              </w:rPr>
-              <w:t>/api/chat</w:t>
-            </w:r>
-            <w:r>
-              <w:rPr>
-                <w:color w:val="1E293B"/>
-                <w:sz w:val="18"/>
-              </w:rPr>
-              <w:t xml:space="preserve"> 30/60s, </w:t>
-            </w:r>
-            <w:r>
-              <w:rPr>
-                <w:rFonts w:ascii="Courier New" w:hAnsi="Courier New"/>
-                <w:color w:val="0F172A"/>
-                <w:sz w:val="18"/>
-              </w:rPr>
-              <w:t>/api/trivia</w:t>
-            </w:r>
-            <w:r>
-              <w:rPr>
-                <w:color w:val="1E293B"/>
-                <w:sz w:val="18"/>
-              </w:rPr>
-              <w:t xml:space="preserve"> 10/60s, `/api/exam/generate</w:t>
+              <w:t>Landing page copy fixes — FAQ "Do I need an account?" updated to mention 20-question/day guest limit and midnight reset; correctly states Exam Mode and Adventure Mode require an account. Trust badge "Free to use / no premium tier" corrected to "Free to start / 7-day trial then $9.99/month AUD". Guest badge updated to "20 free questions a day"</w:t>
             </w:r>
           </w:p>
         </w:tc>
@@ -29732,7 +29642,7 @@
                 <w:b/>
                 <w:color w:val="1E293B"/>
               </w:rPr>
-              <w:t>v0.25.0</w:t>
+              <w:t>v0.26.0</w:t>
             </w:r>
           </w:p>
         </w:tc>
@@ -29782,7 +29692,7 @@
                 <w:color w:val="1E293B"/>
                 <w:sz w:val="18"/>
               </w:rPr>
-              <w:t xml:space="preserve">Automated security agent — (1) </w:t>
+              <w:t xml:space="preserve">DoS protection — three-layer defence: (1) Upstash Redis distributed rate limiting replaces the defunct in-memory </w:t>
             </w:r>
             <w:r>
               <w:rPr>
@@ -29790,14 +29700,14 @@
                 <w:color w:val="0F172A"/>
                 <w:sz w:val="18"/>
               </w:rPr>
-              <w:t>next.config.ts</w:t>
-            </w:r>
-            <w:r>
-              <w:rPr>
-                <w:color w:val="1E293B"/>
-                <w:sz w:val="18"/>
-              </w:rPr>
-              <w:t xml:space="preserve"> now sets 7 HTTP security headers on every route: </w:t>
+              <w:t>Map</w:t>
+            </w:r>
+            <w:r>
+              <w:rPr>
+                <w:color w:val="1E293B"/>
+                <w:sz w:val="18"/>
+              </w:rPr>
+              <w:t xml:space="preserve"> in </w:t>
             </w:r>
             <w:r>
               <w:rPr>
@@ -29805,14 +29715,14 @@
                 <w:color w:val="0F172A"/>
                 <w:sz w:val="18"/>
               </w:rPr>
-              <w:t>X-Frame-Options: SAMEORIGIN</w:t>
-            </w:r>
-            <w:r>
-              <w:rPr>
-                <w:color w:val="1E293B"/>
-                <w:sz w:val="18"/>
-              </w:rPr>
-              <w:t xml:space="preserve">, </w:t>
+              <w:t>lib/ratelimit.ts</w:t>
+            </w:r>
+            <w:r>
+              <w:rPr>
+                <w:color w:val="1E293B"/>
+                <w:sz w:val="18"/>
+              </w:rPr>
+              <w:t xml:space="preserve"> — sliding window, graceful in-memory fallback when env vars absent, unique Redis prefix per endpoint. </w:t>
             </w:r>
             <w:r>
               <w:rPr>
@@ -29820,14 +29730,14 @@
                 <w:color w:val="0F172A"/>
                 <w:sz w:val="18"/>
               </w:rPr>
-              <w:t>X-Content-Type-Options: nosniff</w:t>
-            </w:r>
-            <w:r>
-              <w:rPr>
-                <w:color w:val="1E293B"/>
-                <w:sz w:val="18"/>
-              </w:rPr>
-              <w:t xml:space="preserve">, </w:t>
+              <w:t>middleware.ts</w:t>
+            </w:r>
+            <w:r>
+              <w:rPr>
+                <w:color w:val="1E293B"/>
+                <w:sz w:val="18"/>
+              </w:rPr>
+              <w:t xml:space="preserve"> deprecated → renamed to </w:t>
             </w:r>
             <w:r>
               <w:rPr>
@@ -29835,14 +29745,14 @@
                 <w:color w:val="0F172A"/>
                 <w:sz w:val="18"/>
               </w:rPr>
-              <w:t>Referrer-Policy: strict-origin-when-cross-origin</w:t>
-            </w:r>
-            <w:r>
-              <w:rPr>
-                <w:color w:val="1E293B"/>
-                <w:sz w:val="18"/>
-              </w:rPr>
-              <w:t xml:space="preserve">, </w:t>
+              <w:t>proxy.ts</w:t>
+            </w:r>
+            <w:r>
+              <w:rPr>
+                <w:color w:val="1E293B"/>
+                <w:sz w:val="18"/>
+              </w:rPr>
+              <w:t xml:space="preserve"> per Next.js 16 proxy convention; proxy runs a blanket 120-req/60s-per-IP gate on all </w:t>
             </w:r>
             <w:r>
               <w:rPr>
@@ -29850,14 +29760,14 @@
                 <w:color w:val="0F172A"/>
                 <w:sz w:val="18"/>
               </w:rPr>
-              <w:t>Permissions-Policy</w:t>
-            </w:r>
-            <w:r>
-              <w:rPr>
-                <w:color w:val="1E293B"/>
-                <w:sz w:val="18"/>
-              </w:rPr>
-              <w:t xml:space="preserve"> (blocks camera/mic/geo/payment), </w:t>
+              <w:t>/api/*</w:t>
+            </w:r>
+            <w:r>
+              <w:rPr>
+                <w:color w:val="1E293B"/>
+                <w:sz w:val="18"/>
+              </w:rPr>
+              <w:t xml:space="preserve"> routes before any serverless function is invoked. (2) Per-endpoint fine-grained limits: </w:t>
             </w:r>
             <w:r>
               <w:rPr>
@@ -29865,14 +29775,14 @@
                 <w:color w:val="0F172A"/>
                 <w:sz w:val="18"/>
               </w:rPr>
-              <w:t>Strict-Transport-Security</w:t>
-            </w:r>
-            <w:r>
-              <w:rPr>
-                <w:color w:val="1E293B"/>
-                <w:sz w:val="18"/>
-              </w:rPr>
-              <w:t xml:space="preserve"> (2yr + preload), </w:t>
+              <w:t>/api/chat</w:t>
+            </w:r>
+            <w:r>
+              <w:rPr>
+                <w:color w:val="1E293B"/>
+                <w:sz w:val="18"/>
+              </w:rPr>
+              <w:t xml:space="preserve"> 30/60s, </w:t>
             </w:r>
             <w:r>
               <w:rPr>
@@ -29880,44 +29790,14 @@
                 <w:color w:val="0F172A"/>
                 <w:sz w:val="18"/>
               </w:rPr>
-              <w:t>X-DNS-Prefetch-Control</w:t>
-            </w:r>
-            <w:r>
-              <w:rPr>
-                <w:color w:val="1E293B"/>
-                <w:sz w:val="18"/>
-              </w:rPr>
-              <w:t xml:space="preserve">, and a full </w:t>
-            </w:r>
-            <w:r>
-              <w:rPr>
-                <w:rFonts w:ascii="Courier New" w:hAnsi="Courier New"/>
-                <w:color w:val="0F172A"/>
-                <w:sz w:val="18"/>
-              </w:rPr>
-              <w:t>Content-Security-Policy</w:t>
-            </w:r>
-            <w:r>
-              <w:rPr>
-                <w:color w:val="1E293B"/>
-                <w:sz w:val="18"/>
-              </w:rPr>
-              <w:t xml:space="preserve"> covering script/style/font/img/connect/frame origins for Clerk, Stripe, KaTeX, Google Fonts, and Vercel Analytics. (2) </w:t>
-            </w:r>
-            <w:r>
-              <w:rPr>
-                <w:rFonts w:ascii="Courier New" w:hAnsi="Courier New"/>
-                <w:color w:val="0F172A"/>
-                <w:sz w:val="18"/>
-              </w:rPr>
-              <w:t>scripts/pentest.mjs</w:t>
-            </w:r>
-            <w:r>
-              <w:rPr>
-                <w:color w:val="1E293B"/>
-                <w:sz w:val="18"/>
-              </w:rPr>
-              <w:t xml:space="preserve"> — runnable Node.js audit that checks headers, probes 7 API endpoints for unauthenticated access, runs npm audit, scans codebase for dangerous patterns (dangerouslySetInnerHTML, eval, hardcoded secrets, SQL injection, wildcard CORS, sensitive console.log, NEXT_PUBLIC_ secrets, missing auth on API routes), and checks TLS redirect; outputs structured JSON. (3) Weekly Claude Code agent scheduled trigger (every Monday 18:00 UTC) — runs the audit, auto-fixes CRITICAL/HIGH findings, rebuilds, deploys, re-audits to confirm, updates DESIGN.md, and emails the founder a markdown report</w:t>
+              <w:t>/api/trivia</w:t>
+            </w:r>
+            <w:r>
+              <w:rPr>
+                <w:color w:val="1E293B"/>
+                <w:sz w:val="18"/>
+              </w:rPr>
+              <w:t xml:space="preserve"> 10/60s, `/api/exam/generate</w:t>
             </w:r>
           </w:p>
         </w:tc>
@@ -29944,7 +29824,7 @@
                 <w:b/>
                 <w:color w:val="1E293B"/>
               </w:rPr>
-              <w:t>v0.24.0</w:t>
+              <w:t>v0.25.0</w:t>
             </w:r>
           </w:p>
         </w:tc>
@@ -29994,7 +29874,7 @@
                 <w:color w:val="1E293B"/>
                 <w:sz w:val="18"/>
               </w:rPr>
-              <w:t>Guest 20-questions/day limit — anonymous users (no Clerk session, no child session) are now gated at 20 questions per day via localStorage (</w:t>
+              <w:t xml:space="preserve">Automated security agent — (1) </w:t>
             </w:r>
             <w:r>
               <w:rPr>
@@ -30002,14 +29882,14 @@
                 <w:color w:val="0F172A"/>
                 <w:sz w:val="18"/>
               </w:rPr>
-              <w:t>selected_guest_usage: {count, date}</w:t>
-            </w:r>
-            <w:r>
-              <w:rPr>
-                <w:color w:val="1E293B"/>
-                <w:sz w:val="18"/>
-              </w:rPr>
-              <w:t xml:space="preserve">). On limit hit or locked-mode attempt, </w:t>
+              <w:t>next.config.ts</w:t>
+            </w:r>
+            <w:r>
+              <w:rPr>
+                <w:color w:val="1E293B"/>
+                <w:sz w:val="18"/>
+              </w:rPr>
+              <w:t xml:space="preserve"> now sets 7 HTTP security headers on every route: </w:t>
             </w:r>
             <w:r>
               <w:rPr>
@@ -30017,14 +29897,14 @@
                 <w:color w:val="0F172A"/>
                 <w:sz w:val="18"/>
               </w:rPr>
-              <w:t>GuestLimitModal</w:t>
-            </w:r>
-            <w:r>
-              <w:rPr>
-                <w:color w:val="1E293B"/>
-                <w:sz w:val="18"/>
-              </w:rPr>
-              <w:t xml:space="preserve"> opens: shows reset countdown to midnight, "Start free 7-day trial" (Clerk SignUpButton modal) and "I already have an account" (SignInButton modal). Header badge shows </w:t>
+              <w:t>X-Frame-Options: SAMEORIGIN</w:t>
+            </w:r>
+            <w:r>
+              <w:rPr>
+                <w:color w:val="1E293B"/>
+                <w:sz w:val="18"/>
+              </w:rPr>
+              <w:t xml:space="preserve">, </w:t>
             </w:r>
             <w:r>
               <w:rPr>
@@ -30032,14 +29912,14 @@
                 <w:color w:val="0F172A"/>
                 <w:sz w:val="18"/>
               </w:rPr>
-              <w:t>X/20 questions today</w:t>
-            </w:r>
-            <w:r>
-              <w:rPr>
-                <w:color w:val="1E293B"/>
-                <w:sz w:val="18"/>
-              </w:rPr>
-              <w:t xml:space="preserve"> for guests (turns red at limit). Signed-in parents and child sessions continue to use server-side tracking. </w:t>
+              <w:t>X-Content-Type-Options: nosniff</w:t>
+            </w:r>
+            <w:r>
+              <w:rPr>
+                <w:color w:val="1E293B"/>
+                <w:sz w:val="18"/>
+              </w:rPr>
+              <w:t xml:space="preserve">, </w:t>
             </w:r>
             <w:r>
               <w:rPr>
@@ -30047,14 +29927,89 @@
                 <w:color w:val="0F172A"/>
                 <w:sz w:val="18"/>
               </w:rPr>
-              <w:t>app/components/GuestLimitModal.tsx</w:t>
-            </w:r>
-            <w:r>
-              <w:rPr>
-                <w:color w:val="1E293B"/>
-                <w:sz w:val="18"/>
-              </w:rPr>
-              <w:t xml:space="preserve"> added</w:t>
+              <w:t>Referrer-Policy: strict-origin-when-cross-origin</w:t>
+            </w:r>
+            <w:r>
+              <w:rPr>
+                <w:color w:val="1E293B"/>
+                <w:sz w:val="18"/>
+              </w:rPr>
+              <w:t xml:space="preserve">, </w:t>
+            </w:r>
+            <w:r>
+              <w:rPr>
+                <w:rFonts w:ascii="Courier New" w:hAnsi="Courier New"/>
+                <w:color w:val="0F172A"/>
+                <w:sz w:val="18"/>
+              </w:rPr>
+              <w:t>Permissions-Policy</w:t>
+            </w:r>
+            <w:r>
+              <w:rPr>
+                <w:color w:val="1E293B"/>
+                <w:sz w:val="18"/>
+              </w:rPr>
+              <w:t xml:space="preserve"> (blocks camera/mic/geo/payment), </w:t>
+            </w:r>
+            <w:r>
+              <w:rPr>
+                <w:rFonts w:ascii="Courier New" w:hAnsi="Courier New"/>
+                <w:color w:val="0F172A"/>
+                <w:sz w:val="18"/>
+              </w:rPr>
+              <w:t>Strict-Transport-Security</w:t>
+            </w:r>
+            <w:r>
+              <w:rPr>
+                <w:color w:val="1E293B"/>
+                <w:sz w:val="18"/>
+              </w:rPr>
+              <w:t xml:space="preserve"> (2yr + preload), </w:t>
+            </w:r>
+            <w:r>
+              <w:rPr>
+                <w:rFonts w:ascii="Courier New" w:hAnsi="Courier New"/>
+                <w:color w:val="0F172A"/>
+                <w:sz w:val="18"/>
+              </w:rPr>
+              <w:t>X-DNS-Prefetch-Control</w:t>
+            </w:r>
+            <w:r>
+              <w:rPr>
+                <w:color w:val="1E293B"/>
+                <w:sz w:val="18"/>
+              </w:rPr>
+              <w:t xml:space="preserve">, and a full </w:t>
+            </w:r>
+            <w:r>
+              <w:rPr>
+                <w:rFonts w:ascii="Courier New" w:hAnsi="Courier New"/>
+                <w:color w:val="0F172A"/>
+                <w:sz w:val="18"/>
+              </w:rPr>
+              <w:t>Content-Security-Policy</w:t>
+            </w:r>
+            <w:r>
+              <w:rPr>
+                <w:color w:val="1E293B"/>
+                <w:sz w:val="18"/>
+              </w:rPr>
+              <w:t xml:space="preserve"> covering script/style/font/img/connect/frame origins for Clerk, Stripe, KaTeX, Google Fonts, and Vercel Analytics. (2) </w:t>
+            </w:r>
+            <w:r>
+              <w:rPr>
+                <w:rFonts w:ascii="Courier New" w:hAnsi="Courier New"/>
+                <w:color w:val="0F172A"/>
+                <w:sz w:val="18"/>
+              </w:rPr>
+              <w:t>scripts/pentest.mjs</w:t>
+            </w:r>
+            <w:r>
+              <w:rPr>
+                <w:color w:val="1E293B"/>
+                <w:sz w:val="18"/>
+              </w:rPr>
+              <w:t xml:space="preserve"> — runnable Node.js audit that checks headers, probes 7 API endpoints for unauthenticated access, runs npm audit, scans codebase for dangerous patterns (dangerouslySetInnerHTML, eval, hardcoded secrets, SQL injection, wildcard CORS, sensitive console.log, NEXT_PUBLIC_ secrets, missing auth on API routes), and checks TLS redirect; outputs structured JSON. (3) Weekly Claude Code agent scheduled trigger (every Monday 18:00 UTC) — runs the audit, auto-fixes CRITICAL/HIGH findings, rebuilds, deploys, re-audits to confirm, updates DESIGN.md, and emails the founder a markdown report</w:t>
             </w:r>
           </w:p>
         </w:tc>
@@ -30081,7 +30036,7 @@
                 <w:b/>
                 <w:color w:val="1E293B"/>
               </w:rPr>
-              <w:t>v0.23.0</w:t>
+              <w:t>v0.24.0</w:t>
             </w:r>
           </w:p>
         </w:tc>
@@ -30131,6 +30086,143 @@
                 <w:color w:val="1E293B"/>
                 <w:sz w:val="18"/>
               </w:rPr>
+              <w:t>Guest 20-questions/day limit — anonymous users (no Clerk session, no child session) are now gated at 20 questions per day via localStorage (</w:t>
+            </w:r>
+            <w:r>
+              <w:rPr>
+                <w:rFonts w:ascii="Courier New" w:hAnsi="Courier New"/>
+                <w:color w:val="0F172A"/>
+                <w:sz w:val="18"/>
+              </w:rPr>
+              <w:t>selected_guest_usage: {count, date}</w:t>
+            </w:r>
+            <w:r>
+              <w:rPr>
+                <w:color w:val="1E293B"/>
+                <w:sz w:val="18"/>
+              </w:rPr>
+              <w:t xml:space="preserve">). On limit hit or locked-mode attempt, </w:t>
+            </w:r>
+            <w:r>
+              <w:rPr>
+                <w:rFonts w:ascii="Courier New" w:hAnsi="Courier New"/>
+                <w:color w:val="0F172A"/>
+                <w:sz w:val="18"/>
+              </w:rPr>
+              <w:t>GuestLimitModal</w:t>
+            </w:r>
+            <w:r>
+              <w:rPr>
+                <w:color w:val="1E293B"/>
+                <w:sz w:val="18"/>
+              </w:rPr>
+              <w:t xml:space="preserve"> opens: shows reset countdown to midnight, "Start free 7-day trial" (Clerk SignUpButton modal) and "I already have an account" (SignInButton modal). Header badge shows </w:t>
+            </w:r>
+            <w:r>
+              <w:rPr>
+                <w:rFonts w:ascii="Courier New" w:hAnsi="Courier New"/>
+                <w:color w:val="0F172A"/>
+                <w:sz w:val="18"/>
+              </w:rPr>
+              <w:t>X/20 questions today</w:t>
+            </w:r>
+            <w:r>
+              <w:rPr>
+                <w:color w:val="1E293B"/>
+                <w:sz w:val="18"/>
+              </w:rPr>
+              <w:t xml:space="preserve"> for guests (turns red at limit). Signed-in parents and child sessions continue to use server-side tracking. </w:t>
+            </w:r>
+            <w:r>
+              <w:rPr>
+                <w:rFonts w:ascii="Courier New" w:hAnsi="Courier New"/>
+                <w:color w:val="0F172A"/>
+                <w:sz w:val="18"/>
+              </w:rPr>
+              <w:t>app/components/GuestLimitModal.tsx</w:t>
+            </w:r>
+            <w:r>
+              <w:rPr>
+                <w:color w:val="1E293B"/>
+                <w:sz w:val="18"/>
+              </w:rPr>
+              <w:t xml:space="preserve"> added</w:t>
+            </w:r>
+          </w:p>
+        </w:tc>
+      </w:tr>
+      <w:tr>
+        <w:tc>
+          <w:tcPr>
+            <w:tcW w:type="dxa" w:w="3024"/>
+            <w:shd w:val="clear" w:color="auto" w:fill="FFFFFF"/>
+            <w:tcBorders>
+              <w:top w:val="single" w:sz="4" w:space="0" w:color="E2E8F0"/>
+              <w:left w:val="single" w:sz="4" w:space="0" w:color="E2E8F0"/>
+              <w:bottom w:val="single" w:sz="4" w:space="0" w:color="E2E8F0"/>
+              <w:right w:val="single" w:sz="4" w:space="0" w:color="E2E8F0"/>
+            </w:tcBorders>
+          </w:tcPr>
+          <w:p>
+            <w:pPr>
+              <w:spacing w:before="30" w:after="30"/>
+            </w:pPr>
+            <w:r/>
+            <w:r>
+              <w:rPr>
+                <w:b/>
+                <w:color w:val="1E293B"/>
+              </w:rPr>
+              <w:t>v0.23.0</w:t>
+            </w:r>
+          </w:p>
+        </w:tc>
+        <w:tc>
+          <w:tcPr>
+            <w:tcW w:type="dxa" w:w="3024"/>
+            <w:shd w:val="clear" w:color="auto" w:fill="FFFFFF"/>
+            <w:tcBorders>
+              <w:top w:val="single" w:sz="4" w:space="0" w:color="E2E8F0"/>
+              <w:left w:val="single" w:sz="4" w:space="0" w:color="E2E8F0"/>
+              <w:bottom w:val="single" w:sz="4" w:space="0" w:color="E2E8F0"/>
+              <w:right w:val="single" w:sz="4" w:space="0" w:color="E2E8F0"/>
+            </w:tcBorders>
+          </w:tcPr>
+          <w:p>
+            <w:pPr>
+              <w:spacing w:before="30" w:after="30"/>
+            </w:pPr>
+            <w:r/>
+            <w:r>
+              <w:rPr>
+                <w:color w:val="1E293B"/>
+                <w:sz w:val="18"/>
+              </w:rPr>
+              <w:t>July 2026</w:t>
+            </w:r>
+          </w:p>
+        </w:tc>
+        <w:tc>
+          <w:tcPr>
+            <w:tcW w:type="dxa" w:w="3024"/>
+            <w:shd w:val="clear" w:color="auto" w:fill="FFFFFF"/>
+            <w:tcBorders>
+              <w:top w:val="single" w:sz="4" w:space="0" w:color="E2E8F0"/>
+              <w:left w:val="single" w:sz="4" w:space="0" w:color="E2E8F0"/>
+              <w:bottom w:val="single" w:sz="4" w:space="0" w:color="E2E8F0"/>
+              <w:right w:val="single" w:sz="4" w:space="0" w:color="E2E8F0"/>
+            </w:tcBorders>
+          </w:tcPr>
+          <w:p>
+            <w:pPr>
+              <w:spacing w:before="30" w:after="30"/>
+            </w:pPr>
+            <w:r/>
+            <w:r>
+              <w:rPr>
+                <w:color w:val="1E293B"/>
+                <w:sz w:val="18"/>
+              </w:rPr>
               <w:t xml:space="preserve">Landing page: exam coverage panel, testimonials section, FAQ accordion — (1) Hero redesigned to two-column layout on desktop: text/CTAs left, exam coverage panel right. Panel shows 8 colour-coded exam badges (AMC, Olympiad, ACER, ICAS, ATAR, NAPLAN, Bebras, KSF) with name, full title, year range, and coloured accent bar. Includes legal disclaimer: "SelectEd is an independent preparation platform. Not affiliated with, endorsed by, or connected to the organisations that administer these assessments." (2) Testimonials section added (after Founder card): 3 hardcoded seed cards + fetched approved DB testimonials; "Share your experience →" opens inline form (name, location, star rating, quote); </w:t>
             </w:r>
             <w:r>
@@ -30235,7 +30327,7 @@
           <w:i/>
           <w:color w:val="1E293B"/>
         </w:rPr>
-        <w:t>Document last updated: 1 July 2026 (v0.31). Updated alongside the codebase whenever routes, components, or UX decisions change.</w:t>
+        <w:t>Document last updated: 1 July 2026 (v0.32). Updated alongside the codebase whenever routes, components, or UX decisions change.</w:t>
       </w:r>
     </w:p>
     <w:p>

</xml_diff>

<commit_message>
v0.33: age gate on sign-up + founder dashboard display fixes
- Sign-up: added year of birth select (1940–2008) and 18+ confirmation
  checkbox; both required before email or Google sign-up proceeds
- Parent dashboard: all isPremium-only checks now also check isFounder
  (child limit label, daily limit placeholders, upgrade-for-more button)

Co-Authored-By: Claude Sonnet 4.6 <noreply@anthropic.com>
</commit_message>
<xml_diff>
--- a/DESIGN.docx
+++ b/DESIGN.docx
@@ -30305,6 +30305,94 @@
       </w:tr>
     </w:tbl>
     <w:p/>
+    <w:tbl>
+      <w:tblPr>
+        <w:tblStyle w:val="TableGrid"/>
+        <w:tblW w:type="auto" w:w="0"/>
+        <w:jc w:val="left"/>
+        <w:tblLook w:firstColumn="1" w:firstRow="1" w:lastColumn="0" w:lastRow="0" w:noHBand="0" w:noVBand="1" w:val="04A0"/>
+      </w:tblPr>
+      <w:tblGrid>
+        <w:gridCol w:w="3024"/>
+        <w:gridCol w:w="3024"/>
+        <w:gridCol w:w="3024"/>
+      </w:tblGrid>
+      <w:tr>
+        <w:tc>
+          <w:tcPr>
+            <w:tcW w:type="dxa" w:w="3024"/>
+            <w:shd w:val="clear" w:color="auto" w:fill="000936"/>
+            <w:tcBorders>
+              <w:top w:val="single" w:sz="4" w:space="0" w:color="000936"/>
+              <w:left w:val="single" w:sz="4" w:space="0" w:color="000936"/>
+              <w:bottom w:val="single" w:sz="4" w:space="0" w:color="000936"/>
+              <w:right w:val="single" w:sz="4" w:space="0" w:color="000936"/>
+            </w:tcBorders>
+          </w:tcPr>
+          <w:p>
+            <w:r/>
+            <w:r>
+              <w:rPr>
+                <w:rFonts w:ascii="Calibri" w:hAnsi="Calibri"/>
+                <w:b/>
+                <w:color w:val="FFFFFF"/>
+                <w:sz w:val="19"/>
+              </w:rPr>
+              <w:t>**v0.33.0**</w:t>
+            </w:r>
+          </w:p>
+        </w:tc>
+        <w:tc>
+          <w:tcPr>
+            <w:tcW w:type="dxa" w:w="3024"/>
+            <w:shd w:val="clear" w:color="auto" w:fill="000936"/>
+            <w:tcBorders>
+              <w:top w:val="single" w:sz="4" w:space="0" w:color="000936"/>
+              <w:left w:val="single" w:sz="4" w:space="0" w:color="000936"/>
+              <w:bottom w:val="single" w:sz="4" w:space="0" w:color="000936"/>
+              <w:right w:val="single" w:sz="4" w:space="0" w:color="000936"/>
+            </w:tcBorders>
+          </w:tcPr>
+          <w:p>
+            <w:r/>
+            <w:r>
+              <w:rPr>
+                <w:rFonts w:ascii="Calibri" w:hAnsi="Calibri"/>
+                <w:b/>
+                <w:color w:val="FFFFFF"/>
+                <w:sz w:val="19"/>
+              </w:rPr>
+              <w:t>July 2026</w:t>
+            </w:r>
+          </w:p>
+        </w:tc>
+        <w:tc>
+          <w:tcPr>
+            <w:tcW w:type="dxa" w:w="3024"/>
+            <w:shd w:val="clear" w:color="auto" w:fill="000936"/>
+            <w:tcBorders>
+              <w:top w:val="single" w:sz="4" w:space="0" w:color="000936"/>
+              <w:left w:val="single" w:sz="4" w:space="0" w:color="000936"/>
+              <w:bottom w:val="single" w:sz="4" w:space="0" w:color="000936"/>
+              <w:right w:val="single" w:sz="4" w:space="0" w:color="000936"/>
+            </w:tcBorders>
+          </w:tcPr>
+          <w:p>
+            <w:r/>
+            <w:r>
+              <w:rPr>
+                <w:rFonts w:ascii="Calibri" w:hAnsi="Calibri"/>
+                <w:b/>
+                <w:color w:val="FFFFFF"/>
+                <w:sz w:val="19"/>
+              </w:rPr>
+              <w:t>Age verification on sign-up + founder dashboard fixes — (1) **Sign-up age gate**: year of birth dropdown (1940–2008) and "I confirm I am 18 years of age or older" checkbox added to `app/sign-up/[[...sign-up]]/page.tsx`. Both fields must be completed before the email form's submit button or the Google OAuth button become active. Client-side validation blocks submission if either is missing. Prevents under-18 users from creating accounts directly; parents/guardians create accounts on behalf of their children. (2) **Founder dashboard display fixes**: all `sub.isPremium`-only checks in `app/parent/page.tsx` now also check `sub.isFounder` — affects child profile limit display ("Unlimited questions/day"), daily limit placeholder text, edit-limit placeholder, and the "Upgrade for more" button visibility. Subscription API (`/api/subscription`) already returned `isPremium: true, isFounder: true` for the founder; the dashboard UI was simply not propagating the founder status to these secondary fields</w:t>
+            </w:r>
+          </w:p>
+        </w:tc>
+      </w:tr>
+    </w:tbl>
+    <w:p/>
     <w:p>
       <w:pPr>
         <w:spacing w:before="60" w:after="60"/>
@@ -30327,7 +30415,7 @@
           <w:i/>
           <w:color w:val="1E293B"/>
         </w:rPr>
-        <w:t>Document last updated: 1 July 2026 (v0.32). Updated alongside the codebase whenever routes, components, or UX decisions change.</w:t>
+        <w:t>Document last updated: 2 July 2026 (v0.33). Updated alongside the codebase whenever routes, components, or UX decisions change.</w:t>
       </w:r>
     </w:p>
     <w:p>

</xml_diff>

<commit_message>
feat: Study Mode (4-phase chapters), rich parent analytics, PDF reports (v0.34)
- StudyMode: Chapter picker → Theory → Examples → Practice → Test flow
- 8 exams × 6-8 chapters each in lib/chapters.ts
- 6 new /api/chapter/* routes (theory, examples, practice, feedback, test, progress)
- ChapterProgress Prisma model + Prisma client regenerated
- Parent dashboard: inline analytics per child (bar/line/donut SVG charts)
- jsPDF branded PDF report download per child
- Sign-in/sign-up force redirect to /parent
- exam-results + practice-results APIs updated for child JWT auth
- DESIGN.md + DESIGN.docx updated to v0.34

Co-Authored-By: Claude Sonnet 4.6 <noreply@anthropic.com>
</commit_message>
<xml_diff>
--- a/DESIGN.docx
+++ b/DESIGN.docx
@@ -30338,7 +30338,7 @@
                 <w:color w:val="FFFFFF"/>
                 <w:sz w:val="19"/>
               </w:rPr>
-              <w:t>**v0.33.0**</w:t>
+              <w:t>**v0.34.0**</w:t>
             </w:r>
           </w:p>
         </w:tc>
@@ -30386,13 +30386,101 @@
                 <w:color w:val="FFFFFF"/>
                 <w:sz w:val="19"/>
               </w:rPr>
-              <w:t>Age verification on sign-up + founder dashboard fixes — (1) **Sign-up age gate**: year of birth dropdown (1940–2008) and "I confirm I am 18 years of age or older" checkbox added to `app/sign-up/[[...sign-up]]/page.tsx`. Both fields must be completed before the email form's submit button or the Google OAuth button become active. Client-side validation blocks submission if either is missing. Prevents under-18 users from creating accounts directly; parents/guardians create accounts on behalf of their children. (2) **Founder dashboard display fixes**: all `sub.isPremium`-only checks in `app/parent/page.tsx` now also check `sub.isFounder` — affects child profile limit display ("Unlimited questions/day"), daily limit placeholder text, edit-limit placeholder, and the "Upgrade for more" button visibility. Subscription API (`/api/subscription`) already returned `isPremium: true, isFounder: true` for the founder; the dashboard UI was simply not propagating the founder status to these secondary fields</w:t>
+              <w:t>Study Mode (chapter-based 4-phase learning) + rich parent analytics + PDF reports — (1) **Study Mode**: new `📖 Study` tab added to the sidebar mode picker. Renders `StudyMode` component (`app/components/study/StudyMode.tsx`) with full 4-phase auto-prompted flow: **Theory** (textbook-style markdown + LaTeX + SVG from `/api/chapter/theory`) → **Examples** (3 graduated worked examples with hidden solutions from `/api/chapter/examples`) → **Practice** (5 AI-generated MCQ questions with Socratic feedback from `/api/chapter/practice` + `/api/chapter/feedback`) → **Test** (5-question sealed end-of-chapter test from `/api/chapter/test`; answers hidden until submission). (2) **Chapter taxonomy** (`lib/chapters.ts`): 8 exams × 6-8 chapters each, keyed by exact subject name. (3) **Chapter progress API** (`/api/chapter/progress` GET+POST): stores per-chapter phase progress and test scores in the new `ChapterProgress` Prisma model (`userId`, `childId`, `exam`, `chapter`, `phase`, `completed`, `testScore`, `testTotal`). Supports both Clerk parent auth and child JWT auth via `x-child-token` header. Chapter picker shows completion status and test scores per chapter with progress bar. (4) **Parent analytics** (`app/components/parent/AnalyticsPanel.tsx`): clicking `📊 Analytics` button on any child card in the parent dashboard expands a rich inline analytics panel with: 4 stat cards (questions today, this week, practice accuracy, exams taken); 7-day bar chart (SVG, zero-library); subject donut chart (SVG); exam score history line chart (SVG); practice accuracy progress bars per subject. All charts are hand-drawn SVG — zero bundle cost, SSR-compatible. (5) **PDF report download** (`app/components/parent/downloadChildReport.ts`): dynamically imported `jsPDF` + `jspdf-autotable`; generates branded A4 PDF with SelectEd navy header, stat summary boxes, 7-day usage table, exam results table, and practice-by-subject accuracy table; footer with page numbers and site URL. `Download PDF` button appears in analytics panel header. (6) **New API routes**: `/api/chapter/theory` (POST), `/api/chapter/examples` (POST), `/api/chapter/practice` (POST), `/api/chapter/feedback` (POST), `/api/chapter/test` (POST), `/api/chapter/progress` (GET+POST). (7) **Sign-in redirect**: `NEXT_PUBLIC_CLERK_SIGN_IN_FORCE_REDIRECT_URL=/parent` and `NEXT_PUBLIC_CLERK_SIGN_UP_FORCE_REDIRECT_URL=/parent` set in Vercel production env — parents land directly on the dashboard after auth. Custom sign-up page also `router.push("/parent")` on success</w:t>
             </w:r>
           </w:p>
         </w:tc>
       </w:tr>
     </w:tbl>
     <w:p/>
+    <w:tbl>
+      <w:tblPr>
+        <w:tblStyle w:val="TableGrid"/>
+        <w:tblW w:type="auto" w:w="0"/>
+        <w:jc w:val="left"/>
+        <w:tblLook w:firstColumn="1" w:firstRow="1" w:lastColumn="0" w:lastRow="0" w:noHBand="0" w:noVBand="1" w:val="04A0"/>
+      </w:tblPr>
+      <w:tblGrid>
+        <w:gridCol w:w="3024"/>
+        <w:gridCol w:w="3024"/>
+        <w:gridCol w:w="3024"/>
+      </w:tblGrid>
+      <w:tr>
+        <w:tc>
+          <w:tcPr>
+            <w:tcW w:type="dxa" w:w="3024"/>
+            <w:shd w:val="clear" w:color="auto" w:fill="000936"/>
+            <w:tcBorders>
+              <w:top w:val="single" w:sz="4" w:space="0" w:color="000936"/>
+              <w:left w:val="single" w:sz="4" w:space="0" w:color="000936"/>
+              <w:bottom w:val="single" w:sz="4" w:space="0" w:color="000936"/>
+              <w:right w:val="single" w:sz="4" w:space="0" w:color="000936"/>
+            </w:tcBorders>
+          </w:tcPr>
+          <w:p>
+            <w:r/>
+            <w:r>
+              <w:rPr>
+                <w:rFonts w:ascii="Calibri" w:hAnsi="Calibri"/>
+                <w:b/>
+                <w:color w:val="FFFFFF"/>
+                <w:sz w:val="19"/>
+              </w:rPr>
+              <w:t>**v0.33.0**</w:t>
+            </w:r>
+          </w:p>
+        </w:tc>
+        <w:tc>
+          <w:tcPr>
+            <w:tcW w:type="dxa" w:w="3024"/>
+            <w:shd w:val="clear" w:color="auto" w:fill="000936"/>
+            <w:tcBorders>
+              <w:top w:val="single" w:sz="4" w:space="0" w:color="000936"/>
+              <w:left w:val="single" w:sz="4" w:space="0" w:color="000936"/>
+              <w:bottom w:val="single" w:sz="4" w:space="0" w:color="000936"/>
+              <w:right w:val="single" w:sz="4" w:space="0" w:color="000936"/>
+            </w:tcBorders>
+          </w:tcPr>
+          <w:p>
+            <w:r/>
+            <w:r>
+              <w:rPr>
+                <w:rFonts w:ascii="Calibri" w:hAnsi="Calibri"/>
+                <w:b/>
+                <w:color w:val="FFFFFF"/>
+                <w:sz w:val="19"/>
+              </w:rPr>
+              <w:t>July 2026</w:t>
+            </w:r>
+          </w:p>
+        </w:tc>
+        <w:tc>
+          <w:tcPr>
+            <w:tcW w:type="dxa" w:w="3024"/>
+            <w:shd w:val="clear" w:color="auto" w:fill="000936"/>
+            <w:tcBorders>
+              <w:top w:val="single" w:sz="4" w:space="0" w:color="000936"/>
+              <w:left w:val="single" w:sz="4" w:space="0" w:color="000936"/>
+              <w:bottom w:val="single" w:sz="4" w:space="0" w:color="000936"/>
+              <w:right w:val="single" w:sz="4" w:space="0" w:color="000936"/>
+            </w:tcBorders>
+          </w:tcPr>
+          <w:p>
+            <w:r/>
+            <w:r>
+              <w:rPr>
+                <w:rFonts w:ascii="Calibri" w:hAnsi="Calibri"/>
+                <w:b/>
+                <w:color w:val="FFFFFF"/>
+                <w:sz w:val="19"/>
+              </w:rPr>
+              <w:t>Age verification on sign-up + founder dashboard fixes — (1) **Sign-up age gate**: year of birth dropdown (1940–2008) and "I confirm I am 18 years of age or older" checkbox added to `app/sign-up/[[...sign-up]]/page.tsx`. Both fields must be completed before the email form's submit button or the Google OAuth button become active. Client-side validation blocks submission if either is missing. Prevents under-18 users from creating accounts directly; parents/guardians create accounts on behalf of their children. (2) **Founder dashboard display fixes**: all `sub.isPremium`-only checks in `app/parent/page.tsx` now also check `sub.isFounder` — affects child profile limit display ("Unlimited questions/day"), daily limit placeholder text, edit-limit placeholder, and the "Upgrade for more" button visibility. Subscription API (`/api/subscription`) already returned `isPremium: true, isFounder: true` for the founder; the dashboard UI was simply not propagating the founder status to these secondary fields</w:t>
+            </w:r>
+          </w:p>
+        </w:tc>
+      </w:tr>
+    </w:tbl>
+    <w:p/>
     <w:p>
       <w:pPr>
         <w:spacing w:before="60" w:after="60"/>
@@ -30415,7 +30503,7 @@
           <w:i/>
           <w:color w:val="1E293B"/>
         </w:rPr>
-        <w:t>Document last updated: 2 July 2026 (v0.33). Updated alongside the codebase whenever routes, components, or UX decisions change.</w:t>
+        <w:t>Document last updated: 2 July 2026 (v0.34). Updated alongside the codebase whenever routes, components, or UX decisions change.</w:t>
       </w:r>
     </w:p>
     <w:p>

</xml_diff>

<commit_message>
feat: exam duration scales Qs, difficulty picker, 80% chapter gate, points+levels (v0.35)
- Exam: 30min=10Qs, 45min=15Qs, 60min=20Qs; questionCount+difficulty sent to API
- Difficulty picker: Warm-Up / Real Exam / Challenge with friendly descriptions
- Study Mode is now the default tab on load
- 80% gate: chapters sequential, must pass at >=80% to unlock next chapter
- Points system: (chapterIndex+1)*100 base + accuracy bonus per chapter
- 6 levels: Starter/Scholar/Explorer/Expert/Champion/Legend shown in ChapterPicker
- ChapterResults shows points earned and clear retry message when below 80%
- lib/studyPoints.ts: shared getLevel(), chapterPoints(), totalPoints() utilities
- DESIGN.md + DESIGN.docx updated to v0.35

Co-Authored-By: Claude Sonnet 4.6 <noreply@anthropic.com>
</commit_message>
<xml_diff>
--- a/DESIGN.docx
+++ b/DESIGN.docx
@@ -30338,7 +30338,7 @@
                 <w:color w:val="FFFFFF"/>
                 <w:sz w:val="19"/>
               </w:rPr>
-              <w:t>**v0.34.0**</w:t>
+              <w:t>**v0.35.0**</w:t>
             </w:r>
           </w:p>
         </w:tc>
@@ -30386,7 +30386,7 @@
                 <w:color w:val="FFFFFF"/>
                 <w:sz w:val="19"/>
               </w:rPr>
-              <w:t>Study Mode (chapter-based 4-phase learning) + rich parent analytics + PDF reports — (1) **Study Mode**: new `📖 Study` tab added to the sidebar mode picker. Renders `StudyMode` component (`app/components/study/StudyMode.tsx`) with full 4-phase auto-prompted flow: **Theory** (textbook-style markdown + LaTeX + SVG from `/api/chapter/theory`) → **Examples** (3 graduated worked examples with hidden solutions from `/api/chapter/examples`) → **Practice** (5 AI-generated MCQ questions with Socratic feedback from `/api/chapter/practice` + `/api/chapter/feedback`) → **Test** (5-question sealed end-of-chapter test from `/api/chapter/test`; answers hidden until submission). (2) **Chapter taxonomy** (`lib/chapters.ts`): 8 exams × 6-8 chapters each, keyed by exact subject name. (3) **Chapter progress API** (`/api/chapter/progress` GET+POST): stores per-chapter phase progress and test scores in the new `ChapterProgress` Prisma model (`userId`, `childId`, `exam`, `chapter`, `phase`, `completed`, `testScore`, `testTotal`). Supports both Clerk parent auth and child JWT auth via `x-child-token` header. Chapter picker shows completion status and test scores per chapter with progress bar. (4) **Parent analytics** (`app/components/parent/AnalyticsPanel.tsx`): clicking `📊 Analytics` button on any child card in the parent dashboard expands a rich inline analytics panel with: 4 stat cards (questions today, this week, practice accuracy, exams taken); 7-day bar chart (SVG, zero-library); subject donut chart (SVG); exam score history line chart (SVG); practice accuracy progress bars per subject. All charts are hand-drawn SVG — zero bundle cost, SSR-compatible. (5) **PDF report download** (`app/components/parent/downloadChildReport.ts`): dynamically imported `jsPDF` + `jspdf-autotable`; generates branded A4 PDF with SelectEd navy header, stat summary boxes, 7-day usage table, exam results table, and practice-by-subject accuracy table; footer with page numbers and site URL. `Download PDF` button appears in analytics panel header. (6) **New API routes**: `/api/chapter/theory` (POST), `/api/chapter/examples` (POST), `/api/chapter/practice` (POST), `/api/chapter/feedback` (POST), `/api/chapter/test` (POST), `/api/chapter/progress` (GET+POST). (7) **Sign-in redirect**: `NEXT_PUBLIC_CLERK_SIGN_IN_FORCE_REDIRECT_URL=/parent` and `NEXT_PUBLIC_CLERK_SIGN_UP_FORCE_REDIRECT_URL=/parent` set in Vercel production env — parents land directly on the dashboard after auth. Custom sign-up page also `router.push("/parent")` on success</w:t>
+              <w:t>Exam improvements, Study Mode 80% gate, points + levels — (1) **Exam question count scales with duration**: 30 min → 10 Qs, 45 min → 15 Qs, 60 min → 20 Qs; `questionCount` now passed to `/api/exam/generate` and used in the prompt. (2) **Friendly difficulty picker on exam setup**: three options — Warm-Up 🌱 (accessible, confidence-building), Real Exam 🎯 (matches actual exam style), Challenge 🔥 (harder than the exam). `difficulty` passed to generate API and controls the prompt instruction. (3) **Study Mode default**: opening the study area now defaults to `📖 Study` tab instead of Chat. (4) **80% gate on chapter progression**: chapters are sequential — a chapter only unlocks when the previous chapter's test was completed at ≥80%. ChapterPicker shows locked chapters with a 🔒 badge. ChapterResults shows a clear retry prompt when below 80%, and only marks `completed: true` in the DB when the gate is passed. (5) **Points and level system**: completing each chapter earns `(chapterIndex+1) × 100` base points + accuracy bonus (+25 for ≥90%, +50 for 100%). Six levels shown in ChapterPicker header: Starter ⭐ (0), Scholar 📚 (200), Explorer 🧭 (500), Expert 🎯 (1000), Champion 🏆 (2000), Legend 👑 (4000). Level progress bar updates in real time from ChapterProgress data. Points and badge shown on ChapterResults page. `lib/studyPoints.ts` added as shared utility</w:t>
             </w:r>
           </w:p>
         </w:tc>
@@ -30426,7 +30426,7 @@
                 <w:color w:val="FFFFFF"/>
                 <w:sz w:val="19"/>
               </w:rPr>
-              <w:t>**v0.33.0**</w:t>
+              <w:t>**v0.34.0**</w:t>
             </w:r>
           </w:p>
         </w:tc>
@@ -30474,13 +30474,101 @@
                 <w:color w:val="FFFFFF"/>
                 <w:sz w:val="19"/>
               </w:rPr>
-              <w:t>Age verification on sign-up + founder dashboard fixes — (1) **Sign-up age gate**: year of birth dropdown (1940–2008) and "I confirm I am 18 years of age or older" checkbox added to `app/sign-up/[[...sign-up]]/page.tsx`. Both fields must be completed before the email form's submit button or the Google OAuth button become active. Client-side validation blocks submission if either is missing. Prevents under-18 users from creating accounts directly; parents/guardians create accounts on behalf of their children. (2) **Founder dashboard display fixes**: all `sub.isPremium`-only checks in `app/parent/page.tsx` now also check `sub.isFounder` — affects child profile limit display ("Unlimited questions/day"), daily limit placeholder text, edit-limit placeholder, and the "Upgrade for more" button visibility. Subscription API (`/api/subscription`) already returned `isPremium: true, isFounder: true` for the founder; the dashboard UI was simply not propagating the founder status to these secondary fields</w:t>
+              <w:t>Study Mode (chapter-based 4-phase learning) + rich parent analytics + PDF reports — (1) **Study Mode**: new `📖 Study` tab added to the sidebar mode picker. Renders `StudyMode` component (`app/components/study/StudyMode.tsx`) with full 4-phase auto-prompted flow: **Theory** (textbook-style markdown + LaTeX + SVG from `/api/chapter/theory`) → **Examples** (3 graduated worked examples with hidden solutions from `/api/chapter/examples`) → **Practice** (5 AI-generated MCQ questions with Socratic feedback from `/api/chapter/practice` + `/api/chapter/feedback`) → **Test** (5-question sealed end-of-chapter test from `/api/chapter/test`; answers hidden until submission). (2) **Chapter taxonomy** (`lib/chapters.ts`): 8 exams × 6-8 chapters each, keyed by exact subject name. (3) **Chapter progress API** (`/api/chapter/progress` GET+POST): stores per-chapter phase progress and test scores in the new `ChapterProgress` Prisma model (`userId`, `childId`, `exam`, `chapter`, `phase`, `completed`, `testScore`, `testTotal`). Supports both Clerk parent auth and child JWT auth via `x-child-token` header. Chapter picker shows completion status and test scores per chapter with progress bar. (4) **Parent analytics** (`app/components/parent/AnalyticsPanel.tsx`): clicking `📊 Analytics` button on any child card in the parent dashboard expands a rich inline analytics panel with: 4 stat cards (questions today, this week, practice accuracy, exams taken); 7-day bar chart (SVG, zero-library); subject donut chart (SVG); exam score history line chart (SVG); practice accuracy progress bars per subject. All charts are hand-drawn SVG — zero bundle cost, SSR-compatible. (5) **PDF report download** (`app/components/parent/downloadChildReport.ts`): dynamically imported `jsPDF` + `jspdf-autotable`; generates branded A4 PDF with SelectEd navy header, stat summary boxes, 7-day usage table, exam results table, and practice-by-subject accuracy table; footer with page numbers and site URL. `Download PDF` button appears in analytics panel header. (6) **New API routes**: `/api/chapter/theory` (POST), `/api/chapter/examples` (POST), `/api/chapter/practice` (POST), `/api/chapter/feedback` (POST), `/api/chapter/test` (POST), `/api/chapter/progress` (GET+POST). (7) **Sign-in redirect**: `NEXT_PUBLIC_CLERK_SIGN_IN_FORCE_REDIRECT_URL=/parent` and `NEXT_PUBLIC_CLERK_SIGN_UP_FORCE_REDIRECT_URL=/parent` set in Vercel production env — parents land directly on the dashboard after auth. Custom sign-up page also `router.push("/parent")` on success</w:t>
             </w:r>
           </w:p>
         </w:tc>
       </w:tr>
     </w:tbl>
     <w:p/>
+    <w:tbl>
+      <w:tblPr>
+        <w:tblStyle w:val="TableGrid"/>
+        <w:tblW w:type="auto" w:w="0"/>
+        <w:jc w:val="left"/>
+        <w:tblLook w:firstColumn="1" w:firstRow="1" w:lastColumn="0" w:lastRow="0" w:noHBand="0" w:noVBand="1" w:val="04A0"/>
+      </w:tblPr>
+      <w:tblGrid>
+        <w:gridCol w:w="3024"/>
+        <w:gridCol w:w="3024"/>
+        <w:gridCol w:w="3024"/>
+      </w:tblGrid>
+      <w:tr>
+        <w:tc>
+          <w:tcPr>
+            <w:tcW w:type="dxa" w:w="3024"/>
+            <w:shd w:val="clear" w:color="auto" w:fill="000936"/>
+            <w:tcBorders>
+              <w:top w:val="single" w:sz="4" w:space="0" w:color="000936"/>
+              <w:left w:val="single" w:sz="4" w:space="0" w:color="000936"/>
+              <w:bottom w:val="single" w:sz="4" w:space="0" w:color="000936"/>
+              <w:right w:val="single" w:sz="4" w:space="0" w:color="000936"/>
+            </w:tcBorders>
+          </w:tcPr>
+          <w:p>
+            <w:r/>
+            <w:r>
+              <w:rPr>
+                <w:rFonts w:ascii="Calibri" w:hAnsi="Calibri"/>
+                <w:b/>
+                <w:color w:val="FFFFFF"/>
+                <w:sz w:val="19"/>
+              </w:rPr>
+              <w:t>**v0.33.0**</w:t>
+            </w:r>
+          </w:p>
+        </w:tc>
+        <w:tc>
+          <w:tcPr>
+            <w:tcW w:type="dxa" w:w="3024"/>
+            <w:shd w:val="clear" w:color="auto" w:fill="000936"/>
+            <w:tcBorders>
+              <w:top w:val="single" w:sz="4" w:space="0" w:color="000936"/>
+              <w:left w:val="single" w:sz="4" w:space="0" w:color="000936"/>
+              <w:bottom w:val="single" w:sz="4" w:space="0" w:color="000936"/>
+              <w:right w:val="single" w:sz="4" w:space="0" w:color="000936"/>
+            </w:tcBorders>
+          </w:tcPr>
+          <w:p>
+            <w:r/>
+            <w:r>
+              <w:rPr>
+                <w:rFonts w:ascii="Calibri" w:hAnsi="Calibri"/>
+                <w:b/>
+                <w:color w:val="FFFFFF"/>
+                <w:sz w:val="19"/>
+              </w:rPr>
+              <w:t>July 2026</w:t>
+            </w:r>
+          </w:p>
+        </w:tc>
+        <w:tc>
+          <w:tcPr>
+            <w:tcW w:type="dxa" w:w="3024"/>
+            <w:shd w:val="clear" w:color="auto" w:fill="000936"/>
+            <w:tcBorders>
+              <w:top w:val="single" w:sz="4" w:space="0" w:color="000936"/>
+              <w:left w:val="single" w:sz="4" w:space="0" w:color="000936"/>
+              <w:bottom w:val="single" w:sz="4" w:space="0" w:color="000936"/>
+              <w:right w:val="single" w:sz="4" w:space="0" w:color="000936"/>
+            </w:tcBorders>
+          </w:tcPr>
+          <w:p>
+            <w:r/>
+            <w:r>
+              <w:rPr>
+                <w:rFonts w:ascii="Calibri" w:hAnsi="Calibri"/>
+                <w:b/>
+                <w:color w:val="FFFFFF"/>
+                <w:sz w:val="19"/>
+              </w:rPr>
+              <w:t>Age verification on sign-up + founder dashboard fixes — (1) **Sign-up age gate**: year of birth dropdown (1940–2008) and "I confirm I am 18 years of age or older" checkbox added to `app/sign-up/[[...sign-up]]/page.tsx`. Both fields must be completed before the email form's submit button or the Google OAuth button become active. Client-side validation blocks submission if either is missing. Prevents under-18 users from creating accounts directly; parents/guardians create accounts on behalf of their children. (2) **Founder dashboard display fixes**: all `sub.isPremium`-only checks in `app/parent/page.tsx` now also check `sub.isFounder` — affects child profile limit display ("Unlimited questions/day"), daily limit placeholder text, edit-limit placeholder, and the "Upgrade for more" button visibility. Subscription API (`/api/subscription`) already returned `isPremium: true, isFounder: true` for the founder; the dashboard UI was simply not propagating the founder status to these secondary fields</w:t>
+            </w:r>
+          </w:p>
+        </w:tc>
+      </w:tr>
+    </w:tbl>
+    <w:p/>
     <w:p>
       <w:pPr>
         <w:spacing w:before="60" w:after="60"/>
@@ -30503,7 +30591,7 @@
           <w:i/>
           <w:color w:val="1E293B"/>
         </w:rPr>
-        <w:t>Document last updated: 2 July 2026 (v0.34). Updated alongside the codebase whenever routes, components, or UX decisions change.</w:t>
+        <w:t>Document last updated: 2 July 2026 (v0.35). Updated alongside the codebase whenever routes, components, or UX decisions change.</w:t>
       </w:r>
     </w:p>
     <w:p>

</xml_diff>

<commit_message>
docs: update DESIGN.md + DESIGN.docx for v0.50 landing page redesign
Co-Authored-By: Claude Sonnet 4.6 <noreply@anthropic.com>
</commit_message>
<xml_diff>
--- a/DESIGN.docx
+++ b/DESIGN.docx
@@ -30569,6 +30569,1255 @@
       </w:tr>
     </w:tbl>
     <w:p/>
+    <w:tbl>
+      <w:tblPr>
+        <w:tblStyle w:val="TableGrid"/>
+        <w:tblW w:type="auto" w:w="0"/>
+        <w:jc w:val="left"/>
+        <w:tblLook w:firstColumn="1" w:firstRow="1" w:lastColumn="0" w:lastRow="0" w:noHBand="0" w:noVBand="1" w:val="04A0"/>
+      </w:tblPr>
+      <w:tblGrid>
+        <w:gridCol w:w="3024"/>
+        <w:gridCol w:w="3024"/>
+        <w:gridCol w:w="3024"/>
+      </w:tblGrid>
+      <w:tr>
+        <w:tc>
+          <w:tcPr>
+            <w:tcW w:type="dxa" w:w="3024"/>
+            <w:shd w:val="clear" w:color="auto" w:fill="000936"/>
+            <w:tcBorders>
+              <w:top w:val="single" w:sz="4" w:space="0" w:color="000936"/>
+              <w:left w:val="single" w:sz="4" w:space="0" w:color="000936"/>
+              <w:bottom w:val="single" w:sz="4" w:space="0" w:color="000936"/>
+              <w:right w:val="single" w:sz="4" w:space="0" w:color="000936"/>
+            </w:tcBorders>
+          </w:tcPr>
+          <w:p>
+            <w:r/>
+            <w:r>
+              <w:rPr>
+                <w:rFonts w:ascii="Calibri" w:hAnsi="Calibri"/>
+                <w:b/>
+                <w:color w:val="FFFFFF"/>
+                <w:sz w:val="19"/>
+              </w:rPr>
+              <w:t>**v0.41.0**</w:t>
+            </w:r>
+          </w:p>
+        </w:tc>
+        <w:tc>
+          <w:tcPr>
+            <w:tcW w:type="dxa" w:w="3024"/>
+            <w:shd w:val="clear" w:color="auto" w:fill="000936"/>
+            <w:tcBorders>
+              <w:top w:val="single" w:sz="4" w:space="0" w:color="000936"/>
+              <w:left w:val="single" w:sz="4" w:space="0" w:color="000936"/>
+              <w:bottom w:val="single" w:sz="4" w:space="0" w:color="000936"/>
+              <w:right w:val="single" w:sz="4" w:space="0" w:color="000936"/>
+            </w:tcBorders>
+          </w:tcPr>
+          <w:p>
+            <w:r/>
+            <w:r>
+              <w:rPr>
+                <w:rFonts w:ascii="Calibri" w:hAnsi="Calibri"/>
+                <w:b/>
+                <w:color w:val="FFFFFF"/>
+                <w:sz w:val="19"/>
+              </w:rPr>
+              <w:t>July 2026</w:t>
+            </w:r>
+          </w:p>
+        </w:tc>
+        <w:tc>
+          <w:tcPr>
+            <w:tcW w:type="dxa" w:w="3024"/>
+            <w:shd w:val="clear" w:color="auto" w:fill="000936"/>
+            <w:tcBorders>
+              <w:top w:val="single" w:sz="4" w:space="0" w:color="000936"/>
+              <w:left w:val="single" w:sz="4" w:space="0" w:color="000936"/>
+              <w:bottom w:val="single" w:sz="4" w:space="0" w:color="000936"/>
+              <w:right w:val="single" w:sz="4" w:space="0" w:color="000936"/>
+            </w:tcBorders>
+          </w:tcPr>
+          <w:p>
+            <w:r/>
+            <w:r>
+              <w:rPr>
+                <w:rFonts w:ascii="Calibri" w:hAnsi="Calibri"/>
+                <w:b/>
+                <w:color w:val="FFFFFF"/>
+                <w:sz w:val="19"/>
+              </w:rPr>
+              <w:t>OpenAI TTS nova voice — replaced Web Speech API with OpenAI `tts-1` + `nova` voice at 0.88× speed. TTS queue pattern (`ttsQueueRef`, `drainTtsQueue`, `speakOneChunk`) with `AbortController` for cancellation. Web Speech fallback. `/api/tts` route with 60 req/min rate limiting. `stripForSpeech()` cleans markdown, LaTeX, box-drawing chars, ellipsis, em-dashes before synthesis</w:t>
+            </w:r>
+          </w:p>
+        </w:tc>
+      </w:tr>
+      <w:tr>
+        <w:tc>
+          <w:tcPr>
+            <w:tcW w:type="dxa" w:w="3024"/>
+            <w:shd w:val="clear" w:color="auto" w:fill="F8FAFC"/>
+            <w:tcBorders>
+              <w:top w:val="single" w:sz="4" w:space="0" w:color="E2E8F0"/>
+              <w:left w:val="single" w:sz="4" w:space="0" w:color="E2E8F0"/>
+              <w:bottom w:val="single" w:sz="4" w:space="0" w:color="E2E8F0"/>
+              <w:right w:val="single" w:sz="4" w:space="0" w:color="E2E8F0"/>
+            </w:tcBorders>
+          </w:tcPr>
+          <w:p>
+            <w:pPr>
+              <w:spacing w:before="30" w:after="30"/>
+            </w:pPr>
+            <w:r/>
+            <w:r>
+              <w:rPr>
+                <w:b/>
+                <w:color w:val="1E293B"/>
+              </w:rPr>
+              <w:t>v0.42.0</w:t>
+            </w:r>
+          </w:p>
+        </w:tc>
+        <w:tc>
+          <w:tcPr>
+            <w:tcW w:type="dxa" w:w="3024"/>
+            <w:shd w:val="clear" w:color="auto" w:fill="F8FAFC"/>
+            <w:tcBorders>
+              <w:top w:val="single" w:sz="4" w:space="0" w:color="E2E8F0"/>
+              <w:left w:val="single" w:sz="4" w:space="0" w:color="E2E8F0"/>
+              <w:bottom w:val="single" w:sz="4" w:space="0" w:color="E2E8F0"/>
+              <w:right w:val="single" w:sz="4" w:space="0" w:color="E2E8F0"/>
+            </w:tcBorders>
+          </w:tcPr>
+          <w:p>
+            <w:pPr>
+              <w:spacing w:before="30" w:after="30"/>
+            </w:pPr>
+            <w:r/>
+            <w:r>
+              <w:rPr>
+                <w:color w:val="1E293B"/>
+                <w:sz w:val="18"/>
+              </w:rPr>
+              <w:t>July 2026</w:t>
+            </w:r>
+          </w:p>
+        </w:tc>
+        <w:tc>
+          <w:tcPr>
+            <w:tcW w:type="dxa" w:w="3024"/>
+            <w:shd w:val="clear" w:color="auto" w:fill="F8FAFC"/>
+            <w:tcBorders>
+              <w:top w:val="single" w:sz="4" w:space="0" w:color="E2E8F0"/>
+              <w:left w:val="single" w:sz="4" w:space="0" w:color="E2E8F0"/>
+              <w:bottom w:val="single" w:sz="4" w:space="0" w:color="E2E8F0"/>
+              <w:right w:val="single" w:sz="4" w:space="0" w:color="E2E8F0"/>
+            </w:tcBorders>
+          </w:tcPr>
+          <w:p>
+            <w:pPr>
+              <w:spacing w:before="30" w:after="30"/>
+            </w:pPr>
+            <w:r/>
+            <w:r>
+              <w:rPr>
+                <w:color w:val="1E293B"/>
+                <w:sz w:val="18"/>
+              </w:rPr>
+              <w:t xml:space="preserve">Student dashboard, name+PIN login, brain break mode — (1) </w:t>
+            </w:r>
+            <w:r>
+              <w:rPr>
+                <w:rFonts w:ascii="Courier New" w:hAnsi="Courier New"/>
+                <w:color w:val="0F172A"/>
+                <w:sz w:val="18"/>
+              </w:rPr>
+              <w:t>ChildLoginScreen</w:t>
+            </w:r>
+            <w:r>
+              <w:rPr>
+                <w:color w:val="1E293B"/>
+                <w:sz w:val="18"/>
+              </w:rPr>
+              <w:t xml:space="preserve"> rewritten: name text input + 4-digit PIN boxes, no profile picker. </w:t>
+            </w:r>
+            <w:r>
+              <w:rPr>
+                <w:rFonts w:ascii="Courier New" w:hAnsi="Courier New"/>
+                <w:color w:val="0F172A"/>
+                <w:sz w:val="18"/>
+              </w:rPr>
+              <w:t>/api/child-auth</w:t>
+            </w:r>
+            <w:r>
+              <w:rPr>
+                <w:color w:val="1E293B"/>
+                <w:sz w:val="18"/>
+              </w:rPr>
+              <w:t xml:space="preserve"> POST accepts </w:t>
+            </w:r>
+            <w:r>
+              <w:rPr>
+                <w:rFonts w:ascii="Courier New" w:hAnsi="Courier New"/>
+                <w:color w:val="0F172A"/>
+                <w:sz w:val="18"/>
+              </w:rPr>
+              <w:t>{name, pin, parentId}</w:t>
+            </w:r>
+            <w:r>
+              <w:rPr>
+                <w:color w:val="1E293B"/>
+                <w:sz w:val="18"/>
+              </w:rPr>
+              <w:t xml:space="preserve"> with case-insensitive name search + </w:t>
+            </w:r>
+            <w:r>
+              <w:rPr>
+                <w:rFonts w:ascii="Courier New" w:hAnsi="Courier New"/>
+                <w:color w:val="0F172A"/>
+                <w:sz w:val="18"/>
+              </w:rPr>
+              <w:t>pinVerified</w:t>
+            </w:r>
+            <w:r>
+              <w:rPr>
+                <w:color w:val="1E293B"/>
+                <w:sz w:val="18"/>
+              </w:rPr>
+              <w:t xml:space="preserve"> flag. (2) Student dashboard (</w:t>
+            </w:r>
+            <w:r>
+              <w:rPr>
+                <w:rFonts w:ascii="Courier New" w:hAnsi="Courier New"/>
+                <w:color w:val="0F172A"/>
+                <w:sz w:val="18"/>
+              </w:rPr>
+              <w:t>StudentDashboard.tsx</w:t>
+            </w:r>
+            <w:r>
+              <w:rPr>
+                <w:color w:val="1E293B"/>
+                <w:sz w:val="18"/>
+              </w:rPr>
+              <w:t xml:space="preserve"> + </w:t>
+            </w:r>
+            <w:r>
+              <w:rPr>
+                <w:rFonts w:ascii="Courier New" w:hAnsi="Courier New"/>
+                <w:color w:val="0F172A"/>
+                <w:sz w:val="18"/>
+              </w:rPr>
+              <w:t>/api/student/dashboard</w:t>
+            </w:r>
+            <w:r>
+              <w:rPr>
+                <w:color w:val="1E293B"/>
+                <w:sz w:val="18"/>
+              </w:rPr>
+              <w:t xml:space="preserve">): shows chapters done, test score, accuracy %, per-exam progress bars, recent activity, "Start Studying" button. (3) </w:t>
+            </w:r>
+            <w:r>
+              <w:rPr>
+                <w:rFonts w:ascii="Courier New" w:hAnsi="Courier New"/>
+                <w:color w:val="0F172A"/>
+                <w:sz w:val="18"/>
+              </w:rPr>
+              <w:t>BreakZone</w:t>
+            </w:r>
+            <w:r>
+              <w:rPr>
+                <w:color w:val="1E293B"/>
+                <w:sz w:val="18"/>
+              </w:rPr>
+              <w:t xml:space="preserve"> gets </w:t>
+            </w:r>
+            <w:r>
+              <w:rPr>
+                <w:rFonts w:ascii="Courier New" w:hAnsi="Courier New"/>
+                <w:color w:val="0F172A"/>
+                <w:sz w:val="18"/>
+              </w:rPr>
+              <w:t>forceOpen</w:t>
+            </w:r>
+            <w:r>
+              <w:rPr>
+                <w:color w:val="1E293B"/>
+                <w:sz w:val="18"/>
+              </w:rPr>
+              <w:t xml:space="preserve"> prop; "Break" mode tab added to sidebar. (4) Mobile header overlap fix: Sign in hidden on mobile (</w:t>
+            </w:r>
+            <w:r>
+              <w:rPr>
+                <w:rFonts w:ascii="Courier New" w:hAnsi="Courier New"/>
+                <w:color w:val="0F172A"/>
+                <w:sz w:val="18"/>
+              </w:rPr>
+              <w:t>hidden sm:block</w:t>
+            </w:r>
+            <w:r>
+              <w:rPr>
+                <w:color w:val="1E293B"/>
+                <w:sz w:val="18"/>
+              </w:rPr>
+              <w:t xml:space="preserve">). (5) </w:t>
+            </w:r>
+            <w:r>
+              <w:rPr>
+                <w:rFonts w:ascii="Courier New" w:hAnsi="Courier New"/>
+                <w:color w:val="0F172A"/>
+                <w:sz w:val="18"/>
+              </w:rPr>
+              <w:t>prevSignedInRef</w:t>
+            </w:r>
+            <w:r>
+              <w:rPr>
+                <w:color w:val="1E293B"/>
+                <w:sz w:val="18"/>
+              </w:rPr>
+              <w:t xml:space="preserve"> pattern to detect sign-out transition</w:t>
+            </w:r>
+          </w:p>
+        </w:tc>
+      </w:tr>
+      <w:tr>
+        <w:tc>
+          <w:tcPr>
+            <w:tcW w:type="dxa" w:w="3024"/>
+            <w:shd w:val="clear" w:color="auto" w:fill="FFFFFF"/>
+            <w:tcBorders>
+              <w:top w:val="single" w:sz="4" w:space="0" w:color="E2E8F0"/>
+              <w:left w:val="single" w:sz="4" w:space="0" w:color="E2E8F0"/>
+              <w:bottom w:val="single" w:sz="4" w:space="0" w:color="E2E8F0"/>
+              <w:right w:val="single" w:sz="4" w:space="0" w:color="E2E8F0"/>
+            </w:tcBorders>
+          </w:tcPr>
+          <w:p>
+            <w:pPr>
+              <w:spacing w:before="30" w:after="30"/>
+            </w:pPr>
+            <w:r/>
+            <w:r>
+              <w:rPr>
+                <w:b/>
+                <w:color w:val="1E293B"/>
+              </w:rPr>
+              <w:t>v0.43.0</w:t>
+            </w:r>
+          </w:p>
+        </w:tc>
+        <w:tc>
+          <w:tcPr>
+            <w:tcW w:type="dxa" w:w="3024"/>
+            <w:shd w:val="clear" w:color="auto" w:fill="FFFFFF"/>
+            <w:tcBorders>
+              <w:top w:val="single" w:sz="4" w:space="0" w:color="E2E8F0"/>
+              <w:left w:val="single" w:sz="4" w:space="0" w:color="E2E8F0"/>
+              <w:bottom w:val="single" w:sz="4" w:space="0" w:color="E2E8F0"/>
+              <w:right w:val="single" w:sz="4" w:space="0" w:color="E2E8F0"/>
+            </w:tcBorders>
+          </w:tcPr>
+          <w:p>
+            <w:pPr>
+              <w:spacing w:before="30" w:after="30"/>
+            </w:pPr>
+            <w:r/>
+            <w:r>
+              <w:rPr>
+                <w:color w:val="1E293B"/>
+                <w:sz w:val="18"/>
+              </w:rPr>
+              <w:t>July 2026</w:t>
+            </w:r>
+          </w:p>
+        </w:tc>
+        <w:tc>
+          <w:tcPr>
+            <w:tcW w:type="dxa" w:w="3024"/>
+            <w:shd w:val="clear" w:color="auto" w:fill="FFFFFF"/>
+            <w:tcBorders>
+              <w:top w:val="single" w:sz="4" w:space="0" w:color="E2E8F0"/>
+              <w:left w:val="single" w:sz="4" w:space="0" w:color="E2E8F0"/>
+              <w:bottom w:val="single" w:sz="4" w:space="0" w:color="E2E8F0"/>
+              <w:right w:val="single" w:sz="4" w:space="0" w:color="E2E8F0"/>
+            </w:tcBorders>
+          </w:tcPr>
+          <w:p>
+            <w:pPr>
+              <w:spacing w:before="30" w:after="30"/>
+            </w:pPr>
+            <w:r/>
+            <w:r>
+              <w:rPr>
+                <w:color w:val="1E293B"/>
+                <w:sz w:val="18"/>
+              </w:rPr>
+              <w:t xml:space="preserve">Practice label fix, TTS symbol strip, mic native popup — (1) Practice placeholder uses exam acronym extracted from </w:t>
+            </w:r>
+            <w:r>
+              <w:rPr>
+                <w:rFonts w:ascii="Courier New" w:hAnsi="Courier New"/>
+                <w:color w:val="0F172A"/>
+                <w:sz w:val="18"/>
+              </w:rPr>
+              <w:t>subject.match(/\(([^)]+)\)/)?.[1]</w:t>
+            </w:r>
+            <w:r>
+              <w:rPr>
+                <w:color w:val="1E293B"/>
+                <w:sz w:val="18"/>
+              </w:rPr>
+              <w:t xml:space="preserve">. (2) TTS </w:t>
+            </w:r>
+            <w:r>
+              <w:rPr>
+                <w:rFonts w:ascii="Courier New" w:hAnsi="Courier New"/>
+                <w:color w:val="0F172A"/>
+                <w:sz w:val="18"/>
+              </w:rPr>
+              <w:t>stripForSpeech()</w:t>
+            </w:r>
+            <w:r>
+              <w:rPr>
+                <w:color w:val="1E293B"/>
+                <w:sz w:val="18"/>
+              </w:rPr>
+              <w:t xml:space="preserve"> extended: removes box-drawing characters, horizontal rules, </w:t>
+            </w:r>
+            <w:r>
+              <w:rPr>
+                <w:rFonts w:ascii="Courier New" w:hAnsi="Courier New"/>
+                <w:color w:val="0F172A"/>
+                <w:sz w:val="18"/>
+              </w:rPr>
+              <w:t>[square bracket]</w:t>
+            </w:r>
+            <w:r>
+              <w:rPr>
+                <w:color w:val="1E293B"/>
+                <w:sz w:val="18"/>
+              </w:rPr>
+              <w:t xml:space="preserve"> text, </w:t>
+            </w:r>
+            <w:r>
+              <w:rPr>
+                <w:rFonts w:ascii="Courier New" w:hAnsi="Courier New"/>
+                <w:color w:val="0F172A"/>
+                <w:sz w:val="18"/>
+              </w:rPr>
+              <w:t>(Type A, B, C, or D)</w:t>
+            </w:r>
+            <w:r>
+              <w:rPr>
+                <w:color w:val="1E293B"/>
+                <w:sz w:val="18"/>
+              </w:rPr>
+              <w:t xml:space="preserve">, numbered list markers, ellipsis→".", em/en-dash→",". (3) Mic permission: replaced </w:t>
+            </w:r>
+            <w:r>
+              <w:rPr>
+                <w:rFonts w:ascii="Courier New" w:hAnsi="Courier New"/>
+                <w:color w:val="0F172A"/>
+                <w:sz w:val="18"/>
+              </w:rPr>
+              <w:t>navigator.permissions.query()</w:t>
+            </w:r>
+            <w:r>
+              <w:rPr>
+                <w:color w:val="1E293B"/>
+                <w:sz w:val="18"/>
+              </w:rPr>
+              <w:t xml:space="preserve"> with </w:t>
+            </w:r>
+            <w:r>
+              <w:rPr>
+                <w:rFonts w:ascii="Courier New" w:hAnsi="Courier New"/>
+                <w:color w:val="0F172A"/>
+                <w:sz w:val="18"/>
+              </w:rPr>
+              <w:t>getUserMedia()</w:t>
+            </w:r>
+            <w:r>
+              <w:rPr>
+                <w:color w:val="1E293B"/>
+                <w:sz w:val="18"/>
+              </w:rPr>
+              <w:t xml:space="preserve"> directly — triggers native browser permission popup</w:t>
+            </w:r>
+          </w:p>
+        </w:tc>
+      </w:tr>
+      <w:tr>
+        <w:tc>
+          <w:tcPr>
+            <w:tcW w:type="dxa" w:w="3024"/>
+            <w:shd w:val="clear" w:color="auto" w:fill="F8FAFC"/>
+            <w:tcBorders>
+              <w:top w:val="single" w:sz="4" w:space="0" w:color="E2E8F0"/>
+              <w:left w:val="single" w:sz="4" w:space="0" w:color="E2E8F0"/>
+              <w:bottom w:val="single" w:sz="4" w:space="0" w:color="E2E8F0"/>
+              <w:right w:val="single" w:sz="4" w:space="0" w:color="E2E8F0"/>
+            </w:tcBorders>
+          </w:tcPr>
+          <w:p>
+            <w:pPr>
+              <w:spacing w:before="30" w:after="30"/>
+            </w:pPr>
+            <w:r/>
+            <w:r>
+              <w:rPr>
+                <w:b/>
+                <w:color w:val="1E293B"/>
+              </w:rPr>
+              <w:t>v0.44.0</w:t>
+            </w:r>
+          </w:p>
+        </w:tc>
+        <w:tc>
+          <w:tcPr>
+            <w:tcW w:type="dxa" w:w="3024"/>
+            <w:shd w:val="clear" w:color="auto" w:fill="F8FAFC"/>
+            <w:tcBorders>
+              <w:top w:val="single" w:sz="4" w:space="0" w:color="E2E8F0"/>
+              <w:left w:val="single" w:sz="4" w:space="0" w:color="E2E8F0"/>
+              <w:bottom w:val="single" w:sz="4" w:space="0" w:color="E2E8F0"/>
+              <w:right w:val="single" w:sz="4" w:space="0" w:color="E2E8F0"/>
+            </w:tcBorders>
+          </w:tcPr>
+          <w:p>
+            <w:pPr>
+              <w:spacing w:before="30" w:after="30"/>
+            </w:pPr>
+            <w:r/>
+            <w:r>
+              <w:rPr>
+                <w:color w:val="1E293B"/>
+                <w:sz w:val="18"/>
+              </w:rPr>
+              <w:t>July 2026</w:t>
+            </w:r>
+          </w:p>
+        </w:tc>
+        <w:tc>
+          <w:tcPr>
+            <w:tcW w:type="dxa" w:w="3024"/>
+            <w:shd w:val="clear" w:color="auto" w:fill="F8FAFC"/>
+            <w:tcBorders>
+              <w:top w:val="single" w:sz="4" w:space="0" w:color="E2E8F0"/>
+              <w:left w:val="single" w:sz="4" w:space="0" w:color="E2E8F0"/>
+              <w:bottom w:val="single" w:sz="4" w:space="0" w:color="E2E8F0"/>
+              <w:right w:val="single" w:sz="4" w:space="0" w:color="E2E8F0"/>
+            </w:tcBorders>
+          </w:tcPr>
+          <w:p>
+            <w:pPr>
+              <w:spacing w:before="30" w:after="30"/>
+            </w:pPr>
+            <w:r/>
+            <w:r>
+              <w:rPr>
+                <w:color w:val="1E293B"/>
+                <w:sz w:val="18"/>
+              </w:rPr>
+              <w:t xml:space="preserve">Sign-out redirect fix (critical) — Root cause: Clerk does a full page REDIRECT on sign-out before any React </w:t>
+            </w:r>
+            <w:r>
+              <w:rPr>
+                <w:rFonts w:ascii="Courier New" w:hAnsi="Courier New"/>
+                <w:color w:val="0F172A"/>
+                <w:sz w:val="18"/>
+              </w:rPr>
+              <w:t>useEffect</w:t>
+            </w:r>
+            <w:r>
+              <w:rPr>
+                <w:color w:val="1E293B"/>
+                <w:sz w:val="18"/>
+              </w:rPr>
+              <w:t xml:space="preserve"> runs. Fixed by proactively removing </w:t>
+            </w:r>
+            <w:r>
+              <w:rPr>
+                <w:rFonts w:ascii="Courier New" w:hAnsi="Courier New"/>
+                <w:color w:val="0F172A"/>
+                <w:sz w:val="18"/>
+              </w:rPr>
+              <w:t>selected_intro_seen</w:t>
+            </w:r>
+            <w:r>
+              <w:rPr>
+                <w:color w:val="1E293B"/>
+                <w:sz w:val="18"/>
+              </w:rPr>
+              <w:t xml:space="preserve"> from localStorage when </w:t>
+            </w:r>
+            <w:r>
+              <w:rPr>
+                <w:rFonts w:ascii="Courier New" w:hAnsi="Courier New"/>
+                <w:color w:val="0F172A"/>
+                <w:sz w:val="18"/>
+              </w:rPr>
+              <w:t>isSignedIn === true</w:t>
+            </w:r>
+            <w:r>
+              <w:rPr>
+                <w:color w:val="1E293B"/>
+                <w:sz w:val="18"/>
+              </w:rPr>
+              <w:t xml:space="preserve"> (not on sign-out). The flag is absent before any redirect occurs. Merged all auth state into one unified </w:t>
+            </w:r>
+            <w:r>
+              <w:rPr>
+                <w:rFonts w:ascii="Courier New" w:hAnsi="Courier New"/>
+                <w:color w:val="0F172A"/>
+                <w:sz w:val="18"/>
+              </w:rPr>
+              <w:t>useEffect</w:t>
+            </w:r>
+          </w:p>
+        </w:tc>
+      </w:tr>
+      <w:tr>
+        <w:tc>
+          <w:tcPr>
+            <w:tcW w:type="dxa" w:w="3024"/>
+            <w:shd w:val="clear" w:color="auto" w:fill="FFFFFF"/>
+            <w:tcBorders>
+              <w:top w:val="single" w:sz="4" w:space="0" w:color="E2E8F0"/>
+              <w:left w:val="single" w:sz="4" w:space="0" w:color="E2E8F0"/>
+              <w:bottom w:val="single" w:sz="4" w:space="0" w:color="E2E8F0"/>
+              <w:right w:val="single" w:sz="4" w:space="0" w:color="E2E8F0"/>
+            </w:tcBorders>
+          </w:tcPr>
+          <w:p>
+            <w:pPr>
+              <w:spacing w:before="30" w:after="30"/>
+            </w:pPr>
+            <w:r/>
+            <w:r>
+              <w:rPr>
+                <w:b/>
+                <w:color w:val="1E293B"/>
+              </w:rPr>
+              <w:t>v0.50.0</w:t>
+            </w:r>
+          </w:p>
+        </w:tc>
+        <w:tc>
+          <w:tcPr>
+            <w:tcW w:type="dxa" w:w="3024"/>
+            <w:shd w:val="clear" w:color="auto" w:fill="FFFFFF"/>
+            <w:tcBorders>
+              <w:top w:val="single" w:sz="4" w:space="0" w:color="E2E8F0"/>
+              <w:left w:val="single" w:sz="4" w:space="0" w:color="E2E8F0"/>
+              <w:bottom w:val="single" w:sz="4" w:space="0" w:color="E2E8F0"/>
+              <w:right w:val="single" w:sz="4" w:space="0" w:color="E2E8F0"/>
+            </w:tcBorders>
+          </w:tcPr>
+          <w:p>
+            <w:pPr>
+              <w:spacing w:before="30" w:after="30"/>
+            </w:pPr>
+            <w:r/>
+            <w:r>
+              <w:rPr>
+                <w:color w:val="1E293B"/>
+                <w:sz w:val="18"/>
+              </w:rPr>
+              <w:t>July 2026</w:t>
+            </w:r>
+          </w:p>
+        </w:tc>
+        <w:tc>
+          <w:tcPr>
+            <w:tcW w:type="dxa" w:w="3024"/>
+            <w:shd w:val="clear" w:color="auto" w:fill="FFFFFF"/>
+            <w:tcBorders>
+              <w:top w:val="single" w:sz="4" w:space="0" w:color="E2E8F0"/>
+              <w:left w:val="single" w:sz="4" w:space="0" w:color="E2E8F0"/>
+              <w:bottom w:val="single" w:sz="4" w:space="0" w:color="E2E8F0"/>
+              <w:right w:val="single" w:sz="4" w:space="0" w:color="E2E8F0"/>
+            </w:tcBorders>
+          </w:tcPr>
+          <w:p>
+            <w:pPr>
+              <w:spacing w:before="30" w:after="30"/>
+            </w:pPr>
+            <w:r/>
+            <w:r>
+              <w:rPr>
+                <w:color w:val="1E293B"/>
+                <w:sz w:val="18"/>
+              </w:rPr>
+              <w:t xml:space="preserve">Full landing page redesign + Playwright regression test suite — (1) </w:t>
+            </w:r>
+            <w:r>
+              <w:rPr>
+                <w:b/>
+                <w:color w:val="1E293B"/>
+              </w:rPr>
+              <w:t>Landing page overhaul</w:t>
+            </w:r>
+            <w:r>
+              <w:rPr>
+                <w:color w:val="1E293B"/>
+                <w:sz w:val="18"/>
+              </w:rPr>
+              <w:t xml:space="preserve">: 15 new components in </w:t>
+            </w:r>
+            <w:r>
+              <w:rPr>
+                <w:rFonts w:ascii="Courier New" w:hAnsi="Courier New"/>
+                <w:color w:val="0F172A"/>
+                <w:sz w:val="18"/>
+              </w:rPr>
+              <w:t>app/components/landing/</w:t>
+            </w:r>
+            <w:r>
+              <w:rPr>
+                <w:color w:val="1E293B"/>
+                <w:sz w:val="18"/>
+              </w:rPr>
+              <w:t xml:space="preserve">. New fonts: Plus Jakarta Sans (800 weight headings) + Inter (body), </w:t>
+            </w:r>
+            <w:r>
+              <w:rPr>
+                <w:rFonts w:ascii="Courier New" w:hAnsi="Courier New"/>
+                <w:color w:val="0F172A"/>
+                <w:sz w:val="18"/>
+              </w:rPr>
+              <w:t>--font-jakarta</w:t>
+            </w:r>
+            <w:r>
+              <w:rPr>
+                <w:color w:val="1E293B"/>
+                <w:sz w:val="18"/>
+              </w:rPr>
+              <w:t>/</w:t>
+            </w:r>
+            <w:r>
+              <w:rPr>
+                <w:rFonts w:ascii="Courier New" w:hAnsi="Courier New"/>
+                <w:color w:val="0F172A"/>
+                <w:sz w:val="18"/>
+              </w:rPr>
+              <w:t>--font-inter</w:t>
+            </w:r>
+            <w:r>
+              <w:rPr>
+                <w:color w:val="1E293B"/>
+                <w:sz w:val="18"/>
+              </w:rPr>
+              <w:t xml:space="preserve"> CSS variables. </w:t>
+            </w:r>
+            <w:r>
+              <w:rPr>
+                <w:rFonts w:ascii="Courier New" w:hAnsi="Courier New"/>
+                <w:color w:val="0F172A"/>
+                <w:sz w:val="18"/>
+              </w:rPr>
+              <w:t>LandingNav</w:t>
+            </w:r>
+            <w:r>
+              <w:rPr>
+                <w:color w:val="1E293B"/>
+                <w:sz w:val="18"/>
+              </w:rPr>
+              <w:t xml:space="preserve">: sticky with scroll shadow, mobile hamburger drawer (Framer Motion AnimatePresence), anchor links (#how-it-works, #exams, #pricing). </w:t>
+            </w:r>
+            <w:r>
+              <w:rPr>
+                <w:rFonts w:ascii="Courier New" w:hAnsi="Courier New"/>
+                <w:color w:val="0F172A"/>
+                <w:sz w:val="18"/>
+              </w:rPr>
+              <w:t>HeroSection</w:t>
+            </w:r>
+            <w:r>
+              <w:rPr>
+                <w:color w:val="1E293B"/>
+                <w:sz w:val="18"/>
+              </w:rPr>
+              <w:t xml:space="preserve">: two-column layout, eyebrow/H1 ("Your child's own tutor…"), trust row, exam pills, </w:t>
+            </w:r>
+            <w:r>
+              <w:rPr>
+                <w:rFonts w:ascii="Courier New" w:hAnsi="Courier New"/>
+                <w:color w:val="0F172A"/>
+                <w:sz w:val="18"/>
+              </w:rPr>
+              <w:t>&lt;InteractiveDemo&gt;</w:t>
+            </w:r>
+            <w:r>
+              <w:rPr>
+                <w:color w:val="1E293B"/>
+                <w:sz w:val="18"/>
+              </w:rPr>
+              <w:t xml:space="preserve"> on right. </w:t>
+            </w:r>
+            <w:r>
+              <w:rPr>
+                <w:rFonts w:ascii="Courier New" w:hAnsi="Courier New"/>
+                <w:color w:val="0F172A"/>
+                <w:sz w:val="18"/>
+              </w:rPr>
+              <w:t>InteractiveDemo</w:t>
+            </w:r>
+            <w:r>
+              <w:rPr>
+                <w:color w:val="1E293B"/>
+                <w:sz w:val="18"/>
+              </w:rPr>
+              <w:t xml:space="preserve">: scripted Socratic demo state machine (question → typing → followup → done), simulated character streaming, no live API call. </w:t>
+            </w:r>
+            <w:r>
+              <w:rPr>
+                <w:rFonts w:ascii="Courier New" w:hAnsi="Courier New"/>
+                <w:color w:val="0F172A"/>
+                <w:sz w:val="18"/>
+              </w:rPr>
+              <w:t>StatsBar</w:t>
+            </w:r>
+            <w:r>
+              <w:rPr>
+                <w:color w:val="1E293B"/>
+                <w:sz w:val="18"/>
+              </w:rPr>
+              <w:t xml:space="preserve">, </w:t>
+            </w:r>
+            <w:r>
+              <w:rPr>
+                <w:rFonts w:ascii="Courier New" w:hAnsi="Courier New"/>
+                <w:color w:val="0F172A"/>
+                <w:sz w:val="18"/>
+              </w:rPr>
+              <w:t>HowItWorks</w:t>
+            </w:r>
+            <w:r>
+              <w:rPr>
+                <w:color w:val="1E293B"/>
+                <w:sz w:val="18"/>
+              </w:rPr>
+              <w:t xml:space="preserve"> (3-step with dashed connector), </w:t>
+            </w:r>
+            <w:r>
+              <w:rPr>
+                <w:rFonts w:ascii="Courier New" w:hAnsi="Courier New"/>
+                <w:color w:val="0F172A"/>
+                <w:sz w:val="18"/>
+              </w:rPr>
+              <w:t>ModesTabs</w:t>
+            </w:r>
+            <w:r>
+              <w:rPr>
+                <w:color w:val="1E293B"/>
+                <w:sz w:val="18"/>
+              </w:rPr>
+              <w:t xml:space="preserve"> (4-tab AnimatePresence crossfade), </w:t>
+            </w:r>
+            <w:r>
+              <w:rPr>
+                <w:rFonts w:ascii="Courier New" w:hAnsi="Courier New"/>
+                <w:color w:val="0F172A"/>
+                <w:sz w:val="18"/>
+              </w:rPr>
+              <w:t>ProofBlock</w:t>
+            </w:r>
+            <w:r>
+              <w:rPr>
+                <w:color w:val="1E293B"/>
+                <w:sz w:val="18"/>
+              </w:rPr>
+              <w:t xml:space="preserve"> (annotated Socratic chat mockup), </w:t>
+            </w:r>
+            <w:r>
+              <w:rPr>
+                <w:rFonts w:ascii="Courier New" w:hAnsi="Courier New"/>
+                <w:color w:val="0F172A"/>
+                <w:sz w:val="18"/>
+              </w:rPr>
+              <w:t>ExamGrid</w:t>
+            </w:r>
+            <w:r>
+              <w:rPr>
+                <w:color w:val="1E293B"/>
+                <w:sz w:val="18"/>
+              </w:rPr>
+              <w:t xml:space="preserve"> (8 exam cards), </w:t>
+            </w:r>
+            <w:r>
+              <w:rPr>
+                <w:rFonts w:ascii="Courier New" w:hAnsi="Courier New"/>
+                <w:color w:val="0F172A"/>
+                <w:sz w:val="18"/>
+              </w:rPr>
+              <w:t>FounderSection</w:t>
+            </w:r>
+            <w:r>
+              <w:rPr>
+                <w:color w:val="1E293B"/>
+                <w:sz w:val="18"/>
+              </w:rPr>
+              <w:t xml:space="preserve">, </w:t>
+            </w:r>
+            <w:r>
+              <w:rPr>
+                <w:rFonts w:ascii="Courier New" w:hAnsi="Courier New"/>
+                <w:color w:val="0F172A"/>
+                <w:sz w:val="18"/>
+              </w:rPr>
+              <w:t>PricingSection</w:t>
+            </w:r>
+            <w:r>
+              <w:rPr>
+                <w:color w:val="1E293B"/>
+                <w:sz w:val="18"/>
+              </w:rPr>
+              <w:t xml:space="preserve"> (corrected: Exam + Adventure are </w:t>
+            </w:r>
+            <w:r>
+              <w:rPr>
+                <w:b/>
+                <w:color w:val="1E293B"/>
+              </w:rPr>
+              <w:t>Premium-only</w:t>
+            </w:r>
+            <w:r>
+              <w:rPr>
+                <w:color w:val="1E293B"/>
+                <w:sz w:val="18"/>
+              </w:rPr>
+              <w:t xml:space="preserve">; Free = Chat + Practice only), </w:t>
+            </w:r>
+            <w:r>
+              <w:rPr>
+                <w:rFonts w:ascii="Courier New" w:hAnsi="Courier New"/>
+                <w:color w:val="0F172A"/>
+                <w:sz w:val="18"/>
+              </w:rPr>
+              <w:t>FAQSection</w:t>
+            </w:r>
+            <w:r>
+              <w:rPr>
+                <w:color w:val="1E293B"/>
+                <w:sz w:val="18"/>
+              </w:rPr>
+              <w:t xml:space="preserve"> (6 Framer Motion accordion items), </w:t>
+            </w:r>
+            <w:r>
+              <w:rPr>
+                <w:rFonts w:ascii="Courier New" w:hAnsi="Courier New"/>
+                <w:color w:val="0F172A"/>
+                <w:sz w:val="18"/>
+              </w:rPr>
+              <w:t>FinalCTA</w:t>
+            </w:r>
+            <w:r>
+              <w:rPr>
+                <w:color w:val="1E293B"/>
+                <w:sz w:val="18"/>
+              </w:rPr>
+              <w:t xml:space="preserve"> (dark navy + </w:t>
+            </w:r>
+            <w:r>
+              <w:rPr>
+                <w:rFonts w:ascii="Courier New" w:hAnsi="Courier New"/>
+                <w:color w:val="0F172A"/>
+                <w:sz w:val="18"/>
+              </w:rPr>
+              <w:t>#FDC800</w:t>
+            </w:r>
+            <w:r>
+              <w:rPr>
+                <w:color w:val="1E293B"/>
+                <w:sz w:val="18"/>
+              </w:rPr>
+              <w:t xml:space="preserve"> CTA), </w:t>
+            </w:r>
+            <w:r>
+              <w:rPr>
+                <w:rFonts w:ascii="Courier New" w:hAnsi="Courier New"/>
+                <w:color w:val="0F172A"/>
+                <w:sz w:val="18"/>
+              </w:rPr>
+              <w:t>LandingFooter</w:t>
+            </w:r>
+            <w:r>
+              <w:rPr>
+                <w:color w:val="1E293B"/>
+                <w:sz w:val="18"/>
+              </w:rPr>
+              <w:t xml:space="preserve">, </w:t>
+            </w:r>
+            <w:r>
+              <w:rPr>
+                <w:rFonts w:ascii="Courier New" w:hAnsi="Courier New"/>
+                <w:color w:val="0F172A"/>
+                <w:sz w:val="18"/>
+              </w:rPr>
+              <w:t>MobileBottomBar</w:t>
+            </w:r>
+            <w:r>
+              <w:rPr>
+                <w:color w:val="1E293B"/>
+                <w:sz w:val="18"/>
+              </w:rPr>
+              <w:t xml:space="preserve"> (IntersectionObserver, slide-up). All animations gated with </w:t>
+            </w:r>
+            <w:r>
+              <w:rPr>
+                <w:rFonts w:ascii="Courier New" w:hAnsi="Courier New"/>
+                <w:color w:val="0F172A"/>
+                <w:sz w:val="18"/>
+              </w:rPr>
+              <w:t>useReducedMotion()</w:t>
+            </w:r>
+            <w:r>
+              <w:rPr>
+                <w:color w:val="1E293B"/>
+                <w:sz w:val="18"/>
+              </w:rPr>
+              <w:t xml:space="preserve">. Removed: fake testimonials, testimonial submission form, back-to-top button, particle animations, video background, dead legacy hero block. (2) </w:t>
+            </w:r>
+            <w:r>
+              <w:rPr>
+                <w:b/>
+                <w:color w:val="1E293B"/>
+              </w:rPr>
+              <w:t>Playwright regression test suite</w:t>
+            </w:r>
+            <w:r>
+              <w:rPr>
+                <w:color w:val="1E293B"/>
+                <w:sz w:val="18"/>
+              </w:rPr>
+              <w:t xml:space="preserve"> (</w:t>
+            </w:r>
+            <w:r>
+              <w:rPr>
+                <w:rFonts w:ascii="Courier New" w:hAnsi="Courier New"/>
+                <w:color w:val="0F172A"/>
+                <w:sz w:val="18"/>
+              </w:rPr>
+              <w:t>@playwright/test</w:t>
+            </w:r>
+            <w:r>
+              <w:rPr>
+                <w:color w:val="1E293B"/>
+                <w:sz w:val="18"/>
+              </w:rPr>
+              <w:t xml:space="preserve">): </w:t>
+            </w:r>
+            <w:r>
+              <w:rPr>
+                <w:rFonts w:ascii="Courier New" w:hAnsi="Courier New"/>
+                <w:color w:val="0F172A"/>
+                <w:sz w:val="18"/>
+              </w:rPr>
+              <w:t>playwright.config.ts</w:t>
+            </w:r>
+            <w:r>
+              <w:rPr>
+                <w:color w:val="1E293B"/>
+                <w:sz w:val="18"/>
+              </w:rPr>
+              <w:t xml:space="preserve"> (Chromium, Pixel 7, iPhone 14; webServer auto-starts </w:t>
+            </w:r>
+            <w:r>
+              <w:rPr>
+                <w:rFonts w:ascii="Courier New" w:hAnsi="Courier New"/>
+                <w:color w:val="0F172A"/>
+                <w:sz w:val="18"/>
+              </w:rPr>
+              <w:t>npm run dev</w:t>
+            </w:r>
+            <w:r>
+              <w:rPr>
+                <w:color w:val="1E293B"/>
+                <w:sz w:val="18"/>
+              </w:rPr>
+              <w:t xml:space="preserve">); </w:t>
+            </w:r>
+            <w:r>
+              <w:rPr>
+                <w:rFonts w:ascii="Courier New" w:hAnsi="Courier New"/>
+                <w:color w:val="0F172A"/>
+                <w:sz w:val="18"/>
+              </w:rPr>
+              <w:t>tests/helpers.ts</w:t>
+            </w:r>
+            <w:r>
+              <w:rPr>
+                <w:color w:val="1E293B"/>
+                <w:sz w:val="18"/>
+              </w:rPr>
+              <w:t xml:space="preserve"> (localStorage utilities); 6 spec files — </w:t>
+            </w:r>
+            <w:r>
+              <w:rPr>
+                <w:rFonts w:ascii="Courier New" w:hAnsi="Courier New"/>
+                <w:color w:val="0F172A"/>
+                <w:sz w:val="18"/>
+              </w:rPr>
+              <w:t>landing.spec.ts</w:t>
+            </w:r>
+            <w:r>
+              <w:rPr>
+                <w:color w:val="1E293B"/>
+                <w:sz w:val="18"/>
+              </w:rPr>
+              <w:t xml:space="preserve"> (hero copy, nav, hamburger, exam strip, pricing, FAQ, CTA), </w:t>
+            </w:r>
+            <w:r>
+              <w:rPr>
+                <w:rFonts w:ascii="Courier New" w:hAnsi="Courier New"/>
+                <w:color w:val="0F172A"/>
+                <w:sz w:val="18"/>
+              </w:rPr>
+              <w:t>navigation.spec.ts</w:t>
+            </w:r>
+            <w:r>
+              <w:rPr>
+                <w:color w:val="1E293B"/>
+                <w:sz w:val="18"/>
+              </w:rPr>
+              <w:t xml:space="preserve"> (anchor links, hamburger drawer, sticky nav, Escape key close), </w:t>
+            </w:r>
+            <w:r>
+              <w:rPr>
+                <w:rFonts w:ascii="Courier New" w:hAnsi="Courier New"/>
+                <w:color w:val="0F172A"/>
+                <w:sz w:val="18"/>
+              </w:rPr>
+              <w:t>auth.spec.ts</w:t>
+            </w:r>
+            <w:r>
+              <w:rPr>
+                <w:color w:val="1E293B"/>
+                <w:sz w:val="18"/>
+              </w:rPr>
+              <w:t xml:space="preserve"> (localStorage gate, sign-out clears flag), </w:t>
+            </w:r>
+            <w:r>
+              <w:rPr>
+                <w:rFonts w:ascii="Courier New" w:hAnsi="Courier New"/>
+                <w:color w:val="0F172A"/>
+                <w:sz w:val="18"/>
+              </w:rPr>
+              <w:t>student.spec.ts</w:t>
+            </w:r>
+            <w:r>
+              <w:rPr>
+                <w:color w:val="1E293B"/>
+                <w:sz w:val="18"/>
+              </w:rPr>
+              <w:t xml:space="preserve"> (name+PIN form, wrong credentials, exit flow), </w:t>
+            </w:r>
+            <w:r>
+              <w:rPr>
+                <w:rFonts w:ascii="Courier New" w:hAnsi="Courier New"/>
+                <w:color w:val="0F172A"/>
+                <w:sz w:val="18"/>
+              </w:rPr>
+              <w:t>app.spec.ts</w:t>
+            </w:r>
+            <w:r>
+              <w:rPr>
+                <w:color w:val="1E293B"/>
+                <w:sz w:val="18"/>
+              </w:rPr>
+              <w:t xml:space="preserve"> (mode tabs, brain break, voice toggle, practice label), </w:t>
+            </w:r>
+            <w:r>
+              <w:rPr>
+                <w:rFonts w:ascii="Courier New" w:hAnsi="Courier New"/>
+                <w:color w:val="0F172A"/>
+                <w:sz w:val="18"/>
+              </w:rPr>
+              <w:t>accessibility.spec.ts</w:t>
+            </w:r>
+            <w:r>
+              <w:rPr>
+                <w:color w:val="1E293B"/>
+                <w:sz w:val="18"/>
+              </w:rPr>
+              <w:t xml:space="preserve"> (font sizes, button labels, landmark structure). </w:t>
+            </w:r>
+            <w:r>
+              <w:rPr>
+                <w:rFonts w:ascii="Courier New" w:hAnsi="Courier New"/>
+                <w:color w:val="0F172A"/>
+                <w:sz w:val="18"/>
+              </w:rPr>
+              <w:t>mobile.spec.ts</w:t>
+            </w:r>
+            <w:r>
+              <w:rPr>
+                <w:color w:val="1E293B"/>
+                <w:sz w:val="18"/>
+              </w:rPr>
+              <w:t xml:space="preserve"> covers viewport, tap targets, card stacking. npm scripts: </w:t>
+            </w:r>
+            <w:r>
+              <w:rPr>
+                <w:rFonts w:ascii="Courier New" w:hAnsi="Courier New"/>
+                <w:color w:val="0F172A"/>
+                <w:sz w:val="18"/>
+              </w:rPr>
+              <w:t>test</w:t>
+            </w:r>
+            <w:r>
+              <w:rPr>
+                <w:color w:val="1E293B"/>
+                <w:sz w:val="18"/>
+              </w:rPr>
+              <w:t xml:space="preserve">, </w:t>
+            </w:r>
+            <w:r>
+              <w:rPr>
+                <w:rFonts w:ascii="Courier New" w:hAnsi="Courier New"/>
+                <w:color w:val="0F172A"/>
+                <w:sz w:val="18"/>
+              </w:rPr>
+              <w:t>test:ui</w:t>
+            </w:r>
+            <w:r>
+              <w:rPr>
+                <w:color w:val="1E293B"/>
+                <w:sz w:val="18"/>
+              </w:rPr>
+              <w:t xml:space="preserve">, </w:t>
+            </w:r>
+            <w:r>
+              <w:rPr>
+                <w:rFonts w:ascii="Courier New" w:hAnsi="Courier New"/>
+                <w:color w:val="0F172A"/>
+                <w:sz w:val="18"/>
+              </w:rPr>
+              <w:t>test:headed</w:t>
+            </w:r>
+            <w:r>
+              <w:rPr>
+                <w:color w:val="1E293B"/>
+                <w:sz w:val="18"/>
+              </w:rPr>
+              <w:t xml:space="preserve">, </w:t>
+            </w:r>
+            <w:r>
+              <w:rPr>
+                <w:rFonts w:ascii="Courier New" w:hAnsi="Courier New"/>
+                <w:color w:val="0F172A"/>
+                <w:sz w:val="18"/>
+              </w:rPr>
+              <w:t>test:report</w:t>
+            </w:r>
+          </w:p>
+        </w:tc>
+      </w:tr>
+    </w:tbl>
+    <w:p/>
     <w:p>
       <w:pPr>
         <w:spacing w:before="60" w:after="60"/>
@@ -30591,7 +31840,7 @@
           <w:i/>
           <w:color w:val="1E293B"/>
         </w:rPr>
-        <w:t>Document last updated: 2 July 2026 (v0.35). Updated alongside the codebase whenever routes, components, or UX decisions change.</w:t>
+        <w:t>Document last updated: 2 July 2026 (v0.50). Updated alongside the codebase whenever routes, components, or UX decisions change.</w:t>
       </w:r>
     </w:p>
     <w:p>

</xml_diff>